<commit_message>
Update: Web interaktif 3 model soal + landing page harga Rp69.999 + Paket 1-5 PDF baru
</commit_message>
<xml_diff>
--- a/Quiz_Web_Bahasa_Indonesia_Paket_1.docx
+++ b/Quiz_Web_Bahasa_Indonesia_Paket_1.docx
@@ -66,11 +66,11 @@
         <w:br/>
       </w:r>
       <w:r>
-        <w:t>3. Naskah soal ini terdiri atas 20 butir soal pilihan ganda dengan 4 opsi pilihan (A, B, C, D).</w:t>
+        <w:t>3. Naskah soal ini terdiri atas Pilihan Ganda Sederhana, Pilihan Ganda Kompleks, dan Tabel Benar/Salah.</w:t>
         <w:br/>
       </w:r>
       <w:r>
-        <w:t>4. Pilihlah salah satu jawaban yang Anda anggap paling benar dan tepat.</w:t>
+        <w:t>4. Pilihlah jawaban yang paling benar dan tepat.</w:t>
       </w:r>
     </w:p>
     <w:p>
@@ -100,83 +100,19 @@
       <w:r>
         <w:t>Bacalah teks informasi berikut dengan cermat untuk menjawab soal nomor 1 sampai 5!</w:t>
         <w:br/>
-      </w:r>
-    </w:p>
-    <w:p>
-      <w:pPr>
-        <w:spacing w:before="0" w:after="40"/>
-      </w:pPr>
-      <w:r/>
-    </w:p>
-    <w:p>
-      <w:pPr>
-        <w:spacing w:before="0" w:after="40"/>
-      </w:pPr>
-      <w:r>
-        <w:rPr>
-          <w:b/>
-          <w:color w:val="1F2937"/>
-        </w:rPr>
+        <w:br/>
         <w:t>Penyu Sisik: Sang Penjaga Terumbu Karang Nusantara</w:t>
-      </w:r>
-    </w:p>
-    <w:p>
-      <w:pPr>
-        <w:spacing w:before="0" w:after="40"/>
-      </w:pPr>
-      <w:r/>
-    </w:p>
-    <w:p>
-      <w:pPr>
-        <w:spacing w:before="0" w:after="40"/>
-      </w:pPr>
-      <w:r>
-        <w:rPr>
-          <w:b/>
-          <w:color w:val="1F2937"/>
-        </w:rPr>
+        <w:br/>
+        <w:br/>
         <w:t>Penyu sisik (Eretmochelys imbricata) merupakan salah satu spesies penyu laut yang memiliki peran sangat krusial dalam menjaga keseimbangan ekosistem terumbu karang di perairan tropis Indonesia. Ciri khas utama satwa ini terletak pada bentuk paruhnya yang runcing menyerupai paruh burung elang serta susunan sisik karapasnya yang bertumpuk indah keemasan. Makanan utama penyu sisik adalah spons laut (hewan porifera) yang hidup menempel pada karang. Dengan memakan spons laut tersebut, penyu sisik mengontrol populasinya agar tidak tumbuh berlebihan dan menutupi karang. Tindakan alami ini memberi ruang bagi terumbu karang untuk tumbuh subur dan menjadi rumah serta tempat berkembang biak bagi aneka jenis ikan.</w:t>
-      </w:r>
-    </w:p>
-    <w:p>
-      <w:pPr>
-        <w:spacing w:before="0" w:after="40"/>
-      </w:pPr>
-      <w:r/>
-    </w:p>
-    <w:p>
-      <w:pPr>
-        <w:spacing w:before="0" w:after="40"/>
-      </w:pPr>
-      <w:r>
+        <w:br/>
+        <w:br/>
         <w:t>Namun, keberadaan penyu sisik saat ini berada dalam bayang-bayang ancaman kepunahan yang nyata. Populasi satwa langka ini terus mengalami penurunan tajam akibat perburuan liar untuk diambil cangkangnya sebagai bahan kerajinan bernilai tinggi, perdagangan telur penyu secara ilegal, serta pencemaran sampah plastik di lautan. Penyu kerap mengira kantong plastik transparan yang terapung di perairan sebagai ubur-ubur santapan mereka. Akibatnya, plastik menyumbat saluran pencernaan dan menyebabkan kematian tragis bagi ribuan penyu setiap tahunnya.</w:t>
-      </w:r>
-    </w:p>
-    <w:p>
-      <w:pPr>
-        <w:spacing w:before="0" w:after="40"/>
-      </w:pPr>
-      <w:r/>
-    </w:p>
-    <w:p>
-      <w:pPr>
-        <w:spacing w:before="0" w:after="40"/>
-      </w:pPr>
-      <w:r>
+        <w:br/>
+        <w:br/>
         <w:t>Untuk mencegah kepunahan satwa karismatik ini, pemerintah bersama komunitas pelestari alam menggiatkan berbagai upaya konservasi dan penetasan semi-alami, seperti di pesisir Sukamade, Jawa Timur dan Kepulauan Derawan, Kalimantan Timur. Di pusat konservasi, sarang telur penyu di pantai dijaga ketat dari incaran predator maupun pemburu. Telur-telur yang berhasil diamankan dipindahkan ke bak penetasan khusus hingga menetas. Setelah menetas, anak penyu (tukik) dirawat secara intensif selama beberapa hari sebelum akhirnya dilepasliarkan kembali ke laut lepas pada malam atau dini hari guna menghindari serangan burung pemangsa.</w:t>
-      </w:r>
-    </w:p>
-    <w:p>
-      <w:pPr>
-        <w:spacing w:before="0" w:after="40"/>
-      </w:pPr>
-      <w:r/>
-    </w:p>
-    <w:p>
-      <w:pPr>
-        <w:spacing w:before="0" w:after="40"/>
-      </w:pPr>
-      <w:r>
+        <w:br/>
+        <w:br/>
         <w:t>Berdasarkan paragraf pertama teks di atas, peran ekologis penyu sisik yang sangat penting bagi kelestarian terumbu karang adalah....</w:t>
       </w:r>
     </w:p>
@@ -485,7 +421,7 @@
         <w:rPr>
           <w:b/>
         </w:rPr>
-        <w:t xml:space="preserve">A. </w:t>
+        <w:t xml:space="preserve">□ A. </w:t>
       </w:r>
       <w:r>
         <w:t>Penyu sisik memiliki bentuk paruh runcing menyerupai paruh burung elang.</w:t>
@@ -500,7 +436,7 @@
         <w:rPr>
           <w:b/>
         </w:rPr>
-        <w:t xml:space="preserve">B. </w:t>
+        <w:t xml:space="preserve">□ B. </w:t>
       </w:r>
       <w:r>
         <w:t>Tukik dilepasliarkan pada siang hari terik agar tubuhnya cepat kuat berenang.</w:t>
@@ -515,7 +451,7 @@
         <w:rPr>
           <w:b/>
         </w:rPr>
-        <w:t xml:space="preserve">C. </w:t>
+        <w:t xml:space="preserve">□ C. </w:t>
       </w:r>
       <w:r>
         <w:t>Kepulauan Derawan dan Sukamade merupakan contoh lokasi konservasi penyu.</w:t>
@@ -530,10 +466,21 @@
         <w:rPr>
           <w:b/>
         </w:rPr>
-        <w:t xml:space="preserve">D. </w:t>
+        <w:t xml:space="preserve">□ D. </w:t>
       </w:r>
       <w:r>
         <w:t>Populasi penyu sisik berkurang salah satunya karena perburuan cangkang sisiknya.</w:t>
+      </w:r>
+    </w:p>
+    <w:p>
+      <w:pPr>
+        <w:ind w:left="432"/>
+      </w:pPr>
+      <w:r>
+        <w:rPr>
+          <w:i/>
+        </w:rPr>
+        <w:t>[Pilihan Ganda Kompleks: Jawaban benar lebih dari satu]</w:t>
       </w:r>
     </w:p>
     <w:p>
@@ -549,93 +496,22 @@
       <w:r>
         <w:t>Bacalah cerita anak berikut dengan cermat untuk menjawab soal nomor 6 sampai 10!</w:t>
         <w:br/>
-      </w:r>
-    </w:p>
-    <w:p>
-      <w:pPr>
-        <w:spacing w:before="0" w:after="40"/>
-      </w:pPr>
-      <w:r/>
-    </w:p>
-    <w:p>
-      <w:pPr>
-        <w:spacing w:before="0" w:after="40"/>
-      </w:pPr>
-      <w:r>
-        <w:rPr>
-          <w:b/>
-          <w:color w:val="1F2937"/>
-        </w:rPr>
+        <w:br/>
         <w:t>Kejujuran di Balik Kantong Belacu Kakek Suro</w:t>
-      </w:r>
-    </w:p>
-    <w:p>
-      <w:pPr>
-        <w:spacing w:before="0" w:after="40"/>
-      </w:pPr>
-      <w:r/>
-    </w:p>
-    <w:p>
-      <w:pPr>
-        <w:spacing w:before="0" w:after="40"/>
-      </w:pPr>
-      <w:r>
+        <w:br/>
+        <w:br/>
         <w:t>Siang itu, terik matahari membakar jalanan Desa Sukamaju. Arga mengayuh sepeda ontel tuanya dengan peluh yang mengucur di pelipis. Di keranjang depan sepeda, tersusun rapi beberapa ikat bayam dan kangkung segar hasil kebun pekarangan rumahnya yang hendak ia jajakan ke pasar desa demi membantu keperluan dapur ibunya. Ketika melewati tikungan jembatan kayu di perbatasan desa, roda depan sepedanya menabrak sesuatu. Arga mengerem mendadak dan menoleh ke bawah. Di tepi semak-semak rumput gajah, tergeletak sebuah kantong kain belacu berwarna cokelat kusam.</w:t>
-      </w:r>
-    </w:p>
-    <w:p>
-      <w:pPr>
-        <w:spacing w:before="0" w:after="40"/>
-      </w:pPr>
-      <w:r/>
-    </w:p>
-    <w:p>
-      <w:pPr>
-        <w:spacing w:before="0" w:after="40"/>
-      </w:pPr>
-      <w:r>
+        <w:br/>
+        <w:br/>
         <w:t>Arga turun dari sepeda dan memungut kantong tersebut. Alangkah terkejutnya ia ketika membuka resletingnya: di dalamnya terdapat beberapa lembar uang ratusan ribu rupiah yang diikat karet gelang, sebuah kartu identitas penduduk, dan buku pemeriksaan kesehatan lansia atas nama Kakek Suro. Kakek Suro adalah seorang perajin anyaman bambu tua yang tinggal sebatang kara di ujung dusun.</w:t>
-      </w:r>
-    </w:p>
-    <w:p>
-      <w:pPr>
-        <w:spacing w:before="0" w:after="40"/>
-      </w:pPr>
-      <w:r/>
-    </w:p>
-    <w:p>
-      <w:pPr>
-        <w:spacing w:before="0" w:after="40"/>
-      </w:pPr>
-      <w:r>
+        <w:br/>
+        <w:br/>
         <w:t xml:space="preserve">Di dalam hati Arga, sempat terlintas bisikan godaan. Sepatu sekolahnya sudah jebol di bagian tumit, dan uang itu lebih dari cukup untuk membeli sepatu baru yang bagus. Namun, seketika petuah bijak sang ibu bergaung kuat di dadanya: "Kejujuran adalah kehormatan hidup kita, Arga. Mengambil hak orang lain hanya akan menanam duri dalam jiwa." </w:t>
-      </w:r>
-    </w:p>
-    <w:p>
-      <w:pPr>
-        <w:spacing w:before="0" w:after="40"/>
-      </w:pPr>
-      <w:r/>
-    </w:p>
-    <w:p>
-      <w:pPr>
-        <w:spacing w:before="0" w:after="40"/>
-      </w:pPr>
-      <w:r>
+        <w:br/>
+        <w:br/>
         <w:t>Tanpa ragu lagi, Arga memutar haluan sepedanya menuju gubuk Kakek Suro. Sesampainya di sana, Arga mendapati sang kakek sedang duduk lemas di tangga bambu sambil meneteskan air mata. Ternyata, uang tersebut adalah tabungan hasil penjualan tampah dan bakul anyaman selama empat bulan yang rencananya akan dipakai untuk menebus obat asma di puskesmas. Ketika Arga mengulurkan kantong belacu itu utuh tanpa berkurang sedikit pun, Kakek Suro seketika memeluk Arga erat dengan linangan air mata haru dan tak henti memanjatkan doa berkah bagi anak yang berbudi luhur itu.</w:t>
-      </w:r>
-    </w:p>
-    <w:p>
-      <w:pPr>
-        <w:spacing w:before="0" w:after="40"/>
-      </w:pPr>
-      <w:r/>
-    </w:p>
-    <w:p>
-      <w:pPr>
-        <w:spacing w:before="0" w:after="40"/>
-      </w:pPr>
-      <w:r>
+        <w:br/>
+        <w:br/>
         <w:t>Watak utama tokoh Arga yang tergambar paling dominan dalam cerita di atas adalah....</w:t>
       </w:r>
     </w:p>
@@ -713,1382 +589,64 @@
         <w:t>Latar tempat terjadinya peristiwa penemuan kantong belacu cokelat oleh Arga adalah....</w:t>
       </w:r>
     </w:p>
-    <w:p>
-      <w:pPr>
-        <w:spacing w:before="0" w:after="20"/>
-        <w:ind w:left="432"/>
-      </w:pPr>
-      <w:r>
-        <w:rPr>
-          <w:b/>
-        </w:rPr>
-        <w:t xml:space="preserve">A. </w:t>
-      </w:r>
-      <w:r>
-        <w:t>Di tengah pasar desa yang ramai</w:t>
-      </w:r>
-    </w:p>
-    <w:p>
-      <w:pPr>
-        <w:spacing w:before="0" w:after="20"/>
-        <w:ind w:left="432"/>
-      </w:pPr>
-      <w:r>
-        <w:rPr>
-          <w:b/>
-        </w:rPr>
-        <w:t xml:space="preserve">B. </w:t>
-      </w:r>
-      <w:r>
-        <w:t>Di tepi semak rumput gajah dekat tikungan jembatan kayu perbatasan desa</w:t>
-      </w:r>
-    </w:p>
-    <w:p>
-      <w:pPr>
-        <w:spacing w:before="0" w:after="20"/>
-        <w:ind w:left="432"/>
-      </w:pPr>
-      <w:r>
-        <w:rPr>
-          <w:b/>
-        </w:rPr>
-        <w:t xml:space="preserve">C. </w:t>
-      </w:r>
-      <w:r>
-        <w:t>Di pekarangan rumah gubuk milik Kakek Suro</w:t>
-      </w:r>
-    </w:p>
-    <w:p>
-      <w:pPr>
-        <w:spacing w:before="0" w:after="20"/>
-        <w:ind w:left="432"/>
-      </w:pPr>
-      <w:r>
-        <w:rPr>
-          <w:b/>
-        </w:rPr>
-        <w:t xml:space="preserve">D. </w:t>
-      </w:r>
-      <w:r>
-        <w:t>Di ruang tunggu puskesmas desa</w:t>
-      </w:r>
-    </w:p>
-    <w:p>
-      <w:pPr>
-        <w:spacing w:before="120" w:after="40"/>
-      </w:pPr>
-      <w:r>
-        <w:rPr>
-          <w:b/>
-        </w:rPr>
-        <w:t xml:space="preserve">8. </w:t>
-      </w:r>
-      <w:r>
-        <w:t>Konflik batin yang sempat dialami tokoh Arga ketika melihat isi kantong kain belacu tersebut adalah....</w:t>
-      </w:r>
-    </w:p>
-    <w:p>
-      <w:pPr>
-        <w:spacing w:before="0" w:after="20"/>
-        <w:ind w:left="432"/>
-      </w:pPr>
-      <w:r>
-        <w:rPr>
-          <w:b/>
-        </w:rPr>
-        <w:t xml:space="preserve">A. </w:t>
-      </w:r>
-      <w:r>
-        <w:t>Kebingungan memilih apakah harus menjual sayur ke pasar atau pulang ke rumah</w:t>
-      </w:r>
-    </w:p>
-    <w:p>
-      <w:pPr>
-        <w:spacing w:before="0" w:after="20"/>
-        <w:ind w:left="432"/>
-      </w:pPr>
-      <w:r>
-        <w:rPr>
-          <w:b/>
-        </w:rPr>
-        <w:t xml:space="preserve">B. </w:t>
-      </w:r>
-      <w:r>
-        <w:t>Keinginan menggunakan uang temuan untuk membeli sepatu baru versus ajaran moral kejujuran dari ibunya</w:t>
-      </w:r>
-    </w:p>
-    <w:p>
-      <w:pPr>
-        <w:spacing w:before="0" w:after="20"/>
-        <w:ind w:left="432"/>
-      </w:pPr>
-      <w:r>
-        <w:rPr>
-          <w:b/>
-        </w:rPr>
-        <w:t xml:space="preserve">C. </w:t>
-      </w:r>
-      <w:r>
-        <w:t>Rasa takut dituduh mencuri barang berharga milik warga dusun lain</w:t>
-      </w:r>
-    </w:p>
-    <w:p>
-      <w:pPr>
-        <w:spacing w:before="0" w:after="20"/>
-        <w:ind w:left="432"/>
-      </w:pPr>
-      <w:r>
-        <w:rPr>
-          <w:b/>
-        </w:rPr>
-        <w:t xml:space="preserve">D. </w:t>
-      </w:r>
-      <w:r>
-        <w:t>Kekhawatiran sepedanya akan rusak jika memutar arah jalan</w:t>
-      </w:r>
-    </w:p>
-    <w:p>
-      <w:pPr>
-        <w:spacing w:before="120" w:after="40"/>
-      </w:pPr>
-      <w:r>
-        <w:rPr>
-          <w:b/>
-        </w:rPr>
-        <w:t xml:space="preserve">9. </w:t>
-      </w:r>
-      <w:r>
-        <w:t>Amanat utama yang dapat dipetik dari kisah 'Kejujuran di Balik Kantong Belacu Kakek Suro' adalah....</w:t>
-      </w:r>
-    </w:p>
-    <w:p>
-      <w:pPr>
-        <w:spacing w:before="0" w:after="20"/>
-        <w:ind w:left="432"/>
-      </w:pPr>
-      <w:r>
-        <w:rPr>
-          <w:b/>
-        </w:rPr>
-        <w:t xml:space="preserve">A. </w:t>
-      </w:r>
-      <w:r>
-        <w:t>Simpanlah barang berharga di rumah agar tidak tercecer di jalanan</w:t>
-      </w:r>
-    </w:p>
-    <w:p>
-      <w:pPr>
-        <w:spacing w:before="0" w:after="20"/>
-        <w:ind w:left="432"/>
-      </w:pPr>
-      <w:r>
-        <w:rPr>
-          <w:b/>
-        </w:rPr>
-        <w:t xml:space="preserve">B. </w:t>
-      </w:r>
-      <w:r>
-        <w:t>Kejujuran dan integritas adalah harta paling berharga yang tidak boleh ditukar dengan kesenangan sesaat</w:t>
-      </w:r>
-    </w:p>
-    <w:p>
-      <w:pPr>
-        <w:spacing w:before="0" w:after="20"/>
-        <w:ind w:left="432"/>
-      </w:pPr>
-      <w:r>
-        <w:rPr>
-          <w:b/>
-        </w:rPr>
-        <w:t xml:space="preserve">C. </w:t>
-      </w:r>
-      <w:r>
-        <w:t>Bantulah orang tua berjualan sayur agar mendapatkan uang saku tambahan</w:t>
-      </w:r>
-    </w:p>
-    <w:p>
-      <w:pPr>
-        <w:spacing w:before="0" w:after="20"/>
-        <w:ind w:left="432"/>
-      </w:pPr>
-      <w:r>
-        <w:rPr>
-          <w:b/>
-        </w:rPr>
-        <w:t xml:space="preserve">D. </w:t>
-      </w:r>
-      <w:r>
-        <w:t>Belilah sepatu baru yang berkualitas agar tidak mudah robek di sekolah</w:t>
-      </w:r>
-    </w:p>
-    <w:p>
-      <w:pPr>
-        <w:spacing w:before="120" w:after="40"/>
-      </w:pPr>
-      <w:r>
-        <w:rPr>
-          <w:b/>
-        </w:rPr>
-        <w:t xml:space="preserve">10. </w:t>
-      </w:r>
-      <w:r>
-        <w:t>Perilaku terpuji tokoh Arga yang paling patut diteladani oleh siswa dalam kehidupan sehari-hari adalah....</w:t>
-      </w:r>
-    </w:p>
-    <w:p>
-      <w:pPr>
-        <w:spacing w:before="0" w:after="20"/>
-        <w:ind w:left="432"/>
-      </w:pPr>
-      <w:r>
-        <w:rPr>
-          <w:b/>
-        </w:rPr>
-        <w:t xml:space="preserve">A. </w:t>
-      </w:r>
-      <w:r>
-        <w:t>Menabung uang saku sekolah sebanyak-banyaknya di bank</w:t>
-      </w:r>
-    </w:p>
-    <w:p>
-      <w:pPr>
-        <w:spacing w:before="0" w:after="20"/>
-        <w:ind w:left="432"/>
-      </w:pPr>
-      <w:r>
-        <w:rPr>
-          <w:b/>
-        </w:rPr>
-        <w:t xml:space="preserve">B. </w:t>
-      </w:r>
-      <w:r>
-        <w:t>Mengembalikan barang temuan yang bukan haknya secara utuh kepada pemilik aslinya</w:t>
-      </w:r>
-    </w:p>
-    <w:p>
-      <w:pPr>
-        <w:spacing w:before="0" w:after="20"/>
-        <w:ind w:left="432"/>
-      </w:pPr>
-      <w:r>
-        <w:rPr>
-          <w:b/>
-        </w:rPr>
-        <w:t xml:space="preserve">C. </w:t>
-      </w:r>
-      <w:r>
-        <w:t>Memperbaiki sepeda ontel sendiri tanpa bantuan orang dewasa</w:t>
-      </w:r>
-    </w:p>
-    <w:p>
-      <w:pPr>
-        <w:spacing w:before="0" w:after="20"/>
-        <w:ind w:left="432"/>
-      </w:pPr>
-      <w:r>
-        <w:rPr>
-          <w:b/>
-        </w:rPr>
-        <w:t xml:space="preserve">D. </w:t>
-      </w:r>
-      <w:r>
-        <w:t>Berjalan kaki saat berangkat ke sekolah demi menghemat tenaga</w:t>
-      </w:r>
-    </w:p>
-    <w:p>
-      <w:pPr>
-        <w:spacing w:before="120" w:after="40"/>
-      </w:pPr>
-      <w:r>
-        <w:rPr>
-          <w:b/>
-        </w:rPr>
-        <w:t xml:space="preserve">11. </w:t>
-      </w:r>
-      <w:r>
-        <w:t>Bacalah kutipan dialog wawancara berikut untuk menjawab soal nomor 11 sampai 14!</w:t>
-        <w:br/>
-      </w:r>
-    </w:p>
-    <w:p>
-      <w:pPr>
-        <w:spacing w:before="0" w:after="40"/>
-      </w:pPr>
-      <w:r/>
-    </w:p>
-    <w:p>
-      <w:pPr>
-        <w:spacing w:before="0" w:after="40"/>
-      </w:pPr>
-      <w:r>
-        <w:rPr>
-          <w:b/>
-          <w:color w:val="1F2937"/>
-        </w:rPr>
-        <w:t>Wawancara Cilik: Menggugah Kepedulian Lewat Bank Sampah Sekolah</w:t>
-      </w:r>
-    </w:p>
-    <w:p>
-      <w:pPr>
-        <w:spacing w:before="0" w:after="40"/>
-      </w:pPr>
-      <w:r/>
-    </w:p>
-    <w:p>
-      <w:pPr>
-        <w:spacing w:before="0" w:after="40"/>
-      </w:pPr>
-      <w:r>
-        <w:t>Dika (Pewawancara) : "Selamat pagi, Ibu Ratna. Kami dari tim buletin sekolah ingin menggali informasi tentang keberhasilan program 'Bank Sampah Berseri' yang Ibu bimbing. Sebenarnya apa tujuan utama dibentuknya bank sampah ini di sekolah kita?"</w:t>
-      </w:r>
-    </w:p>
-    <w:p>
-      <w:pPr>
-        <w:spacing w:before="0" w:after="40"/>
-      </w:pPr>
-      <w:r>
-        <w:t>Ibu Ratna (Pembina) : "Selamat pagi, Dika. Tujuan utamanya bukan semata-mata mengumpulkan sampah, melainkan membangun kesadaran dan kebiasaan berwawasan lingkungan hidup sejak dini. Kami ingin para siswa memahami konsep pilah sampah: mana sampah organik yang bisa diolah jadi kompos, mana anorganik yang bisa didaur ulang bernilai ekonomis, dan mana residu."</w:t>
-      </w:r>
-    </w:p>
-    <w:p>
-      <w:pPr>
-        <w:spacing w:before="0" w:after="40"/>
-      </w:pPr>
-      <w:r>
-        <w:t>Dika : "Bagaimana cara kerja penyetoran sampah oleh siswa setiap pekannya, Bu?"</w:t>
-      </w:r>
-    </w:p>
-    <w:p>
-      <w:pPr>
-        <w:spacing w:before="0" w:after="40"/>
-      </w:pPr>
-      <w:r>
-        <w:t>Ibu Ratna : "Setiap hari Jumat pagi, siswa membawa sampah anorganik kering dari rumah maupun sekolah, seperti botol plastik, kardus bekas, atau kaleng minuman. Pengurus cilik bank sampah akan menimbang beratnya, mencatatnya, lalu mengonversikannya menjadi saldo tabungan di buku rekening siswa. Saldo tabungan ini pada akhir semester dapat ditukarkan dengan buku tulis, pensil warna, atau bibit tanaman hias."</w:t>
-      </w:r>
-    </w:p>
-    <w:p>
-      <w:pPr>
-        <w:spacing w:before="0" w:after="40"/>
-      </w:pPr>
-      <w:r>
-        <w:t>Dika : "Sungguh inovatif! Lalu apa dampak paling signifikan yang dirasakan sekolah setelah program ini berjalan satu semester, Bu?"</w:t>
-      </w:r>
-    </w:p>
-    <w:p>
-      <w:pPr>
-        <w:spacing w:before="0" w:after="40"/>
-      </w:pPr>
-      <w:r>
-        <w:t xml:space="preserve">Ibu Ratna : "Alhamdulillah, volume timbulan sampah sekolah yang dibuang ke TPA berkurang drastis hingga 60%. Selain itu, ruang kelas menjadi sangat bersih dan siswa terbiasa bertanggung jawab terhadap lingkungan sekitarnya." </w:t>
-      </w:r>
-    </w:p>
-    <w:p>
-      <w:pPr>
-        <w:spacing w:before="0" w:after="40"/>
-      </w:pPr>
-      <w:r/>
-    </w:p>
-    <w:p>
-      <w:pPr>
-        <w:spacing w:before="0" w:after="40"/>
-      </w:pPr>
-      <w:r>
-        <w:t>Topik pokok pembicaraan dalam wawancara antara Dika dan Ibu Ratna adalah....</w:t>
-      </w:r>
-    </w:p>
-    <w:p>
-      <w:pPr>
-        <w:spacing w:before="0" w:after="20"/>
-        <w:ind w:left="432"/>
-      </w:pPr>
-      <w:r>
-        <w:rPr>
-          <w:b/>
-        </w:rPr>
-        <w:t xml:space="preserve">A. </w:t>
-      </w:r>
-      <w:r>
-        <w:t>Proses pembuatan kompos dari sisa tanaman hias sekolah</w:t>
-      </w:r>
-    </w:p>
-    <w:p>
-      <w:pPr>
-        <w:spacing w:before="0" w:after="20"/>
-        <w:ind w:left="432"/>
-      </w:pPr>
-      <w:r>
-        <w:rPr>
-          <w:b/>
-        </w:rPr>
-        <w:t xml:space="preserve">B. </w:t>
-      </w:r>
-      <w:r>
-        <w:t>Sosialisasi dan manfaat pelaksanaan program Bank Sampah di lingkungan sekolah</w:t>
-      </w:r>
-    </w:p>
-    <w:p>
-      <w:pPr>
-        <w:spacing w:before="0" w:after="20"/>
-        <w:ind w:left="432"/>
-      </w:pPr>
-      <w:r>
-        <w:rPr>
-          <w:b/>
-        </w:rPr>
-        <w:t xml:space="preserve">C. </w:t>
-      </w:r>
-      <w:r>
-        <w:t>Pemilihan ketua pengurus dokter cilik Adiwiyata periode baru</w:t>
-      </w:r>
-    </w:p>
-    <w:p>
-      <w:pPr>
-        <w:spacing w:before="0" w:after="20"/>
-        <w:ind w:left="432"/>
-      </w:pPr>
-      <w:r>
-        <w:rPr>
-          <w:b/>
-        </w:rPr>
-        <w:t xml:space="preserve">D. </w:t>
-      </w:r>
-      <w:r>
-        <w:t>Teknik mendaur ulang botol plastik menjadi pot bunga hias</w:t>
-      </w:r>
-    </w:p>
-    <w:p>
-      <w:pPr>
-        <w:spacing w:before="120" w:after="40"/>
-      </w:pPr>
-      <w:r>
-        <w:rPr>
-          <w:b/>
-        </w:rPr>
-        <w:t xml:space="preserve">12. </w:t>
-      </w:r>
-      <w:r>
-        <w:t>Berdasarkan dialog di atas, keuntungan langsung yang diperoleh siswa ketika menyetorkan sampah anorganik bersih ke Bank Sampah adalah....</w:t>
-      </w:r>
-    </w:p>
-    <w:p>
-      <w:pPr>
-        <w:spacing w:before="0" w:after="20"/>
-        <w:ind w:left="432"/>
-      </w:pPr>
-      <w:r>
-        <w:rPr>
-          <w:b/>
-        </w:rPr>
-        <w:t xml:space="preserve">A. </w:t>
-      </w:r>
-      <w:r>
-        <w:t>Mendapatkan nilai rapor tertinggi pada mata pelajaran IPA</w:t>
-      </w:r>
-    </w:p>
-    <w:p>
-      <w:pPr>
-        <w:spacing w:before="0" w:after="20"/>
-        <w:ind w:left="432"/>
-      </w:pPr>
-      <w:r>
-        <w:rPr>
-          <w:b/>
-        </w:rPr>
-        <w:t xml:space="preserve">B. </w:t>
-      </w:r>
-      <w:r>
-        <w:t>Memperoleh saldo tabungan yang kelak dapat ditukar dengan alat tulis atau bibit tanaman</w:t>
-      </w:r>
-    </w:p>
-    <w:p>
-      <w:pPr>
-        <w:spacing w:before="0" w:after="20"/>
-        <w:ind w:left="432"/>
-      </w:pPr>
-      <w:r>
-        <w:rPr>
-          <w:b/>
-        </w:rPr>
-        <w:t xml:space="preserve">C. </w:t>
-      </w:r>
-      <w:r>
-        <w:t>Dibebaskan dari tugas piket membersihkan ruang kelas selama satu semester</w:t>
-      </w:r>
-    </w:p>
-    <w:p>
-      <w:pPr>
-        <w:spacing w:before="0" w:after="20"/>
-        <w:ind w:left="432"/>
-      </w:pPr>
-      <w:r>
-        <w:rPr>
-          <w:b/>
-        </w:rPr>
-        <w:t xml:space="preserve">D. </w:t>
-      </w:r>
-      <w:r>
-        <w:t>Diberikan hadiah uang tunai langsung oleh kepala sekolah</w:t>
-      </w:r>
-    </w:p>
-    <w:p>
-      <w:pPr>
-        <w:spacing w:before="120" w:after="40"/>
-      </w:pPr>
-      <w:r>
-        <w:rPr>
-          <w:b/>
-        </w:rPr>
-        <w:t xml:space="preserve">13. </w:t>
-      </w:r>
-      <w:r>
-        <w:t>Dampak lingkungan yang paling nyata dirasakan sekolah setelah program Bank Sampah berjalan adalah....</w:t>
-      </w:r>
-    </w:p>
-    <w:p>
-      <w:pPr>
-        <w:spacing w:before="0" w:after="20"/>
-        <w:ind w:left="432"/>
-      </w:pPr>
-      <w:r>
-        <w:rPr>
-          <w:b/>
-        </w:rPr>
-        <w:t xml:space="preserve">A. </w:t>
-      </w:r>
-      <w:r>
-        <w:t>Penjualan tanaman hias sekolah meningkat pesat ke luar kota</w:t>
-      </w:r>
-    </w:p>
-    <w:p>
-      <w:pPr>
-        <w:spacing w:before="0" w:after="20"/>
-        <w:ind w:left="432"/>
-      </w:pPr>
-      <w:r>
-        <w:rPr>
-          <w:b/>
-        </w:rPr>
-        <w:t xml:space="preserve">B. </w:t>
-      </w:r>
-      <w:r>
-        <w:t>Volume timbulan sampah sekolah yang dibuang ke TPA berkurang hingga 60%</w:t>
-      </w:r>
-    </w:p>
-    <w:p>
-      <w:pPr>
-        <w:spacing w:before="0" w:after="20"/>
-        <w:ind w:left="432"/>
-      </w:pPr>
-      <w:r>
-        <w:rPr>
-          <w:b/>
-        </w:rPr>
-        <w:t xml:space="preserve">C. </w:t>
-      </w:r>
-      <w:r>
-        <w:t>Biaya operasional kebersihan sekolah menjadi sepenuhnya gratis</w:t>
-      </w:r>
-    </w:p>
-    <w:p>
-      <w:pPr>
-        <w:spacing w:before="0" w:after="20"/>
-        <w:ind w:left="432"/>
-      </w:pPr>
-      <w:r>
-        <w:rPr>
-          <w:b/>
-        </w:rPr>
-        <w:t xml:space="preserve">D. </w:t>
-      </w:r>
-      <w:r>
-        <w:t>Semua kantin sekolah dilarang menjual makanan berkemasan</w:t>
-      </w:r>
-    </w:p>
-    <w:p>
-      <w:pPr>
-        <w:spacing w:before="120" w:after="40"/>
-      </w:pPr>
-      <w:r>
-        <w:rPr>
-          <w:b/>
-        </w:rPr>
-        <w:t xml:space="preserve">14. </w:t>
-      </w:r>
-      <w:r>
-        <w:t>Simpulan yang paling tepat dari kutipan wawancara di atas adalah....</w:t>
-      </w:r>
-    </w:p>
-    <w:p>
-      <w:pPr>
-        <w:spacing w:before="0" w:after="20"/>
-        <w:ind w:left="432"/>
-      </w:pPr>
-      <w:r>
-        <w:rPr>
-          <w:b/>
-        </w:rPr>
-        <w:t xml:space="preserve">A. </w:t>
-      </w:r>
-      <w:r>
-        <w:t>Pengelolaan bank sampah sekolah merupakan kegiatan wajib yang harus diawasi dinas kebersihan kota.</w:t>
-      </w:r>
-    </w:p>
-    <w:p>
-      <w:pPr>
-        <w:spacing w:before="0" w:after="20"/>
-        <w:ind w:left="432"/>
-      </w:pPr>
-      <w:r>
-        <w:rPr>
-          <w:b/>
-        </w:rPr>
-        <w:t xml:space="preserve">B. </w:t>
-      </w:r>
-      <w:r>
-        <w:t>Program Bank Sampah di sekolah sangat efektif mengedukasi siswa dalam memilah sampah dan menciptakan lingkungan bersih.</w:t>
-      </w:r>
-    </w:p>
-    <w:p>
-      <w:pPr>
-        <w:spacing w:before="0" w:after="20"/>
-        <w:ind w:left="432"/>
-      </w:pPr>
-      <w:r>
-        <w:rPr>
-          <w:b/>
-        </w:rPr>
-        <w:t xml:space="preserve">C. </w:t>
-      </w:r>
-      <w:r>
-        <w:t>Sampah anorganik bernilai ekonomis jauh lebih tinggi daripada pupuk kompos organik.</w:t>
-      </w:r>
-    </w:p>
-    <w:p>
-      <w:pPr>
-        <w:spacing w:before="0" w:after="20"/>
-        <w:ind w:left="432"/>
-      </w:pPr>
-      <w:r>
-        <w:rPr>
-          <w:b/>
-        </w:rPr>
-        <w:t xml:space="preserve">D. </w:t>
-      </w:r>
-      <w:r>
-        <w:t>Siswa kelas VI harus bertanggung jawab penuh menjadi pengurus inti bank sampah sekolah.</w:t>
-      </w:r>
-    </w:p>
-    <w:p>
-      <w:pPr>
-        <w:spacing w:before="120" w:after="40"/>
-      </w:pPr>
-      <w:r>
-        <w:rPr>
-          <w:b/>
-        </w:rPr>
-        <w:t xml:space="preserve">15. </w:t>
-      </w:r>
-      <w:r>
-        <w:t>Bacalah petunjuk prosedur berikut untuk menjawab soal nomor 15 dan 16!</w:t>
-        <w:br/>
-      </w:r>
-    </w:p>
-    <w:p>
-      <w:pPr>
-        <w:spacing w:before="0" w:after="40"/>
-      </w:pPr>
-      <w:r/>
-    </w:p>
-    <w:p>
-      <w:pPr>
-        <w:spacing w:before="0" w:after="40"/>
-      </w:pPr>
-      <w:r>
-        <w:t>Petunjuk Praktis Menanam Sayuran Hidroponik Sistem Sumbu (Wick System)</w:t>
-      </w:r>
-    </w:p>
-    <w:p>
-      <w:pPr>
-        <w:spacing w:before="0" w:after="40"/>
-      </w:pPr>
-      <w:r>
-        <w:t>(1) Siapkan botol plastik bekas air mineral ukuran 1,5 liter, lalu potong secara horizontal menjadi dua bagian menggunakan gunting atau *cutter*.</w:t>
-      </w:r>
-    </w:p>
-    <w:p>
-      <w:pPr>
-        <w:spacing w:before="0" w:after="40"/>
-      </w:pPr>
-      <w:r>
-        <w:t>(2) Buatlah lubang kecil pada tutup botol menggunakan solder atau paku panas, lalu selipkan sehelai kain flanel sepanjang 15 cm sebagai sumbu kapiler.</w:t>
-      </w:r>
-    </w:p>
-    <w:p>
-      <w:pPr>
-        <w:spacing w:before="0" w:after="40"/>
-      </w:pPr>
-      <w:r>
-        <w:t>(3) Pasang bagian atas botol yang sudah bersumbu ke dalam potongan bagian bawah botol secara terbalik (leher botol menghadap ke dasar).</w:t>
-      </w:r>
-    </w:p>
-    <w:p>
-      <w:pPr>
-        <w:spacing w:before="0" w:after="40"/>
-      </w:pPr>
-      <w:r>
-        <w:t>(4) [...]</w:t>
-      </w:r>
-    </w:p>
-    <w:p>
-      <w:pPr>
-        <w:spacing w:before="0" w:after="40"/>
-      </w:pPr>
-      <w:r>
-        <w:t>(5) Masukkan bibit tanaman sawi atau selada yang telah disemai (berdaun 3 sampai 4 helai) dengan hati-hati ke dalam media tanam tersebut.</w:t>
-      </w:r>
-    </w:p>
-    <w:p>
-      <w:pPr>
-        <w:spacing w:before="0" w:after="40"/>
-      </w:pPr>
-      <w:r>
-        <w:t>(6) Tuangkan larutan nutrisi hidroponik (larutan AB Mix) ke dalam wadah bagian bawah hingga menyentuh separuh sumbu flanel, lalu letakkan di area yang terkena sinar matahari cukup.</w:t>
-      </w:r>
-    </w:p>
-    <w:p>
-      <w:pPr>
-        <w:spacing w:before="0" w:after="40"/>
-      </w:pPr>
-      <w:r/>
-    </w:p>
-    <w:p>
-      <w:pPr>
-        <w:spacing w:before="0" w:after="40"/>
-      </w:pPr>
-      <w:r>
-        <w:t>Kalimat yang paling tepat dan runtut untuk melengkapi langkah nomor (4) pada petunjuk hidroponik tersebut adalah....</w:t>
-      </w:r>
-    </w:p>
-    <w:p>
-      <w:pPr>
-        <w:spacing w:before="0" w:after="20"/>
-        <w:ind w:left="432"/>
-      </w:pPr>
-      <w:r>
-        <w:rPr>
-          <w:b/>
-        </w:rPr>
-        <w:t xml:space="preserve">A. </w:t>
-      </w:r>
-      <w:r>
-        <w:t>Gunakan cat minyak untuk mewarnai bagian luar botol plastik agar kedap cahaya.</w:t>
-      </w:r>
-    </w:p>
-    <w:p>
-      <w:pPr>
-        <w:spacing w:before="0" w:after="20"/>
-        <w:ind w:left="432"/>
-      </w:pPr>
-      <w:r>
-        <w:rPr>
-          <w:b/>
-        </w:rPr>
-        <w:t xml:space="preserve">B. </w:t>
-      </w:r>
-      <w:r>
-        <w:t>Isilah bagian atas botol tersebut dengan media tanam berupa arang sekam atau rockwool secukupnya.</w:t>
-      </w:r>
-    </w:p>
-    <w:p>
-      <w:pPr>
-        <w:spacing w:before="0" w:after="20"/>
-        <w:ind w:left="432"/>
-      </w:pPr>
-      <w:r>
-        <w:rPr>
-          <w:b/>
-        </w:rPr>
-        <w:t xml:space="preserve">C. </w:t>
-      </w:r>
-      <w:r>
-        <w:t>Rendamlah biji benih sawi di dalam air hangat selama dua hari penuh.</w:t>
-      </w:r>
-    </w:p>
-    <w:p>
-      <w:pPr>
-        <w:spacing w:before="0" w:after="20"/>
-        <w:ind w:left="432"/>
-      </w:pPr>
-      <w:r>
-        <w:rPr>
-          <w:b/>
-        </w:rPr>
-        <w:t xml:space="preserve">D. </w:t>
-      </w:r>
-      <w:r>
-        <w:t>Buanglah sisa potongan botol bagian bawah ke tempat penampungan sampah.</w:t>
-      </w:r>
-    </w:p>
-    <w:p>
-      <w:pPr>
-        <w:spacing w:before="120" w:after="40"/>
-      </w:pPr>
-      <w:r>
-        <w:rPr>
-          <w:b/>
-        </w:rPr>
-        <w:t xml:space="preserve">16. </w:t>
-      </w:r>
-      <w:r>
-        <w:t>Fungsi utama kain flanel pada sistem hidroponik sumbu (wick system) berdasarkan teks prosedur di atas adalah....</w:t>
-      </w:r>
-    </w:p>
-    <w:p>
-      <w:pPr>
-        <w:spacing w:before="0" w:after="20"/>
-        <w:ind w:left="432"/>
-      </w:pPr>
-      <w:r>
-        <w:rPr>
-          <w:b/>
-        </w:rPr>
-        <w:t xml:space="preserve">A. </w:t>
-      </w:r>
-      <w:r>
-        <w:t>Sebagai penahan agar botol bagian atas tidak mudah goyang dan tumpah</w:t>
-      </w:r>
-    </w:p>
-    <w:p>
-      <w:pPr>
-        <w:spacing w:before="0" w:after="20"/>
-        <w:ind w:left="432"/>
-      </w:pPr>
-      <w:r>
-        <w:rPr>
-          <w:b/>
-        </w:rPr>
-        <w:t xml:space="preserve">B. </w:t>
-      </w:r>
-      <w:r>
-        <w:t>Sebagai sumbu kapiler yang menyerap larutan nutrisi dari bawah menuju akar tanaman</w:t>
-      </w:r>
-    </w:p>
-    <w:p>
-      <w:pPr>
-        <w:spacing w:before="0" w:after="20"/>
-        <w:ind w:left="432"/>
-      </w:pPr>
-      <w:r>
-        <w:rPr>
-          <w:b/>
-        </w:rPr>
-        <w:t xml:space="preserve">C. </w:t>
-      </w:r>
-      <w:r>
-        <w:t>Untuk menyaring kotoran dan lumut yang tumbuh di dalam air tandon</w:t>
-      </w:r>
-    </w:p>
-    <w:p>
-      <w:pPr>
-        <w:spacing w:before="0" w:after="20"/>
-        <w:ind w:left="432"/>
-      </w:pPr>
-      <w:r>
-        <w:rPr>
-          <w:b/>
-        </w:rPr>
-        <w:t xml:space="preserve">D. </w:t>
-      </w:r>
-      <w:r>
-        <w:t>Sebagai pengganti sinar matahari buatan bagi bibit tanaman</w:t>
-      </w:r>
-    </w:p>
-    <w:p>
-      <w:pPr>
-        <w:spacing w:before="120" w:after="40"/>
-      </w:pPr>
-      <w:r>
-        <w:rPr>
-          <w:b/>
-        </w:rPr>
-        <w:t xml:space="preserve">17. </w:t>
-      </w:r>
-      <w:r>
-        <w:t>Perhatikan bait puisi berikut!</w:t>
-        <w:br/>
-      </w:r>
-    </w:p>
-    <w:p>
-      <w:pPr>
-        <w:spacing w:before="0" w:after="40"/>
-      </w:pPr>
-      <w:r/>
-    </w:p>
-    <w:p>
-      <w:pPr>
-        <w:spacing w:before="0" w:after="40"/>
-      </w:pPr>
-      <w:r>
-        <w:t>Mentari pagi menyapa ramah</w:t>
-      </w:r>
-    </w:p>
-    <w:p>
-      <w:pPr>
-        <w:spacing w:before="0" w:after="40"/>
-      </w:pPr>
-      <w:r>
-        <w:t>Embun menari di ujung dedaunan</w:t>
-      </w:r>
-    </w:p>
-    <w:p>
-      <w:pPr>
-        <w:spacing w:before="0" w:after="40"/>
-      </w:pPr>
-      <w:r>
-        <w:t>Langkah kaki riang melangkah</w:t>
-      </w:r>
-    </w:p>
-    <w:p>
-      <w:pPr>
-        <w:spacing w:before="0" w:after="40"/>
-      </w:pPr>
-      <w:r>
-        <w:t>Menyambut masa depan penuh harapan</w:t>
-      </w:r>
-    </w:p>
-    <w:p>
-      <w:pPr>
-        <w:spacing w:before="0" w:after="40"/>
-      </w:pPr>
-      <w:r/>
-    </w:p>
-    <w:p>
-      <w:pPr>
-        <w:spacing w:before="0" w:after="40"/>
-      </w:pPr>
-      <w:r>
-        <w:t>Makna ungkapan 'Embun menari di ujung dedaunan' pada bait puisi di atas adalah....</w:t>
-      </w:r>
-    </w:p>
-    <w:p>
-      <w:pPr>
-        <w:spacing w:before="0" w:after="20"/>
-        <w:ind w:left="432"/>
-      </w:pPr>
-      <w:r>
-        <w:rPr>
-          <w:b/>
-        </w:rPr>
-        <w:t xml:space="preserve">A. </w:t>
-      </w:r>
-      <w:r>
-        <w:t>Tetesan air embun pagi yang tampak berkilau dan bergoyang terkena hembusan angin sejuk</w:t>
-      </w:r>
-    </w:p>
-    <w:p>
-      <w:pPr>
-        <w:spacing w:before="0" w:after="20"/>
-        <w:ind w:left="432"/>
-      </w:pPr>
-      <w:r>
-        <w:rPr>
-          <w:b/>
-        </w:rPr>
-        <w:t xml:space="preserve">B. </w:t>
-      </w:r>
-      <w:r>
-        <w:t>Daun-daun berguguran ke tanah karena terkena tetesan air hujan lebat</w:t>
-      </w:r>
-    </w:p>
-    <w:p>
-      <w:pPr>
-        <w:spacing w:before="0" w:after="20"/>
-        <w:ind w:left="432"/>
-      </w:pPr>
-      <w:r>
-        <w:rPr>
-          <w:b/>
-        </w:rPr>
-        <w:t xml:space="preserve">C. </w:t>
-      </w:r>
-      <w:r>
-        <w:t>Udara dingin yang menyebabkan tanaman layu di pagi hari</w:t>
-      </w:r>
-    </w:p>
-    <w:p>
-      <w:pPr>
-        <w:spacing w:before="0" w:after="20"/>
-        <w:ind w:left="432"/>
-      </w:pPr>
-      <w:r>
-        <w:rPr>
-          <w:b/>
-        </w:rPr>
-        <w:t xml:space="preserve">D. </w:t>
-      </w:r>
-      <w:r>
-        <w:t>Cahaya matahari yang terhalang oleh kabut tebal pegunungan</w:t>
-      </w:r>
-    </w:p>
-    <w:p>
-      <w:pPr>
-        <w:spacing w:before="120" w:after="40"/>
-      </w:pPr>
-      <w:r>
-        <w:rPr>
-          <w:b/>
-        </w:rPr>
-        <w:t xml:space="preserve">18. </w:t>
-      </w:r>
-      <w:r>
-        <w:t>Perhatikan kalimat-kalimat petunjuk pembuatan puding berikut!</w:t>
-        <w:br/>
-      </w:r>
-    </w:p>
-    <w:p>
-      <w:pPr>
-        <w:spacing w:before="0" w:after="40"/>
-      </w:pPr>
-      <w:r>
-        <w:t>(1) Setelah uap panasnya berkurang, masukkan puding ke dalam lemari es hingga mengeras.</w:t>
-      </w:r>
-    </w:p>
-    <w:p>
-      <w:pPr>
-        <w:spacing w:before="0" w:after="40"/>
-      </w:pPr>
-      <w:r>
-        <w:t>(2) Campurkan bubuk agar-agar, gula pasir, dan air kelapa muda ke dalam panci secara merata.</w:t>
-      </w:r>
-    </w:p>
-    <w:p>
-      <w:pPr>
-        <w:spacing w:before="0" w:after="40"/>
-      </w:pPr>
-      <w:r>
-        <w:t>(3) Rebus adonan di atas api sedang sambil terus diaduk perlahan hingga mendidih sempurna.</w:t>
-      </w:r>
-    </w:p>
-    <w:p>
-      <w:pPr>
-        <w:spacing w:before="0" w:after="40"/>
-      </w:pPr>
-      <w:r>
-        <w:t>(4) Tuangkan cairan puding yang telah mendidih ke dalam cetakan yang telah disiapkan.</w:t>
-      </w:r>
-    </w:p>
-    <w:p>
-      <w:pPr>
-        <w:spacing w:before="0" w:after="40"/>
-      </w:pPr>
-      <w:r/>
-    </w:p>
-    <w:p>
-      <w:pPr>
-        <w:spacing w:before="0" w:after="40"/>
-      </w:pPr>
-      <w:r>
-        <w:t>Urutan petunjuk yang tepat dan logis agar menjadi teks prosedur yang padu adalah....</w:t>
-      </w:r>
-    </w:p>
-    <w:p>
-      <w:pPr>
-        <w:spacing w:before="0" w:after="20"/>
-        <w:ind w:left="432"/>
-      </w:pPr>
-      <w:r>
-        <w:rPr>
-          <w:b/>
-        </w:rPr>
-        <w:t xml:space="preserve">A. </w:t>
-      </w:r>
-      <w:r>
-        <w:t>(2) - (3) - (4) - (1)</w:t>
-      </w:r>
-    </w:p>
-    <w:p>
-      <w:pPr>
-        <w:spacing w:before="0" w:after="20"/>
-        <w:ind w:left="432"/>
-      </w:pPr>
-      <w:r>
-        <w:rPr>
-          <w:b/>
-        </w:rPr>
-        <w:t xml:space="preserve">B. </w:t>
-      </w:r>
-      <w:r>
-        <w:t>(2) - (4) - (3) - (1)</w:t>
-      </w:r>
-    </w:p>
-    <w:p>
-      <w:pPr>
-        <w:spacing w:before="0" w:after="20"/>
-        <w:ind w:left="432"/>
-      </w:pPr>
-      <w:r>
-        <w:rPr>
-          <w:b/>
-        </w:rPr>
-        <w:t xml:space="preserve">C. </w:t>
-      </w:r>
-      <w:r>
-        <w:t>(3) - (2) - (4) - (1)</w:t>
-      </w:r>
-    </w:p>
-    <w:p>
-      <w:pPr>
-        <w:spacing w:before="0" w:after="20"/>
-        <w:ind w:left="432"/>
-      </w:pPr>
-      <w:r>
-        <w:rPr>
-          <w:b/>
-        </w:rPr>
-        <w:t xml:space="preserve">D. </w:t>
-      </w:r>
-      <w:r>
-        <w:t>(3) - (4) - (2) - (1)</w:t>
-      </w:r>
-    </w:p>
-    <w:p>
-      <w:pPr>
-        <w:spacing w:before="120" w:after="40"/>
-      </w:pPr>
-      <w:r>
-        <w:rPr>
-          <w:b/>
-        </w:rPr>
-        <w:t xml:space="preserve">19. </w:t>
-      </w:r>
-      <w:r>
-        <w:t>Kalimat berikut yang seluruhnya menggunakan kata baku secara tepat sesuai Pedoman Umum Ejaan Bahasa Indonesia (PUEBI/EYD) adalah....</w:t>
-      </w:r>
-    </w:p>
-    <w:p>
-      <w:pPr>
-        <w:spacing w:before="0" w:after="20"/>
-        <w:ind w:left="432"/>
-      </w:pPr>
-      <w:r>
-        <w:rPr>
-          <w:b/>
-        </w:rPr>
-        <w:t xml:space="preserve">A. </w:t>
-      </w:r>
-      <w:r>
-        <w:t>Para pasien sedang antri di apotik untuk mengambil obat resep dokter.</w:t>
-      </w:r>
-    </w:p>
-    <w:p>
-      <w:pPr>
-        <w:spacing w:before="0" w:after="20"/>
-        <w:ind w:left="432"/>
-      </w:pPr>
-      <w:r>
-        <w:rPr>
-          <w:b/>
-        </w:rPr>
-        <w:t xml:space="preserve">B. </w:t>
-      </w:r>
-      <w:r>
-        <w:t>Jadwal praktik dokter spesialis anak di klinik tersebut sudah aktif sejak pagi.</w:t>
-      </w:r>
-    </w:p>
-    <w:p>
-      <w:pPr>
-        <w:spacing w:before="0" w:after="20"/>
-        <w:ind w:left="432"/>
-      </w:pPr>
-      <w:r>
-        <w:rPr>
-          <w:b/>
-        </w:rPr>
-        <w:t xml:space="preserve">C. </w:t>
-      </w:r>
-      <w:r>
-        <w:t>Rian meminta ijin kepada gurunya karena badannya sedang tidak fit.</w:t>
-      </w:r>
-    </w:p>
-    <w:p>
-      <w:pPr>
-        <w:spacing w:before="0" w:after="20"/>
-        <w:ind w:left="432"/>
-      </w:pPr>
-      <w:r>
-        <w:rPr>
-          <w:b/>
-        </w:rPr>
-        <w:t xml:space="preserve">D. </w:t>
-      </w:r>
-      <w:r>
-        <w:t>Kwalitas produk kerajinan bambu itu sangat dikagumi para turis manca negara.</w:t>
-      </w:r>
-    </w:p>
-    <w:p>
-      <w:pPr>
-        <w:spacing w:before="120" w:after="40"/>
-      </w:pPr>
-      <w:r>
-        <w:rPr>
-          <w:b/>
-        </w:rPr>
-        <w:t xml:space="preserve">20. </w:t>
-      </w:r>
-      <w:r>
-        <w:t>Penulisan kalimat langsung berikut yang menggunakan tanda baca dan huruf kapital secara tepat adalah....</w:t>
-      </w:r>
-    </w:p>
-    <w:p>
-      <w:pPr>
-        <w:spacing w:before="0" w:after="20"/>
-        <w:ind w:left="432"/>
-      </w:pPr>
-      <w:r>
-        <w:rPr>
-          <w:b/>
-        </w:rPr>
-        <w:t xml:space="preserve">A. </w:t>
-      </w:r>
-      <w:r>
-        <w:t>Ibu berpesan, "Tolong rapikan buku pelajaran di mejamu, Farhan!"</w:t>
-      </w:r>
-    </w:p>
-    <w:p>
-      <w:pPr>
-        <w:spacing w:before="0" w:after="20"/>
-        <w:ind w:left="432"/>
-      </w:pPr>
-      <w:r>
-        <w:rPr>
-          <w:b/>
-        </w:rPr>
-        <w:t xml:space="preserve">B. </w:t>
-      </w:r>
-      <w:r>
-        <w:t>Ibu berpesan: "tolong rapikan buku pelajaran di mejamu, Farhan!"</w:t>
-      </w:r>
-    </w:p>
-    <w:p>
-      <w:pPr>
-        <w:spacing w:before="0" w:after="20"/>
-        <w:ind w:left="432"/>
-      </w:pPr>
-      <w:r>
-        <w:rPr>
-          <w:b/>
-        </w:rPr>
-        <w:t xml:space="preserve">C. </w:t>
-      </w:r>
-      <w:r>
-        <w:t>Ibu berpesan, "Tolong rapikan buku pelajaran di mejamu Farhan"!</w:t>
-      </w:r>
-    </w:p>
-    <w:p>
-      <w:pPr>
-        <w:spacing w:before="0" w:after="20"/>
-        <w:ind w:left="432"/>
-      </w:pPr>
-      <w:r>
-        <w:rPr>
-          <w:b/>
-        </w:rPr>
-        <w:t xml:space="preserve">D. </w:t>
-      </w:r>
-      <w:r>
-        <w:t>"Ibu berpesan, tolong rapikan buku pelajaran di mejamu, Farhan."</w:t>
-      </w:r>
-    </w:p>
-    <w:p>
-      <w:r>
-        <w:br w:type="page"/>
-      </w:r>
-    </w:p>
-    <w:p>
-      <w:pPr>
-        <w:pStyle w:val="Heading2"/>
-        <w:spacing w:before="160" w:after="160"/>
-      </w:pPr>
-      <w:r>
-        <w:rPr>
-          <w:b/>
-          <w:color w:val="15803D"/>
-          <w:sz w:val="26"/>
-        </w:rPr>
-        <w:t>BAGIAN B: KUNCI JAWABAN &amp; PEMBAHASAN LENGKAP</w:t>
-      </w:r>
-    </w:p>
-    <w:p>
-      <w:r>
-        <w:rPr>
-          <w:b/>
-        </w:rPr>
-        <w:t>TABEL KUNCI JAWABAN CEPAT:</w:t>
-        <w:br/>
-      </w:r>
-    </w:p>
     <w:tbl>
       <w:tblPr>
-        <w:tblStyle w:val="LightShading-Accent1"/>
+        <w:tblStyle w:val="TableGrid"/>
         <w:tblW w:type="auto" w:w="0"/>
         <w:jc w:val="center"/>
         <w:tblLook w:firstColumn="1" w:firstRow="1" w:lastColumn="0" w:lastRow="0" w:noHBand="0" w:noVBand="1" w:val="04A0"/>
       </w:tblPr>
       <w:tblGrid>
-        <w:gridCol w:w="1930"/>
-        <w:gridCol w:w="1930"/>
-        <w:gridCol w:w="1930"/>
-        <w:gridCol w:w="1930"/>
-        <w:gridCol w:w="1930"/>
+        <w:gridCol w:w="3216"/>
+        <w:gridCol w:w="3216"/>
+        <w:gridCol w:w="3216"/>
       </w:tblGrid>
       <w:tr>
         <w:tc>
           <w:tcPr>
-            <w:tcW w:type="dxa" w:w="1930"/>
+            <w:tcW w:type="dxa" w:w="3216"/>
           </w:tcPr>
           <w:p>
+            <w:pPr>
+              <w:jc w:val="center"/>
+            </w:pPr>
             <w:r>
-              <w:t>No 1-4</w:t>
+              <w:rPr>
+                <w:b/>
+              </w:rPr>
+              <w:t>Pernyataan</w:t>
             </w:r>
           </w:p>
         </w:tc>
         <w:tc>
           <w:tcPr>
-            <w:tcW w:type="dxa" w:w="1930"/>
+            <w:tcW w:type="dxa" w:w="3216"/>
           </w:tcPr>
           <w:p>
+            <w:pPr>
+              <w:jc w:val="center"/>
+            </w:pPr>
             <w:r>
-              <w:t>No 5-8</w:t>
+              <w:rPr>
+                <w:b/>
+              </w:rPr>
+              <w:t>Benar</w:t>
             </w:r>
           </w:p>
         </w:tc>
         <w:tc>
           <w:tcPr>
-            <w:tcW w:type="dxa" w:w="1930"/>
+            <w:tcW w:type="dxa" w:w="3216"/>
           </w:tcPr>
           <w:p>
+            <w:pPr>
+              <w:jc w:val="center"/>
+            </w:pPr>
             <w:r>
-              <w:t>No 9-12</w:t>
-            </w:r>
-          </w:p>
-        </w:tc>
-        <w:tc>
-          <w:tcPr>
-            <w:tcW w:type="dxa" w:w="1930"/>
-          </w:tcPr>
-          <w:p>
-            <w:r>
-              <w:t>No 13-16</w:t>
-            </w:r>
-          </w:p>
-        </w:tc>
-        <w:tc>
-          <w:tcPr>
-            <w:tcW w:type="dxa" w:w="1930"/>
-          </w:tcPr>
-          <w:p>
-            <w:r>
-              <w:t>No 17-20</w:t>
+              <w:rPr>
+                <w:b/>
+              </w:rPr>
+              <w:t>Salah</w:t>
             </w:r>
           </w:p>
         </w:tc>
@@ -2096,51 +654,37 @@
       <w:tr>
         <w:tc>
           <w:tcPr>
-            <w:tcW w:type="dxa" w:w="1930"/>
+            <w:tcW w:type="dxa" w:w="3216"/>
           </w:tcPr>
           <w:p>
             <w:r>
-              <w:t>No 1: B</w:t>
+              <w:t>A. Pernyataan pertama berkaitan dengan konsep dasar materi ini.</w:t>
             </w:r>
           </w:p>
         </w:tc>
         <w:tc>
           <w:tcPr>
-            <w:tcW w:type="dxa" w:w="1930"/>
+            <w:tcW w:type="dxa" w:w="3216"/>
           </w:tcPr>
           <w:p>
+            <w:pPr>
+              <w:jc w:val="center"/>
+            </w:pPr>
             <w:r>
-              <w:t>No 5: B</w:t>
+              <w:t>[   ]</w:t>
             </w:r>
           </w:p>
         </w:tc>
         <w:tc>
           <w:tcPr>
-            <w:tcW w:type="dxa" w:w="1930"/>
+            <w:tcW w:type="dxa" w:w="3216"/>
           </w:tcPr>
           <w:p>
+            <w:pPr>
+              <w:jc w:val="center"/>
+            </w:pPr>
             <w:r>
-              <w:t>No 9: B</w:t>
-            </w:r>
-          </w:p>
-        </w:tc>
-        <w:tc>
-          <w:tcPr>
-            <w:tcW w:type="dxa" w:w="1930"/>
-          </w:tcPr>
-          <w:p>
-            <w:r>
-              <w:t>No 13: B</w:t>
-            </w:r>
-          </w:p>
-        </w:tc>
-        <w:tc>
-          <w:tcPr>
-            <w:tcW w:type="dxa" w:w="1930"/>
-          </w:tcPr>
-          <w:p>
-            <w:r>
-              <w:t>No 17: A</w:t>
+              <w:t>[   ]</w:t>
             </w:r>
           </w:p>
         </w:tc>
@@ -2148,51 +692,37 @@
       <w:tr>
         <w:tc>
           <w:tcPr>
-            <w:tcW w:type="dxa" w:w="1930"/>
+            <w:tcW w:type="dxa" w:w="3216"/>
           </w:tcPr>
           <w:p>
             <w:r>
-              <w:t>No 2: C</w:t>
+              <w:t>B. Hasil perhitungan akhir bernilai lebih dari 50.</w:t>
             </w:r>
           </w:p>
         </w:tc>
         <w:tc>
           <w:tcPr>
-            <w:tcW w:type="dxa" w:w="1930"/>
+            <w:tcW w:type="dxa" w:w="3216"/>
           </w:tcPr>
           <w:p>
+            <w:pPr>
+              <w:jc w:val="center"/>
+            </w:pPr>
             <w:r>
-              <w:t>No 6: B</w:t>
+              <w:t>[   ]</w:t>
             </w:r>
           </w:p>
         </w:tc>
         <w:tc>
           <w:tcPr>
-            <w:tcW w:type="dxa" w:w="1930"/>
+            <w:tcW w:type="dxa" w:w="3216"/>
           </w:tcPr>
           <w:p>
+            <w:pPr>
+              <w:jc w:val="center"/>
+            </w:pPr>
             <w:r>
-              <w:t>No 10: B</w:t>
-            </w:r>
-          </w:p>
-        </w:tc>
-        <w:tc>
-          <w:tcPr>
-            <w:tcW w:type="dxa" w:w="1930"/>
-          </w:tcPr>
-          <w:p>
-            <w:r>
-              <w:t>No 14: B</w:t>
-            </w:r>
-          </w:p>
-        </w:tc>
-        <w:tc>
-          <w:tcPr>
-            <w:tcW w:type="dxa" w:w="1930"/>
-          </w:tcPr>
-          <w:p>
-            <w:r>
-              <w:t>No 18: A</w:t>
+              <w:t>[   ]</w:t>
             </w:r>
           </w:p>
         </w:tc>
@@ -2200,51 +730,688 @@
       <w:tr>
         <w:tc>
           <w:tcPr>
-            <w:tcW w:type="dxa" w:w="1930"/>
+            <w:tcW w:type="dxa" w:w="3216"/>
           </w:tcPr>
           <w:p>
             <w:r>
-              <w:t>No 3: B</w:t>
+              <w:t>C. Pernyataan ketiga bernilai salah berdasarkan analisis rumus.</w:t>
             </w:r>
           </w:p>
         </w:tc>
         <w:tc>
           <w:tcPr>
-            <w:tcW w:type="dxa" w:w="1930"/>
+            <w:tcW w:type="dxa" w:w="3216"/>
           </w:tcPr>
           <w:p>
+            <w:pPr>
+              <w:jc w:val="center"/>
+            </w:pPr>
             <w:r>
-              <w:t>No 7: B</w:t>
+              <w:t>[   ]</w:t>
             </w:r>
           </w:p>
         </w:tc>
         <w:tc>
           <w:tcPr>
-            <w:tcW w:type="dxa" w:w="1930"/>
+            <w:tcW w:type="dxa" w:w="3216"/>
           </w:tcPr>
           <w:p>
+            <w:pPr>
+              <w:jc w:val="center"/>
+            </w:pPr>
             <w:r>
-              <w:t>No 11: B</w:t>
+              <w:t>[   ]</w:t>
+            </w:r>
+          </w:p>
+        </w:tc>
+      </w:tr>
+    </w:tbl>
+    <w:p>
+      <w:r>
+        <w:rPr>
+          <w:i/>
+        </w:rPr>
+        <w:t>[Pilihan Ganda Kompleks: Kategori Benar / Salah]</w:t>
+      </w:r>
+    </w:p>
+    <w:p>
+      <w:pPr>
+        <w:spacing w:before="120" w:after="40"/>
+      </w:pPr>
+      <w:r>
+        <w:rPr>
+          <w:b/>
+        </w:rPr>
+        <w:t xml:space="preserve">8. </w:t>
+      </w:r>
+      <w:r>
+        <w:t>Konflik batin yang sempat dialami tokoh Arga ketika melihat isi kantong kain belacu tersebut adalah....</w:t>
+      </w:r>
+    </w:p>
+    <w:p>
+      <w:pPr>
+        <w:spacing w:before="0" w:after="20"/>
+        <w:ind w:left="432"/>
+      </w:pPr>
+      <w:r>
+        <w:rPr>
+          <w:b/>
+        </w:rPr>
+        <w:t xml:space="preserve">A. </w:t>
+      </w:r>
+      <w:r>
+        <w:t>Kebingungan memilih apakah harus menjual sayur ke pasar atau pulang ke rumah</w:t>
+      </w:r>
+    </w:p>
+    <w:p>
+      <w:pPr>
+        <w:spacing w:before="0" w:after="20"/>
+        <w:ind w:left="432"/>
+      </w:pPr>
+      <w:r>
+        <w:rPr>
+          <w:b/>
+        </w:rPr>
+        <w:t xml:space="preserve">B. </w:t>
+      </w:r>
+      <w:r>
+        <w:t>Keinginan menggunakan uang temuan untuk membeli sepatu baru versus ajaran moral kejujuran dari ibunya</w:t>
+      </w:r>
+    </w:p>
+    <w:p>
+      <w:pPr>
+        <w:spacing w:before="0" w:after="20"/>
+        <w:ind w:left="432"/>
+      </w:pPr>
+      <w:r>
+        <w:rPr>
+          <w:b/>
+        </w:rPr>
+        <w:t xml:space="preserve">C. </w:t>
+      </w:r>
+      <w:r>
+        <w:t>Rasa takut dituduh mencuri barang berharga milik warga dusun lain</w:t>
+      </w:r>
+    </w:p>
+    <w:p>
+      <w:pPr>
+        <w:spacing w:before="0" w:after="20"/>
+        <w:ind w:left="432"/>
+      </w:pPr>
+      <w:r>
+        <w:rPr>
+          <w:b/>
+        </w:rPr>
+        <w:t xml:space="preserve">D. </w:t>
+      </w:r>
+      <w:r>
+        <w:t>Kekhawatiran sepedanya akan rusak jika memutar arah jalan</w:t>
+      </w:r>
+    </w:p>
+    <w:p>
+      <w:pPr>
+        <w:spacing w:before="120" w:after="40"/>
+      </w:pPr>
+      <w:r>
+        <w:rPr>
+          <w:b/>
+        </w:rPr>
+        <w:t xml:space="preserve">9. </w:t>
+      </w:r>
+      <w:r>
+        <w:t>Amanat utama yang dapat dipetik dari kisah 'Kejujuran di Balik Kantong Belacu Kakek Suro' adalah....</w:t>
+      </w:r>
+    </w:p>
+    <w:p>
+      <w:pPr>
+        <w:spacing w:before="0" w:after="20"/>
+        <w:ind w:left="432"/>
+      </w:pPr>
+      <w:r>
+        <w:rPr>
+          <w:b/>
+        </w:rPr>
+        <w:t xml:space="preserve">A. </w:t>
+      </w:r>
+      <w:r>
+        <w:t>Simpanlah barang berharga di rumah agar tidak tercecer di jalanan</w:t>
+      </w:r>
+    </w:p>
+    <w:p>
+      <w:pPr>
+        <w:spacing w:before="0" w:after="20"/>
+        <w:ind w:left="432"/>
+      </w:pPr>
+      <w:r>
+        <w:rPr>
+          <w:b/>
+        </w:rPr>
+        <w:t xml:space="preserve">B. </w:t>
+      </w:r>
+      <w:r>
+        <w:t>Kejujuran dan integritas adalah harta paling berharga yang tidak boleh ditukar dengan kesenangan sesaat</w:t>
+      </w:r>
+    </w:p>
+    <w:p>
+      <w:pPr>
+        <w:spacing w:before="0" w:after="20"/>
+        <w:ind w:left="432"/>
+      </w:pPr>
+      <w:r>
+        <w:rPr>
+          <w:b/>
+        </w:rPr>
+        <w:t xml:space="preserve">C. </w:t>
+      </w:r>
+      <w:r>
+        <w:t>Bantulah orang tua berjualan sayur agar mendapatkan uang saku tambahan</w:t>
+      </w:r>
+    </w:p>
+    <w:p>
+      <w:pPr>
+        <w:spacing w:before="0" w:after="20"/>
+        <w:ind w:left="432"/>
+      </w:pPr>
+      <w:r>
+        <w:rPr>
+          <w:b/>
+        </w:rPr>
+        <w:t xml:space="preserve">D. </w:t>
+      </w:r>
+      <w:r>
+        <w:t>Belilah sepatu baru yang berkualitas agar tidak mudah robek di sekolah</w:t>
+      </w:r>
+    </w:p>
+    <w:p>
+      <w:pPr>
+        <w:spacing w:before="120" w:after="40"/>
+      </w:pPr>
+      <w:r>
+        <w:rPr>
+          <w:b/>
+        </w:rPr>
+        <w:t xml:space="preserve">10. </w:t>
+      </w:r>
+      <w:r>
+        <w:t>Perilaku terpuji tokoh Arga yang paling patut diteladani oleh siswa dalam kehidupan sehari-hari adalah....</w:t>
+      </w:r>
+    </w:p>
+    <w:p>
+      <w:pPr>
+        <w:spacing w:before="0" w:after="20"/>
+        <w:ind w:left="432"/>
+      </w:pPr>
+      <w:r>
+        <w:rPr>
+          <w:b/>
+        </w:rPr>
+        <w:t xml:space="preserve">A. </w:t>
+      </w:r>
+      <w:r>
+        <w:t>Menabung uang saku sekolah sebanyak-banyaknya di bank</w:t>
+      </w:r>
+    </w:p>
+    <w:p>
+      <w:pPr>
+        <w:spacing w:before="0" w:after="20"/>
+        <w:ind w:left="432"/>
+      </w:pPr>
+      <w:r>
+        <w:rPr>
+          <w:b/>
+        </w:rPr>
+        <w:t xml:space="preserve">B. </w:t>
+      </w:r>
+      <w:r>
+        <w:t>Mengembalikan barang temuan yang bukan haknya secara utuh kepada pemilik aslinya</w:t>
+      </w:r>
+    </w:p>
+    <w:p>
+      <w:pPr>
+        <w:spacing w:before="0" w:after="20"/>
+        <w:ind w:left="432"/>
+      </w:pPr>
+      <w:r>
+        <w:rPr>
+          <w:b/>
+        </w:rPr>
+        <w:t xml:space="preserve">C. </w:t>
+      </w:r>
+      <w:r>
+        <w:t>Memperbaiki sepeda ontel sendiri tanpa bantuan orang dewasa</w:t>
+      </w:r>
+    </w:p>
+    <w:p>
+      <w:pPr>
+        <w:spacing w:before="0" w:after="20"/>
+        <w:ind w:left="432"/>
+      </w:pPr>
+      <w:r>
+        <w:rPr>
+          <w:b/>
+        </w:rPr>
+        <w:t xml:space="preserve">D. </w:t>
+      </w:r>
+      <w:r>
+        <w:t>Berjalan kaki saat berangkat ke sekolah demi menghemat tenaga</w:t>
+      </w:r>
+    </w:p>
+    <w:p>
+      <w:pPr>
+        <w:spacing w:before="120" w:after="40"/>
+      </w:pPr>
+      <w:r>
+        <w:rPr>
+          <w:b/>
+        </w:rPr>
+        <w:t xml:space="preserve">11. </w:t>
+      </w:r>
+      <w:r>
+        <w:t>Bacalah kutipan dialog wawancara berikut untuk menjawab soal nomor 11 sampai 14!</w:t>
+        <w:br/>
+        <w:br/>
+        <w:t>Wawancara Cilik: Menggugah Kepedulian Lewat Bank Sampah Sekolah</w:t>
+        <w:br/>
+        <w:br/>
+        <w:t>Dika (Pewawancara) : "Selamat pagi, Ibu Ratna. Kami dari tim buletin sekolah ingin menggali informasi tentang keberhasilan program 'Bank Sampah Berseri' yang Ibu bimbing. Sebenarnya apa tujuan utama dibentuknya bank sampah ini di sekolah kita?"</w:t>
+        <w:br/>
+        <w:t>Ibu Ratna (Pembina) : "Selamat pagi, Dika. Tujuan utamanya bukan semata-mata mengumpulkan sampah, melainkan membangun kesadaran dan kebiasaan berwawasan lingkungan hidup sejak dini. Kami ingin para siswa memahami konsep pilah sampah: mana sampah organik yang bisa diolah jadi kompos, mana anorganik yang bisa didaur ulang bernilai ekonomis, dan mana residu."</w:t>
+        <w:br/>
+        <w:t>Dika : "Bagaimana cara kerja penyetoran sampah oleh siswa setiap pekannya, Bu?"</w:t>
+        <w:br/>
+        <w:t>Ibu Ratna : "Setiap hari Jumat pagi, siswa membawa sampah anorganik kering dari rumah maupun sekolah, seperti botol plastik, kardus bekas, atau kaleng minuman. Pengurus cilik bank sampah akan menimbang beratnya, mencatatnya, lalu mengonversikannya menjadi saldo tabungan di buku rekening siswa. Saldo tabungan ini pada akhir semester dapat ditukarkan dengan buku tulis, pensil warna, atau bibit tanaman hias."</w:t>
+        <w:br/>
+        <w:t>Dika : "Sungguh inovatif! Lalu apa dampak paling signifikan yang dirasakan sekolah setelah program ini berjalan satu semester, Bu?"</w:t>
+        <w:br/>
+        <w:t xml:space="preserve">Ibu Ratna : "Alhamdulillah, volume timbulan sampah sekolah yang dibuang ke TPA berkurang drastis hingga 60%. Selain itu, ruang kelas menjadi sangat bersih dan siswa terbiasa bertanggung jawab terhadap lingkungan sekitarnya." </w:t>
+        <w:br/>
+        <w:br/>
+        <w:t>Topik pokok pembicaraan dalam wawancara antara Dika dan Ibu Ratna adalah....</w:t>
+      </w:r>
+    </w:p>
+    <w:p>
+      <w:pPr>
+        <w:spacing w:before="0" w:after="20"/>
+        <w:ind w:left="432"/>
+      </w:pPr>
+      <w:r>
+        <w:rPr>
+          <w:b/>
+        </w:rPr>
+        <w:t xml:space="preserve">A. </w:t>
+      </w:r>
+      <w:r>
+        <w:t>Proses pembuatan kompos dari sisa tanaman hias sekolah</w:t>
+      </w:r>
+    </w:p>
+    <w:p>
+      <w:pPr>
+        <w:spacing w:before="0" w:after="20"/>
+        <w:ind w:left="432"/>
+      </w:pPr>
+      <w:r>
+        <w:rPr>
+          <w:b/>
+        </w:rPr>
+        <w:t xml:space="preserve">B. </w:t>
+      </w:r>
+      <w:r>
+        <w:t>Sosialisasi dan manfaat pelaksanaan program Bank Sampah di lingkungan sekolah</w:t>
+      </w:r>
+    </w:p>
+    <w:p>
+      <w:pPr>
+        <w:spacing w:before="0" w:after="20"/>
+        <w:ind w:left="432"/>
+      </w:pPr>
+      <w:r>
+        <w:rPr>
+          <w:b/>
+        </w:rPr>
+        <w:t xml:space="preserve">C. </w:t>
+      </w:r>
+      <w:r>
+        <w:t>Pemilihan ketua pengurus dokter cilik Adiwiyata periode baru</w:t>
+      </w:r>
+    </w:p>
+    <w:p>
+      <w:pPr>
+        <w:spacing w:before="0" w:after="20"/>
+        <w:ind w:left="432"/>
+      </w:pPr>
+      <w:r>
+        <w:rPr>
+          <w:b/>
+        </w:rPr>
+        <w:t xml:space="preserve">D. </w:t>
+      </w:r>
+      <w:r>
+        <w:t>Teknik mendaur ulang botol plastik menjadi pot bunga hias</w:t>
+      </w:r>
+    </w:p>
+    <w:p>
+      <w:pPr>
+        <w:spacing w:before="120" w:after="40"/>
+      </w:pPr>
+      <w:r>
+        <w:rPr>
+          <w:b/>
+        </w:rPr>
+        <w:t xml:space="preserve">12. </w:t>
+      </w:r>
+      <w:r>
+        <w:t>Berdasarkan dialog di atas, keuntungan langsung yang diperoleh siswa ketika menyetorkan sampah anorganik bersih ke Bank Sampah adalah....</w:t>
+      </w:r>
+    </w:p>
+    <w:p>
+      <w:pPr>
+        <w:spacing w:before="0" w:after="20"/>
+        <w:ind w:left="432"/>
+      </w:pPr>
+      <w:r>
+        <w:rPr>
+          <w:b/>
+        </w:rPr>
+        <w:t xml:space="preserve">□ A. </w:t>
+      </w:r>
+      <w:r>
+        <w:t>Mendapatkan nilai rapor tertinggi pada mata pelajaran IPA</w:t>
+      </w:r>
+    </w:p>
+    <w:p>
+      <w:pPr>
+        <w:spacing w:before="0" w:after="20"/>
+        <w:ind w:left="432"/>
+      </w:pPr>
+      <w:r>
+        <w:rPr>
+          <w:b/>
+        </w:rPr>
+        <w:t xml:space="preserve">□ B. </w:t>
+      </w:r>
+      <w:r>
+        <w:t>Memperoleh saldo tabungan yang kelak dapat ditukar dengan alat tulis atau bibit tanaman</w:t>
+      </w:r>
+    </w:p>
+    <w:p>
+      <w:pPr>
+        <w:spacing w:before="0" w:after="20"/>
+        <w:ind w:left="432"/>
+      </w:pPr>
+      <w:r>
+        <w:rPr>
+          <w:b/>
+        </w:rPr>
+        <w:t xml:space="preserve">□ C. </w:t>
+      </w:r>
+      <w:r>
+        <w:t>Dibebaskan dari tugas piket membersihkan ruang kelas selama satu semester</w:t>
+      </w:r>
+    </w:p>
+    <w:p>
+      <w:pPr>
+        <w:spacing w:before="0" w:after="20"/>
+        <w:ind w:left="432"/>
+      </w:pPr>
+      <w:r>
+        <w:rPr>
+          <w:b/>
+        </w:rPr>
+        <w:t xml:space="preserve">□ D. </w:t>
+      </w:r>
+      <w:r>
+        <w:t>Diberikan hadiah uang tunai langsung oleh kepala sekolah</w:t>
+      </w:r>
+    </w:p>
+    <w:p>
+      <w:pPr>
+        <w:ind w:left="432"/>
+      </w:pPr>
+      <w:r>
+        <w:rPr>
+          <w:i/>
+        </w:rPr>
+        <w:t>[Pilihan Ganda Kompleks: Jawaban benar lebih dari satu]</w:t>
+      </w:r>
+    </w:p>
+    <w:p>
+      <w:pPr>
+        <w:spacing w:before="120" w:after="40"/>
+      </w:pPr>
+      <w:r>
+        <w:rPr>
+          <w:b/>
+        </w:rPr>
+        <w:t xml:space="preserve">13. </w:t>
+      </w:r>
+      <w:r>
+        <w:t>Dampak lingkungan yang paling nyata dirasakan sekolah setelah program Bank Sampah berjalan adalah....</w:t>
+      </w:r>
+    </w:p>
+    <w:p>
+      <w:pPr>
+        <w:spacing w:before="0" w:after="20"/>
+        <w:ind w:left="432"/>
+      </w:pPr>
+      <w:r>
+        <w:rPr>
+          <w:b/>
+        </w:rPr>
+        <w:t xml:space="preserve">A. </w:t>
+      </w:r>
+      <w:r>
+        <w:t>Penjualan tanaman hias sekolah meningkat pesat ke luar kota</w:t>
+      </w:r>
+    </w:p>
+    <w:p>
+      <w:pPr>
+        <w:spacing w:before="0" w:after="20"/>
+        <w:ind w:left="432"/>
+      </w:pPr>
+      <w:r>
+        <w:rPr>
+          <w:b/>
+        </w:rPr>
+        <w:t xml:space="preserve">B. </w:t>
+      </w:r>
+      <w:r>
+        <w:t>Volume timbulan sampah sekolah yang dibuang ke TPA berkurang hingga 60%</w:t>
+      </w:r>
+    </w:p>
+    <w:p>
+      <w:pPr>
+        <w:spacing w:before="0" w:after="20"/>
+        <w:ind w:left="432"/>
+      </w:pPr>
+      <w:r>
+        <w:rPr>
+          <w:b/>
+        </w:rPr>
+        <w:t xml:space="preserve">C. </w:t>
+      </w:r>
+      <w:r>
+        <w:t>Biaya operasional kebersihan sekolah menjadi sepenuhnya gratis</w:t>
+      </w:r>
+    </w:p>
+    <w:p>
+      <w:pPr>
+        <w:spacing w:before="0" w:after="20"/>
+        <w:ind w:left="432"/>
+      </w:pPr>
+      <w:r>
+        <w:rPr>
+          <w:b/>
+        </w:rPr>
+        <w:t xml:space="preserve">D. </w:t>
+      </w:r>
+      <w:r>
+        <w:t>Semua kantin sekolah dilarang menjual makanan berkemasan</w:t>
+      </w:r>
+    </w:p>
+    <w:p>
+      <w:pPr>
+        <w:spacing w:before="120" w:after="40"/>
+      </w:pPr>
+      <w:r>
+        <w:rPr>
+          <w:b/>
+        </w:rPr>
+        <w:t xml:space="preserve">14. </w:t>
+      </w:r>
+      <w:r>
+        <w:t>Simpulan yang paling tepat dari kutipan wawancara di atas adalah....</w:t>
+      </w:r>
+    </w:p>
+    <w:p>
+      <w:pPr>
+        <w:spacing w:before="0" w:after="20"/>
+        <w:ind w:left="432"/>
+      </w:pPr>
+      <w:r>
+        <w:rPr>
+          <w:b/>
+        </w:rPr>
+        <w:t xml:space="preserve">A. </w:t>
+      </w:r>
+      <w:r>
+        <w:t>Pengelolaan bank sampah sekolah merupakan kegiatan wajib yang harus diawasi dinas kebersihan kota.</w:t>
+      </w:r>
+    </w:p>
+    <w:p>
+      <w:pPr>
+        <w:spacing w:before="0" w:after="20"/>
+        <w:ind w:left="432"/>
+      </w:pPr>
+      <w:r>
+        <w:rPr>
+          <w:b/>
+        </w:rPr>
+        <w:t xml:space="preserve">B. </w:t>
+      </w:r>
+      <w:r>
+        <w:t>Program Bank Sampah di sekolah sangat efektif mengedukasi siswa dalam memilah sampah dan menciptakan lingkungan bersih.</w:t>
+      </w:r>
+    </w:p>
+    <w:p>
+      <w:pPr>
+        <w:spacing w:before="0" w:after="20"/>
+        <w:ind w:left="432"/>
+      </w:pPr>
+      <w:r>
+        <w:rPr>
+          <w:b/>
+        </w:rPr>
+        <w:t xml:space="preserve">C. </w:t>
+      </w:r>
+      <w:r>
+        <w:t>Sampah anorganik bernilai ekonomis jauh lebih tinggi daripada pupuk kompos organik.</w:t>
+      </w:r>
+    </w:p>
+    <w:p>
+      <w:pPr>
+        <w:spacing w:before="0" w:after="20"/>
+        <w:ind w:left="432"/>
+      </w:pPr>
+      <w:r>
+        <w:rPr>
+          <w:b/>
+        </w:rPr>
+        <w:t xml:space="preserve">D. </w:t>
+      </w:r>
+      <w:r>
+        <w:t>Siswa kelas VI harus bertanggung jawab penuh menjadi pengurus inti bank sampah sekolah.</w:t>
+      </w:r>
+    </w:p>
+    <w:p>
+      <w:pPr>
+        <w:spacing w:before="120" w:after="40"/>
+      </w:pPr>
+      <w:r>
+        <w:rPr>
+          <w:b/>
+        </w:rPr>
+        <w:t xml:space="preserve">15. </w:t>
+      </w:r>
+      <w:r>
+        <w:t>Bacalah petunjuk prosedur berikut untuk menjawab soal nomor 15 dan 16!</w:t>
+        <w:br/>
+        <w:br/>
+        <w:t>Petunjuk Praktis Menanam Sayuran Hidroponik Sistem Sumbu (Wick System)</w:t>
+        <w:br/>
+        <w:t>(1) Siapkan botol plastik bekas air mineral ukuran 1,5 liter, lalu potong secara horizontal menjadi dua bagian menggunakan gunting atau *cutter*.</w:t>
+        <w:br/>
+        <w:t>(2) Buatlah lubang kecil pada tutup botol menggunakan solder atau paku panas, lalu selipkan sehelai kain flanel sepanjang 15 cm sebagai sumbu kapiler.</w:t>
+        <w:br/>
+        <w:t>(3) Pasang bagian atas botol yang sudah bersumbu ke dalam potongan bagian bawah botol secara terbalik (leher botol menghadap ke dasar).</w:t>
+        <w:br/>
+        <w:t>(4) [...]</w:t>
+        <w:br/>
+        <w:t>(5) Masukkan bibit tanaman sawi atau selada yang telah disemai (berdaun 3 sampai 4 helai) dengan hati-hati ke dalam media tanam tersebut.</w:t>
+        <w:br/>
+        <w:t>(6) Tuangkan larutan nutrisi hidroponik (larutan AB Mix) ke dalam wadah bagian bawah hingga menyentuh separuh sumbu flanel, lalu letakkan di area yang terkena sinar matahari cukup.</w:t>
+        <w:br/>
+        <w:br/>
+        <w:t>Kalimat yang paling tepat dan runtut untuk melengkapi langkah nomor (4) pada petunjuk hidroponik tersebut adalah....</w:t>
+      </w:r>
+    </w:p>
+    <w:tbl>
+      <w:tblPr>
+        <w:tblStyle w:val="TableGrid"/>
+        <w:tblW w:type="auto" w:w="0"/>
+        <w:jc w:val="center"/>
+        <w:tblLook w:firstColumn="1" w:firstRow="1" w:lastColumn="0" w:lastRow="0" w:noHBand="0" w:noVBand="1" w:val="04A0"/>
+      </w:tblPr>
+      <w:tblGrid>
+        <w:gridCol w:w="3216"/>
+        <w:gridCol w:w="3216"/>
+        <w:gridCol w:w="3216"/>
+      </w:tblGrid>
+      <w:tr>
+        <w:tc>
+          <w:tcPr>
+            <w:tcW w:type="dxa" w:w="3216"/>
+          </w:tcPr>
+          <w:p>
+            <w:pPr>
+              <w:jc w:val="center"/>
+            </w:pPr>
+            <w:r>
+              <w:rPr>
+                <w:b/>
+              </w:rPr>
+              <w:t>Pernyataan</w:t>
             </w:r>
           </w:p>
         </w:tc>
         <w:tc>
           <w:tcPr>
-            <w:tcW w:type="dxa" w:w="1930"/>
+            <w:tcW w:type="dxa" w:w="3216"/>
           </w:tcPr>
           <w:p>
+            <w:pPr>
+              <w:jc w:val="center"/>
+            </w:pPr>
             <w:r>
-              <w:t>No 15: B</w:t>
+              <w:rPr>
+                <w:b/>
+              </w:rPr>
+              <w:t>Benar</w:t>
             </w:r>
           </w:p>
         </w:tc>
         <w:tc>
           <w:tcPr>
-            <w:tcW w:type="dxa" w:w="1930"/>
+            <w:tcW w:type="dxa" w:w="3216"/>
           </w:tcPr>
           <w:p>
+            <w:pPr>
+              <w:jc w:val="center"/>
+            </w:pPr>
             <w:r>
-              <w:t>No 19: B</w:t>
+              <w:rPr>
+                <w:b/>
+              </w:rPr>
+              <w:t>Salah</w:t>
             </w:r>
           </w:p>
         </w:tc>
@@ -2252,60 +1419,673 @@
       <w:tr>
         <w:tc>
           <w:tcPr>
-            <w:tcW w:type="dxa" w:w="1930"/>
+            <w:tcW w:type="dxa" w:w="3216"/>
           </w:tcPr>
           <w:p>
             <w:r>
-              <w:t>No 4: B</w:t>
+              <w:t>A. Pernyataan pertama berkaitan dengan konsep dasar materi ini.</w:t>
             </w:r>
           </w:p>
         </w:tc>
         <w:tc>
           <w:tcPr>
-            <w:tcW w:type="dxa" w:w="1930"/>
+            <w:tcW w:type="dxa" w:w="3216"/>
           </w:tcPr>
           <w:p>
+            <w:pPr>
+              <w:jc w:val="center"/>
+            </w:pPr>
             <w:r>
-              <w:t>No 8: B</w:t>
+              <w:t>[   ]</w:t>
             </w:r>
           </w:p>
         </w:tc>
         <w:tc>
           <w:tcPr>
-            <w:tcW w:type="dxa" w:w="1930"/>
+            <w:tcW w:type="dxa" w:w="3216"/>
+          </w:tcPr>
+          <w:p>
+            <w:pPr>
+              <w:jc w:val="center"/>
+            </w:pPr>
+            <w:r>
+              <w:t>[   ]</w:t>
+            </w:r>
+          </w:p>
+        </w:tc>
+      </w:tr>
+      <w:tr>
+        <w:tc>
+          <w:tcPr>
+            <w:tcW w:type="dxa" w:w="3216"/>
           </w:tcPr>
           <w:p>
             <w:r>
-              <w:t>No 12: B</w:t>
+              <w:t>B. Hasil perhitungan akhir bernilai lebih dari 50.</w:t>
             </w:r>
           </w:p>
         </w:tc>
         <w:tc>
           <w:tcPr>
-            <w:tcW w:type="dxa" w:w="1930"/>
+            <w:tcW w:type="dxa" w:w="3216"/>
           </w:tcPr>
           <w:p>
+            <w:pPr>
+              <w:jc w:val="center"/>
+            </w:pPr>
             <w:r>
-              <w:t>No 16: B</w:t>
+              <w:t>[   ]</w:t>
             </w:r>
           </w:p>
         </w:tc>
         <w:tc>
           <w:tcPr>
-            <w:tcW w:type="dxa" w:w="1930"/>
+            <w:tcW w:type="dxa" w:w="3216"/>
+          </w:tcPr>
+          <w:p>
+            <w:pPr>
+              <w:jc w:val="center"/>
+            </w:pPr>
+            <w:r>
+              <w:t>[   ]</w:t>
+            </w:r>
+          </w:p>
+        </w:tc>
+      </w:tr>
+      <w:tr>
+        <w:tc>
+          <w:tcPr>
+            <w:tcW w:type="dxa" w:w="3216"/>
           </w:tcPr>
           <w:p>
             <w:r>
-              <w:t>No 20: A</w:t>
+              <w:t>C. Pernyataan ketiga bernilai salah berdasarkan analisis rumus.</w:t>
+            </w:r>
+          </w:p>
+        </w:tc>
+        <w:tc>
+          <w:tcPr>
+            <w:tcW w:type="dxa" w:w="3216"/>
+          </w:tcPr>
+          <w:p>
+            <w:pPr>
+              <w:jc w:val="center"/>
+            </w:pPr>
+            <w:r>
+              <w:t>[   ]</w:t>
+            </w:r>
+          </w:p>
+        </w:tc>
+        <w:tc>
+          <w:tcPr>
+            <w:tcW w:type="dxa" w:w="3216"/>
+          </w:tcPr>
+          <w:p>
+            <w:pPr>
+              <w:jc w:val="center"/>
+            </w:pPr>
+            <w:r>
+              <w:t>[   ]</w:t>
             </w:r>
           </w:p>
         </w:tc>
       </w:tr>
     </w:tbl>
     <w:p>
+      <w:r>
+        <w:rPr>
+          <w:i/>
+        </w:rPr>
+        <w:t>[Pilihan Ganda Kompleks: Kategori Benar / Salah]</w:t>
+      </w:r>
+    </w:p>
+    <w:p>
       <w:pPr>
-        <w:spacing w:after="160"/>
+        <w:spacing w:before="120" w:after="40"/>
       </w:pPr>
+      <w:r>
+        <w:rPr>
+          <w:b/>
+        </w:rPr>
+        <w:t xml:space="preserve">16. </w:t>
+      </w:r>
+      <w:r>
+        <w:t>Fungsi utama kain flanel pada sistem hidroponik sumbu (wick system) berdasarkan teks prosedur di atas adalah....</w:t>
+      </w:r>
+    </w:p>
+    <w:p>
+      <w:pPr>
+        <w:spacing w:before="0" w:after="20"/>
+        <w:ind w:left="432"/>
+      </w:pPr>
+      <w:r>
+        <w:rPr>
+          <w:b/>
+        </w:rPr>
+        <w:t xml:space="preserve">A. </w:t>
+      </w:r>
+      <w:r>
+        <w:t>Sebagai penahan agar botol bagian atas tidak mudah goyang dan tumpah</w:t>
+      </w:r>
+    </w:p>
+    <w:p>
+      <w:pPr>
+        <w:spacing w:before="0" w:after="20"/>
+        <w:ind w:left="432"/>
+      </w:pPr>
+      <w:r>
+        <w:rPr>
+          <w:b/>
+        </w:rPr>
+        <w:t xml:space="preserve">B. </w:t>
+      </w:r>
+      <w:r>
+        <w:t>Sebagai sumbu kapiler yang menyerap larutan nutrisi dari bawah menuju akar tanaman</w:t>
+      </w:r>
+    </w:p>
+    <w:p>
+      <w:pPr>
+        <w:spacing w:before="0" w:after="20"/>
+        <w:ind w:left="432"/>
+      </w:pPr>
+      <w:r>
+        <w:rPr>
+          <w:b/>
+        </w:rPr>
+        <w:t xml:space="preserve">C. </w:t>
+      </w:r>
+      <w:r>
+        <w:t>Untuk menyaring kotoran dan lumut yang tumbuh di dalam air tandon</w:t>
+      </w:r>
+    </w:p>
+    <w:p>
+      <w:pPr>
+        <w:spacing w:before="0" w:after="20"/>
+        <w:ind w:left="432"/>
+      </w:pPr>
+      <w:r>
+        <w:rPr>
+          <w:b/>
+        </w:rPr>
+        <w:t xml:space="preserve">D. </w:t>
+      </w:r>
+      <w:r>
+        <w:t>Sebagai pengganti sinar matahari buatan bagi bibit tanaman</w:t>
+      </w:r>
+    </w:p>
+    <w:p>
+      <w:pPr>
+        <w:spacing w:before="120" w:after="40"/>
+      </w:pPr>
+      <w:r>
+        <w:rPr>
+          <w:b/>
+        </w:rPr>
+        <w:t xml:space="preserve">17. </w:t>
+      </w:r>
+      <w:r>
+        <w:t>Perhatikan bait puisi berikut!</w:t>
+        <w:br/>
+        <w:br/>
+        <w:t>Mentari pagi menyapa ramah</w:t>
+        <w:br/>
+        <w:t>Embun menari di ujung dedaunan</w:t>
+        <w:br/>
+        <w:t>Langkah kaki riang melangkah</w:t>
+        <w:br/>
+        <w:t>Menyambut masa depan penuh harapan</w:t>
+        <w:br/>
+        <w:br/>
+        <w:t>Makna ungkapan 'Embun menari di ujung dedaunan' pada bait puisi di atas adalah....</w:t>
+      </w:r>
+    </w:p>
+    <w:p>
+      <w:pPr>
+        <w:spacing w:before="0" w:after="20"/>
+        <w:ind w:left="432"/>
+      </w:pPr>
+      <w:r>
+        <w:rPr>
+          <w:b/>
+        </w:rPr>
+        <w:t xml:space="preserve">A. </w:t>
+      </w:r>
+      <w:r>
+        <w:t>Tetesan air embun pagi yang tampak berkilau dan bergoyang terkena hembusan angin sejuk</w:t>
+      </w:r>
+    </w:p>
+    <w:p>
+      <w:pPr>
+        <w:spacing w:before="0" w:after="20"/>
+        <w:ind w:left="432"/>
+      </w:pPr>
+      <w:r>
+        <w:rPr>
+          <w:b/>
+        </w:rPr>
+        <w:t xml:space="preserve">B. </w:t>
+      </w:r>
+      <w:r>
+        <w:t>Daun-daun berguguran ke tanah karena terkena tetesan air hujan lebat</w:t>
+      </w:r>
+    </w:p>
+    <w:p>
+      <w:pPr>
+        <w:spacing w:before="0" w:after="20"/>
+        <w:ind w:left="432"/>
+      </w:pPr>
+      <w:r>
+        <w:rPr>
+          <w:b/>
+        </w:rPr>
+        <w:t xml:space="preserve">C. </w:t>
+      </w:r>
+      <w:r>
+        <w:t>Udara dingin yang menyebabkan tanaman layu di pagi hari</w:t>
+      </w:r>
+    </w:p>
+    <w:p>
+      <w:pPr>
+        <w:spacing w:before="0" w:after="20"/>
+        <w:ind w:left="432"/>
+      </w:pPr>
+      <w:r>
+        <w:rPr>
+          <w:b/>
+        </w:rPr>
+        <w:t xml:space="preserve">D. </w:t>
+      </w:r>
+      <w:r>
+        <w:t>Cahaya matahari yang terhalang oleh kabut tebal pegunungan</w:t>
+      </w:r>
+    </w:p>
+    <w:p>
+      <w:pPr>
+        <w:spacing w:before="120" w:after="40"/>
+      </w:pPr>
+      <w:r>
+        <w:rPr>
+          <w:b/>
+        </w:rPr>
+        <w:t xml:space="preserve">18. </w:t>
+      </w:r>
+      <w:r>
+        <w:t>Perhatikan kalimat-kalimat petunjuk pembuatan puding berikut!</w:t>
+        <w:br/>
+        <w:t>(1) Setelah uap panasnya berkurang, masukkan puding ke dalam lemari es hingga mengeras.</w:t>
+        <w:br/>
+        <w:t>(2) Campurkan bubuk agar-agar, gula pasir, dan air kelapa muda ke dalam panci secara merata.</w:t>
+        <w:br/>
+        <w:t>(3) Rebus adonan di atas api sedang sambil terus diaduk perlahan hingga mendidih sempurna.</w:t>
+        <w:br/>
+        <w:t>(4) Tuangkan cairan puding yang telah mendidih ke dalam cetakan yang telah disiapkan.</w:t>
+        <w:br/>
+        <w:br/>
+        <w:t>Urutan petunjuk yang tepat dan logis agar menjadi teks prosedur yang padu adalah....</w:t>
+      </w:r>
+    </w:p>
+    <w:p>
+      <w:pPr>
+        <w:spacing w:before="0" w:after="20"/>
+        <w:ind w:left="432"/>
+      </w:pPr>
+      <w:r>
+        <w:rPr>
+          <w:b/>
+        </w:rPr>
+        <w:t xml:space="preserve">□ A. </w:t>
+      </w:r>
+      <w:r>
+        <w:t>(2) - (3) - (4) - (1)</w:t>
+      </w:r>
+    </w:p>
+    <w:p>
+      <w:pPr>
+        <w:spacing w:before="0" w:after="20"/>
+        <w:ind w:left="432"/>
+      </w:pPr>
+      <w:r>
+        <w:rPr>
+          <w:b/>
+        </w:rPr>
+        <w:t xml:space="preserve">□ B. </w:t>
+      </w:r>
+      <w:r>
+        <w:t>(2) - (4) - (3) - (1)</w:t>
+      </w:r>
+    </w:p>
+    <w:p>
+      <w:pPr>
+        <w:spacing w:before="0" w:after="20"/>
+        <w:ind w:left="432"/>
+      </w:pPr>
+      <w:r>
+        <w:rPr>
+          <w:b/>
+        </w:rPr>
+        <w:t xml:space="preserve">□ C. </w:t>
+      </w:r>
+      <w:r>
+        <w:t>(3) - (2) - (4) - (1)</w:t>
+      </w:r>
+    </w:p>
+    <w:p>
+      <w:pPr>
+        <w:spacing w:before="0" w:after="20"/>
+        <w:ind w:left="432"/>
+      </w:pPr>
+      <w:r>
+        <w:rPr>
+          <w:b/>
+        </w:rPr>
+        <w:t xml:space="preserve">□ D. </w:t>
+      </w:r>
+      <w:r>
+        <w:t>(3) - (4) - (2) - (1)</w:t>
+      </w:r>
+    </w:p>
+    <w:p>
+      <w:pPr>
+        <w:ind w:left="432"/>
+      </w:pPr>
+      <w:r>
+        <w:rPr>
+          <w:i/>
+        </w:rPr>
+        <w:t>[Pilihan Ganda Kompleks: Jawaban benar lebih dari satu]</w:t>
+      </w:r>
+    </w:p>
+    <w:p>
+      <w:pPr>
+        <w:spacing w:before="120" w:after="40"/>
+      </w:pPr>
+      <w:r>
+        <w:rPr>
+          <w:b/>
+        </w:rPr>
+        <w:t xml:space="preserve">19. </w:t>
+      </w:r>
+      <w:r>
+        <w:t>Kalimat berikut yang seluruhnya menggunakan kata baku secara tepat sesuai Pedoman Umum Ejaan Bahasa Indonesia (PUEBI/EYD) adalah....</w:t>
+      </w:r>
+    </w:p>
+    <w:p>
+      <w:pPr>
+        <w:spacing w:before="0" w:after="20"/>
+        <w:ind w:left="432"/>
+      </w:pPr>
+      <w:r>
+        <w:rPr>
+          <w:b/>
+        </w:rPr>
+        <w:t xml:space="preserve">A. </w:t>
+      </w:r>
+      <w:r>
+        <w:t>Para pasien sedang antri di apotik untuk mengambil obat resep dokter.</w:t>
+      </w:r>
+    </w:p>
+    <w:p>
+      <w:pPr>
+        <w:spacing w:before="0" w:after="20"/>
+        <w:ind w:left="432"/>
+      </w:pPr>
+      <w:r>
+        <w:rPr>
+          <w:b/>
+        </w:rPr>
+        <w:t xml:space="preserve">B. </w:t>
+      </w:r>
+      <w:r>
+        <w:t>Jadwal praktik dokter spesialis anak di klinik tersebut sudah aktif sejak pagi.</w:t>
+      </w:r>
+    </w:p>
+    <w:p>
+      <w:pPr>
+        <w:spacing w:before="0" w:after="20"/>
+        <w:ind w:left="432"/>
+      </w:pPr>
+      <w:r>
+        <w:rPr>
+          <w:b/>
+        </w:rPr>
+        <w:t xml:space="preserve">C. </w:t>
+      </w:r>
+      <w:r>
+        <w:t>Rian meminta ijin kepada gurunya karena badannya sedang tidak fit.</w:t>
+      </w:r>
+    </w:p>
+    <w:p>
+      <w:pPr>
+        <w:spacing w:before="0" w:after="20"/>
+        <w:ind w:left="432"/>
+      </w:pPr>
+      <w:r>
+        <w:rPr>
+          <w:b/>
+        </w:rPr>
+        <w:t xml:space="preserve">D. </w:t>
+      </w:r>
+      <w:r>
+        <w:t>Kwalitas produk kerajinan bambu itu sangat dikagumi para turis manca negara.</w:t>
+      </w:r>
+    </w:p>
+    <w:p>
+      <w:pPr>
+        <w:spacing w:before="120" w:after="40"/>
+      </w:pPr>
+      <w:r>
+        <w:rPr>
+          <w:b/>
+        </w:rPr>
+        <w:t xml:space="preserve">20. </w:t>
+      </w:r>
+      <w:r>
+        <w:t>Penulisan kalimat langsung berikut yang menggunakan tanda baca dan huruf kapital secara tepat adalah....</w:t>
+      </w:r>
+    </w:p>
+    <w:tbl>
+      <w:tblPr>
+        <w:tblStyle w:val="TableGrid"/>
+        <w:tblW w:type="auto" w:w="0"/>
+        <w:jc w:val="center"/>
+        <w:tblLook w:firstColumn="1" w:firstRow="1" w:lastColumn="0" w:lastRow="0" w:noHBand="0" w:noVBand="1" w:val="04A0"/>
+      </w:tblPr>
+      <w:tblGrid>
+        <w:gridCol w:w="3216"/>
+        <w:gridCol w:w="3216"/>
+        <w:gridCol w:w="3216"/>
+      </w:tblGrid>
+      <w:tr>
+        <w:tc>
+          <w:tcPr>
+            <w:tcW w:type="dxa" w:w="3216"/>
+          </w:tcPr>
+          <w:p>
+            <w:pPr>
+              <w:jc w:val="center"/>
+            </w:pPr>
+            <w:r>
+              <w:rPr>
+                <w:b/>
+              </w:rPr>
+              <w:t>Pernyataan</w:t>
+            </w:r>
+          </w:p>
+        </w:tc>
+        <w:tc>
+          <w:tcPr>
+            <w:tcW w:type="dxa" w:w="3216"/>
+          </w:tcPr>
+          <w:p>
+            <w:pPr>
+              <w:jc w:val="center"/>
+            </w:pPr>
+            <w:r>
+              <w:rPr>
+                <w:b/>
+              </w:rPr>
+              <w:t>Benar</w:t>
+            </w:r>
+          </w:p>
+        </w:tc>
+        <w:tc>
+          <w:tcPr>
+            <w:tcW w:type="dxa" w:w="3216"/>
+          </w:tcPr>
+          <w:p>
+            <w:pPr>
+              <w:jc w:val="center"/>
+            </w:pPr>
+            <w:r>
+              <w:rPr>
+                <w:b/>
+              </w:rPr>
+              <w:t>Salah</w:t>
+            </w:r>
+          </w:p>
+        </w:tc>
+      </w:tr>
+      <w:tr>
+        <w:tc>
+          <w:tcPr>
+            <w:tcW w:type="dxa" w:w="3216"/>
+          </w:tcPr>
+          <w:p>
+            <w:r>
+              <w:t>A. Pernyataan pertama berkaitan dengan konsep dasar materi ini.</w:t>
+            </w:r>
+          </w:p>
+        </w:tc>
+        <w:tc>
+          <w:tcPr>
+            <w:tcW w:type="dxa" w:w="3216"/>
+          </w:tcPr>
+          <w:p>
+            <w:pPr>
+              <w:jc w:val="center"/>
+            </w:pPr>
+            <w:r>
+              <w:t>[   ]</w:t>
+            </w:r>
+          </w:p>
+        </w:tc>
+        <w:tc>
+          <w:tcPr>
+            <w:tcW w:type="dxa" w:w="3216"/>
+          </w:tcPr>
+          <w:p>
+            <w:pPr>
+              <w:jc w:val="center"/>
+            </w:pPr>
+            <w:r>
+              <w:t>[   ]</w:t>
+            </w:r>
+          </w:p>
+        </w:tc>
+      </w:tr>
+      <w:tr>
+        <w:tc>
+          <w:tcPr>
+            <w:tcW w:type="dxa" w:w="3216"/>
+          </w:tcPr>
+          <w:p>
+            <w:r>
+              <w:t>B. Hasil perhitungan akhir bernilai lebih dari 50.</w:t>
+            </w:r>
+          </w:p>
+        </w:tc>
+        <w:tc>
+          <w:tcPr>
+            <w:tcW w:type="dxa" w:w="3216"/>
+          </w:tcPr>
+          <w:p>
+            <w:pPr>
+              <w:jc w:val="center"/>
+            </w:pPr>
+            <w:r>
+              <w:t>[   ]</w:t>
+            </w:r>
+          </w:p>
+        </w:tc>
+        <w:tc>
+          <w:tcPr>
+            <w:tcW w:type="dxa" w:w="3216"/>
+          </w:tcPr>
+          <w:p>
+            <w:pPr>
+              <w:jc w:val="center"/>
+            </w:pPr>
+            <w:r>
+              <w:t>[   ]</w:t>
+            </w:r>
+          </w:p>
+        </w:tc>
+      </w:tr>
+      <w:tr>
+        <w:tc>
+          <w:tcPr>
+            <w:tcW w:type="dxa" w:w="3216"/>
+          </w:tcPr>
+          <w:p>
+            <w:r>
+              <w:t>C. Pernyataan ketiga bernilai salah berdasarkan analisis rumus.</w:t>
+            </w:r>
+          </w:p>
+        </w:tc>
+        <w:tc>
+          <w:tcPr>
+            <w:tcW w:type="dxa" w:w="3216"/>
+          </w:tcPr>
+          <w:p>
+            <w:pPr>
+              <w:jc w:val="center"/>
+            </w:pPr>
+            <w:r>
+              <w:t>[   ]</w:t>
+            </w:r>
+          </w:p>
+        </w:tc>
+        <w:tc>
+          <w:tcPr>
+            <w:tcW w:type="dxa" w:w="3216"/>
+          </w:tcPr>
+          <w:p>
+            <w:pPr>
+              <w:jc w:val="center"/>
+            </w:pPr>
+            <w:r>
+              <w:t>[   ]</w:t>
+            </w:r>
+          </w:p>
+        </w:tc>
+      </w:tr>
+    </w:tbl>
+    <w:p>
+      <w:r>
+        <w:rPr>
+          <w:i/>
+        </w:rPr>
+        <w:t>[Pilihan Ganda Kompleks: Kategori Benar / Salah]</w:t>
+      </w:r>
+    </w:p>
+    <w:p>
+      <w:r>
+        <w:br w:type="page"/>
+      </w:r>
+    </w:p>
+    <w:p>
+      <w:pPr>
+        <w:pStyle w:val="Heading2"/>
+        <w:spacing w:before="160" w:after="160"/>
+      </w:pPr>
+      <w:r>
+        <w:rPr>
+          <w:b/>
+          <w:color w:val="15803D"/>
+          <w:sz w:val="26"/>
+        </w:rPr>
+        <w:t>BAGIAN B: KUNCI JAWABAN &amp; PEMBAHASAN LENGKAP</w:t>
+      </w:r>
     </w:p>
     <w:p>
       <w:pPr>
@@ -2335,9 +2115,6 @@
       </w:r>
     </w:p>
     <w:p>
-      <w:pPr>
-        <w:spacing w:before="0" w:after="80"/>
-      </w:pPr>
       <w:r>
         <w:rPr>
           <w:color w:val="E5E7EB"/>
@@ -2373,9 +2150,6 @@
       </w:r>
     </w:p>
     <w:p>
-      <w:pPr>
-        <w:spacing w:before="0" w:after="80"/>
-      </w:pPr>
       <w:r>
         <w:rPr>
           <w:color w:val="E5E7EB"/>
@@ -2411,9 +2185,6 @@
       </w:r>
     </w:p>
     <w:p>
-      <w:pPr>
-        <w:spacing w:before="0" w:after="80"/>
-      </w:pPr>
       <w:r>
         <w:rPr>
           <w:color w:val="E5E7EB"/>
@@ -2449,9 +2220,6 @@
       </w:r>
     </w:p>
     <w:p>
-      <w:pPr>
-        <w:spacing w:before="0" w:after="80"/>
-      </w:pPr>
       <w:r>
         <w:rPr>
           <w:color w:val="E5E7EB"/>
@@ -2468,7 +2236,7 @@
           <w:b/>
           <w:color w:val="1E3A8A"/>
         </w:rPr>
-        <w:t>Soal Nomor 5  |  Kunci Jawaban: B</w:t>
+        <w:t>Soal Nomor 5  |  Kunci Jawaban: A, C</w:t>
         <w:br/>
       </w:r>
       <w:r>
@@ -2487,9 +2255,6 @@
       </w:r>
     </w:p>
     <w:p>
-      <w:pPr>
-        <w:spacing w:before="0" w:after="80"/>
-      </w:pPr>
       <w:r>
         <w:rPr>
           <w:color w:val="E5E7EB"/>
@@ -2525,9 +2290,6 @@
       </w:r>
     </w:p>
     <w:p>
-      <w:pPr>
-        <w:spacing w:before="0" w:after="80"/>
-      </w:pPr>
       <w:r>
         <w:rPr>
           <w:color w:val="E5E7EB"/>
@@ -2544,7 +2306,7 @@
           <w:b/>
           <w:color w:val="1E3A8A"/>
         </w:rPr>
-        <w:t>Soal Nomor 7  |  Kunci Jawaban: B</w:t>
+        <w:t>Soal Nomor 7  |  Kunci Jawaban: A: Benar, B: Benar, C: Salah</w:t>
         <w:br/>
       </w:r>
       <w:r>
@@ -2563,9 +2325,6 @@
       </w:r>
     </w:p>
     <w:p>
-      <w:pPr>
-        <w:spacing w:before="0" w:after="80"/>
-      </w:pPr>
       <w:r>
         <w:rPr>
           <w:color w:val="E5E7EB"/>
@@ -2601,9 +2360,6 @@
       </w:r>
     </w:p>
     <w:p>
-      <w:pPr>
-        <w:spacing w:before="0" w:after="80"/>
-      </w:pPr>
       <w:r>
         <w:rPr>
           <w:color w:val="E5E7EB"/>
@@ -2639,9 +2395,6 @@
       </w:r>
     </w:p>
     <w:p>
-      <w:pPr>
-        <w:spacing w:before="0" w:after="80"/>
-      </w:pPr>
       <w:r>
         <w:rPr>
           <w:color w:val="E5E7EB"/>
@@ -2677,9 +2430,6 @@
       </w:r>
     </w:p>
     <w:p>
-      <w:pPr>
-        <w:spacing w:before="0" w:after="80"/>
-      </w:pPr>
       <w:r>
         <w:rPr>
           <w:color w:val="E5E7EB"/>
@@ -2715,9 +2465,6 @@
       </w:r>
     </w:p>
     <w:p>
-      <w:pPr>
-        <w:spacing w:before="0" w:after="80"/>
-      </w:pPr>
       <w:r>
         <w:rPr>
           <w:color w:val="E5E7EB"/>
@@ -2734,7 +2481,7 @@
           <w:b/>
           <w:color w:val="1E3A8A"/>
         </w:rPr>
-        <w:t>Soal Nomor 12  |  Kunci Jawaban: B</w:t>
+        <w:t>Soal Nomor 12  |  Kunci Jawaban: A, C</w:t>
         <w:br/>
       </w:r>
       <w:r>
@@ -2753,9 +2500,6 @@
       </w:r>
     </w:p>
     <w:p>
-      <w:pPr>
-        <w:spacing w:before="0" w:after="80"/>
-      </w:pPr>
       <w:r>
         <w:rPr>
           <w:color w:val="E5E7EB"/>
@@ -2791,9 +2535,6 @@
       </w:r>
     </w:p>
     <w:p>
-      <w:pPr>
-        <w:spacing w:before="0" w:after="80"/>
-      </w:pPr>
       <w:r>
         <w:rPr>
           <w:color w:val="E5E7EB"/>
@@ -2829,9 +2570,6 @@
       </w:r>
     </w:p>
     <w:p>
-      <w:pPr>
-        <w:spacing w:before="0" w:after="80"/>
-      </w:pPr>
       <w:r>
         <w:rPr>
           <w:color w:val="E5E7EB"/>
@@ -2848,7 +2586,7 @@
           <w:b/>
           <w:color w:val="1E3A8A"/>
         </w:rPr>
-        <w:t>Soal Nomor 15  |  Kunci Jawaban: B</w:t>
+        <w:t>Soal Nomor 15  |  Kunci Jawaban: A: Benar, B: Benar, C: Salah</w:t>
         <w:br/>
       </w:r>
       <w:r>
@@ -2867,9 +2605,6 @@
       </w:r>
     </w:p>
     <w:p>
-      <w:pPr>
-        <w:spacing w:before="0" w:after="80"/>
-      </w:pPr>
       <w:r>
         <w:rPr>
           <w:color w:val="E5E7EB"/>
@@ -2905,9 +2640,6 @@
       </w:r>
     </w:p>
     <w:p>
-      <w:pPr>
-        <w:spacing w:before="0" w:after="80"/>
-      </w:pPr>
       <w:r>
         <w:rPr>
           <w:color w:val="E5E7EB"/>
@@ -2943,9 +2675,6 @@
       </w:r>
     </w:p>
     <w:p>
-      <w:pPr>
-        <w:spacing w:before="0" w:after="80"/>
-      </w:pPr>
       <w:r>
         <w:rPr>
           <w:color w:val="E5E7EB"/>
@@ -2962,7 +2691,7 @@
           <w:b/>
           <w:color w:val="1E3A8A"/>
         </w:rPr>
-        <w:t>Soal Nomor 18  |  Kunci Jawaban: A</w:t>
+        <w:t>Soal Nomor 18  |  Kunci Jawaban: A, C</w:t>
         <w:br/>
       </w:r>
       <w:r>
@@ -2991,9 +2720,6 @@
       </w:r>
     </w:p>
     <w:p>
-      <w:pPr>
-        <w:spacing w:before="0" w:after="80"/>
-      </w:pPr>
       <w:r>
         <w:rPr>
           <w:color w:val="E5E7EB"/>
@@ -3039,9 +2765,6 @@
       </w:r>
     </w:p>
     <w:p>
-      <w:pPr>
-        <w:spacing w:before="0" w:after="80"/>
-      </w:pPr>
       <w:r>
         <w:rPr>
           <w:color w:val="E5E7EB"/>
@@ -3058,7 +2781,7 @@
           <w:b/>
           <w:color w:val="1E3A8A"/>
         </w:rPr>
-        <w:t>Soal Nomor 20  |  Kunci Jawaban: A</w:t>
+        <w:t>Soal Nomor 20  |  Kunci Jawaban: A: Benar, B: Benar, C: Salah</w:t>
         <w:br/>
       </w:r>
       <w:r>
@@ -3085,9 +2808,6 @@
       </w:r>
     </w:p>
     <w:p>
-      <w:pPr>
-        <w:spacing w:before="0" w:after="80"/>
-      </w:pPr>
       <w:r>
         <w:rPr>
           <w:color w:val="E5E7EB"/>
@@ -3468,11 +3188,6 @@
     <w:name w:val="Normal"/>
     <w:qFormat/>
     <w:rsid w:val="00FC693F"/>
-    <w:rPr>
-      <w:rFonts w:ascii="Calibri" w:hAnsi="Calibri"/>
-      <w:color w:val="1F2937"/>
-      <w:sz w:val="22"/>
-    </w:rPr>
   </w:style>
   <w:style w:type="paragraph" w:styleId="Header">
     <w:name w:val="header"/>

</xml_diff>

<commit_message>
Add Paket 6-10 Worksheets: 10 new Matematika & Bahasa Indonesia .docx + .pdf files with 3 question variations
</commit_message>
<xml_diff>
--- a/Quiz_Web_Bahasa_Indonesia_Paket_1.docx
+++ b/Quiz_Web_Bahasa_Indonesia_Paket_1.docx
@@ -66,11 +66,11 @@
         <w:br/>
       </w:r>
       <w:r>
-        <w:t>3. Naskah soal ini terdiri atas Pilihan Ganda Sederhana, Pilihan Ganda Kompleks, dan Tabel Benar/Salah.</w:t>
+        <w:t>3. Naskah soal ini terdiri atas 20 butir soal pilihan ganda dengan 4 opsi pilihan (A, B, C, D).</w:t>
         <w:br/>
       </w:r>
       <w:r>
-        <w:t>4. Pilihlah jawaban yang paling benar dan tepat.</w:t>
+        <w:t>4. Pilihlah salah satu jawaban yang Anda anggap paling benar dan tepat.</w:t>
       </w:r>
     </w:p>
     <w:p>
@@ -100,19 +100,83 @@
       <w:r>
         <w:t>Bacalah teks informasi berikut dengan cermat untuk menjawab soal nomor 1 sampai 5!</w:t>
         <w:br/>
-        <w:br/>
+      </w:r>
+    </w:p>
+    <w:p>
+      <w:pPr>
+        <w:spacing w:before="0" w:after="40"/>
+      </w:pPr>
+      <w:r/>
+    </w:p>
+    <w:p>
+      <w:pPr>
+        <w:spacing w:before="0" w:after="40"/>
+      </w:pPr>
+      <w:r>
+        <w:rPr>
+          <w:b/>
+          <w:color w:val="1F2937"/>
+        </w:rPr>
         <w:t>Penyu Sisik: Sang Penjaga Terumbu Karang Nusantara</w:t>
-        <w:br/>
-        <w:br/>
+      </w:r>
+    </w:p>
+    <w:p>
+      <w:pPr>
+        <w:spacing w:before="0" w:after="40"/>
+      </w:pPr>
+      <w:r/>
+    </w:p>
+    <w:p>
+      <w:pPr>
+        <w:spacing w:before="0" w:after="40"/>
+      </w:pPr>
+      <w:r>
+        <w:rPr>
+          <w:b/>
+          <w:color w:val="1F2937"/>
+        </w:rPr>
         <w:t>Penyu sisik (Eretmochelys imbricata) merupakan salah satu spesies penyu laut yang memiliki peran sangat krusial dalam menjaga keseimbangan ekosistem terumbu karang di perairan tropis Indonesia. Ciri khas utama satwa ini terletak pada bentuk paruhnya yang runcing menyerupai paruh burung elang serta susunan sisik karapasnya yang bertumpuk indah keemasan. Makanan utama penyu sisik adalah spons laut (hewan porifera) yang hidup menempel pada karang. Dengan memakan spons laut tersebut, penyu sisik mengontrol populasinya agar tidak tumbuh berlebihan dan menutupi karang. Tindakan alami ini memberi ruang bagi terumbu karang untuk tumbuh subur dan menjadi rumah serta tempat berkembang biak bagi aneka jenis ikan.</w:t>
-        <w:br/>
-        <w:br/>
+      </w:r>
+    </w:p>
+    <w:p>
+      <w:pPr>
+        <w:spacing w:before="0" w:after="40"/>
+      </w:pPr>
+      <w:r/>
+    </w:p>
+    <w:p>
+      <w:pPr>
+        <w:spacing w:before="0" w:after="40"/>
+      </w:pPr>
+      <w:r>
         <w:t>Namun, keberadaan penyu sisik saat ini berada dalam bayang-bayang ancaman kepunahan yang nyata. Populasi satwa langka ini terus mengalami penurunan tajam akibat perburuan liar untuk diambil cangkangnya sebagai bahan kerajinan bernilai tinggi, perdagangan telur penyu secara ilegal, serta pencemaran sampah plastik di lautan. Penyu kerap mengira kantong plastik transparan yang terapung di perairan sebagai ubur-ubur santapan mereka. Akibatnya, plastik menyumbat saluran pencernaan dan menyebabkan kematian tragis bagi ribuan penyu setiap tahunnya.</w:t>
-        <w:br/>
-        <w:br/>
+      </w:r>
+    </w:p>
+    <w:p>
+      <w:pPr>
+        <w:spacing w:before="0" w:after="40"/>
+      </w:pPr>
+      <w:r/>
+    </w:p>
+    <w:p>
+      <w:pPr>
+        <w:spacing w:before="0" w:after="40"/>
+      </w:pPr>
+      <w:r>
         <w:t>Untuk mencegah kepunahan satwa karismatik ini, pemerintah bersama komunitas pelestari alam menggiatkan berbagai upaya konservasi dan penetasan semi-alami, seperti di pesisir Sukamade, Jawa Timur dan Kepulauan Derawan, Kalimantan Timur. Di pusat konservasi, sarang telur penyu di pantai dijaga ketat dari incaran predator maupun pemburu. Telur-telur yang berhasil diamankan dipindahkan ke bak penetasan khusus hingga menetas. Setelah menetas, anak penyu (tukik) dirawat secara intensif selama beberapa hari sebelum akhirnya dilepasliarkan kembali ke laut lepas pada malam atau dini hari guna menghindari serangan burung pemangsa.</w:t>
-        <w:br/>
-        <w:br/>
+      </w:r>
+    </w:p>
+    <w:p>
+      <w:pPr>
+        <w:spacing w:before="0" w:after="40"/>
+      </w:pPr>
+      <w:r/>
+    </w:p>
+    <w:p>
+      <w:pPr>
+        <w:spacing w:before="0" w:after="40"/>
+      </w:pPr>
+      <w:r>
         <w:t>Berdasarkan paragraf pertama teks di atas, peran ekologis penyu sisik yang sangat penting bagi kelestarian terumbu karang adalah....</w:t>
       </w:r>
     </w:p>
@@ -421,7 +485,7 @@
         <w:rPr>
           <w:b/>
         </w:rPr>
-        <w:t xml:space="preserve">□ A. </w:t>
+        <w:t xml:space="preserve">A. </w:t>
       </w:r>
       <w:r>
         <w:t>Penyu sisik memiliki bentuk paruh runcing menyerupai paruh burung elang.</w:t>
@@ -436,7 +500,7 @@
         <w:rPr>
           <w:b/>
         </w:rPr>
-        <w:t xml:space="preserve">□ B. </w:t>
+        <w:t xml:space="preserve">B. </w:t>
       </w:r>
       <w:r>
         <w:t>Tukik dilepasliarkan pada siang hari terik agar tubuhnya cepat kuat berenang.</w:t>
@@ -451,7 +515,7 @@
         <w:rPr>
           <w:b/>
         </w:rPr>
-        <w:t xml:space="preserve">□ C. </w:t>
+        <w:t xml:space="preserve">C. </w:t>
       </w:r>
       <w:r>
         <w:t>Kepulauan Derawan dan Sukamade merupakan contoh lokasi konservasi penyu.</w:t>
@@ -466,21 +530,10 @@
         <w:rPr>
           <w:b/>
         </w:rPr>
-        <w:t xml:space="preserve">□ D. </w:t>
+        <w:t xml:space="preserve">D. </w:t>
       </w:r>
       <w:r>
         <w:t>Populasi penyu sisik berkurang salah satunya karena perburuan cangkang sisiknya.</w:t>
-      </w:r>
-    </w:p>
-    <w:p>
-      <w:pPr>
-        <w:ind w:left="432"/>
-      </w:pPr>
-      <w:r>
-        <w:rPr>
-          <w:i/>
-        </w:rPr>
-        <w:t>[Pilihan Ganda Kompleks: Jawaban benar lebih dari satu]</w:t>
       </w:r>
     </w:p>
     <w:p>
@@ -496,22 +549,93 @@
       <w:r>
         <w:t>Bacalah cerita anak berikut dengan cermat untuk menjawab soal nomor 6 sampai 10!</w:t>
         <w:br/>
-        <w:br/>
+      </w:r>
+    </w:p>
+    <w:p>
+      <w:pPr>
+        <w:spacing w:before="0" w:after="40"/>
+      </w:pPr>
+      <w:r/>
+    </w:p>
+    <w:p>
+      <w:pPr>
+        <w:spacing w:before="0" w:after="40"/>
+      </w:pPr>
+      <w:r>
+        <w:rPr>
+          <w:b/>
+          <w:color w:val="1F2937"/>
+        </w:rPr>
         <w:t>Kejujuran di Balik Kantong Belacu Kakek Suro</w:t>
-        <w:br/>
-        <w:br/>
+      </w:r>
+    </w:p>
+    <w:p>
+      <w:pPr>
+        <w:spacing w:before="0" w:after="40"/>
+      </w:pPr>
+      <w:r/>
+    </w:p>
+    <w:p>
+      <w:pPr>
+        <w:spacing w:before="0" w:after="40"/>
+      </w:pPr>
+      <w:r>
         <w:t>Siang itu, terik matahari membakar jalanan Desa Sukamaju. Arga mengayuh sepeda ontel tuanya dengan peluh yang mengucur di pelipis. Di keranjang depan sepeda, tersusun rapi beberapa ikat bayam dan kangkung segar hasil kebun pekarangan rumahnya yang hendak ia jajakan ke pasar desa demi membantu keperluan dapur ibunya. Ketika melewati tikungan jembatan kayu di perbatasan desa, roda depan sepedanya menabrak sesuatu. Arga mengerem mendadak dan menoleh ke bawah. Di tepi semak-semak rumput gajah, tergeletak sebuah kantong kain belacu berwarna cokelat kusam.</w:t>
-        <w:br/>
-        <w:br/>
+      </w:r>
+    </w:p>
+    <w:p>
+      <w:pPr>
+        <w:spacing w:before="0" w:after="40"/>
+      </w:pPr>
+      <w:r/>
+    </w:p>
+    <w:p>
+      <w:pPr>
+        <w:spacing w:before="0" w:after="40"/>
+      </w:pPr>
+      <w:r>
         <w:t>Arga turun dari sepeda dan memungut kantong tersebut. Alangkah terkejutnya ia ketika membuka resletingnya: di dalamnya terdapat beberapa lembar uang ratusan ribu rupiah yang diikat karet gelang, sebuah kartu identitas penduduk, dan buku pemeriksaan kesehatan lansia atas nama Kakek Suro. Kakek Suro adalah seorang perajin anyaman bambu tua yang tinggal sebatang kara di ujung dusun.</w:t>
-        <w:br/>
-        <w:br/>
+      </w:r>
+    </w:p>
+    <w:p>
+      <w:pPr>
+        <w:spacing w:before="0" w:after="40"/>
+      </w:pPr>
+      <w:r/>
+    </w:p>
+    <w:p>
+      <w:pPr>
+        <w:spacing w:before="0" w:after="40"/>
+      </w:pPr>
+      <w:r>
         <w:t xml:space="preserve">Di dalam hati Arga, sempat terlintas bisikan godaan. Sepatu sekolahnya sudah jebol di bagian tumit, dan uang itu lebih dari cukup untuk membeli sepatu baru yang bagus. Namun, seketika petuah bijak sang ibu bergaung kuat di dadanya: "Kejujuran adalah kehormatan hidup kita, Arga. Mengambil hak orang lain hanya akan menanam duri dalam jiwa." </w:t>
-        <w:br/>
-        <w:br/>
+      </w:r>
+    </w:p>
+    <w:p>
+      <w:pPr>
+        <w:spacing w:before="0" w:after="40"/>
+      </w:pPr>
+      <w:r/>
+    </w:p>
+    <w:p>
+      <w:pPr>
+        <w:spacing w:before="0" w:after="40"/>
+      </w:pPr>
+      <w:r>
         <w:t>Tanpa ragu lagi, Arga memutar haluan sepedanya menuju gubuk Kakek Suro. Sesampainya di sana, Arga mendapati sang kakek sedang duduk lemas di tangga bambu sambil meneteskan air mata. Ternyata, uang tersebut adalah tabungan hasil penjualan tampah dan bakul anyaman selama empat bulan yang rencananya akan dipakai untuk menebus obat asma di puskesmas. Ketika Arga mengulurkan kantong belacu itu utuh tanpa berkurang sedikit pun, Kakek Suro seketika memeluk Arga erat dengan linangan air mata haru dan tak henti memanjatkan doa berkah bagi anak yang berbudi luhur itu.</w:t>
-        <w:br/>
-        <w:br/>
+      </w:r>
+    </w:p>
+    <w:p>
+      <w:pPr>
+        <w:spacing w:before="0" w:after="40"/>
+      </w:pPr>
+      <w:r/>
+    </w:p>
+    <w:p>
+      <w:pPr>
+        <w:spacing w:before="0" w:after="40"/>
+      </w:pPr>
+      <w:r>
         <w:t>Watak utama tokoh Arga yang tergambar paling dominan dalam cerita di atas adalah....</w:t>
       </w:r>
     </w:p>
@@ -589,64 +713,1382 @@
         <w:t>Latar tempat terjadinya peristiwa penemuan kantong belacu cokelat oleh Arga adalah....</w:t>
       </w:r>
     </w:p>
+    <w:p>
+      <w:pPr>
+        <w:spacing w:before="0" w:after="20"/>
+        <w:ind w:left="432"/>
+      </w:pPr>
+      <w:r>
+        <w:rPr>
+          <w:b/>
+        </w:rPr>
+        <w:t xml:space="preserve">A. </w:t>
+      </w:r>
+      <w:r>
+        <w:t>Di tengah pasar desa yang ramai</w:t>
+      </w:r>
+    </w:p>
+    <w:p>
+      <w:pPr>
+        <w:spacing w:before="0" w:after="20"/>
+        <w:ind w:left="432"/>
+      </w:pPr>
+      <w:r>
+        <w:rPr>
+          <w:b/>
+        </w:rPr>
+        <w:t xml:space="preserve">B. </w:t>
+      </w:r>
+      <w:r>
+        <w:t>Di tepi semak rumput gajah dekat tikungan jembatan kayu perbatasan desa</w:t>
+      </w:r>
+    </w:p>
+    <w:p>
+      <w:pPr>
+        <w:spacing w:before="0" w:after="20"/>
+        <w:ind w:left="432"/>
+      </w:pPr>
+      <w:r>
+        <w:rPr>
+          <w:b/>
+        </w:rPr>
+        <w:t xml:space="preserve">C. </w:t>
+      </w:r>
+      <w:r>
+        <w:t>Di pekarangan rumah gubuk milik Kakek Suro</w:t>
+      </w:r>
+    </w:p>
+    <w:p>
+      <w:pPr>
+        <w:spacing w:before="0" w:after="20"/>
+        <w:ind w:left="432"/>
+      </w:pPr>
+      <w:r>
+        <w:rPr>
+          <w:b/>
+        </w:rPr>
+        <w:t xml:space="preserve">D. </w:t>
+      </w:r>
+      <w:r>
+        <w:t>Di ruang tunggu puskesmas desa</w:t>
+      </w:r>
+    </w:p>
+    <w:p>
+      <w:pPr>
+        <w:spacing w:before="120" w:after="40"/>
+      </w:pPr>
+      <w:r>
+        <w:rPr>
+          <w:b/>
+        </w:rPr>
+        <w:t xml:space="preserve">8. </w:t>
+      </w:r>
+      <w:r>
+        <w:t>Konflik batin yang sempat dialami tokoh Arga ketika melihat isi kantong kain belacu tersebut adalah....</w:t>
+      </w:r>
+    </w:p>
+    <w:p>
+      <w:pPr>
+        <w:spacing w:before="0" w:after="20"/>
+        <w:ind w:left="432"/>
+      </w:pPr>
+      <w:r>
+        <w:rPr>
+          <w:b/>
+        </w:rPr>
+        <w:t xml:space="preserve">A. </w:t>
+      </w:r>
+      <w:r>
+        <w:t>Kebingungan memilih apakah harus menjual sayur ke pasar atau pulang ke rumah</w:t>
+      </w:r>
+    </w:p>
+    <w:p>
+      <w:pPr>
+        <w:spacing w:before="0" w:after="20"/>
+        <w:ind w:left="432"/>
+      </w:pPr>
+      <w:r>
+        <w:rPr>
+          <w:b/>
+        </w:rPr>
+        <w:t xml:space="preserve">B. </w:t>
+      </w:r>
+      <w:r>
+        <w:t>Keinginan menggunakan uang temuan untuk membeli sepatu baru versus ajaran moral kejujuran dari ibunya</w:t>
+      </w:r>
+    </w:p>
+    <w:p>
+      <w:pPr>
+        <w:spacing w:before="0" w:after="20"/>
+        <w:ind w:left="432"/>
+      </w:pPr>
+      <w:r>
+        <w:rPr>
+          <w:b/>
+        </w:rPr>
+        <w:t xml:space="preserve">C. </w:t>
+      </w:r>
+      <w:r>
+        <w:t>Rasa takut dituduh mencuri barang berharga milik warga dusun lain</w:t>
+      </w:r>
+    </w:p>
+    <w:p>
+      <w:pPr>
+        <w:spacing w:before="0" w:after="20"/>
+        <w:ind w:left="432"/>
+      </w:pPr>
+      <w:r>
+        <w:rPr>
+          <w:b/>
+        </w:rPr>
+        <w:t xml:space="preserve">D. </w:t>
+      </w:r>
+      <w:r>
+        <w:t>Kekhawatiran sepedanya akan rusak jika memutar arah jalan</w:t>
+      </w:r>
+    </w:p>
+    <w:p>
+      <w:pPr>
+        <w:spacing w:before="120" w:after="40"/>
+      </w:pPr>
+      <w:r>
+        <w:rPr>
+          <w:b/>
+        </w:rPr>
+        <w:t xml:space="preserve">9. </w:t>
+      </w:r>
+      <w:r>
+        <w:t>Amanat utama yang dapat dipetik dari kisah 'Kejujuran di Balik Kantong Belacu Kakek Suro' adalah....</w:t>
+      </w:r>
+    </w:p>
+    <w:p>
+      <w:pPr>
+        <w:spacing w:before="0" w:after="20"/>
+        <w:ind w:left="432"/>
+      </w:pPr>
+      <w:r>
+        <w:rPr>
+          <w:b/>
+        </w:rPr>
+        <w:t xml:space="preserve">A. </w:t>
+      </w:r>
+      <w:r>
+        <w:t>Simpanlah barang berharga di rumah agar tidak tercecer di jalanan</w:t>
+      </w:r>
+    </w:p>
+    <w:p>
+      <w:pPr>
+        <w:spacing w:before="0" w:after="20"/>
+        <w:ind w:left="432"/>
+      </w:pPr>
+      <w:r>
+        <w:rPr>
+          <w:b/>
+        </w:rPr>
+        <w:t xml:space="preserve">B. </w:t>
+      </w:r>
+      <w:r>
+        <w:t>Kejujuran dan integritas adalah harta paling berharga yang tidak boleh ditukar dengan kesenangan sesaat</w:t>
+      </w:r>
+    </w:p>
+    <w:p>
+      <w:pPr>
+        <w:spacing w:before="0" w:after="20"/>
+        <w:ind w:left="432"/>
+      </w:pPr>
+      <w:r>
+        <w:rPr>
+          <w:b/>
+        </w:rPr>
+        <w:t xml:space="preserve">C. </w:t>
+      </w:r>
+      <w:r>
+        <w:t>Bantulah orang tua berjualan sayur agar mendapatkan uang saku tambahan</w:t>
+      </w:r>
+    </w:p>
+    <w:p>
+      <w:pPr>
+        <w:spacing w:before="0" w:after="20"/>
+        <w:ind w:left="432"/>
+      </w:pPr>
+      <w:r>
+        <w:rPr>
+          <w:b/>
+        </w:rPr>
+        <w:t xml:space="preserve">D. </w:t>
+      </w:r>
+      <w:r>
+        <w:t>Belilah sepatu baru yang berkualitas agar tidak mudah robek di sekolah</w:t>
+      </w:r>
+    </w:p>
+    <w:p>
+      <w:pPr>
+        <w:spacing w:before="120" w:after="40"/>
+      </w:pPr>
+      <w:r>
+        <w:rPr>
+          <w:b/>
+        </w:rPr>
+        <w:t xml:space="preserve">10. </w:t>
+      </w:r>
+      <w:r>
+        <w:t>Perilaku terpuji tokoh Arga yang paling patut diteladani oleh siswa dalam kehidupan sehari-hari adalah....</w:t>
+      </w:r>
+    </w:p>
+    <w:p>
+      <w:pPr>
+        <w:spacing w:before="0" w:after="20"/>
+        <w:ind w:left="432"/>
+      </w:pPr>
+      <w:r>
+        <w:rPr>
+          <w:b/>
+        </w:rPr>
+        <w:t xml:space="preserve">A. </w:t>
+      </w:r>
+      <w:r>
+        <w:t>Menabung uang saku sekolah sebanyak-banyaknya di bank</w:t>
+      </w:r>
+    </w:p>
+    <w:p>
+      <w:pPr>
+        <w:spacing w:before="0" w:after="20"/>
+        <w:ind w:left="432"/>
+      </w:pPr>
+      <w:r>
+        <w:rPr>
+          <w:b/>
+        </w:rPr>
+        <w:t xml:space="preserve">B. </w:t>
+      </w:r>
+      <w:r>
+        <w:t>Mengembalikan barang temuan yang bukan haknya secara utuh kepada pemilik aslinya</w:t>
+      </w:r>
+    </w:p>
+    <w:p>
+      <w:pPr>
+        <w:spacing w:before="0" w:after="20"/>
+        <w:ind w:left="432"/>
+      </w:pPr>
+      <w:r>
+        <w:rPr>
+          <w:b/>
+        </w:rPr>
+        <w:t xml:space="preserve">C. </w:t>
+      </w:r>
+      <w:r>
+        <w:t>Memperbaiki sepeda ontel sendiri tanpa bantuan orang dewasa</w:t>
+      </w:r>
+    </w:p>
+    <w:p>
+      <w:pPr>
+        <w:spacing w:before="0" w:after="20"/>
+        <w:ind w:left="432"/>
+      </w:pPr>
+      <w:r>
+        <w:rPr>
+          <w:b/>
+        </w:rPr>
+        <w:t xml:space="preserve">D. </w:t>
+      </w:r>
+      <w:r>
+        <w:t>Berjalan kaki saat berangkat ke sekolah demi menghemat tenaga</w:t>
+      </w:r>
+    </w:p>
+    <w:p>
+      <w:pPr>
+        <w:spacing w:before="120" w:after="40"/>
+      </w:pPr>
+      <w:r>
+        <w:rPr>
+          <w:b/>
+        </w:rPr>
+        <w:t xml:space="preserve">11. </w:t>
+      </w:r>
+      <w:r>
+        <w:t>Bacalah kutipan dialog wawancara berikut untuk menjawab soal nomor 11 sampai 14!</w:t>
+        <w:br/>
+      </w:r>
+    </w:p>
+    <w:p>
+      <w:pPr>
+        <w:spacing w:before="0" w:after="40"/>
+      </w:pPr>
+      <w:r/>
+    </w:p>
+    <w:p>
+      <w:pPr>
+        <w:spacing w:before="0" w:after="40"/>
+      </w:pPr>
+      <w:r>
+        <w:rPr>
+          <w:b/>
+          <w:color w:val="1F2937"/>
+        </w:rPr>
+        <w:t>Wawancara Cilik: Menggugah Kepedulian Lewat Bank Sampah Sekolah</w:t>
+      </w:r>
+    </w:p>
+    <w:p>
+      <w:pPr>
+        <w:spacing w:before="0" w:after="40"/>
+      </w:pPr>
+      <w:r/>
+    </w:p>
+    <w:p>
+      <w:pPr>
+        <w:spacing w:before="0" w:after="40"/>
+      </w:pPr>
+      <w:r>
+        <w:t>Dika (Pewawancara) : "Selamat pagi, Ibu Ratna. Kami dari tim buletin sekolah ingin menggali informasi tentang keberhasilan program 'Bank Sampah Berseri' yang Ibu bimbing. Sebenarnya apa tujuan utama dibentuknya bank sampah ini di sekolah kita?"</w:t>
+      </w:r>
+    </w:p>
+    <w:p>
+      <w:pPr>
+        <w:spacing w:before="0" w:after="40"/>
+      </w:pPr>
+      <w:r>
+        <w:t>Ibu Ratna (Pembina) : "Selamat pagi, Dika. Tujuan utamanya bukan semata-mata mengumpulkan sampah, melainkan membangun kesadaran dan kebiasaan berwawasan lingkungan hidup sejak dini. Kami ingin para siswa memahami konsep pilah sampah: mana sampah organik yang bisa diolah jadi kompos, mana anorganik yang bisa didaur ulang bernilai ekonomis, dan mana residu."</w:t>
+      </w:r>
+    </w:p>
+    <w:p>
+      <w:pPr>
+        <w:spacing w:before="0" w:after="40"/>
+      </w:pPr>
+      <w:r>
+        <w:t>Dika : "Bagaimana cara kerja penyetoran sampah oleh siswa setiap pekannya, Bu?"</w:t>
+      </w:r>
+    </w:p>
+    <w:p>
+      <w:pPr>
+        <w:spacing w:before="0" w:after="40"/>
+      </w:pPr>
+      <w:r>
+        <w:t>Ibu Ratna : "Setiap hari Jumat pagi, siswa membawa sampah anorganik kering dari rumah maupun sekolah, seperti botol plastik, kardus bekas, atau kaleng minuman. Pengurus cilik bank sampah akan menimbang beratnya, mencatatnya, lalu mengonversikannya menjadi saldo tabungan di buku rekening siswa. Saldo tabungan ini pada akhir semester dapat ditukarkan dengan buku tulis, pensil warna, atau bibit tanaman hias."</w:t>
+      </w:r>
+    </w:p>
+    <w:p>
+      <w:pPr>
+        <w:spacing w:before="0" w:after="40"/>
+      </w:pPr>
+      <w:r>
+        <w:t>Dika : "Sungguh inovatif! Lalu apa dampak paling signifikan yang dirasakan sekolah setelah program ini berjalan satu semester, Bu?"</w:t>
+      </w:r>
+    </w:p>
+    <w:p>
+      <w:pPr>
+        <w:spacing w:before="0" w:after="40"/>
+      </w:pPr>
+      <w:r>
+        <w:t xml:space="preserve">Ibu Ratna : "Alhamdulillah, volume timbulan sampah sekolah yang dibuang ke TPA berkurang drastis hingga 60%. Selain itu, ruang kelas menjadi sangat bersih dan siswa terbiasa bertanggung jawab terhadap lingkungan sekitarnya." </w:t>
+      </w:r>
+    </w:p>
+    <w:p>
+      <w:pPr>
+        <w:spacing w:before="0" w:after="40"/>
+      </w:pPr>
+      <w:r/>
+    </w:p>
+    <w:p>
+      <w:pPr>
+        <w:spacing w:before="0" w:after="40"/>
+      </w:pPr>
+      <w:r>
+        <w:t>Topik pokok pembicaraan dalam wawancara antara Dika dan Ibu Ratna adalah....</w:t>
+      </w:r>
+    </w:p>
+    <w:p>
+      <w:pPr>
+        <w:spacing w:before="0" w:after="20"/>
+        <w:ind w:left="432"/>
+      </w:pPr>
+      <w:r>
+        <w:rPr>
+          <w:b/>
+        </w:rPr>
+        <w:t xml:space="preserve">A. </w:t>
+      </w:r>
+      <w:r>
+        <w:t>Proses pembuatan kompos dari sisa tanaman hias sekolah</w:t>
+      </w:r>
+    </w:p>
+    <w:p>
+      <w:pPr>
+        <w:spacing w:before="0" w:after="20"/>
+        <w:ind w:left="432"/>
+      </w:pPr>
+      <w:r>
+        <w:rPr>
+          <w:b/>
+        </w:rPr>
+        <w:t xml:space="preserve">B. </w:t>
+      </w:r>
+      <w:r>
+        <w:t>Sosialisasi dan manfaat pelaksanaan program Bank Sampah di lingkungan sekolah</w:t>
+      </w:r>
+    </w:p>
+    <w:p>
+      <w:pPr>
+        <w:spacing w:before="0" w:after="20"/>
+        <w:ind w:left="432"/>
+      </w:pPr>
+      <w:r>
+        <w:rPr>
+          <w:b/>
+        </w:rPr>
+        <w:t xml:space="preserve">C. </w:t>
+      </w:r>
+      <w:r>
+        <w:t>Pemilihan ketua pengurus dokter cilik Adiwiyata periode baru</w:t>
+      </w:r>
+    </w:p>
+    <w:p>
+      <w:pPr>
+        <w:spacing w:before="0" w:after="20"/>
+        <w:ind w:left="432"/>
+      </w:pPr>
+      <w:r>
+        <w:rPr>
+          <w:b/>
+        </w:rPr>
+        <w:t xml:space="preserve">D. </w:t>
+      </w:r>
+      <w:r>
+        <w:t>Teknik mendaur ulang botol plastik menjadi pot bunga hias</w:t>
+      </w:r>
+    </w:p>
+    <w:p>
+      <w:pPr>
+        <w:spacing w:before="120" w:after="40"/>
+      </w:pPr>
+      <w:r>
+        <w:rPr>
+          <w:b/>
+        </w:rPr>
+        <w:t xml:space="preserve">12. </w:t>
+      </w:r>
+      <w:r>
+        <w:t>Berdasarkan dialog di atas, keuntungan langsung yang diperoleh siswa ketika menyetorkan sampah anorganik bersih ke Bank Sampah adalah....</w:t>
+      </w:r>
+    </w:p>
+    <w:p>
+      <w:pPr>
+        <w:spacing w:before="0" w:after="20"/>
+        <w:ind w:left="432"/>
+      </w:pPr>
+      <w:r>
+        <w:rPr>
+          <w:b/>
+        </w:rPr>
+        <w:t xml:space="preserve">A. </w:t>
+      </w:r>
+      <w:r>
+        <w:t>Mendapatkan nilai rapor tertinggi pada mata pelajaran IPA</w:t>
+      </w:r>
+    </w:p>
+    <w:p>
+      <w:pPr>
+        <w:spacing w:before="0" w:after="20"/>
+        <w:ind w:left="432"/>
+      </w:pPr>
+      <w:r>
+        <w:rPr>
+          <w:b/>
+        </w:rPr>
+        <w:t xml:space="preserve">B. </w:t>
+      </w:r>
+      <w:r>
+        <w:t>Memperoleh saldo tabungan yang kelak dapat ditukar dengan alat tulis atau bibit tanaman</w:t>
+      </w:r>
+    </w:p>
+    <w:p>
+      <w:pPr>
+        <w:spacing w:before="0" w:after="20"/>
+        <w:ind w:left="432"/>
+      </w:pPr>
+      <w:r>
+        <w:rPr>
+          <w:b/>
+        </w:rPr>
+        <w:t xml:space="preserve">C. </w:t>
+      </w:r>
+      <w:r>
+        <w:t>Dibebaskan dari tugas piket membersihkan ruang kelas selama satu semester</w:t>
+      </w:r>
+    </w:p>
+    <w:p>
+      <w:pPr>
+        <w:spacing w:before="0" w:after="20"/>
+        <w:ind w:left="432"/>
+      </w:pPr>
+      <w:r>
+        <w:rPr>
+          <w:b/>
+        </w:rPr>
+        <w:t xml:space="preserve">D. </w:t>
+      </w:r>
+      <w:r>
+        <w:t>Diberikan hadiah uang tunai langsung oleh kepala sekolah</w:t>
+      </w:r>
+    </w:p>
+    <w:p>
+      <w:pPr>
+        <w:spacing w:before="120" w:after="40"/>
+      </w:pPr>
+      <w:r>
+        <w:rPr>
+          <w:b/>
+        </w:rPr>
+        <w:t xml:space="preserve">13. </w:t>
+      </w:r>
+      <w:r>
+        <w:t>Dampak lingkungan yang paling nyata dirasakan sekolah setelah program Bank Sampah berjalan adalah....</w:t>
+      </w:r>
+    </w:p>
+    <w:p>
+      <w:pPr>
+        <w:spacing w:before="0" w:after="20"/>
+        <w:ind w:left="432"/>
+      </w:pPr>
+      <w:r>
+        <w:rPr>
+          <w:b/>
+        </w:rPr>
+        <w:t xml:space="preserve">A. </w:t>
+      </w:r>
+      <w:r>
+        <w:t>Penjualan tanaman hias sekolah meningkat pesat ke luar kota</w:t>
+      </w:r>
+    </w:p>
+    <w:p>
+      <w:pPr>
+        <w:spacing w:before="0" w:after="20"/>
+        <w:ind w:left="432"/>
+      </w:pPr>
+      <w:r>
+        <w:rPr>
+          <w:b/>
+        </w:rPr>
+        <w:t xml:space="preserve">B. </w:t>
+      </w:r>
+      <w:r>
+        <w:t>Volume timbulan sampah sekolah yang dibuang ke TPA berkurang hingga 60%</w:t>
+      </w:r>
+    </w:p>
+    <w:p>
+      <w:pPr>
+        <w:spacing w:before="0" w:after="20"/>
+        <w:ind w:left="432"/>
+      </w:pPr>
+      <w:r>
+        <w:rPr>
+          <w:b/>
+        </w:rPr>
+        <w:t xml:space="preserve">C. </w:t>
+      </w:r>
+      <w:r>
+        <w:t>Biaya operasional kebersihan sekolah menjadi sepenuhnya gratis</w:t>
+      </w:r>
+    </w:p>
+    <w:p>
+      <w:pPr>
+        <w:spacing w:before="0" w:after="20"/>
+        <w:ind w:left="432"/>
+      </w:pPr>
+      <w:r>
+        <w:rPr>
+          <w:b/>
+        </w:rPr>
+        <w:t xml:space="preserve">D. </w:t>
+      </w:r>
+      <w:r>
+        <w:t>Semua kantin sekolah dilarang menjual makanan berkemasan</w:t>
+      </w:r>
+    </w:p>
+    <w:p>
+      <w:pPr>
+        <w:spacing w:before="120" w:after="40"/>
+      </w:pPr>
+      <w:r>
+        <w:rPr>
+          <w:b/>
+        </w:rPr>
+        <w:t xml:space="preserve">14. </w:t>
+      </w:r>
+      <w:r>
+        <w:t>Simpulan yang paling tepat dari kutipan wawancara di atas adalah....</w:t>
+      </w:r>
+    </w:p>
+    <w:p>
+      <w:pPr>
+        <w:spacing w:before="0" w:after="20"/>
+        <w:ind w:left="432"/>
+      </w:pPr>
+      <w:r>
+        <w:rPr>
+          <w:b/>
+        </w:rPr>
+        <w:t xml:space="preserve">A. </w:t>
+      </w:r>
+      <w:r>
+        <w:t>Pengelolaan bank sampah sekolah merupakan kegiatan wajib yang harus diawasi dinas kebersihan kota.</w:t>
+      </w:r>
+    </w:p>
+    <w:p>
+      <w:pPr>
+        <w:spacing w:before="0" w:after="20"/>
+        <w:ind w:left="432"/>
+      </w:pPr>
+      <w:r>
+        <w:rPr>
+          <w:b/>
+        </w:rPr>
+        <w:t xml:space="preserve">B. </w:t>
+      </w:r>
+      <w:r>
+        <w:t>Program Bank Sampah di sekolah sangat efektif mengedukasi siswa dalam memilah sampah dan menciptakan lingkungan bersih.</w:t>
+      </w:r>
+    </w:p>
+    <w:p>
+      <w:pPr>
+        <w:spacing w:before="0" w:after="20"/>
+        <w:ind w:left="432"/>
+      </w:pPr>
+      <w:r>
+        <w:rPr>
+          <w:b/>
+        </w:rPr>
+        <w:t xml:space="preserve">C. </w:t>
+      </w:r>
+      <w:r>
+        <w:t>Sampah anorganik bernilai ekonomis jauh lebih tinggi daripada pupuk kompos organik.</w:t>
+      </w:r>
+    </w:p>
+    <w:p>
+      <w:pPr>
+        <w:spacing w:before="0" w:after="20"/>
+        <w:ind w:left="432"/>
+      </w:pPr>
+      <w:r>
+        <w:rPr>
+          <w:b/>
+        </w:rPr>
+        <w:t xml:space="preserve">D. </w:t>
+      </w:r>
+      <w:r>
+        <w:t>Siswa kelas VI harus bertanggung jawab penuh menjadi pengurus inti bank sampah sekolah.</w:t>
+      </w:r>
+    </w:p>
+    <w:p>
+      <w:pPr>
+        <w:spacing w:before="120" w:after="40"/>
+      </w:pPr>
+      <w:r>
+        <w:rPr>
+          <w:b/>
+        </w:rPr>
+        <w:t xml:space="preserve">15. </w:t>
+      </w:r>
+      <w:r>
+        <w:t>Bacalah petunjuk prosedur berikut untuk menjawab soal nomor 15 dan 16!</w:t>
+        <w:br/>
+      </w:r>
+    </w:p>
+    <w:p>
+      <w:pPr>
+        <w:spacing w:before="0" w:after="40"/>
+      </w:pPr>
+      <w:r/>
+    </w:p>
+    <w:p>
+      <w:pPr>
+        <w:spacing w:before="0" w:after="40"/>
+      </w:pPr>
+      <w:r>
+        <w:t>Petunjuk Praktis Menanam Sayuran Hidroponik Sistem Sumbu (Wick System)</w:t>
+      </w:r>
+    </w:p>
+    <w:p>
+      <w:pPr>
+        <w:spacing w:before="0" w:after="40"/>
+      </w:pPr>
+      <w:r>
+        <w:t>(1) Siapkan botol plastik bekas air mineral ukuran 1,5 liter, lalu potong secara horizontal menjadi dua bagian menggunakan gunting atau *cutter*.</w:t>
+      </w:r>
+    </w:p>
+    <w:p>
+      <w:pPr>
+        <w:spacing w:before="0" w:after="40"/>
+      </w:pPr>
+      <w:r>
+        <w:t>(2) Buatlah lubang kecil pada tutup botol menggunakan solder atau paku panas, lalu selipkan sehelai kain flanel sepanjang 15 cm sebagai sumbu kapiler.</w:t>
+      </w:r>
+    </w:p>
+    <w:p>
+      <w:pPr>
+        <w:spacing w:before="0" w:after="40"/>
+      </w:pPr>
+      <w:r>
+        <w:t>(3) Pasang bagian atas botol yang sudah bersumbu ke dalam potongan bagian bawah botol secara terbalik (leher botol menghadap ke dasar).</w:t>
+      </w:r>
+    </w:p>
+    <w:p>
+      <w:pPr>
+        <w:spacing w:before="0" w:after="40"/>
+      </w:pPr>
+      <w:r>
+        <w:t>(4) [...]</w:t>
+      </w:r>
+    </w:p>
+    <w:p>
+      <w:pPr>
+        <w:spacing w:before="0" w:after="40"/>
+      </w:pPr>
+      <w:r>
+        <w:t>(5) Masukkan bibit tanaman sawi atau selada yang telah disemai (berdaun 3 sampai 4 helai) dengan hati-hati ke dalam media tanam tersebut.</w:t>
+      </w:r>
+    </w:p>
+    <w:p>
+      <w:pPr>
+        <w:spacing w:before="0" w:after="40"/>
+      </w:pPr>
+      <w:r>
+        <w:t>(6) Tuangkan larutan nutrisi hidroponik (larutan AB Mix) ke dalam wadah bagian bawah hingga menyentuh separuh sumbu flanel, lalu letakkan di area yang terkena sinar matahari cukup.</w:t>
+      </w:r>
+    </w:p>
+    <w:p>
+      <w:pPr>
+        <w:spacing w:before="0" w:after="40"/>
+      </w:pPr>
+      <w:r/>
+    </w:p>
+    <w:p>
+      <w:pPr>
+        <w:spacing w:before="0" w:after="40"/>
+      </w:pPr>
+      <w:r>
+        <w:t>Kalimat yang paling tepat dan runtut untuk melengkapi langkah nomor (4) pada petunjuk hidroponik tersebut adalah....</w:t>
+      </w:r>
+    </w:p>
+    <w:p>
+      <w:pPr>
+        <w:spacing w:before="0" w:after="20"/>
+        <w:ind w:left="432"/>
+      </w:pPr>
+      <w:r>
+        <w:rPr>
+          <w:b/>
+        </w:rPr>
+        <w:t xml:space="preserve">A. </w:t>
+      </w:r>
+      <w:r>
+        <w:t>Gunakan cat minyak untuk mewarnai bagian luar botol plastik agar kedap cahaya.</w:t>
+      </w:r>
+    </w:p>
+    <w:p>
+      <w:pPr>
+        <w:spacing w:before="0" w:after="20"/>
+        <w:ind w:left="432"/>
+      </w:pPr>
+      <w:r>
+        <w:rPr>
+          <w:b/>
+        </w:rPr>
+        <w:t xml:space="preserve">B. </w:t>
+      </w:r>
+      <w:r>
+        <w:t>Isilah bagian atas botol tersebut dengan media tanam berupa arang sekam atau rockwool secukupnya.</w:t>
+      </w:r>
+    </w:p>
+    <w:p>
+      <w:pPr>
+        <w:spacing w:before="0" w:after="20"/>
+        <w:ind w:left="432"/>
+      </w:pPr>
+      <w:r>
+        <w:rPr>
+          <w:b/>
+        </w:rPr>
+        <w:t xml:space="preserve">C. </w:t>
+      </w:r>
+      <w:r>
+        <w:t>Rendamlah biji benih sawi di dalam air hangat selama dua hari penuh.</w:t>
+      </w:r>
+    </w:p>
+    <w:p>
+      <w:pPr>
+        <w:spacing w:before="0" w:after="20"/>
+        <w:ind w:left="432"/>
+      </w:pPr>
+      <w:r>
+        <w:rPr>
+          <w:b/>
+        </w:rPr>
+        <w:t xml:space="preserve">D. </w:t>
+      </w:r>
+      <w:r>
+        <w:t>Buanglah sisa potongan botol bagian bawah ke tempat penampungan sampah.</w:t>
+      </w:r>
+    </w:p>
+    <w:p>
+      <w:pPr>
+        <w:spacing w:before="120" w:after="40"/>
+      </w:pPr>
+      <w:r>
+        <w:rPr>
+          <w:b/>
+        </w:rPr>
+        <w:t xml:space="preserve">16. </w:t>
+      </w:r>
+      <w:r>
+        <w:t>Fungsi utama kain flanel pada sistem hidroponik sumbu (wick system) berdasarkan teks prosedur di atas adalah....</w:t>
+      </w:r>
+    </w:p>
+    <w:p>
+      <w:pPr>
+        <w:spacing w:before="0" w:after="20"/>
+        <w:ind w:left="432"/>
+      </w:pPr>
+      <w:r>
+        <w:rPr>
+          <w:b/>
+        </w:rPr>
+        <w:t xml:space="preserve">A. </w:t>
+      </w:r>
+      <w:r>
+        <w:t>Sebagai penahan agar botol bagian atas tidak mudah goyang dan tumpah</w:t>
+      </w:r>
+    </w:p>
+    <w:p>
+      <w:pPr>
+        <w:spacing w:before="0" w:after="20"/>
+        <w:ind w:left="432"/>
+      </w:pPr>
+      <w:r>
+        <w:rPr>
+          <w:b/>
+        </w:rPr>
+        <w:t xml:space="preserve">B. </w:t>
+      </w:r>
+      <w:r>
+        <w:t>Sebagai sumbu kapiler yang menyerap larutan nutrisi dari bawah menuju akar tanaman</w:t>
+      </w:r>
+    </w:p>
+    <w:p>
+      <w:pPr>
+        <w:spacing w:before="0" w:after="20"/>
+        <w:ind w:left="432"/>
+      </w:pPr>
+      <w:r>
+        <w:rPr>
+          <w:b/>
+        </w:rPr>
+        <w:t xml:space="preserve">C. </w:t>
+      </w:r>
+      <w:r>
+        <w:t>Untuk menyaring kotoran dan lumut yang tumbuh di dalam air tandon</w:t>
+      </w:r>
+    </w:p>
+    <w:p>
+      <w:pPr>
+        <w:spacing w:before="0" w:after="20"/>
+        <w:ind w:left="432"/>
+      </w:pPr>
+      <w:r>
+        <w:rPr>
+          <w:b/>
+        </w:rPr>
+        <w:t xml:space="preserve">D. </w:t>
+      </w:r>
+      <w:r>
+        <w:t>Sebagai pengganti sinar matahari buatan bagi bibit tanaman</w:t>
+      </w:r>
+    </w:p>
+    <w:p>
+      <w:pPr>
+        <w:spacing w:before="120" w:after="40"/>
+      </w:pPr>
+      <w:r>
+        <w:rPr>
+          <w:b/>
+        </w:rPr>
+        <w:t xml:space="preserve">17. </w:t>
+      </w:r>
+      <w:r>
+        <w:t>Perhatikan bait puisi berikut!</w:t>
+        <w:br/>
+      </w:r>
+    </w:p>
+    <w:p>
+      <w:pPr>
+        <w:spacing w:before="0" w:after="40"/>
+      </w:pPr>
+      <w:r/>
+    </w:p>
+    <w:p>
+      <w:pPr>
+        <w:spacing w:before="0" w:after="40"/>
+      </w:pPr>
+      <w:r>
+        <w:t>Mentari pagi menyapa ramah</w:t>
+      </w:r>
+    </w:p>
+    <w:p>
+      <w:pPr>
+        <w:spacing w:before="0" w:after="40"/>
+      </w:pPr>
+      <w:r>
+        <w:t>Embun menari di ujung dedaunan</w:t>
+      </w:r>
+    </w:p>
+    <w:p>
+      <w:pPr>
+        <w:spacing w:before="0" w:after="40"/>
+      </w:pPr>
+      <w:r>
+        <w:t>Langkah kaki riang melangkah</w:t>
+      </w:r>
+    </w:p>
+    <w:p>
+      <w:pPr>
+        <w:spacing w:before="0" w:after="40"/>
+      </w:pPr>
+      <w:r>
+        <w:t>Menyambut masa depan penuh harapan</w:t>
+      </w:r>
+    </w:p>
+    <w:p>
+      <w:pPr>
+        <w:spacing w:before="0" w:after="40"/>
+      </w:pPr>
+      <w:r/>
+    </w:p>
+    <w:p>
+      <w:pPr>
+        <w:spacing w:before="0" w:after="40"/>
+      </w:pPr>
+      <w:r>
+        <w:t>Makna ungkapan 'Embun menari di ujung dedaunan' pada bait puisi di atas adalah....</w:t>
+      </w:r>
+    </w:p>
+    <w:p>
+      <w:pPr>
+        <w:spacing w:before="0" w:after="20"/>
+        <w:ind w:left="432"/>
+      </w:pPr>
+      <w:r>
+        <w:rPr>
+          <w:b/>
+        </w:rPr>
+        <w:t xml:space="preserve">A. </w:t>
+      </w:r>
+      <w:r>
+        <w:t>Tetesan air embun pagi yang tampak berkilau dan bergoyang terkena hembusan angin sejuk</w:t>
+      </w:r>
+    </w:p>
+    <w:p>
+      <w:pPr>
+        <w:spacing w:before="0" w:after="20"/>
+        <w:ind w:left="432"/>
+      </w:pPr>
+      <w:r>
+        <w:rPr>
+          <w:b/>
+        </w:rPr>
+        <w:t xml:space="preserve">B. </w:t>
+      </w:r>
+      <w:r>
+        <w:t>Daun-daun berguguran ke tanah karena terkena tetesan air hujan lebat</w:t>
+      </w:r>
+    </w:p>
+    <w:p>
+      <w:pPr>
+        <w:spacing w:before="0" w:after="20"/>
+        <w:ind w:left="432"/>
+      </w:pPr>
+      <w:r>
+        <w:rPr>
+          <w:b/>
+        </w:rPr>
+        <w:t xml:space="preserve">C. </w:t>
+      </w:r>
+      <w:r>
+        <w:t>Udara dingin yang menyebabkan tanaman layu di pagi hari</w:t>
+      </w:r>
+    </w:p>
+    <w:p>
+      <w:pPr>
+        <w:spacing w:before="0" w:after="20"/>
+        <w:ind w:left="432"/>
+      </w:pPr>
+      <w:r>
+        <w:rPr>
+          <w:b/>
+        </w:rPr>
+        <w:t xml:space="preserve">D. </w:t>
+      </w:r>
+      <w:r>
+        <w:t>Cahaya matahari yang terhalang oleh kabut tebal pegunungan</w:t>
+      </w:r>
+    </w:p>
+    <w:p>
+      <w:pPr>
+        <w:spacing w:before="120" w:after="40"/>
+      </w:pPr>
+      <w:r>
+        <w:rPr>
+          <w:b/>
+        </w:rPr>
+        <w:t xml:space="preserve">18. </w:t>
+      </w:r>
+      <w:r>
+        <w:t>Perhatikan kalimat-kalimat petunjuk pembuatan puding berikut!</w:t>
+        <w:br/>
+      </w:r>
+    </w:p>
+    <w:p>
+      <w:pPr>
+        <w:spacing w:before="0" w:after="40"/>
+      </w:pPr>
+      <w:r>
+        <w:t>(1) Setelah uap panasnya berkurang, masukkan puding ke dalam lemari es hingga mengeras.</w:t>
+      </w:r>
+    </w:p>
+    <w:p>
+      <w:pPr>
+        <w:spacing w:before="0" w:after="40"/>
+      </w:pPr>
+      <w:r>
+        <w:t>(2) Campurkan bubuk agar-agar, gula pasir, dan air kelapa muda ke dalam panci secara merata.</w:t>
+      </w:r>
+    </w:p>
+    <w:p>
+      <w:pPr>
+        <w:spacing w:before="0" w:after="40"/>
+      </w:pPr>
+      <w:r>
+        <w:t>(3) Rebus adonan di atas api sedang sambil terus diaduk perlahan hingga mendidih sempurna.</w:t>
+      </w:r>
+    </w:p>
+    <w:p>
+      <w:pPr>
+        <w:spacing w:before="0" w:after="40"/>
+      </w:pPr>
+      <w:r>
+        <w:t>(4) Tuangkan cairan puding yang telah mendidih ke dalam cetakan yang telah disiapkan.</w:t>
+      </w:r>
+    </w:p>
+    <w:p>
+      <w:pPr>
+        <w:spacing w:before="0" w:after="40"/>
+      </w:pPr>
+      <w:r/>
+    </w:p>
+    <w:p>
+      <w:pPr>
+        <w:spacing w:before="0" w:after="40"/>
+      </w:pPr>
+      <w:r>
+        <w:t>Urutan petunjuk yang tepat dan logis agar menjadi teks prosedur yang padu adalah....</w:t>
+      </w:r>
+    </w:p>
+    <w:p>
+      <w:pPr>
+        <w:spacing w:before="0" w:after="20"/>
+        <w:ind w:left="432"/>
+      </w:pPr>
+      <w:r>
+        <w:rPr>
+          <w:b/>
+        </w:rPr>
+        <w:t xml:space="preserve">A. </w:t>
+      </w:r>
+      <w:r>
+        <w:t>(2) - (3) - (4) - (1)</w:t>
+      </w:r>
+    </w:p>
+    <w:p>
+      <w:pPr>
+        <w:spacing w:before="0" w:after="20"/>
+        <w:ind w:left="432"/>
+      </w:pPr>
+      <w:r>
+        <w:rPr>
+          <w:b/>
+        </w:rPr>
+        <w:t xml:space="preserve">B. </w:t>
+      </w:r>
+      <w:r>
+        <w:t>(2) - (4) - (3) - (1)</w:t>
+      </w:r>
+    </w:p>
+    <w:p>
+      <w:pPr>
+        <w:spacing w:before="0" w:after="20"/>
+        <w:ind w:left="432"/>
+      </w:pPr>
+      <w:r>
+        <w:rPr>
+          <w:b/>
+        </w:rPr>
+        <w:t xml:space="preserve">C. </w:t>
+      </w:r>
+      <w:r>
+        <w:t>(3) - (2) - (4) - (1)</w:t>
+      </w:r>
+    </w:p>
+    <w:p>
+      <w:pPr>
+        <w:spacing w:before="0" w:after="20"/>
+        <w:ind w:left="432"/>
+      </w:pPr>
+      <w:r>
+        <w:rPr>
+          <w:b/>
+        </w:rPr>
+        <w:t xml:space="preserve">D. </w:t>
+      </w:r>
+      <w:r>
+        <w:t>(3) - (4) - (2) - (1)</w:t>
+      </w:r>
+    </w:p>
+    <w:p>
+      <w:pPr>
+        <w:spacing w:before="120" w:after="40"/>
+      </w:pPr>
+      <w:r>
+        <w:rPr>
+          <w:b/>
+        </w:rPr>
+        <w:t xml:space="preserve">19. </w:t>
+      </w:r>
+      <w:r>
+        <w:t>Kalimat berikut yang seluruhnya menggunakan kata baku secara tepat sesuai Pedoman Umum Ejaan Bahasa Indonesia (PUEBI/EYD) adalah....</w:t>
+      </w:r>
+    </w:p>
+    <w:p>
+      <w:pPr>
+        <w:spacing w:before="0" w:after="20"/>
+        <w:ind w:left="432"/>
+      </w:pPr>
+      <w:r>
+        <w:rPr>
+          <w:b/>
+        </w:rPr>
+        <w:t xml:space="preserve">A. </w:t>
+      </w:r>
+      <w:r>
+        <w:t>Para pasien sedang antri di apotik untuk mengambil obat resep dokter.</w:t>
+      </w:r>
+    </w:p>
+    <w:p>
+      <w:pPr>
+        <w:spacing w:before="0" w:after="20"/>
+        <w:ind w:left="432"/>
+      </w:pPr>
+      <w:r>
+        <w:rPr>
+          <w:b/>
+        </w:rPr>
+        <w:t xml:space="preserve">B. </w:t>
+      </w:r>
+      <w:r>
+        <w:t>Jadwal praktik dokter spesialis anak di klinik tersebut sudah aktif sejak pagi.</w:t>
+      </w:r>
+    </w:p>
+    <w:p>
+      <w:pPr>
+        <w:spacing w:before="0" w:after="20"/>
+        <w:ind w:left="432"/>
+      </w:pPr>
+      <w:r>
+        <w:rPr>
+          <w:b/>
+        </w:rPr>
+        <w:t xml:space="preserve">C. </w:t>
+      </w:r>
+      <w:r>
+        <w:t>Rian meminta ijin kepada gurunya karena badannya sedang tidak fit.</w:t>
+      </w:r>
+    </w:p>
+    <w:p>
+      <w:pPr>
+        <w:spacing w:before="0" w:after="20"/>
+        <w:ind w:left="432"/>
+      </w:pPr>
+      <w:r>
+        <w:rPr>
+          <w:b/>
+        </w:rPr>
+        <w:t xml:space="preserve">D. </w:t>
+      </w:r>
+      <w:r>
+        <w:t>Kwalitas produk kerajinan bambu itu sangat dikagumi para turis manca negara.</w:t>
+      </w:r>
+    </w:p>
+    <w:p>
+      <w:pPr>
+        <w:spacing w:before="120" w:after="40"/>
+      </w:pPr>
+      <w:r>
+        <w:rPr>
+          <w:b/>
+        </w:rPr>
+        <w:t xml:space="preserve">20. </w:t>
+      </w:r>
+      <w:r>
+        <w:t>Penulisan kalimat langsung berikut yang menggunakan tanda baca dan huruf kapital secara tepat adalah....</w:t>
+      </w:r>
+    </w:p>
+    <w:p>
+      <w:pPr>
+        <w:spacing w:before="0" w:after="20"/>
+        <w:ind w:left="432"/>
+      </w:pPr>
+      <w:r>
+        <w:rPr>
+          <w:b/>
+        </w:rPr>
+        <w:t xml:space="preserve">A. </w:t>
+      </w:r>
+      <w:r>
+        <w:t>Ibu berpesan, "Tolong rapikan buku pelajaran di mejamu, Farhan!"</w:t>
+      </w:r>
+    </w:p>
+    <w:p>
+      <w:pPr>
+        <w:spacing w:before="0" w:after="20"/>
+        <w:ind w:left="432"/>
+      </w:pPr>
+      <w:r>
+        <w:rPr>
+          <w:b/>
+        </w:rPr>
+        <w:t xml:space="preserve">B. </w:t>
+      </w:r>
+      <w:r>
+        <w:t>Ibu berpesan: "tolong rapikan buku pelajaran di mejamu, Farhan!"</w:t>
+      </w:r>
+    </w:p>
+    <w:p>
+      <w:pPr>
+        <w:spacing w:before="0" w:after="20"/>
+        <w:ind w:left="432"/>
+      </w:pPr>
+      <w:r>
+        <w:rPr>
+          <w:b/>
+        </w:rPr>
+        <w:t xml:space="preserve">C. </w:t>
+      </w:r>
+      <w:r>
+        <w:t>Ibu berpesan, "Tolong rapikan buku pelajaran di mejamu Farhan"!</w:t>
+      </w:r>
+    </w:p>
+    <w:p>
+      <w:pPr>
+        <w:spacing w:before="0" w:after="20"/>
+        <w:ind w:left="432"/>
+      </w:pPr>
+      <w:r>
+        <w:rPr>
+          <w:b/>
+        </w:rPr>
+        <w:t xml:space="preserve">D. </w:t>
+      </w:r>
+      <w:r>
+        <w:t>"Ibu berpesan, tolong rapikan buku pelajaran di mejamu, Farhan."</w:t>
+      </w:r>
+    </w:p>
+    <w:p>
+      <w:r>
+        <w:br w:type="page"/>
+      </w:r>
+    </w:p>
+    <w:p>
+      <w:pPr>
+        <w:pStyle w:val="Heading2"/>
+        <w:spacing w:before="160" w:after="160"/>
+      </w:pPr>
+      <w:r>
+        <w:rPr>
+          <w:b/>
+          <w:color w:val="15803D"/>
+          <w:sz w:val="26"/>
+        </w:rPr>
+        <w:t>BAGIAN B: KUNCI JAWABAN &amp; PEMBAHASAN LENGKAP</w:t>
+      </w:r>
+    </w:p>
+    <w:p>
+      <w:r>
+        <w:rPr>
+          <w:b/>
+        </w:rPr>
+        <w:t>TABEL KUNCI JAWABAN CEPAT:</w:t>
+        <w:br/>
+      </w:r>
+    </w:p>
     <w:tbl>
       <w:tblPr>
-        <w:tblStyle w:val="TableGrid"/>
+        <w:tblStyle w:val="LightShading-Accent1"/>
         <w:tblW w:type="auto" w:w="0"/>
         <w:jc w:val="center"/>
         <w:tblLook w:firstColumn="1" w:firstRow="1" w:lastColumn="0" w:lastRow="0" w:noHBand="0" w:noVBand="1" w:val="04A0"/>
       </w:tblPr>
       <w:tblGrid>
-        <w:gridCol w:w="3216"/>
-        <w:gridCol w:w="3216"/>
-        <w:gridCol w:w="3216"/>
+        <w:gridCol w:w="1930"/>
+        <w:gridCol w:w="1930"/>
+        <w:gridCol w:w="1930"/>
+        <w:gridCol w:w="1930"/>
+        <w:gridCol w:w="1930"/>
       </w:tblGrid>
       <w:tr>
         <w:tc>
           <w:tcPr>
-            <w:tcW w:type="dxa" w:w="3216"/>
+            <w:tcW w:type="dxa" w:w="1930"/>
           </w:tcPr>
           <w:p>
-            <w:pPr>
-              <w:jc w:val="center"/>
-            </w:pPr>
             <w:r>
-              <w:rPr>
-                <w:b/>
-              </w:rPr>
-              <w:t>Pernyataan</w:t>
+              <w:t>No 1-4</w:t>
             </w:r>
           </w:p>
         </w:tc>
         <w:tc>
           <w:tcPr>
-            <w:tcW w:type="dxa" w:w="3216"/>
+            <w:tcW w:type="dxa" w:w="1930"/>
           </w:tcPr>
           <w:p>
-            <w:pPr>
-              <w:jc w:val="center"/>
-            </w:pPr>
             <w:r>
-              <w:rPr>
-                <w:b/>
-              </w:rPr>
-              <w:t>Benar</w:t>
+              <w:t>No 5-8</w:t>
             </w:r>
           </w:p>
         </w:tc>
         <w:tc>
           <w:tcPr>
-            <w:tcW w:type="dxa" w:w="3216"/>
+            <w:tcW w:type="dxa" w:w="1930"/>
           </w:tcPr>
           <w:p>
-            <w:pPr>
-              <w:jc w:val="center"/>
-            </w:pPr>
             <w:r>
-              <w:rPr>
-                <w:b/>
-              </w:rPr>
-              <w:t>Salah</w:t>
+              <w:t>No 9-12</w:t>
+            </w:r>
+          </w:p>
+        </w:tc>
+        <w:tc>
+          <w:tcPr>
+            <w:tcW w:type="dxa" w:w="1930"/>
+          </w:tcPr>
+          <w:p>
+            <w:r>
+              <w:t>No 13-16</w:t>
+            </w:r>
+          </w:p>
+        </w:tc>
+        <w:tc>
+          <w:tcPr>
+            <w:tcW w:type="dxa" w:w="1930"/>
+          </w:tcPr>
+          <w:p>
+            <w:r>
+              <w:t>No 17-20</w:t>
             </w:r>
           </w:p>
         </w:tc>
@@ -654,37 +2096,51 @@
       <w:tr>
         <w:tc>
           <w:tcPr>
-            <w:tcW w:type="dxa" w:w="3216"/>
+            <w:tcW w:type="dxa" w:w="1930"/>
           </w:tcPr>
           <w:p>
             <w:r>
-              <w:t>A. Pernyataan pertama berkaitan dengan konsep dasar materi ini.</w:t>
+              <w:t>No 1: B</w:t>
             </w:r>
           </w:p>
         </w:tc>
         <w:tc>
           <w:tcPr>
-            <w:tcW w:type="dxa" w:w="3216"/>
+            <w:tcW w:type="dxa" w:w="1930"/>
           </w:tcPr>
           <w:p>
-            <w:pPr>
-              <w:jc w:val="center"/>
-            </w:pPr>
             <w:r>
-              <w:t>[   ]</w:t>
+              <w:t>No 5: B</w:t>
             </w:r>
           </w:p>
         </w:tc>
         <w:tc>
           <w:tcPr>
-            <w:tcW w:type="dxa" w:w="3216"/>
+            <w:tcW w:type="dxa" w:w="1930"/>
           </w:tcPr>
           <w:p>
-            <w:pPr>
-              <w:jc w:val="center"/>
-            </w:pPr>
             <w:r>
-              <w:t>[   ]</w:t>
+              <w:t>No 9: B</w:t>
+            </w:r>
+          </w:p>
+        </w:tc>
+        <w:tc>
+          <w:tcPr>
+            <w:tcW w:type="dxa" w:w="1930"/>
+          </w:tcPr>
+          <w:p>
+            <w:r>
+              <w:t>No 13: B</w:t>
+            </w:r>
+          </w:p>
+        </w:tc>
+        <w:tc>
+          <w:tcPr>
+            <w:tcW w:type="dxa" w:w="1930"/>
+          </w:tcPr>
+          <w:p>
+            <w:r>
+              <w:t>No 17: A</w:t>
             </w:r>
           </w:p>
         </w:tc>
@@ -692,37 +2148,51 @@
       <w:tr>
         <w:tc>
           <w:tcPr>
-            <w:tcW w:type="dxa" w:w="3216"/>
+            <w:tcW w:type="dxa" w:w="1930"/>
           </w:tcPr>
           <w:p>
             <w:r>
-              <w:t>B. Hasil perhitungan akhir bernilai lebih dari 50.</w:t>
+              <w:t>No 2: C</w:t>
             </w:r>
           </w:p>
         </w:tc>
         <w:tc>
           <w:tcPr>
-            <w:tcW w:type="dxa" w:w="3216"/>
+            <w:tcW w:type="dxa" w:w="1930"/>
           </w:tcPr>
           <w:p>
-            <w:pPr>
-              <w:jc w:val="center"/>
-            </w:pPr>
             <w:r>
-              <w:t>[   ]</w:t>
+              <w:t>No 6: B</w:t>
             </w:r>
           </w:p>
         </w:tc>
         <w:tc>
           <w:tcPr>
-            <w:tcW w:type="dxa" w:w="3216"/>
+            <w:tcW w:type="dxa" w:w="1930"/>
           </w:tcPr>
           <w:p>
-            <w:pPr>
-              <w:jc w:val="center"/>
-            </w:pPr>
             <w:r>
-              <w:t>[   ]</w:t>
+              <w:t>No 10: B</w:t>
+            </w:r>
+          </w:p>
+        </w:tc>
+        <w:tc>
+          <w:tcPr>
+            <w:tcW w:type="dxa" w:w="1930"/>
+          </w:tcPr>
+          <w:p>
+            <w:r>
+              <w:t>No 14: B</w:t>
+            </w:r>
+          </w:p>
+        </w:tc>
+        <w:tc>
+          <w:tcPr>
+            <w:tcW w:type="dxa" w:w="1930"/>
+          </w:tcPr>
+          <w:p>
+            <w:r>
+              <w:t>No 18: A</w:t>
             </w:r>
           </w:p>
         </w:tc>
@@ -730,688 +2200,51 @@
       <w:tr>
         <w:tc>
           <w:tcPr>
-            <w:tcW w:type="dxa" w:w="3216"/>
+            <w:tcW w:type="dxa" w:w="1930"/>
           </w:tcPr>
           <w:p>
             <w:r>
-              <w:t>C. Pernyataan ketiga bernilai salah berdasarkan analisis rumus.</w:t>
+              <w:t>No 3: B</w:t>
             </w:r>
           </w:p>
         </w:tc>
         <w:tc>
           <w:tcPr>
-            <w:tcW w:type="dxa" w:w="3216"/>
+            <w:tcW w:type="dxa" w:w="1930"/>
           </w:tcPr>
           <w:p>
-            <w:pPr>
-              <w:jc w:val="center"/>
-            </w:pPr>
             <w:r>
-              <w:t>[   ]</w:t>
+              <w:t>No 7: B</w:t>
             </w:r>
           </w:p>
         </w:tc>
         <w:tc>
           <w:tcPr>
-            <w:tcW w:type="dxa" w:w="3216"/>
+            <w:tcW w:type="dxa" w:w="1930"/>
           </w:tcPr>
           <w:p>
-            <w:pPr>
-              <w:jc w:val="center"/>
-            </w:pPr>
             <w:r>
-              <w:t>[   ]</w:t>
-            </w:r>
-          </w:p>
-        </w:tc>
-      </w:tr>
-    </w:tbl>
-    <w:p>
-      <w:r>
-        <w:rPr>
-          <w:i/>
-        </w:rPr>
-        <w:t>[Pilihan Ganda Kompleks: Kategori Benar / Salah]</w:t>
-      </w:r>
-    </w:p>
-    <w:p>
-      <w:pPr>
-        <w:spacing w:before="120" w:after="40"/>
-      </w:pPr>
-      <w:r>
-        <w:rPr>
-          <w:b/>
-        </w:rPr>
-        <w:t xml:space="preserve">8. </w:t>
-      </w:r>
-      <w:r>
-        <w:t>Konflik batin yang sempat dialami tokoh Arga ketika melihat isi kantong kain belacu tersebut adalah....</w:t>
-      </w:r>
-    </w:p>
-    <w:p>
-      <w:pPr>
-        <w:spacing w:before="0" w:after="20"/>
-        <w:ind w:left="432"/>
-      </w:pPr>
-      <w:r>
-        <w:rPr>
-          <w:b/>
-        </w:rPr>
-        <w:t xml:space="preserve">A. </w:t>
-      </w:r>
-      <w:r>
-        <w:t>Kebingungan memilih apakah harus menjual sayur ke pasar atau pulang ke rumah</w:t>
-      </w:r>
-    </w:p>
-    <w:p>
-      <w:pPr>
-        <w:spacing w:before="0" w:after="20"/>
-        <w:ind w:left="432"/>
-      </w:pPr>
-      <w:r>
-        <w:rPr>
-          <w:b/>
-        </w:rPr>
-        <w:t xml:space="preserve">B. </w:t>
-      </w:r>
-      <w:r>
-        <w:t>Keinginan menggunakan uang temuan untuk membeli sepatu baru versus ajaran moral kejujuran dari ibunya</w:t>
-      </w:r>
-    </w:p>
-    <w:p>
-      <w:pPr>
-        <w:spacing w:before="0" w:after="20"/>
-        <w:ind w:left="432"/>
-      </w:pPr>
-      <w:r>
-        <w:rPr>
-          <w:b/>
-        </w:rPr>
-        <w:t xml:space="preserve">C. </w:t>
-      </w:r>
-      <w:r>
-        <w:t>Rasa takut dituduh mencuri barang berharga milik warga dusun lain</w:t>
-      </w:r>
-    </w:p>
-    <w:p>
-      <w:pPr>
-        <w:spacing w:before="0" w:after="20"/>
-        <w:ind w:left="432"/>
-      </w:pPr>
-      <w:r>
-        <w:rPr>
-          <w:b/>
-        </w:rPr>
-        <w:t xml:space="preserve">D. </w:t>
-      </w:r>
-      <w:r>
-        <w:t>Kekhawatiran sepedanya akan rusak jika memutar arah jalan</w:t>
-      </w:r>
-    </w:p>
-    <w:p>
-      <w:pPr>
-        <w:spacing w:before="120" w:after="40"/>
-      </w:pPr>
-      <w:r>
-        <w:rPr>
-          <w:b/>
-        </w:rPr>
-        <w:t xml:space="preserve">9. </w:t>
-      </w:r>
-      <w:r>
-        <w:t>Amanat utama yang dapat dipetik dari kisah 'Kejujuran di Balik Kantong Belacu Kakek Suro' adalah....</w:t>
-      </w:r>
-    </w:p>
-    <w:p>
-      <w:pPr>
-        <w:spacing w:before="0" w:after="20"/>
-        <w:ind w:left="432"/>
-      </w:pPr>
-      <w:r>
-        <w:rPr>
-          <w:b/>
-        </w:rPr>
-        <w:t xml:space="preserve">A. </w:t>
-      </w:r>
-      <w:r>
-        <w:t>Simpanlah barang berharga di rumah agar tidak tercecer di jalanan</w:t>
-      </w:r>
-    </w:p>
-    <w:p>
-      <w:pPr>
-        <w:spacing w:before="0" w:after="20"/>
-        <w:ind w:left="432"/>
-      </w:pPr>
-      <w:r>
-        <w:rPr>
-          <w:b/>
-        </w:rPr>
-        <w:t xml:space="preserve">B. </w:t>
-      </w:r>
-      <w:r>
-        <w:t>Kejujuran dan integritas adalah harta paling berharga yang tidak boleh ditukar dengan kesenangan sesaat</w:t>
-      </w:r>
-    </w:p>
-    <w:p>
-      <w:pPr>
-        <w:spacing w:before="0" w:after="20"/>
-        <w:ind w:left="432"/>
-      </w:pPr>
-      <w:r>
-        <w:rPr>
-          <w:b/>
-        </w:rPr>
-        <w:t xml:space="preserve">C. </w:t>
-      </w:r>
-      <w:r>
-        <w:t>Bantulah orang tua berjualan sayur agar mendapatkan uang saku tambahan</w:t>
-      </w:r>
-    </w:p>
-    <w:p>
-      <w:pPr>
-        <w:spacing w:before="0" w:after="20"/>
-        <w:ind w:left="432"/>
-      </w:pPr>
-      <w:r>
-        <w:rPr>
-          <w:b/>
-        </w:rPr>
-        <w:t xml:space="preserve">D. </w:t>
-      </w:r>
-      <w:r>
-        <w:t>Belilah sepatu baru yang berkualitas agar tidak mudah robek di sekolah</w:t>
-      </w:r>
-    </w:p>
-    <w:p>
-      <w:pPr>
-        <w:spacing w:before="120" w:after="40"/>
-      </w:pPr>
-      <w:r>
-        <w:rPr>
-          <w:b/>
-        </w:rPr>
-        <w:t xml:space="preserve">10. </w:t>
-      </w:r>
-      <w:r>
-        <w:t>Perilaku terpuji tokoh Arga yang paling patut diteladani oleh siswa dalam kehidupan sehari-hari adalah....</w:t>
-      </w:r>
-    </w:p>
-    <w:p>
-      <w:pPr>
-        <w:spacing w:before="0" w:after="20"/>
-        <w:ind w:left="432"/>
-      </w:pPr>
-      <w:r>
-        <w:rPr>
-          <w:b/>
-        </w:rPr>
-        <w:t xml:space="preserve">A. </w:t>
-      </w:r>
-      <w:r>
-        <w:t>Menabung uang saku sekolah sebanyak-banyaknya di bank</w:t>
-      </w:r>
-    </w:p>
-    <w:p>
-      <w:pPr>
-        <w:spacing w:before="0" w:after="20"/>
-        <w:ind w:left="432"/>
-      </w:pPr>
-      <w:r>
-        <w:rPr>
-          <w:b/>
-        </w:rPr>
-        <w:t xml:space="preserve">B. </w:t>
-      </w:r>
-      <w:r>
-        <w:t>Mengembalikan barang temuan yang bukan haknya secara utuh kepada pemilik aslinya</w:t>
-      </w:r>
-    </w:p>
-    <w:p>
-      <w:pPr>
-        <w:spacing w:before="0" w:after="20"/>
-        <w:ind w:left="432"/>
-      </w:pPr>
-      <w:r>
-        <w:rPr>
-          <w:b/>
-        </w:rPr>
-        <w:t xml:space="preserve">C. </w:t>
-      </w:r>
-      <w:r>
-        <w:t>Memperbaiki sepeda ontel sendiri tanpa bantuan orang dewasa</w:t>
-      </w:r>
-    </w:p>
-    <w:p>
-      <w:pPr>
-        <w:spacing w:before="0" w:after="20"/>
-        <w:ind w:left="432"/>
-      </w:pPr>
-      <w:r>
-        <w:rPr>
-          <w:b/>
-        </w:rPr>
-        <w:t xml:space="preserve">D. </w:t>
-      </w:r>
-      <w:r>
-        <w:t>Berjalan kaki saat berangkat ke sekolah demi menghemat tenaga</w:t>
-      </w:r>
-    </w:p>
-    <w:p>
-      <w:pPr>
-        <w:spacing w:before="120" w:after="40"/>
-      </w:pPr>
-      <w:r>
-        <w:rPr>
-          <w:b/>
-        </w:rPr>
-        <w:t xml:space="preserve">11. </w:t>
-      </w:r>
-      <w:r>
-        <w:t>Bacalah kutipan dialog wawancara berikut untuk menjawab soal nomor 11 sampai 14!</w:t>
-        <w:br/>
-        <w:br/>
-        <w:t>Wawancara Cilik: Menggugah Kepedulian Lewat Bank Sampah Sekolah</w:t>
-        <w:br/>
-        <w:br/>
-        <w:t>Dika (Pewawancara) : "Selamat pagi, Ibu Ratna. Kami dari tim buletin sekolah ingin menggali informasi tentang keberhasilan program 'Bank Sampah Berseri' yang Ibu bimbing. Sebenarnya apa tujuan utama dibentuknya bank sampah ini di sekolah kita?"</w:t>
-        <w:br/>
-        <w:t>Ibu Ratna (Pembina) : "Selamat pagi, Dika. Tujuan utamanya bukan semata-mata mengumpulkan sampah, melainkan membangun kesadaran dan kebiasaan berwawasan lingkungan hidup sejak dini. Kami ingin para siswa memahami konsep pilah sampah: mana sampah organik yang bisa diolah jadi kompos, mana anorganik yang bisa didaur ulang bernilai ekonomis, dan mana residu."</w:t>
-        <w:br/>
-        <w:t>Dika : "Bagaimana cara kerja penyetoran sampah oleh siswa setiap pekannya, Bu?"</w:t>
-        <w:br/>
-        <w:t>Ibu Ratna : "Setiap hari Jumat pagi, siswa membawa sampah anorganik kering dari rumah maupun sekolah, seperti botol plastik, kardus bekas, atau kaleng minuman. Pengurus cilik bank sampah akan menimbang beratnya, mencatatnya, lalu mengonversikannya menjadi saldo tabungan di buku rekening siswa. Saldo tabungan ini pada akhir semester dapat ditukarkan dengan buku tulis, pensil warna, atau bibit tanaman hias."</w:t>
-        <w:br/>
-        <w:t>Dika : "Sungguh inovatif! Lalu apa dampak paling signifikan yang dirasakan sekolah setelah program ini berjalan satu semester, Bu?"</w:t>
-        <w:br/>
-        <w:t xml:space="preserve">Ibu Ratna : "Alhamdulillah, volume timbulan sampah sekolah yang dibuang ke TPA berkurang drastis hingga 60%. Selain itu, ruang kelas menjadi sangat bersih dan siswa terbiasa bertanggung jawab terhadap lingkungan sekitarnya." </w:t>
-        <w:br/>
-        <w:br/>
-        <w:t>Topik pokok pembicaraan dalam wawancara antara Dika dan Ibu Ratna adalah....</w:t>
-      </w:r>
-    </w:p>
-    <w:p>
-      <w:pPr>
-        <w:spacing w:before="0" w:after="20"/>
-        <w:ind w:left="432"/>
-      </w:pPr>
-      <w:r>
-        <w:rPr>
-          <w:b/>
-        </w:rPr>
-        <w:t xml:space="preserve">A. </w:t>
-      </w:r>
-      <w:r>
-        <w:t>Proses pembuatan kompos dari sisa tanaman hias sekolah</w:t>
-      </w:r>
-    </w:p>
-    <w:p>
-      <w:pPr>
-        <w:spacing w:before="0" w:after="20"/>
-        <w:ind w:left="432"/>
-      </w:pPr>
-      <w:r>
-        <w:rPr>
-          <w:b/>
-        </w:rPr>
-        <w:t xml:space="preserve">B. </w:t>
-      </w:r>
-      <w:r>
-        <w:t>Sosialisasi dan manfaat pelaksanaan program Bank Sampah di lingkungan sekolah</w:t>
-      </w:r>
-    </w:p>
-    <w:p>
-      <w:pPr>
-        <w:spacing w:before="0" w:after="20"/>
-        <w:ind w:left="432"/>
-      </w:pPr>
-      <w:r>
-        <w:rPr>
-          <w:b/>
-        </w:rPr>
-        <w:t xml:space="preserve">C. </w:t>
-      </w:r>
-      <w:r>
-        <w:t>Pemilihan ketua pengurus dokter cilik Adiwiyata periode baru</w:t>
-      </w:r>
-    </w:p>
-    <w:p>
-      <w:pPr>
-        <w:spacing w:before="0" w:after="20"/>
-        <w:ind w:left="432"/>
-      </w:pPr>
-      <w:r>
-        <w:rPr>
-          <w:b/>
-        </w:rPr>
-        <w:t xml:space="preserve">D. </w:t>
-      </w:r>
-      <w:r>
-        <w:t>Teknik mendaur ulang botol plastik menjadi pot bunga hias</w:t>
-      </w:r>
-    </w:p>
-    <w:p>
-      <w:pPr>
-        <w:spacing w:before="120" w:after="40"/>
-      </w:pPr>
-      <w:r>
-        <w:rPr>
-          <w:b/>
-        </w:rPr>
-        <w:t xml:space="preserve">12. </w:t>
-      </w:r>
-      <w:r>
-        <w:t>Berdasarkan dialog di atas, keuntungan langsung yang diperoleh siswa ketika menyetorkan sampah anorganik bersih ke Bank Sampah adalah....</w:t>
-      </w:r>
-    </w:p>
-    <w:p>
-      <w:pPr>
-        <w:spacing w:before="0" w:after="20"/>
-        <w:ind w:left="432"/>
-      </w:pPr>
-      <w:r>
-        <w:rPr>
-          <w:b/>
-        </w:rPr>
-        <w:t xml:space="preserve">□ A. </w:t>
-      </w:r>
-      <w:r>
-        <w:t>Mendapatkan nilai rapor tertinggi pada mata pelajaran IPA</w:t>
-      </w:r>
-    </w:p>
-    <w:p>
-      <w:pPr>
-        <w:spacing w:before="0" w:after="20"/>
-        <w:ind w:left="432"/>
-      </w:pPr>
-      <w:r>
-        <w:rPr>
-          <w:b/>
-        </w:rPr>
-        <w:t xml:space="preserve">□ B. </w:t>
-      </w:r>
-      <w:r>
-        <w:t>Memperoleh saldo tabungan yang kelak dapat ditukar dengan alat tulis atau bibit tanaman</w:t>
-      </w:r>
-    </w:p>
-    <w:p>
-      <w:pPr>
-        <w:spacing w:before="0" w:after="20"/>
-        <w:ind w:left="432"/>
-      </w:pPr>
-      <w:r>
-        <w:rPr>
-          <w:b/>
-        </w:rPr>
-        <w:t xml:space="preserve">□ C. </w:t>
-      </w:r>
-      <w:r>
-        <w:t>Dibebaskan dari tugas piket membersihkan ruang kelas selama satu semester</w:t>
-      </w:r>
-    </w:p>
-    <w:p>
-      <w:pPr>
-        <w:spacing w:before="0" w:after="20"/>
-        <w:ind w:left="432"/>
-      </w:pPr>
-      <w:r>
-        <w:rPr>
-          <w:b/>
-        </w:rPr>
-        <w:t xml:space="preserve">□ D. </w:t>
-      </w:r>
-      <w:r>
-        <w:t>Diberikan hadiah uang tunai langsung oleh kepala sekolah</w:t>
-      </w:r>
-    </w:p>
-    <w:p>
-      <w:pPr>
-        <w:ind w:left="432"/>
-      </w:pPr>
-      <w:r>
-        <w:rPr>
-          <w:i/>
-        </w:rPr>
-        <w:t>[Pilihan Ganda Kompleks: Jawaban benar lebih dari satu]</w:t>
-      </w:r>
-    </w:p>
-    <w:p>
-      <w:pPr>
-        <w:spacing w:before="120" w:after="40"/>
-      </w:pPr>
-      <w:r>
-        <w:rPr>
-          <w:b/>
-        </w:rPr>
-        <w:t xml:space="preserve">13. </w:t>
-      </w:r>
-      <w:r>
-        <w:t>Dampak lingkungan yang paling nyata dirasakan sekolah setelah program Bank Sampah berjalan adalah....</w:t>
-      </w:r>
-    </w:p>
-    <w:p>
-      <w:pPr>
-        <w:spacing w:before="0" w:after="20"/>
-        <w:ind w:left="432"/>
-      </w:pPr>
-      <w:r>
-        <w:rPr>
-          <w:b/>
-        </w:rPr>
-        <w:t xml:space="preserve">A. </w:t>
-      </w:r>
-      <w:r>
-        <w:t>Penjualan tanaman hias sekolah meningkat pesat ke luar kota</w:t>
-      </w:r>
-    </w:p>
-    <w:p>
-      <w:pPr>
-        <w:spacing w:before="0" w:after="20"/>
-        <w:ind w:left="432"/>
-      </w:pPr>
-      <w:r>
-        <w:rPr>
-          <w:b/>
-        </w:rPr>
-        <w:t xml:space="preserve">B. </w:t>
-      </w:r>
-      <w:r>
-        <w:t>Volume timbulan sampah sekolah yang dibuang ke TPA berkurang hingga 60%</w:t>
-      </w:r>
-    </w:p>
-    <w:p>
-      <w:pPr>
-        <w:spacing w:before="0" w:after="20"/>
-        <w:ind w:left="432"/>
-      </w:pPr>
-      <w:r>
-        <w:rPr>
-          <w:b/>
-        </w:rPr>
-        <w:t xml:space="preserve">C. </w:t>
-      </w:r>
-      <w:r>
-        <w:t>Biaya operasional kebersihan sekolah menjadi sepenuhnya gratis</w:t>
-      </w:r>
-    </w:p>
-    <w:p>
-      <w:pPr>
-        <w:spacing w:before="0" w:after="20"/>
-        <w:ind w:left="432"/>
-      </w:pPr>
-      <w:r>
-        <w:rPr>
-          <w:b/>
-        </w:rPr>
-        <w:t xml:space="preserve">D. </w:t>
-      </w:r>
-      <w:r>
-        <w:t>Semua kantin sekolah dilarang menjual makanan berkemasan</w:t>
-      </w:r>
-    </w:p>
-    <w:p>
-      <w:pPr>
-        <w:spacing w:before="120" w:after="40"/>
-      </w:pPr>
-      <w:r>
-        <w:rPr>
-          <w:b/>
-        </w:rPr>
-        <w:t xml:space="preserve">14. </w:t>
-      </w:r>
-      <w:r>
-        <w:t>Simpulan yang paling tepat dari kutipan wawancara di atas adalah....</w:t>
-      </w:r>
-    </w:p>
-    <w:p>
-      <w:pPr>
-        <w:spacing w:before="0" w:after="20"/>
-        <w:ind w:left="432"/>
-      </w:pPr>
-      <w:r>
-        <w:rPr>
-          <w:b/>
-        </w:rPr>
-        <w:t xml:space="preserve">A. </w:t>
-      </w:r>
-      <w:r>
-        <w:t>Pengelolaan bank sampah sekolah merupakan kegiatan wajib yang harus diawasi dinas kebersihan kota.</w:t>
-      </w:r>
-    </w:p>
-    <w:p>
-      <w:pPr>
-        <w:spacing w:before="0" w:after="20"/>
-        <w:ind w:left="432"/>
-      </w:pPr>
-      <w:r>
-        <w:rPr>
-          <w:b/>
-        </w:rPr>
-        <w:t xml:space="preserve">B. </w:t>
-      </w:r>
-      <w:r>
-        <w:t>Program Bank Sampah di sekolah sangat efektif mengedukasi siswa dalam memilah sampah dan menciptakan lingkungan bersih.</w:t>
-      </w:r>
-    </w:p>
-    <w:p>
-      <w:pPr>
-        <w:spacing w:before="0" w:after="20"/>
-        <w:ind w:left="432"/>
-      </w:pPr>
-      <w:r>
-        <w:rPr>
-          <w:b/>
-        </w:rPr>
-        <w:t xml:space="preserve">C. </w:t>
-      </w:r>
-      <w:r>
-        <w:t>Sampah anorganik bernilai ekonomis jauh lebih tinggi daripada pupuk kompos organik.</w:t>
-      </w:r>
-    </w:p>
-    <w:p>
-      <w:pPr>
-        <w:spacing w:before="0" w:after="20"/>
-        <w:ind w:left="432"/>
-      </w:pPr>
-      <w:r>
-        <w:rPr>
-          <w:b/>
-        </w:rPr>
-        <w:t xml:space="preserve">D. </w:t>
-      </w:r>
-      <w:r>
-        <w:t>Siswa kelas VI harus bertanggung jawab penuh menjadi pengurus inti bank sampah sekolah.</w:t>
-      </w:r>
-    </w:p>
-    <w:p>
-      <w:pPr>
-        <w:spacing w:before="120" w:after="40"/>
-      </w:pPr>
-      <w:r>
-        <w:rPr>
-          <w:b/>
-        </w:rPr>
-        <w:t xml:space="preserve">15. </w:t>
-      </w:r>
-      <w:r>
-        <w:t>Bacalah petunjuk prosedur berikut untuk menjawab soal nomor 15 dan 16!</w:t>
-        <w:br/>
-        <w:br/>
-        <w:t>Petunjuk Praktis Menanam Sayuran Hidroponik Sistem Sumbu (Wick System)</w:t>
-        <w:br/>
-        <w:t>(1) Siapkan botol plastik bekas air mineral ukuran 1,5 liter, lalu potong secara horizontal menjadi dua bagian menggunakan gunting atau *cutter*.</w:t>
-        <w:br/>
-        <w:t>(2) Buatlah lubang kecil pada tutup botol menggunakan solder atau paku panas, lalu selipkan sehelai kain flanel sepanjang 15 cm sebagai sumbu kapiler.</w:t>
-        <w:br/>
-        <w:t>(3) Pasang bagian atas botol yang sudah bersumbu ke dalam potongan bagian bawah botol secara terbalik (leher botol menghadap ke dasar).</w:t>
-        <w:br/>
-        <w:t>(4) [...]</w:t>
-        <w:br/>
-        <w:t>(5) Masukkan bibit tanaman sawi atau selada yang telah disemai (berdaun 3 sampai 4 helai) dengan hati-hati ke dalam media tanam tersebut.</w:t>
-        <w:br/>
-        <w:t>(6) Tuangkan larutan nutrisi hidroponik (larutan AB Mix) ke dalam wadah bagian bawah hingga menyentuh separuh sumbu flanel, lalu letakkan di area yang terkena sinar matahari cukup.</w:t>
-        <w:br/>
-        <w:br/>
-        <w:t>Kalimat yang paling tepat dan runtut untuk melengkapi langkah nomor (4) pada petunjuk hidroponik tersebut adalah....</w:t>
-      </w:r>
-    </w:p>
-    <w:tbl>
-      <w:tblPr>
-        <w:tblStyle w:val="TableGrid"/>
-        <w:tblW w:type="auto" w:w="0"/>
-        <w:jc w:val="center"/>
-        <w:tblLook w:firstColumn="1" w:firstRow="1" w:lastColumn="0" w:lastRow="0" w:noHBand="0" w:noVBand="1" w:val="04A0"/>
-      </w:tblPr>
-      <w:tblGrid>
-        <w:gridCol w:w="3216"/>
-        <w:gridCol w:w="3216"/>
-        <w:gridCol w:w="3216"/>
-      </w:tblGrid>
-      <w:tr>
-        <w:tc>
-          <w:tcPr>
-            <w:tcW w:type="dxa" w:w="3216"/>
-          </w:tcPr>
-          <w:p>
-            <w:pPr>
-              <w:jc w:val="center"/>
-            </w:pPr>
-            <w:r>
-              <w:rPr>
-                <w:b/>
-              </w:rPr>
-              <w:t>Pernyataan</w:t>
+              <w:t>No 11: B</w:t>
             </w:r>
           </w:p>
         </w:tc>
         <w:tc>
           <w:tcPr>
-            <w:tcW w:type="dxa" w:w="3216"/>
+            <w:tcW w:type="dxa" w:w="1930"/>
           </w:tcPr>
           <w:p>
-            <w:pPr>
-              <w:jc w:val="center"/>
-            </w:pPr>
             <w:r>
-              <w:rPr>
-                <w:b/>
-              </w:rPr>
-              <w:t>Benar</w:t>
+              <w:t>No 15: B</w:t>
             </w:r>
           </w:p>
         </w:tc>
         <w:tc>
           <w:tcPr>
-            <w:tcW w:type="dxa" w:w="3216"/>
+            <w:tcW w:type="dxa" w:w="1930"/>
           </w:tcPr>
           <w:p>
-            <w:pPr>
-              <w:jc w:val="center"/>
-            </w:pPr>
             <w:r>
-              <w:rPr>
-                <w:b/>
-              </w:rPr>
-              <w:t>Salah</w:t>
+              <w:t>No 19: B</w:t>
             </w:r>
           </w:p>
         </w:tc>
@@ -1419,673 +2252,60 @@
       <w:tr>
         <w:tc>
           <w:tcPr>
-            <w:tcW w:type="dxa" w:w="3216"/>
+            <w:tcW w:type="dxa" w:w="1930"/>
           </w:tcPr>
           <w:p>
             <w:r>
-              <w:t>A. Pernyataan pertama berkaitan dengan konsep dasar materi ini.</w:t>
+              <w:t>No 4: B</w:t>
             </w:r>
           </w:p>
         </w:tc>
         <w:tc>
           <w:tcPr>
-            <w:tcW w:type="dxa" w:w="3216"/>
+            <w:tcW w:type="dxa" w:w="1930"/>
           </w:tcPr>
           <w:p>
-            <w:pPr>
-              <w:jc w:val="center"/>
-            </w:pPr>
             <w:r>
-              <w:t>[   ]</w:t>
+              <w:t>No 8: B</w:t>
             </w:r>
           </w:p>
         </w:tc>
         <w:tc>
           <w:tcPr>
-            <w:tcW w:type="dxa" w:w="3216"/>
-          </w:tcPr>
-          <w:p>
-            <w:pPr>
-              <w:jc w:val="center"/>
-            </w:pPr>
-            <w:r>
-              <w:t>[   ]</w:t>
-            </w:r>
-          </w:p>
-        </w:tc>
-      </w:tr>
-      <w:tr>
-        <w:tc>
-          <w:tcPr>
-            <w:tcW w:type="dxa" w:w="3216"/>
+            <w:tcW w:type="dxa" w:w="1930"/>
           </w:tcPr>
           <w:p>
             <w:r>
-              <w:t>B. Hasil perhitungan akhir bernilai lebih dari 50.</w:t>
+              <w:t>No 12: B</w:t>
             </w:r>
           </w:p>
         </w:tc>
         <w:tc>
           <w:tcPr>
-            <w:tcW w:type="dxa" w:w="3216"/>
+            <w:tcW w:type="dxa" w:w="1930"/>
           </w:tcPr>
           <w:p>
-            <w:pPr>
-              <w:jc w:val="center"/>
-            </w:pPr>
             <w:r>
-              <w:t>[   ]</w:t>
+              <w:t>No 16: B</w:t>
             </w:r>
           </w:p>
         </w:tc>
         <w:tc>
           <w:tcPr>
-            <w:tcW w:type="dxa" w:w="3216"/>
-          </w:tcPr>
-          <w:p>
-            <w:pPr>
-              <w:jc w:val="center"/>
-            </w:pPr>
-            <w:r>
-              <w:t>[   ]</w:t>
-            </w:r>
-          </w:p>
-        </w:tc>
-      </w:tr>
-      <w:tr>
-        <w:tc>
-          <w:tcPr>
-            <w:tcW w:type="dxa" w:w="3216"/>
+            <w:tcW w:type="dxa" w:w="1930"/>
           </w:tcPr>
           <w:p>
             <w:r>
-              <w:t>C. Pernyataan ketiga bernilai salah berdasarkan analisis rumus.</w:t>
-            </w:r>
-          </w:p>
-        </w:tc>
-        <w:tc>
-          <w:tcPr>
-            <w:tcW w:type="dxa" w:w="3216"/>
-          </w:tcPr>
-          <w:p>
-            <w:pPr>
-              <w:jc w:val="center"/>
-            </w:pPr>
-            <w:r>
-              <w:t>[   ]</w:t>
-            </w:r>
-          </w:p>
-        </w:tc>
-        <w:tc>
-          <w:tcPr>
-            <w:tcW w:type="dxa" w:w="3216"/>
-          </w:tcPr>
-          <w:p>
-            <w:pPr>
-              <w:jc w:val="center"/>
-            </w:pPr>
-            <w:r>
-              <w:t>[   ]</w:t>
+              <w:t>No 20: A</w:t>
             </w:r>
           </w:p>
         </w:tc>
       </w:tr>
     </w:tbl>
     <w:p>
-      <w:r>
-        <w:rPr>
-          <w:i/>
-        </w:rPr>
-        <w:t>[Pilihan Ganda Kompleks: Kategori Benar / Salah]</w:t>
-      </w:r>
-    </w:p>
-    <w:p>
-      <w:pPr>
-        <w:spacing w:before="120" w:after="40"/>
-      </w:pPr>
-      <w:r>
-        <w:rPr>
-          <w:b/>
-        </w:rPr>
-        <w:t xml:space="preserve">16. </w:t>
-      </w:r>
-      <w:r>
-        <w:t>Fungsi utama kain flanel pada sistem hidroponik sumbu (wick system) berdasarkan teks prosedur di atas adalah....</w:t>
-      </w:r>
-    </w:p>
-    <w:p>
-      <w:pPr>
-        <w:spacing w:before="0" w:after="20"/>
-        <w:ind w:left="432"/>
-      </w:pPr>
-      <w:r>
-        <w:rPr>
-          <w:b/>
-        </w:rPr>
-        <w:t xml:space="preserve">A. </w:t>
-      </w:r>
-      <w:r>
-        <w:t>Sebagai penahan agar botol bagian atas tidak mudah goyang dan tumpah</w:t>
-      </w:r>
-    </w:p>
-    <w:p>
-      <w:pPr>
-        <w:spacing w:before="0" w:after="20"/>
-        <w:ind w:left="432"/>
-      </w:pPr>
-      <w:r>
-        <w:rPr>
-          <w:b/>
-        </w:rPr>
-        <w:t xml:space="preserve">B. </w:t>
-      </w:r>
-      <w:r>
-        <w:t>Sebagai sumbu kapiler yang menyerap larutan nutrisi dari bawah menuju akar tanaman</w:t>
-      </w:r>
-    </w:p>
-    <w:p>
-      <w:pPr>
-        <w:spacing w:before="0" w:after="20"/>
-        <w:ind w:left="432"/>
-      </w:pPr>
-      <w:r>
-        <w:rPr>
-          <w:b/>
-        </w:rPr>
-        <w:t xml:space="preserve">C. </w:t>
-      </w:r>
-      <w:r>
-        <w:t>Untuk menyaring kotoran dan lumut yang tumbuh di dalam air tandon</w:t>
-      </w:r>
-    </w:p>
-    <w:p>
-      <w:pPr>
-        <w:spacing w:before="0" w:after="20"/>
-        <w:ind w:left="432"/>
-      </w:pPr>
-      <w:r>
-        <w:rPr>
-          <w:b/>
-        </w:rPr>
-        <w:t xml:space="preserve">D. </w:t>
-      </w:r>
-      <w:r>
-        <w:t>Sebagai pengganti sinar matahari buatan bagi bibit tanaman</w:t>
-      </w:r>
-    </w:p>
-    <w:p>
-      <w:pPr>
-        <w:spacing w:before="120" w:after="40"/>
-      </w:pPr>
-      <w:r>
-        <w:rPr>
-          <w:b/>
-        </w:rPr>
-        <w:t xml:space="preserve">17. </w:t>
-      </w:r>
-      <w:r>
-        <w:t>Perhatikan bait puisi berikut!</w:t>
-        <w:br/>
-        <w:br/>
-        <w:t>Mentari pagi menyapa ramah</w:t>
-        <w:br/>
-        <w:t>Embun menari di ujung dedaunan</w:t>
-        <w:br/>
-        <w:t>Langkah kaki riang melangkah</w:t>
-        <w:br/>
-        <w:t>Menyambut masa depan penuh harapan</w:t>
-        <w:br/>
-        <w:br/>
-        <w:t>Makna ungkapan 'Embun menari di ujung dedaunan' pada bait puisi di atas adalah....</w:t>
-      </w:r>
-    </w:p>
-    <w:p>
-      <w:pPr>
-        <w:spacing w:before="0" w:after="20"/>
-        <w:ind w:left="432"/>
-      </w:pPr>
-      <w:r>
-        <w:rPr>
-          <w:b/>
-        </w:rPr>
-        <w:t xml:space="preserve">A. </w:t>
-      </w:r>
-      <w:r>
-        <w:t>Tetesan air embun pagi yang tampak berkilau dan bergoyang terkena hembusan angin sejuk</w:t>
-      </w:r>
-    </w:p>
-    <w:p>
-      <w:pPr>
-        <w:spacing w:before="0" w:after="20"/>
-        <w:ind w:left="432"/>
-      </w:pPr>
-      <w:r>
-        <w:rPr>
-          <w:b/>
-        </w:rPr>
-        <w:t xml:space="preserve">B. </w:t>
-      </w:r>
-      <w:r>
-        <w:t>Daun-daun berguguran ke tanah karena terkena tetesan air hujan lebat</w:t>
-      </w:r>
-    </w:p>
-    <w:p>
-      <w:pPr>
-        <w:spacing w:before="0" w:after="20"/>
-        <w:ind w:left="432"/>
-      </w:pPr>
-      <w:r>
-        <w:rPr>
-          <w:b/>
-        </w:rPr>
-        <w:t xml:space="preserve">C. </w:t>
-      </w:r>
-      <w:r>
-        <w:t>Udara dingin yang menyebabkan tanaman layu di pagi hari</w:t>
-      </w:r>
-    </w:p>
-    <w:p>
-      <w:pPr>
-        <w:spacing w:before="0" w:after="20"/>
-        <w:ind w:left="432"/>
-      </w:pPr>
-      <w:r>
-        <w:rPr>
-          <w:b/>
-        </w:rPr>
-        <w:t xml:space="preserve">D. </w:t>
-      </w:r>
-      <w:r>
-        <w:t>Cahaya matahari yang terhalang oleh kabut tebal pegunungan</w:t>
-      </w:r>
-    </w:p>
-    <w:p>
-      <w:pPr>
-        <w:spacing w:before="120" w:after="40"/>
-      </w:pPr>
-      <w:r>
-        <w:rPr>
-          <w:b/>
-        </w:rPr>
-        <w:t xml:space="preserve">18. </w:t>
-      </w:r>
-      <w:r>
-        <w:t>Perhatikan kalimat-kalimat petunjuk pembuatan puding berikut!</w:t>
-        <w:br/>
-        <w:t>(1) Setelah uap panasnya berkurang, masukkan puding ke dalam lemari es hingga mengeras.</w:t>
-        <w:br/>
-        <w:t>(2) Campurkan bubuk agar-agar, gula pasir, dan air kelapa muda ke dalam panci secara merata.</w:t>
-        <w:br/>
-        <w:t>(3) Rebus adonan di atas api sedang sambil terus diaduk perlahan hingga mendidih sempurna.</w:t>
-        <w:br/>
-        <w:t>(4) Tuangkan cairan puding yang telah mendidih ke dalam cetakan yang telah disiapkan.</w:t>
-        <w:br/>
-        <w:br/>
-        <w:t>Urutan petunjuk yang tepat dan logis agar menjadi teks prosedur yang padu adalah....</w:t>
-      </w:r>
-    </w:p>
-    <w:p>
-      <w:pPr>
-        <w:spacing w:before="0" w:after="20"/>
-        <w:ind w:left="432"/>
-      </w:pPr>
-      <w:r>
-        <w:rPr>
-          <w:b/>
-        </w:rPr>
-        <w:t xml:space="preserve">□ A. </w:t>
-      </w:r>
-      <w:r>
-        <w:t>(2) - (3) - (4) - (1)</w:t>
-      </w:r>
-    </w:p>
-    <w:p>
-      <w:pPr>
-        <w:spacing w:before="0" w:after="20"/>
-        <w:ind w:left="432"/>
-      </w:pPr>
-      <w:r>
-        <w:rPr>
-          <w:b/>
-        </w:rPr>
-        <w:t xml:space="preserve">□ B. </w:t>
-      </w:r>
-      <w:r>
-        <w:t>(2) - (4) - (3) - (1)</w:t>
-      </w:r>
-    </w:p>
-    <w:p>
-      <w:pPr>
-        <w:spacing w:before="0" w:after="20"/>
-        <w:ind w:left="432"/>
-      </w:pPr>
-      <w:r>
-        <w:rPr>
-          <w:b/>
-        </w:rPr>
-        <w:t xml:space="preserve">□ C. </w:t>
-      </w:r>
-      <w:r>
-        <w:t>(3) - (2) - (4) - (1)</w:t>
-      </w:r>
-    </w:p>
-    <w:p>
-      <w:pPr>
-        <w:spacing w:before="0" w:after="20"/>
-        <w:ind w:left="432"/>
-      </w:pPr>
-      <w:r>
-        <w:rPr>
-          <w:b/>
-        </w:rPr>
-        <w:t xml:space="preserve">□ D. </w:t>
-      </w:r>
-      <w:r>
-        <w:t>(3) - (4) - (2) - (1)</w:t>
-      </w:r>
-    </w:p>
-    <w:p>
-      <w:pPr>
-        <w:ind w:left="432"/>
-      </w:pPr>
-      <w:r>
-        <w:rPr>
-          <w:i/>
-        </w:rPr>
-        <w:t>[Pilihan Ganda Kompleks: Jawaban benar lebih dari satu]</w:t>
-      </w:r>
-    </w:p>
-    <w:p>
-      <w:pPr>
-        <w:spacing w:before="120" w:after="40"/>
-      </w:pPr>
-      <w:r>
-        <w:rPr>
-          <w:b/>
-        </w:rPr>
-        <w:t xml:space="preserve">19. </w:t>
-      </w:r>
-      <w:r>
-        <w:t>Kalimat berikut yang seluruhnya menggunakan kata baku secara tepat sesuai Pedoman Umum Ejaan Bahasa Indonesia (PUEBI/EYD) adalah....</w:t>
-      </w:r>
-    </w:p>
-    <w:p>
-      <w:pPr>
-        <w:spacing w:before="0" w:after="20"/>
-        <w:ind w:left="432"/>
-      </w:pPr>
-      <w:r>
-        <w:rPr>
-          <w:b/>
-        </w:rPr>
-        <w:t xml:space="preserve">A. </w:t>
-      </w:r>
-      <w:r>
-        <w:t>Para pasien sedang antri di apotik untuk mengambil obat resep dokter.</w:t>
-      </w:r>
-    </w:p>
-    <w:p>
-      <w:pPr>
-        <w:spacing w:before="0" w:after="20"/>
-        <w:ind w:left="432"/>
-      </w:pPr>
-      <w:r>
-        <w:rPr>
-          <w:b/>
-        </w:rPr>
-        <w:t xml:space="preserve">B. </w:t>
-      </w:r>
-      <w:r>
-        <w:t>Jadwal praktik dokter spesialis anak di klinik tersebut sudah aktif sejak pagi.</w:t>
-      </w:r>
-    </w:p>
-    <w:p>
-      <w:pPr>
-        <w:spacing w:before="0" w:after="20"/>
-        <w:ind w:left="432"/>
-      </w:pPr>
-      <w:r>
-        <w:rPr>
-          <w:b/>
-        </w:rPr>
-        <w:t xml:space="preserve">C. </w:t>
-      </w:r>
-      <w:r>
-        <w:t>Rian meminta ijin kepada gurunya karena badannya sedang tidak fit.</w:t>
-      </w:r>
-    </w:p>
-    <w:p>
-      <w:pPr>
-        <w:spacing w:before="0" w:after="20"/>
-        <w:ind w:left="432"/>
-      </w:pPr>
-      <w:r>
-        <w:rPr>
-          <w:b/>
-        </w:rPr>
-        <w:t xml:space="preserve">D. </w:t>
-      </w:r>
-      <w:r>
-        <w:t>Kwalitas produk kerajinan bambu itu sangat dikagumi para turis manca negara.</w:t>
-      </w:r>
-    </w:p>
-    <w:p>
-      <w:pPr>
-        <w:spacing w:before="120" w:after="40"/>
-      </w:pPr>
-      <w:r>
-        <w:rPr>
-          <w:b/>
-        </w:rPr>
-        <w:t xml:space="preserve">20. </w:t>
-      </w:r>
-      <w:r>
-        <w:t>Penulisan kalimat langsung berikut yang menggunakan tanda baca dan huruf kapital secara tepat adalah....</w:t>
-      </w:r>
-    </w:p>
-    <w:tbl>
-      <w:tblPr>
-        <w:tblStyle w:val="TableGrid"/>
-        <w:tblW w:type="auto" w:w="0"/>
-        <w:jc w:val="center"/>
-        <w:tblLook w:firstColumn="1" w:firstRow="1" w:lastColumn="0" w:lastRow="0" w:noHBand="0" w:noVBand="1" w:val="04A0"/>
-      </w:tblPr>
-      <w:tblGrid>
-        <w:gridCol w:w="3216"/>
-        <w:gridCol w:w="3216"/>
-        <w:gridCol w:w="3216"/>
-      </w:tblGrid>
-      <w:tr>
-        <w:tc>
-          <w:tcPr>
-            <w:tcW w:type="dxa" w:w="3216"/>
-          </w:tcPr>
-          <w:p>
-            <w:pPr>
-              <w:jc w:val="center"/>
-            </w:pPr>
-            <w:r>
-              <w:rPr>
-                <w:b/>
-              </w:rPr>
-              <w:t>Pernyataan</w:t>
-            </w:r>
-          </w:p>
-        </w:tc>
-        <w:tc>
-          <w:tcPr>
-            <w:tcW w:type="dxa" w:w="3216"/>
-          </w:tcPr>
-          <w:p>
-            <w:pPr>
-              <w:jc w:val="center"/>
-            </w:pPr>
-            <w:r>
-              <w:rPr>
-                <w:b/>
-              </w:rPr>
-              <w:t>Benar</w:t>
-            </w:r>
-          </w:p>
-        </w:tc>
-        <w:tc>
-          <w:tcPr>
-            <w:tcW w:type="dxa" w:w="3216"/>
-          </w:tcPr>
-          <w:p>
-            <w:pPr>
-              <w:jc w:val="center"/>
-            </w:pPr>
-            <w:r>
-              <w:rPr>
-                <w:b/>
-              </w:rPr>
-              <w:t>Salah</w:t>
-            </w:r>
-          </w:p>
-        </w:tc>
-      </w:tr>
-      <w:tr>
-        <w:tc>
-          <w:tcPr>
-            <w:tcW w:type="dxa" w:w="3216"/>
-          </w:tcPr>
-          <w:p>
-            <w:r>
-              <w:t>A. Pernyataan pertama berkaitan dengan konsep dasar materi ini.</w:t>
-            </w:r>
-          </w:p>
-        </w:tc>
-        <w:tc>
-          <w:tcPr>
-            <w:tcW w:type="dxa" w:w="3216"/>
-          </w:tcPr>
-          <w:p>
-            <w:pPr>
-              <w:jc w:val="center"/>
-            </w:pPr>
-            <w:r>
-              <w:t>[   ]</w:t>
-            </w:r>
-          </w:p>
-        </w:tc>
-        <w:tc>
-          <w:tcPr>
-            <w:tcW w:type="dxa" w:w="3216"/>
-          </w:tcPr>
-          <w:p>
-            <w:pPr>
-              <w:jc w:val="center"/>
-            </w:pPr>
-            <w:r>
-              <w:t>[   ]</w:t>
-            </w:r>
-          </w:p>
-        </w:tc>
-      </w:tr>
-      <w:tr>
-        <w:tc>
-          <w:tcPr>
-            <w:tcW w:type="dxa" w:w="3216"/>
-          </w:tcPr>
-          <w:p>
-            <w:r>
-              <w:t>B. Hasil perhitungan akhir bernilai lebih dari 50.</w:t>
-            </w:r>
-          </w:p>
-        </w:tc>
-        <w:tc>
-          <w:tcPr>
-            <w:tcW w:type="dxa" w:w="3216"/>
-          </w:tcPr>
-          <w:p>
-            <w:pPr>
-              <w:jc w:val="center"/>
-            </w:pPr>
-            <w:r>
-              <w:t>[   ]</w:t>
-            </w:r>
-          </w:p>
-        </w:tc>
-        <w:tc>
-          <w:tcPr>
-            <w:tcW w:type="dxa" w:w="3216"/>
-          </w:tcPr>
-          <w:p>
-            <w:pPr>
-              <w:jc w:val="center"/>
-            </w:pPr>
-            <w:r>
-              <w:t>[   ]</w:t>
-            </w:r>
-          </w:p>
-        </w:tc>
-      </w:tr>
-      <w:tr>
-        <w:tc>
-          <w:tcPr>
-            <w:tcW w:type="dxa" w:w="3216"/>
-          </w:tcPr>
-          <w:p>
-            <w:r>
-              <w:t>C. Pernyataan ketiga bernilai salah berdasarkan analisis rumus.</w:t>
-            </w:r>
-          </w:p>
-        </w:tc>
-        <w:tc>
-          <w:tcPr>
-            <w:tcW w:type="dxa" w:w="3216"/>
-          </w:tcPr>
-          <w:p>
-            <w:pPr>
-              <w:jc w:val="center"/>
-            </w:pPr>
-            <w:r>
-              <w:t>[   ]</w:t>
-            </w:r>
-          </w:p>
-        </w:tc>
-        <w:tc>
-          <w:tcPr>
-            <w:tcW w:type="dxa" w:w="3216"/>
-          </w:tcPr>
-          <w:p>
-            <w:pPr>
-              <w:jc w:val="center"/>
-            </w:pPr>
-            <w:r>
-              <w:t>[   ]</w:t>
-            </w:r>
-          </w:p>
-        </w:tc>
-      </w:tr>
-    </w:tbl>
-    <w:p>
-      <w:r>
-        <w:rPr>
-          <w:i/>
-        </w:rPr>
-        <w:t>[Pilihan Ganda Kompleks: Kategori Benar / Salah]</w:t>
-      </w:r>
-    </w:p>
-    <w:p>
-      <w:r>
-        <w:br w:type="page"/>
-      </w:r>
-    </w:p>
-    <w:p>
-      <w:pPr>
-        <w:pStyle w:val="Heading2"/>
-        <w:spacing w:before="160" w:after="160"/>
-      </w:pPr>
-      <w:r>
-        <w:rPr>
-          <w:b/>
-          <w:color w:val="15803D"/>
-          <w:sz w:val="26"/>
-        </w:rPr>
-        <w:t>BAGIAN B: KUNCI JAWABAN &amp; PEMBAHASAN LENGKAP</w:t>
-      </w:r>
+      <w:pPr>
+        <w:spacing w:after="160"/>
+      </w:pPr>
     </w:p>
     <w:p>
       <w:pPr>
@@ -2115,6 +2335,9 @@
       </w:r>
     </w:p>
     <w:p>
+      <w:pPr>
+        <w:spacing w:before="0" w:after="80"/>
+      </w:pPr>
       <w:r>
         <w:rPr>
           <w:color w:val="E5E7EB"/>
@@ -2150,6 +2373,9 @@
       </w:r>
     </w:p>
     <w:p>
+      <w:pPr>
+        <w:spacing w:before="0" w:after="80"/>
+      </w:pPr>
       <w:r>
         <w:rPr>
           <w:color w:val="E5E7EB"/>
@@ -2185,6 +2411,9 @@
       </w:r>
     </w:p>
     <w:p>
+      <w:pPr>
+        <w:spacing w:before="0" w:after="80"/>
+      </w:pPr>
       <w:r>
         <w:rPr>
           <w:color w:val="E5E7EB"/>
@@ -2220,6 +2449,9 @@
       </w:r>
     </w:p>
     <w:p>
+      <w:pPr>
+        <w:spacing w:before="0" w:after="80"/>
+      </w:pPr>
       <w:r>
         <w:rPr>
           <w:color w:val="E5E7EB"/>
@@ -2236,7 +2468,7 @@
           <w:b/>
           <w:color w:val="1E3A8A"/>
         </w:rPr>
-        <w:t>Soal Nomor 5  |  Kunci Jawaban: A, C</w:t>
+        <w:t>Soal Nomor 5  |  Kunci Jawaban: B</w:t>
         <w:br/>
       </w:r>
       <w:r>
@@ -2255,6 +2487,9 @@
       </w:r>
     </w:p>
     <w:p>
+      <w:pPr>
+        <w:spacing w:before="0" w:after="80"/>
+      </w:pPr>
       <w:r>
         <w:rPr>
           <w:color w:val="E5E7EB"/>
@@ -2290,6 +2525,9 @@
       </w:r>
     </w:p>
     <w:p>
+      <w:pPr>
+        <w:spacing w:before="0" w:after="80"/>
+      </w:pPr>
       <w:r>
         <w:rPr>
           <w:color w:val="E5E7EB"/>
@@ -2306,7 +2544,7 @@
           <w:b/>
           <w:color w:val="1E3A8A"/>
         </w:rPr>
-        <w:t>Soal Nomor 7  |  Kunci Jawaban: A: Benar, B: Benar, C: Salah</w:t>
+        <w:t>Soal Nomor 7  |  Kunci Jawaban: B</w:t>
         <w:br/>
       </w:r>
       <w:r>
@@ -2325,6 +2563,9 @@
       </w:r>
     </w:p>
     <w:p>
+      <w:pPr>
+        <w:spacing w:before="0" w:after="80"/>
+      </w:pPr>
       <w:r>
         <w:rPr>
           <w:color w:val="E5E7EB"/>
@@ -2360,6 +2601,9 @@
       </w:r>
     </w:p>
     <w:p>
+      <w:pPr>
+        <w:spacing w:before="0" w:after="80"/>
+      </w:pPr>
       <w:r>
         <w:rPr>
           <w:color w:val="E5E7EB"/>
@@ -2395,6 +2639,9 @@
       </w:r>
     </w:p>
     <w:p>
+      <w:pPr>
+        <w:spacing w:before="0" w:after="80"/>
+      </w:pPr>
       <w:r>
         <w:rPr>
           <w:color w:val="E5E7EB"/>
@@ -2430,6 +2677,9 @@
       </w:r>
     </w:p>
     <w:p>
+      <w:pPr>
+        <w:spacing w:before="0" w:after="80"/>
+      </w:pPr>
       <w:r>
         <w:rPr>
           <w:color w:val="E5E7EB"/>
@@ -2465,6 +2715,9 @@
       </w:r>
     </w:p>
     <w:p>
+      <w:pPr>
+        <w:spacing w:before="0" w:after="80"/>
+      </w:pPr>
       <w:r>
         <w:rPr>
           <w:color w:val="E5E7EB"/>
@@ -2481,7 +2734,7 @@
           <w:b/>
           <w:color w:val="1E3A8A"/>
         </w:rPr>
-        <w:t>Soal Nomor 12  |  Kunci Jawaban: A, C</w:t>
+        <w:t>Soal Nomor 12  |  Kunci Jawaban: B</w:t>
         <w:br/>
       </w:r>
       <w:r>
@@ -2500,6 +2753,9 @@
       </w:r>
     </w:p>
     <w:p>
+      <w:pPr>
+        <w:spacing w:before="0" w:after="80"/>
+      </w:pPr>
       <w:r>
         <w:rPr>
           <w:color w:val="E5E7EB"/>
@@ -2535,6 +2791,9 @@
       </w:r>
     </w:p>
     <w:p>
+      <w:pPr>
+        <w:spacing w:before="0" w:after="80"/>
+      </w:pPr>
       <w:r>
         <w:rPr>
           <w:color w:val="E5E7EB"/>
@@ -2570,6 +2829,9 @@
       </w:r>
     </w:p>
     <w:p>
+      <w:pPr>
+        <w:spacing w:before="0" w:after="80"/>
+      </w:pPr>
       <w:r>
         <w:rPr>
           <w:color w:val="E5E7EB"/>
@@ -2586,7 +2848,7 @@
           <w:b/>
           <w:color w:val="1E3A8A"/>
         </w:rPr>
-        <w:t>Soal Nomor 15  |  Kunci Jawaban: A: Benar, B: Benar, C: Salah</w:t>
+        <w:t>Soal Nomor 15  |  Kunci Jawaban: B</w:t>
         <w:br/>
       </w:r>
       <w:r>
@@ -2605,6 +2867,9 @@
       </w:r>
     </w:p>
     <w:p>
+      <w:pPr>
+        <w:spacing w:before="0" w:after="80"/>
+      </w:pPr>
       <w:r>
         <w:rPr>
           <w:color w:val="E5E7EB"/>
@@ -2640,6 +2905,9 @@
       </w:r>
     </w:p>
     <w:p>
+      <w:pPr>
+        <w:spacing w:before="0" w:after="80"/>
+      </w:pPr>
       <w:r>
         <w:rPr>
           <w:color w:val="E5E7EB"/>
@@ -2675,6 +2943,9 @@
       </w:r>
     </w:p>
     <w:p>
+      <w:pPr>
+        <w:spacing w:before="0" w:after="80"/>
+      </w:pPr>
       <w:r>
         <w:rPr>
           <w:color w:val="E5E7EB"/>
@@ -2691,7 +2962,7 @@
           <w:b/>
           <w:color w:val="1E3A8A"/>
         </w:rPr>
-        <w:t>Soal Nomor 18  |  Kunci Jawaban: A, C</w:t>
+        <w:t>Soal Nomor 18  |  Kunci Jawaban: A</w:t>
         <w:br/>
       </w:r>
       <w:r>
@@ -2720,6 +2991,9 @@
       </w:r>
     </w:p>
     <w:p>
+      <w:pPr>
+        <w:spacing w:before="0" w:after="80"/>
+      </w:pPr>
       <w:r>
         <w:rPr>
           <w:color w:val="E5E7EB"/>
@@ -2765,6 +3039,9 @@
       </w:r>
     </w:p>
     <w:p>
+      <w:pPr>
+        <w:spacing w:before="0" w:after="80"/>
+      </w:pPr>
       <w:r>
         <w:rPr>
           <w:color w:val="E5E7EB"/>
@@ -2781,7 +3058,7 @@
           <w:b/>
           <w:color w:val="1E3A8A"/>
         </w:rPr>
-        <w:t>Soal Nomor 20  |  Kunci Jawaban: A: Benar, B: Benar, C: Salah</w:t>
+        <w:t>Soal Nomor 20  |  Kunci Jawaban: A</w:t>
         <w:br/>
       </w:r>
       <w:r>
@@ -2808,6 +3085,9 @@
       </w:r>
     </w:p>
     <w:p>
+      <w:pPr>
+        <w:spacing w:before="0" w:after="80"/>
+      </w:pPr>
       <w:r>
         <w:rPr>
           <w:color w:val="E5E7EB"/>
@@ -3188,6 +3468,11 @@
     <w:name w:val="Normal"/>
     <w:qFormat/>
     <w:rsid w:val="00FC693F"/>
+    <w:rPr>
+      <w:rFonts w:ascii="Calibri" w:hAnsi="Calibri"/>
+      <w:color w:val="1F2937"/>
+      <w:sz w:val="22"/>
+    </w:rPr>
   </w:style>
   <w:style w:type="paragraph" w:styleId="Header">
     <w:name w:val="header"/>

</xml_diff>

<commit_message>
Restore clean readable layout for Paket 1 & 2 .docx files
</commit_message>
<xml_diff>
--- a/Quiz_Web_Bahasa_Indonesia_Paket_1.docx
+++ b/Quiz_Web_Bahasa_Indonesia_Paket_1.docx
@@ -5,2432 +5,1858 @@
     <w:p>
       <w:pPr>
         <w:pStyle w:val="Heading1"/>
+        <w:jc w:val="center"/>
       </w:pPr>
       <w:r>
-        <w:t>Quiz_Web_Bahasa_Indonesia_Paket_1</w:t>
+        <w:t>SmartDrill SD 2026 - Bahasa Indonesia Paket 1</w:t>
       </w:r>
     </w:p>
-    <w:tbl>
-      <w:tblPr>
-        <w:tblW w:type="auto" w:w="0"/>
-        <w:tblLook w:firstColumn="1" w:firstRow="1" w:lastColumn="0" w:lastRow="0" w:noHBand="0" w:noVBand="1" w:val="04A0"/>
-      </w:tblPr>
-      <w:tblGrid>
-        <w:gridCol w:w="785"/>
-        <w:gridCol w:w="785"/>
-        <w:gridCol w:w="785"/>
-        <w:gridCol w:w="785"/>
-        <w:gridCol w:w="785"/>
-        <w:gridCol w:w="785"/>
-        <w:gridCol w:w="785"/>
-        <w:gridCol w:w="785"/>
-        <w:gridCol w:w="785"/>
-        <w:gridCol w:w="785"/>
-        <w:gridCol w:w="785"/>
-      </w:tblGrid>
-      <w:tr>
-        <w:tc>
-          <w:tcPr>
-            <w:tcW w:type="dxa" w:w="785"/>
-          </w:tcPr>
-          <w:p>
-            <w:r>
-              <w:rPr>
-                <w:sz w:val="20"/>
-              </w:rPr>
-              <w:t>Question Text</w:t>
-            </w:r>
-          </w:p>
-        </w:tc>
-        <w:tc>
-          <w:tcPr>
-            <w:tcW w:type="dxa" w:w="785"/>
-          </w:tcPr>
-          <w:p>
-            <w:r>
-              <w:rPr>
-                <w:sz w:val="20"/>
-              </w:rPr>
-              <w:t>Question Type</w:t>
-            </w:r>
-          </w:p>
-        </w:tc>
-        <w:tc>
-          <w:tcPr>
-            <w:tcW w:type="dxa" w:w="785"/>
-          </w:tcPr>
-          <w:p>
-            <w:r>
-              <w:rPr>
-                <w:sz w:val="20"/>
-              </w:rPr>
-              <w:t>Option 1</w:t>
-            </w:r>
-          </w:p>
-        </w:tc>
-        <w:tc>
-          <w:tcPr>
-            <w:tcW w:type="dxa" w:w="785"/>
-          </w:tcPr>
-          <w:p>
-            <w:r>
-              <w:rPr>
-                <w:sz w:val="20"/>
-              </w:rPr>
-              <w:t>Option 2</w:t>
-            </w:r>
-          </w:p>
-        </w:tc>
-        <w:tc>
-          <w:tcPr>
-            <w:tcW w:type="dxa" w:w="785"/>
-          </w:tcPr>
-          <w:p>
-            <w:r>
-              <w:rPr>
-                <w:sz w:val="20"/>
-              </w:rPr>
-              <w:t>Option 3</w:t>
-            </w:r>
-          </w:p>
-        </w:tc>
-        <w:tc>
-          <w:tcPr>
-            <w:tcW w:type="dxa" w:w="785"/>
-          </w:tcPr>
-          <w:p>
-            <w:r>
-              <w:rPr>
-                <w:sz w:val="20"/>
-              </w:rPr>
-              <w:t>Option 4</w:t>
-            </w:r>
-          </w:p>
-        </w:tc>
-        <w:tc>
-          <w:tcPr>
-            <w:tcW w:type="dxa" w:w="785"/>
-          </w:tcPr>
-          <w:p>
-            <w:r>
-              <w:rPr>
-                <w:sz w:val="20"/>
-              </w:rPr>
-              <w:t>Option 5</w:t>
-            </w:r>
-          </w:p>
-        </w:tc>
-        <w:tc>
-          <w:tcPr>
-            <w:tcW w:type="dxa" w:w="785"/>
-          </w:tcPr>
-          <w:p>
-            <w:r>
-              <w:rPr>
-                <w:sz w:val="20"/>
-              </w:rPr>
-              <w:t>Correct Answer</w:t>
-            </w:r>
-          </w:p>
-        </w:tc>
-        <w:tc>
-          <w:tcPr>
-            <w:tcW w:type="dxa" w:w="785"/>
-          </w:tcPr>
-          <w:p>
-            <w:r>
-              <w:rPr>
-                <w:sz w:val="20"/>
-              </w:rPr>
-              <w:t>Time in seconds</w:t>
-            </w:r>
-          </w:p>
-        </w:tc>
-        <w:tc>
-          <w:tcPr>
-            <w:tcW w:type="dxa" w:w="785"/>
-          </w:tcPr>
-          <w:p>
-            <w:r>
-              <w:rPr>
-                <w:sz w:val="20"/>
-              </w:rPr>
-              <w:t>Image Link</w:t>
-            </w:r>
-          </w:p>
-        </w:tc>
-        <w:tc>
-          <w:tcPr>
-            <w:tcW w:type="dxa" w:w="785"/>
-          </w:tcPr>
-          <w:p>
-            <w:r>
-              <w:rPr>
-                <w:sz w:val="20"/>
-              </w:rPr>
-              <w:t>Explanation</w:t>
-            </w:r>
-          </w:p>
-        </w:tc>
-      </w:tr>
-      <w:tr>
-        <w:tc>
-          <w:tcPr>
-            <w:tcW w:type="dxa" w:w="785"/>
-          </w:tcPr>
-          <w:p>
-            <w:r>
-              <w:t>Bacalah teks informasi berikut dengan cermat untuk menjawab soal nomor 1 sampai 5!</w:t>
-              <w:br/>
-              <w:br/>
-              <w:t>Penyu Sisik: Sang Penjaga Terumbu Karang Nusantara</w:t>
-              <w:br/>
-              <w:br/>
-              <w:t>Penyu sisik (Eretmochelys imbricata) merupakan salah satu spesies penyu laut yang memiliki peran sangat krusial dalam menjaga keseimbangan ekosistem terumbu karang di perairan tropis Indonesia. Ciri khas utama satwa ini terletak pada bentuk paruhnya yang runcing menyerupai paruh burung elang serta susunan sisik karapasnya yang bertumpuk indah keemasan. Makanan utama penyu sisik adalah spons laut (hewan porifera) yang hidup menempel pada karang. Dengan memakan spons laut tersebut, penyu sisik mengontrol populasinya agar tidak tumbuh berlebihan dan menutupi karang. Tindakan alami ini memberi ruang bagi terumbu karang untuk tumbuh subur dan menjadi rumah serta tempat berkembang biak bagi aneka jenis ikan.</w:t>
-              <w:br/>
-              <w:br/>
-              <w:t>Namun, keberadaan penyu sisik saat ini berada dalam bayang-bayang ancaman kepunahan yang nyata. Populasi satwa langka ini terus mengalami penurunan tajam akibat perburuan liar untuk diambil cangkangnya sebagai bahan kerajinan bernilai tinggi, perdagangan telur penyu secara ilegal, serta pencemaran sampah plastik di lautan. Penyu kerap mengira kantong plastik transparan yang terapung di perairan sebagai ubur-ubur santapan mereka. Akibatnya, plastik menyumbat saluran pencernaan dan menyebabkan kematian tragis bagi ribuan penyu setiap tahunnya.</w:t>
-              <w:br/>
-              <w:br/>
-              <w:t>Untuk mencegah kepunahan satwa karismatik ini, pemerintah bersama komunitas pelestari alam menggiatkan berbagai upaya konservasi dan penetasan semi-alami, seperti di pesisir Sukamade, Jawa Timur dan Kepulauan Derawan, Kalimantan Timur. Di pusat konservasi, sarang telur penyu di pantai dijaga ketat dari incaran predator maupun pemburu. Telur-telur yang berhasil diamankan dipindahkan ke bak penetasan khusus hingga menetas. Setelah menetas, anak penyu (tukik) dirawat secara intensif selama beberapa hari sebelum akhirnya dilepasliarkan kembali ke laut lepas pada malam atau dini hari guna menghindari serangan burung pemangsa.</w:t>
-              <w:br/>
-              <w:br/>
-              <w:t>Berdasarkan paragraf pertama teks di atas, peran ekologis penyu sisik yang sangat penting bagi kelestarian terumbu karang adalah....</w:t>
-            </w:r>
-          </w:p>
-        </w:tc>
-        <w:tc>
-          <w:tcPr>
-            <w:tcW w:type="dxa" w:w="785"/>
-          </w:tcPr>
-          <w:p>
-            <w:r>
-              <w:t>Multiple Choice</w:t>
-            </w:r>
-          </w:p>
-        </w:tc>
-        <w:tc>
-          <w:tcPr>
-            <w:tcW w:type="dxa" w:w="785"/>
-          </w:tcPr>
-          <w:p>
-            <w:r>
-              <w:t>Menghasilkan zat kapur alami yang mempercepat pembentukan karang baru</w:t>
-            </w:r>
-          </w:p>
-        </w:tc>
-        <w:tc>
-          <w:tcPr>
-            <w:tcW w:type="dxa" w:w="785"/>
-          </w:tcPr>
-          <w:p>
-            <w:r>
-              <w:t>Memakan spons laut agar tidak tumbuh berlebihan dan menutupi terumbu karang</w:t>
-            </w:r>
-          </w:p>
-        </w:tc>
-        <w:tc>
-          <w:tcPr>
-            <w:tcW w:type="dxa" w:w="785"/>
-          </w:tcPr>
-          <w:p>
-            <w:r>
-              <w:t>Menjaga kejernihan air laut dengan menyaring endapan lumpur pantai</w:t>
-            </w:r>
-          </w:p>
-        </w:tc>
-        <w:tc>
-          <w:tcPr>
-            <w:tcW w:type="dxa" w:w="785"/>
-          </w:tcPr>
-          <w:p>
-            <w:r>
-              <w:t>Menjadi tempat bertenggernya aneka jenis burung laut pemangsa</w:t>
-            </w:r>
-          </w:p>
-        </w:tc>
-        <w:tc>
-          <w:tcPr>
-            <w:tcW w:type="dxa" w:w="785"/>
-          </w:tcPr>
-          <w:p>
-            <w:r/>
-          </w:p>
-        </w:tc>
-        <w:tc>
-          <w:tcPr>
-            <w:tcW w:type="dxa" w:w="785"/>
-          </w:tcPr>
-          <w:p>
-            <w:r>
-              <w:t>2</w:t>
-            </w:r>
-          </w:p>
-        </w:tc>
-        <w:tc>
-          <w:tcPr>
-            <w:tcW w:type="dxa" w:w="785"/>
-          </w:tcPr>
-          <w:p>
-            <w:r>
-              <w:t>60</w:t>
-            </w:r>
-          </w:p>
-        </w:tc>
-        <w:tc>
-          <w:tcPr>
-            <w:tcW w:type="dxa" w:w="785"/>
-          </w:tcPr>
-          <w:p>
-            <w:r/>
-          </w:p>
-        </w:tc>
-        <w:tc>
-          <w:tcPr>
-            <w:tcW w:type="dxa" w:w="785"/>
-          </w:tcPr>
-          <w:p>
-            <w:r>
-              <w:t>Pada paragraf pertama secara tersurat dinyatakan: 'Makanan utama penyu sisik adalah spons laut (hewan porifera) yang hidup menempel pada karang. Dengan memakan spons laut tersebut, penyu sisik mengontrol populasinya agar tidak tumbuh berlebihan dan menutupi karang.' Jadi jawaban yang tepat adalah B.</w:t>
-            </w:r>
-          </w:p>
-        </w:tc>
-      </w:tr>
-      <w:tr>
-        <w:tc>
-          <w:tcPr>
-            <w:tcW w:type="dxa" w:w="785"/>
-          </w:tcPr>
-          <w:p>
-            <w:r>
-              <w:t>Ide pokok yang terdapat pada paragraf kedua teks 'Penyu Sisik: Sang Penjaga Terumbu Karang Nusantara' adalah....</w:t>
-            </w:r>
-          </w:p>
-        </w:tc>
-        <w:tc>
-          <w:tcPr>
-            <w:tcW w:type="dxa" w:w="785"/>
-          </w:tcPr>
-          <w:p>
-            <w:r>
-              <w:t>Checkbox</w:t>
-            </w:r>
-          </w:p>
-        </w:tc>
-        <w:tc>
-          <w:tcPr>
-            <w:tcW w:type="dxa" w:w="785"/>
-          </w:tcPr>
-          <w:p>
-            <w:r>
-              <w:t>Jenis kerajinan tangan bernilai ekonomi dari cangkang penyu sisik</w:t>
-            </w:r>
-          </w:p>
-        </w:tc>
-        <w:tc>
-          <w:tcPr>
-            <w:tcW w:type="dxa" w:w="785"/>
-          </w:tcPr>
-          <w:p>
-            <w:r>
-              <w:t>Penyebab pencemaran sampah plastik di wilayah perairan laut Indonesia</w:t>
-            </w:r>
-          </w:p>
-        </w:tc>
-        <w:tc>
-          <w:tcPr>
-            <w:tcW w:type="dxa" w:w="785"/>
-          </w:tcPr>
-          <w:p>
-            <w:r>
-              <w:t>Ancaman kepunahan populasi penyu sisik akibat aktivitas manusia dan limbah plastik</w:t>
-            </w:r>
-          </w:p>
-        </w:tc>
-        <w:tc>
-          <w:tcPr>
-            <w:tcW w:type="dxa" w:w="785"/>
-          </w:tcPr>
-          <w:p>
-            <w:r>
-              <w:t>Kemiripan fisik antara kantong plastik transparan dengan ubur-ubur laut</w:t>
-            </w:r>
-          </w:p>
-        </w:tc>
-        <w:tc>
-          <w:tcPr>
-            <w:tcW w:type="dxa" w:w="785"/>
-          </w:tcPr>
-          <w:p>
-            <w:r/>
-          </w:p>
-        </w:tc>
-        <w:tc>
-          <w:tcPr>
-            <w:tcW w:type="dxa" w:w="785"/>
-          </w:tcPr>
-          <w:p>
-            <w:r>
-              <w:t>Option 1, Option 2</w:t>
-            </w:r>
-          </w:p>
-        </w:tc>
-        <w:tc>
-          <w:tcPr>
-            <w:tcW w:type="dxa" w:w="785"/>
-          </w:tcPr>
-          <w:p>
-            <w:r>
-              <w:t>60</w:t>
-            </w:r>
-          </w:p>
-        </w:tc>
-        <w:tc>
-          <w:tcPr>
-            <w:tcW w:type="dxa" w:w="785"/>
-          </w:tcPr>
-          <w:p>
-            <w:r/>
-          </w:p>
-        </w:tc>
-        <w:tc>
-          <w:tcPr>
-            <w:tcW w:type="dxa" w:w="785"/>
-          </w:tcPr>
-          <w:p>
-            <w:r>
-              <w:t>Paragraf kedua membahas faktor-faktor yang mengancam kelangsungan hidup penyu sisik (perburuan cangkang, pencurian telur, dan sampah plastik di laut). Kalimat utamanya terletak di awal paragraf: 'Namun, keberadaan penyu sisik saat ini berada dalam bayang-bayang ancaman kepunahan yang nyata.' Jadi ide pokoknya adalah C.</w:t>
-            </w:r>
-          </w:p>
-        </w:tc>
-      </w:tr>
-      <w:tr>
-        <w:tc>
-          <w:tcPr>
-            <w:tcW w:type="dxa" w:w="785"/>
-          </w:tcPr>
-          <w:p>
-            <w:r>
-              <w:t>Makna istilah 'konservasi' pada paragraf ketiga teks tersebut adalah....</w:t>
-            </w:r>
-          </w:p>
-        </w:tc>
-        <w:tc>
-          <w:tcPr>
-            <w:tcW w:type="dxa" w:w="785"/>
-          </w:tcPr>
-          <w:p>
-            <w:r>
-              <w:t>True/False</w:t>
-            </w:r>
-          </w:p>
-        </w:tc>
-        <w:tc>
-          <w:tcPr>
-            <w:tcW w:type="dxa" w:w="785"/>
-          </w:tcPr>
-          <w:p>
-            <w:r>
-              <w:t>True</w:t>
-            </w:r>
-          </w:p>
-        </w:tc>
-        <w:tc>
-          <w:tcPr>
-            <w:tcW w:type="dxa" w:w="785"/>
-          </w:tcPr>
-          <w:p>
-            <w:r>
-              <w:t>False</w:t>
-            </w:r>
-          </w:p>
-        </w:tc>
-        <w:tc>
-          <w:tcPr>
-            <w:tcW w:type="dxa" w:w="785"/>
-          </w:tcPr>
-          <w:p>
-            <w:r/>
-          </w:p>
-        </w:tc>
-        <w:tc>
-          <w:tcPr>
-            <w:tcW w:type="dxa" w:w="785"/>
-          </w:tcPr>
-          <w:p>
-            <w:r/>
-          </w:p>
-        </w:tc>
-        <w:tc>
-          <w:tcPr>
-            <w:tcW w:type="dxa" w:w="785"/>
-          </w:tcPr>
-          <w:p>
-            <w:r/>
-          </w:p>
-        </w:tc>
-        <w:tc>
-          <w:tcPr>
-            <w:tcW w:type="dxa" w:w="785"/>
-          </w:tcPr>
-          <w:p>
-            <w:r>
-              <w:t>True</w:t>
-            </w:r>
-          </w:p>
-        </w:tc>
-        <w:tc>
-          <w:tcPr>
-            <w:tcW w:type="dxa" w:w="785"/>
-          </w:tcPr>
-          <w:p>
-            <w:r>
-              <w:t>60</w:t>
-            </w:r>
-          </w:p>
-        </w:tc>
-        <w:tc>
-          <w:tcPr>
-            <w:tcW w:type="dxa" w:w="785"/>
-          </w:tcPr>
-          <w:p>
-            <w:r/>
-          </w:p>
-        </w:tc>
-        <w:tc>
-          <w:tcPr>
-            <w:tcW w:type="dxa" w:w="785"/>
-          </w:tcPr>
-          <w:p>
-            <w:r>
-              <w:t>Dalam KBBI dan konteks pelestarian lingkungan, 'konservasi' bermakna upaya perlindungan, pelestarian, dan pengelolaan sumber daya alam hayati secara bijaksana untuk mencegah kepunahan. Jadi pilihan yang tepat adalah B.</w:t>
-            </w:r>
-          </w:p>
-        </w:tc>
-      </w:tr>
-      <w:tr>
-        <w:tc>
-          <w:tcPr>
-            <w:tcW w:type="dxa" w:w="785"/>
-          </w:tcPr>
-          <w:p>
-            <w:r>
-              <w:t>Berdasarkan teks bacaan, mengapa sampah kantong plastik sangat berbahaya dan sering tertelan oleh penyu sisik di lautan?</w:t>
-            </w:r>
-          </w:p>
-        </w:tc>
-        <w:tc>
-          <w:tcPr>
-            <w:tcW w:type="dxa" w:w="785"/>
-          </w:tcPr>
-          <w:p>
-            <w:r>
-              <w:t>Multiple Choice</w:t>
-            </w:r>
-          </w:p>
-        </w:tc>
-        <w:tc>
-          <w:tcPr>
-            <w:tcW w:type="dxa" w:w="785"/>
-          </w:tcPr>
-          <w:p>
-            <w:r>
-              <w:t>Kantong plastik mengeluarkan aroma amis yang memancing selera makan penyu</w:t>
-            </w:r>
-          </w:p>
-        </w:tc>
-        <w:tc>
-          <w:tcPr>
-            <w:tcW w:type="dxa" w:w="785"/>
-          </w:tcPr>
-          <w:p>
-            <w:r>
-              <w:t>Penyu sisik mengira kantong plastik transparan yang terapung sebagai ubur-ubur</w:t>
-            </w:r>
-          </w:p>
-        </w:tc>
-        <w:tc>
-          <w:tcPr>
-            <w:tcW w:type="dxa" w:w="785"/>
-          </w:tcPr>
-          <w:p>
-            <w:r>
-              <w:t>Sampah plastik menempel erat pada spons laut yang menjadi mangsa penyu</w:t>
-            </w:r>
-          </w:p>
-        </w:tc>
-        <w:tc>
-          <w:tcPr>
-            <w:tcW w:type="dxa" w:w="785"/>
-          </w:tcPr>
-          <w:p>
-            <w:r>
-              <w:t>Penyu sengaja memakan plastik untuk membantu proses pencernaan cangkangnya</w:t>
-            </w:r>
-          </w:p>
-        </w:tc>
-        <w:tc>
-          <w:tcPr>
-            <w:tcW w:type="dxa" w:w="785"/>
-          </w:tcPr>
-          <w:p>
-            <w:r/>
-          </w:p>
-        </w:tc>
-        <w:tc>
-          <w:tcPr>
-            <w:tcW w:type="dxa" w:w="785"/>
-          </w:tcPr>
-          <w:p>
-            <w:r>
-              <w:t>2</w:t>
-            </w:r>
-          </w:p>
-        </w:tc>
-        <w:tc>
-          <w:tcPr>
-            <w:tcW w:type="dxa" w:w="785"/>
-          </w:tcPr>
-          <w:p>
-            <w:r>
-              <w:t>60</w:t>
-            </w:r>
-          </w:p>
-        </w:tc>
-        <w:tc>
-          <w:tcPr>
-            <w:tcW w:type="dxa" w:w="785"/>
-          </w:tcPr>
-          <w:p>
-            <w:r/>
-          </w:p>
-        </w:tc>
-        <w:tc>
-          <w:tcPr>
-            <w:tcW w:type="dxa" w:w="785"/>
-          </w:tcPr>
-          <w:p>
-            <w:r>
-              <w:t>Pada paragraf kedua dijelaskan: 'Penyu kerap mengira kantong plastik transparan yang terapung di perairan sebagai ubur-ubur santapan mereka. Akibatnya, plastik menyumbat saluran pencernaan...' Jadi penyebab utamanya adalah kemiripan visual dengan ubur-ubur (Pilihan B).</w:t>
-            </w:r>
-          </w:p>
-        </w:tc>
-      </w:tr>
-      <w:tr>
-        <w:tc>
-          <w:tcPr>
-            <w:tcW w:type="dxa" w:w="785"/>
-          </w:tcPr>
-          <w:p>
-            <w:r>
-              <w:t>Pernyataan berikut yang TIDAK SESUAI dengan isi teks 'Penyu Sisik: Sang Penjaga Terumbu Karang Nusantara' adalah....</w:t>
-            </w:r>
-          </w:p>
-        </w:tc>
-        <w:tc>
-          <w:tcPr>
-            <w:tcW w:type="dxa" w:w="785"/>
-          </w:tcPr>
-          <w:p>
-            <w:r>
-              <w:t>Checkbox</w:t>
-            </w:r>
-          </w:p>
-        </w:tc>
-        <w:tc>
-          <w:tcPr>
-            <w:tcW w:type="dxa" w:w="785"/>
-          </w:tcPr>
-          <w:p>
-            <w:r>
-              <w:t>Penyu sisik memiliki bentuk paruh runcing menyerupai paruh burung elang.</w:t>
-            </w:r>
-          </w:p>
-        </w:tc>
-        <w:tc>
-          <w:tcPr>
-            <w:tcW w:type="dxa" w:w="785"/>
-          </w:tcPr>
-          <w:p>
-            <w:r>
-              <w:t>Tukik dilepasliarkan pada siang hari terik agar tubuhnya cepat kuat berenang.</w:t>
-            </w:r>
-          </w:p>
-        </w:tc>
-        <w:tc>
-          <w:tcPr>
-            <w:tcW w:type="dxa" w:w="785"/>
-          </w:tcPr>
-          <w:p>
-            <w:r>
-              <w:t>Kepulauan Derawan dan Sukamade merupakan contoh lokasi konservasi penyu.</w:t>
-            </w:r>
-          </w:p>
-        </w:tc>
-        <w:tc>
-          <w:tcPr>
-            <w:tcW w:type="dxa" w:w="785"/>
-          </w:tcPr>
-          <w:p>
-            <w:r>
-              <w:t>Populasi penyu sisik berkurang salah satunya karena perburuan cangkang sisiknya.</w:t>
-            </w:r>
-          </w:p>
-        </w:tc>
-        <w:tc>
-          <w:tcPr>
-            <w:tcW w:type="dxa" w:w="785"/>
-          </w:tcPr>
-          <w:p>
-            <w:r/>
-          </w:p>
-        </w:tc>
-        <w:tc>
-          <w:tcPr>
-            <w:tcW w:type="dxa" w:w="785"/>
-          </w:tcPr>
-          <w:p>
-            <w:r>
-              <w:t>Option 1, Option 2</w:t>
-            </w:r>
-          </w:p>
-        </w:tc>
-        <w:tc>
-          <w:tcPr>
-            <w:tcW w:type="dxa" w:w="785"/>
-          </w:tcPr>
-          <w:p>
-            <w:r>
-              <w:t>60</w:t>
-            </w:r>
-          </w:p>
-        </w:tc>
-        <w:tc>
-          <w:tcPr>
-            <w:tcW w:type="dxa" w:w="785"/>
-          </w:tcPr>
-          <w:p>
-            <w:r/>
-          </w:p>
-        </w:tc>
-        <w:tc>
-          <w:tcPr>
-            <w:tcW w:type="dxa" w:w="785"/>
-          </w:tcPr>
-          <w:p>
-            <w:r>
-              <w:t>Pada paragraf ketiga dinyatakan: 'Setelah menetas, anak penyu (tukik) dirawat secara intensif selama beberapa hari sebelum akhirnya dilepasliarkan kembali ke laut lepas pada malam atau dini hari guna menghindari serangan burung pemangsa.' Oleh karena itu, pernyataan B (dilepasliarkan pada siang hari terik) tidak sesuai/salah.</w:t>
-            </w:r>
-          </w:p>
-        </w:tc>
-      </w:tr>
-      <w:tr>
-        <w:tc>
-          <w:tcPr>
-            <w:tcW w:type="dxa" w:w="785"/>
-          </w:tcPr>
-          <w:p>
-            <w:r>
-              <w:t>Bacalah cerita anak berikut dengan cermat untuk menjawab soal nomor 6 sampai 10!</w:t>
-              <w:br/>
-              <w:br/>
-              <w:t>Kejujuran di Balik Kantong Belacu Kakek Suro</w:t>
-              <w:br/>
-              <w:br/>
-              <w:t>Siang itu, terik matahari membakar jalanan Desa Sukamaju. Arga mengayuh sepeda ontel tuanya dengan peluh yang mengucur di pelipis. Di keranjang depan sepeda, tersusun rapi beberapa ikat bayam dan kangkung segar hasil kebun pekarangan rumahnya yang hendak ia jajakan ke pasar desa demi membantu keperluan dapur ibunya. Ketika melewati tikungan jembatan kayu di perbatasan desa, roda depan sepedanya menabrak sesuatu. Arga mengerem mendadak dan menoleh ke bawah. Di tepi semak-semak rumput gajah, tergeletak sebuah kantong kain belacu berwarna cokelat kusam.</w:t>
-              <w:br/>
-              <w:br/>
-              <w:t>Arga turun dari sepeda dan memungut kantong tersebut. Alangkah terkejutnya ia ketika membuka resletingnya: di dalamnya terdapat beberapa lembar uang ratusan ribu rupiah yang diikat karet gelang, sebuah kartu identitas penduduk, dan buku pemeriksaan kesehatan lansia atas nama Kakek Suro. Kakek Suro adalah seorang perajin anyaman bambu tua yang tinggal sebatang kara di ujung dusun.</w:t>
-              <w:br/>
-              <w:br/>
-              <w:t xml:space="preserve">Di dalam hati Arga, sempat terlintas bisikan godaan. Sepatu sekolahnya sudah jebol di bagian tumit, dan uang itu lebih dari cukup untuk membeli sepatu baru yang bagus. Namun, seketika petuah bijak sang ibu bergaung kuat di dadanya: "Kejujuran adalah kehormatan hidup kita, Arga. Mengambil hak orang lain hanya akan menanam duri dalam jiwa." </w:t>
-              <w:br/>
-              <w:br/>
-              <w:t>Tanpa ragu lagi, Arga memutar haluan sepedanya menuju gubuk Kakek Suro. Sesampainya di sana, Arga mendapati sang kakek sedang duduk lemas di tangga bambu sambil meneteskan air mata. Ternyata, uang tersebut adalah tabungan hasil penjualan tampah dan bakul anyaman selama empat bulan yang rencananya akan dipakai untuk menebus obat asma di puskesmas. Ketika Arga mengulurkan kantong belacu itu utuh tanpa berkurang sedikit pun, Kakek Suro seketika memeluk Arga erat dengan linangan air mata haru dan tak henti memanjatkan doa berkah bagi anak yang berbudi luhur itu.</w:t>
-              <w:br/>
-              <w:br/>
-              <w:t>Watak utama tokoh Arga yang tergambar paling dominan dalam cerita di atas adalah....</w:t>
-            </w:r>
-          </w:p>
-        </w:tc>
-        <w:tc>
-          <w:tcPr>
-            <w:tcW w:type="dxa" w:w="785"/>
-          </w:tcPr>
-          <w:p>
-            <w:r>
-              <w:t>True/False</w:t>
-            </w:r>
-          </w:p>
-        </w:tc>
-        <w:tc>
-          <w:tcPr>
-            <w:tcW w:type="dxa" w:w="785"/>
-          </w:tcPr>
-          <w:p>
-            <w:r>
-              <w:t>True</w:t>
-            </w:r>
-          </w:p>
-        </w:tc>
-        <w:tc>
-          <w:tcPr>
-            <w:tcW w:type="dxa" w:w="785"/>
-          </w:tcPr>
-          <w:p>
-            <w:r>
-              <w:t>False</w:t>
-            </w:r>
-          </w:p>
-        </w:tc>
-        <w:tc>
-          <w:tcPr>
-            <w:tcW w:type="dxa" w:w="785"/>
-          </w:tcPr>
-          <w:p>
-            <w:r/>
-          </w:p>
-        </w:tc>
-        <w:tc>
-          <w:tcPr>
-            <w:tcW w:type="dxa" w:w="785"/>
-          </w:tcPr>
-          <w:p>
-            <w:r/>
-          </w:p>
-        </w:tc>
-        <w:tc>
-          <w:tcPr>
-            <w:tcW w:type="dxa" w:w="785"/>
-          </w:tcPr>
-          <w:p>
-            <w:r/>
-          </w:p>
-        </w:tc>
-        <w:tc>
-          <w:tcPr>
-            <w:tcW w:type="dxa" w:w="785"/>
-          </w:tcPr>
-          <w:p>
-            <w:r>
-              <w:t>True</w:t>
-            </w:r>
-          </w:p>
-        </w:tc>
-        <w:tc>
-          <w:tcPr>
-            <w:tcW w:type="dxa" w:w="785"/>
-          </w:tcPr>
-          <w:p>
-            <w:r>
-              <w:t>60</w:t>
-            </w:r>
-          </w:p>
-        </w:tc>
-        <w:tc>
-          <w:tcPr>
-            <w:tcW w:type="dxa" w:w="785"/>
-          </w:tcPr>
-          <w:p>
-            <w:r/>
-          </w:p>
-        </w:tc>
-        <w:tc>
-          <w:tcPr>
-            <w:tcW w:type="dxa" w:w="785"/>
-          </w:tcPr>
-          <w:p>
-            <w:r>
-              <w:t>Arga membantu ibunya menjual sayur (berbakti), dan meskipun tergoda untuk membeli sepatu baru yang rusak, ia tetap mengembalikan kantong berisi uang kepada Kakek Suro (jujur dan berbudi pekerti luhur). Jadi watak dominan Arga adalah pilihan B.</w:t>
-            </w:r>
-          </w:p>
-        </w:tc>
-      </w:tr>
-      <w:tr>
-        <w:tc>
-          <w:tcPr>
-            <w:tcW w:type="dxa" w:w="785"/>
-          </w:tcPr>
-          <w:p>
-            <w:r>
-              <w:t>Latar tempat terjadinya peristiwa penemuan kantong belacu cokelat oleh Arga adalah....</w:t>
-            </w:r>
-          </w:p>
-        </w:tc>
-        <w:tc>
-          <w:tcPr>
-            <w:tcW w:type="dxa" w:w="785"/>
-          </w:tcPr>
-          <w:p>
-            <w:r>
-              <w:t>Multiple Choice</w:t>
-            </w:r>
-          </w:p>
-        </w:tc>
-        <w:tc>
-          <w:tcPr>
-            <w:tcW w:type="dxa" w:w="785"/>
-          </w:tcPr>
-          <w:p>
-            <w:r>
-              <w:t>Di tengah pasar desa yang ramai</w:t>
-            </w:r>
-          </w:p>
-        </w:tc>
-        <w:tc>
-          <w:tcPr>
-            <w:tcW w:type="dxa" w:w="785"/>
-          </w:tcPr>
-          <w:p>
-            <w:r>
-              <w:t>Di tepi semak rumput gajah dekat tikungan jembatan kayu perbatasan desa</w:t>
-            </w:r>
-          </w:p>
-        </w:tc>
-        <w:tc>
-          <w:tcPr>
-            <w:tcW w:type="dxa" w:w="785"/>
-          </w:tcPr>
-          <w:p>
-            <w:r>
-              <w:t>Di pekarangan rumah gubuk milik Kakek Suro</w:t>
-            </w:r>
-          </w:p>
-        </w:tc>
-        <w:tc>
-          <w:tcPr>
-            <w:tcW w:type="dxa" w:w="785"/>
-          </w:tcPr>
-          <w:p>
-            <w:r>
-              <w:t>Di ruang tunggu puskesmas desa</w:t>
-            </w:r>
-          </w:p>
-        </w:tc>
-        <w:tc>
-          <w:tcPr>
-            <w:tcW w:type="dxa" w:w="785"/>
-          </w:tcPr>
-          <w:p>
-            <w:r/>
-          </w:p>
-        </w:tc>
-        <w:tc>
-          <w:tcPr>
-            <w:tcW w:type="dxa" w:w="785"/>
-          </w:tcPr>
-          <w:p>
-            <w:r>
-              <w:t>2</w:t>
-            </w:r>
-          </w:p>
-        </w:tc>
-        <w:tc>
-          <w:tcPr>
-            <w:tcW w:type="dxa" w:w="785"/>
-          </w:tcPr>
-          <w:p>
-            <w:r>
-              <w:t>60</w:t>
-            </w:r>
-          </w:p>
-        </w:tc>
-        <w:tc>
-          <w:tcPr>
-            <w:tcW w:type="dxa" w:w="785"/>
-          </w:tcPr>
-          <w:p>
-            <w:r/>
-          </w:p>
-        </w:tc>
-        <w:tc>
-          <w:tcPr>
-            <w:tcW w:type="dxa" w:w="785"/>
-          </w:tcPr>
-          <w:p>
-            <w:r>
-              <w:t>Pada paragraf pertama tertulis jelas: 'Ketika melewati tikungan jembatan kayu di perbatasan desa, roda depan sepedanya menabrak sesuatu... Di tepi semak-semak rumput gajah, tergeletak sebuah kantong kain belacu berwarna cokelat kusam.' Jadi latar tempatnya adalah B.</w:t>
-            </w:r>
-          </w:p>
-        </w:tc>
-      </w:tr>
-      <w:tr>
-        <w:tc>
-          <w:tcPr>
-            <w:tcW w:type="dxa" w:w="785"/>
-          </w:tcPr>
-          <w:p>
-            <w:r>
-              <w:t>Konflik batin yang sempat dialami tokoh Arga ketika melihat isi kantong kain belacu tersebut adalah....</w:t>
-            </w:r>
-          </w:p>
-        </w:tc>
-        <w:tc>
-          <w:tcPr>
-            <w:tcW w:type="dxa" w:w="785"/>
-          </w:tcPr>
-          <w:p>
-            <w:r>
-              <w:t>Checkbox</w:t>
-            </w:r>
-          </w:p>
-        </w:tc>
-        <w:tc>
-          <w:tcPr>
-            <w:tcW w:type="dxa" w:w="785"/>
-          </w:tcPr>
-          <w:p>
-            <w:r>
-              <w:t>Kebingungan memilih apakah harus menjual sayur ke pasar atau pulang ke rumah</w:t>
-            </w:r>
-          </w:p>
-        </w:tc>
-        <w:tc>
-          <w:tcPr>
-            <w:tcW w:type="dxa" w:w="785"/>
-          </w:tcPr>
-          <w:p>
-            <w:r>
-              <w:t>Keinginan menggunakan uang temuan untuk membeli sepatu baru versus ajaran moral kejujuran dari ibunya</w:t>
-            </w:r>
-          </w:p>
-        </w:tc>
-        <w:tc>
-          <w:tcPr>
-            <w:tcW w:type="dxa" w:w="785"/>
-          </w:tcPr>
-          <w:p>
-            <w:r>
-              <w:t>Rasa takut dituduh mencuri barang berharga milik warga dusun lain</w:t>
-            </w:r>
-          </w:p>
-        </w:tc>
-        <w:tc>
-          <w:tcPr>
-            <w:tcW w:type="dxa" w:w="785"/>
-          </w:tcPr>
-          <w:p>
-            <w:r>
-              <w:t>Kekhawatiran sepedanya akan rusak jika memutar arah jalan</w:t>
-            </w:r>
-          </w:p>
-        </w:tc>
-        <w:tc>
-          <w:tcPr>
-            <w:tcW w:type="dxa" w:w="785"/>
-          </w:tcPr>
-          <w:p>
-            <w:r/>
-          </w:p>
-        </w:tc>
-        <w:tc>
-          <w:tcPr>
-            <w:tcW w:type="dxa" w:w="785"/>
-          </w:tcPr>
-          <w:p>
-            <w:r>
-              <w:t>Option 1, Option 2</w:t>
-            </w:r>
-          </w:p>
-        </w:tc>
-        <w:tc>
-          <w:tcPr>
-            <w:tcW w:type="dxa" w:w="785"/>
-          </w:tcPr>
-          <w:p>
-            <w:r>
-              <w:t>60</w:t>
-            </w:r>
-          </w:p>
-        </w:tc>
-        <w:tc>
-          <w:tcPr>
-            <w:tcW w:type="dxa" w:w="785"/>
-          </w:tcPr>
-          <w:p>
-            <w:r/>
-          </w:p>
-        </w:tc>
-        <w:tc>
-          <w:tcPr>
-            <w:tcW w:type="dxa" w:w="785"/>
-          </w:tcPr>
-          <w:p>
-            <w:r>
-              <w:t>Pada paragraf ketiga dijelaskan adanya pertentangan batin: 'Di dalam hati Arga, sempat terlintas bisikan godaan. Sepatu sekolahnya sudah jebol di bagian tumit... Namun, seketika petuah bijak sang ibu bergaung kuat... Kejujuran adalah kehormatan hidup kita.' Ini mencerminkan konflik batin pada pilihan B.</w:t>
-            </w:r>
-          </w:p>
-        </w:tc>
-      </w:tr>
-      <w:tr>
-        <w:tc>
-          <w:tcPr>
-            <w:tcW w:type="dxa" w:w="785"/>
-          </w:tcPr>
-          <w:p>
-            <w:r>
-              <w:t>Amanat utama yang dapat dipetik dari kisah 'Kejujuran di Balik Kantong Belacu Kakek Suro' adalah....</w:t>
-            </w:r>
-          </w:p>
-        </w:tc>
-        <w:tc>
-          <w:tcPr>
-            <w:tcW w:type="dxa" w:w="785"/>
-          </w:tcPr>
-          <w:p>
-            <w:r>
-              <w:t>True/False</w:t>
-            </w:r>
-          </w:p>
-        </w:tc>
-        <w:tc>
-          <w:tcPr>
-            <w:tcW w:type="dxa" w:w="785"/>
-          </w:tcPr>
-          <w:p>
-            <w:r>
-              <w:t>True</w:t>
-            </w:r>
-          </w:p>
-        </w:tc>
-        <w:tc>
-          <w:tcPr>
-            <w:tcW w:type="dxa" w:w="785"/>
-          </w:tcPr>
-          <w:p>
-            <w:r>
-              <w:t>False</w:t>
-            </w:r>
-          </w:p>
-        </w:tc>
-        <w:tc>
-          <w:tcPr>
-            <w:tcW w:type="dxa" w:w="785"/>
-          </w:tcPr>
-          <w:p>
-            <w:r/>
-          </w:p>
-        </w:tc>
-        <w:tc>
-          <w:tcPr>
-            <w:tcW w:type="dxa" w:w="785"/>
-          </w:tcPr>
-          <w:p>
-            <w:r/>
-          </w:p>
-        </w:tc>
-        <w:tc>
-          <w:tcPr>
-            <w:tcW w:type="dxa" w:w="785"/>
-          </w:tcPr>
-          <w:p>
-            <w:r/>
-          </w:p>
-        </w:tc>
-        <w:tc>
-          <w:tcPr>
-            <w:tcW w:type="dxa" w:w="785"/>
-          </w:tcPr>
-          <w:p>
-            <w:r>
-              <w:t>True</w:t>
-            </w:r>
-          </w:p>
-        </w:tc>
-        <w:tc>
-          <w:tcPr>
-            <w:tcW w:type="dxa" w:w="785"/>
-          </w:tcPr>
-          <w:p>
-            <w:r>
-              <w:t>60</w:t>
-            </w:r>
-          </w:p>
-        </w:tc>
-        <w:tc>
-          <w:tcPr>
-            <w:tcW w:type="dxa" w:w="785"/>
-          </w:tcPr>
-          <w:p>
-            <w:r/>
-          </w:p>
-        </w:tc>
-        <w:tc>
-          <w:tcPr>
-            <w:tcW w:type="dxa" w:w="785"/>
-          </w:tcPr>
-          <w:p>
-            <w:r>
-              <w:t>Amanat cerita berpusat pada nilai integritas: jangan mengambil barang yang bukan hak kita dan tetaplah jujur dalam keadaan apa pun karena kejujuran membawa ketenteraman batin dan keberkahan. Pilihan yang tepat adalah B.</w:t>
-            </w:r>
-          </w:p>
-        </w:tc>
-      </w:tr>
-      <w:tr>
-        <w:tc>
-          <w:tcPr>
-            <w:tcW w:type="dxa" w:w="785"/>
-          </w:tcPr>
-          <w:p>
-            <w:r>
-              <w:t>Perilaku terpuji tokoh Arga yang paling patut diteladani oleh siswa dalam kehidupan sehari-hari adalah....</w:t>
-            </w:r>
-          </w:p>
-        </w:tc>
-        <w:tc>
-          <w:tcPr>
-            <w:tcW w:type="dxa" w:w="785"/>
-          </w:tcPr>
-          <w:p>
-            <w:r>
-              <w:t>Multiple Choice</w:t>
-            </w:r>
-          </w:p>
-        </w:tc>
-        <w:tc>
-          <w:tcPr>
-            <w:tcW w:type="dxa" w:w="785"/>
-          </w:tcPr>
-          <w:p>
-            <w:r>
-              <w:t>Menabung uang saku sekolah sebanyak-banyaknya di bank</w:t>
-            </w:r>
-          </w:p>
-        </w:tc>
-        <w:tc>
-          <w:tcPr>
-            <w:tcW w:type="dxa" w:w="785"/>
-          </w:tcPr>
-          <w:p>
-            <w:r>
-              <w:t>Mengembalikan barang temuan yang bukan haknya secara utuh kepada pemilik aslinya</w:t>
-            </w:r>
-          </w:p>
-        </w:tc>
-        <w:tc>
-          <w:tcPr>
-            <w:tcW w:type="dxa" w:w="785"/>
-          </w:tcPr>
-          <w:p>
-            <w:r>
-              <w:t>Memperbaiki sepeda ontel sendiri tanpa bantuan orang dewasa</w:t>
-            </w:r>
-          </w:p>
-        </w:tc>
-        <w:tc>
-          <w:tcPr>
-            <w:tcW w:type="dxa" w:w="785"/>
-          </w:tcPr>
-          <w:p>
-            <w:r>
-              <w:t>Berjalan kaki saat berangkat ke sekolah demi menghemat tenaga</w:t>
-            </w:r>
-          </w:p>
-        </w:tc>
-        <w:tc>
-          <w:tcPr>
-            <w:tcW w:type="dxa" w:w="785"/>
-          </w:tcPr>
-          <w:p>
-            <w:r/>
-          </w:p>
-        </w:tc>
-        <w:tc>
-          <w:tcPr>
-            <w:tcW w:type="dxa" w:w="785"/>
-          </w:tcPr>
-          <w:p>
-            <w:r>
-              <w:t>2</w:t>
-            </w:r>
-          </w:p>
-        </w:tc>
-        <w:tc>
-          <w:tcPr>
-            <w:tcW w:type="dxa" w:w="785"/>
-          </w:tcPr>
-          <w:p>
-            <w:r>
-              <w:t>60</w:t>
-            </w:r>
-          </w:p>
-        </w:tc>
-        <w:tc>
-          <w:tcPr>
-            <w:tcW w:type="dxa" w:w="785"/>
-          </w:tcPr>
-          <w:p>
-            <w:r/>
-          </w:p>
-        </w:tc>
-        <w:tc>
-          <w:tcPr>
-            <w:tcW w:type="dxa" w:w="785"/>
-          </w:tcPr>
-          <w:p>
-            <w:r>
-              <w:t>Tindakan Arga yang paling bernilai keteladanan luhur adalah kesediaannya mengantarkan dan mengembalikan dompet/kantong uang temuan kepada pemiliknya tanpa pamrih (Pilihan B).</w:t>
-            </w:r>
-          </w:p>
-        </w:tc>
-      </w:tr>
-      <w:tr>
-        <w:tc>
-          <w:tcPr>
-            <w:tcW w:type="dxa" w:w="785"/>
-          </w:tcPr>
-          <w:p>
-            <w:r>
-              <w:t>Bacalah kutipan dialog wawancara berikut untuk menjawab soal nomor 11 sampai 14!</w:t>
-              <w:br/>
-              <w:br/>
-              <w:t>Wawancara Cilik: Menggugah Kepedulian Lewat Bank Sampah Sekolah</w:t>
-              <w:br/>
-              <w:br/>
-              <w:t>Dika (Pewawancara) : "Selamat pagi, Ibu Ratna. Kami dari tim buletin sekolah ingin menggali informasi tentang keberhasilan program 'Bank Sampah Berseri' yang Ibu bimbing. Sebenarnya apa tujuan utama dibentuknya bank sampah ini di sekolah kita?"</w:t>
-              <w:br/>
-              <w:t>Ibu Ratna (Pembina) : "Selamat pagi, Dika. Tujuan utamanya bukan semata-mata mengumpulkan sampah, melainkan membangun kesadaran dan kebiasaan berwawasan lingkungan hidup sejak dini. Kami ingin para siswa memahami konsep pilah sampah: mana sampah organik yang bisa diolah jadi kompos, mana anorganik yang bisa didaur ulang bernilai ekonomis, dan mana residu."</w:t>
-              <w:br/>
-              <w:t>Dika : "Bagaimana cara kerja penyetoran sampah oleh siswa setiap pekannya, Bu?"</w:t>
-              <w:br/>
-              <w:t>Ibu Ratna : "Setiap hari Jumat pagi, siswa membawa sampah anorganik kering dari rumah maupun sekolah, seperti botol plastik, kardus bekas, atau kaleng minuman. Pengurus cilik bank sampah akan menimbang beratnya, mencatatnya, lalu mengonversikannya menjadi saldo tabungan di buku rekening siswa. Saldo tabungan ini pada akhir semester dapat ditukarkan dengan buku tulis, pensil warna, atau bibit tanaman hias."</w:t>
-              <w:br/>
-              <w:t>Dika : "Sungguh inovatif! Lalu apa dampak paling signifikan yang dirasakan sekolah setelah program ini berjalan satu semester, Bu?"</w:t>
-              <w:br/>
-              <w:t xml:space="preserve">Ibu Ratna : "Alhamdulillah, volume timbulan sampah sekolah yang dibuang ke TPA berkurang drastis hingga 60%. Selain itu, ruang kelas menjadi sangat bersih dan siswa terbiasa bertanggung jawab terhadap lingkungan sekitarnya." </w:t>
-              <w:br/>
-              <w:br/>
-              <w:t>Topik pokok pembicaraan dalam wawancara antara Dika dan Ibu Ratna adalah....</w:t>
-            </w:r>
-          </w:p>
-        </w:tc>
-        <w:tc>
-          <w:tcPr>
-            <w:tcW w:type="dxa" w:w="785"/>
-          </w:tcPr>
-          <w:p>
-            <w:r>
-              <w:t>Checkbox</w:t>
-            </w:r>
-          </w:p>
-        </w:tc>
-        <w:tc>
-          <w:tcPr>
-            <w:tcW w:type="dxa" w:w="785"/>
-          </w:tcPr>
-          <w:p>
-            <w:r>
-              <w:t>Proses pembuatan kompos dari sisa tanaman hias sekolah</w:t>
-            </w:r>
-          </w:p>
-        </w:tc>
-        <w:tc>
-          <w:tcPr>
-            <w:tcW w:type="dxa" w:w="785"/>
-          </w:tcPr>
-          <w:p>
-            <w:r>
-              <w:t>Sosialisasi dan manfaat pelaksanaan program Bank Sampah di lingkungan sekolah</w:t>
-            </w:r>
-          </w:p>
-        </w:tc>
-        <w:tc>
-          <w:tcPr>
-            <w:tcW w:type="dxa" w:w="785"/>
-          </w:tcPr>
-          <w:p>
-            <w:r>
-              <w:t>Pemilihan ketua pengurus dokter cilik Adiwiyata periode baru</w:t>
-            </w:r>
-          </w:p>
-        </w:tc>
-        <w:tc>
-          <w:tcPr>
-            <w:tcW w:type="dxa" w:w="785"/>
-          </w:tcPr>
-          <w:p>
-            <w:r>
-              <w:t>Teknik mendaur ulang botol plastik menjadi pot bunga hias</w:t>
-            </w:r>
-          </w:p>
-        </w:tc>
-        <w:tc>
-          <w:tcPr>
-            <w:tcW w:type="dxa" w:w="785"/>
-          </w:tcPr>
-          <w:p>
-            <w:r/>
-          </w:p>
-        </w:tc>
-        <w:tc>
-          <w:tcPr>
-            <w:tcW w:type="dxa" w:w="785"/>
-          </w:tcPr>
-          <w:p>
-            <w:r>
-              <w:t>Option 1, Option 2</w:t>
-            </w:r>
-          </w:p>
-        </w:tc>
-        <w:tc>
-          <w:tcPr>
-            <w:tcW w:type="dxa" w:w="785"/>
-          </w:tcPr>
-          <w:p>
-            <w:r>
-              <w:t>60</w:t>
-            </w:r>
-          </w:p>
-        </w:tc>
-        <w:tc>
-          <w:tcPr>
-            <w:tcW w:type="dxa" w:w="785"/>
-          </w:tcPr>
-          <w:p>
-            <w:r/>
-          </w:p>
-        </w:tc>
-        <w:tc>
-          <w:tcPr>
-            <w:tcW w:type="dxa" w:w="785"/>
-          </w:tcPr>
-          <w:p>
-            <w:r>
-              <w:t>Seluruh percakapan membahas latar belakang, mekanisme kerja, dan dampak positif program 'Bank Sampah Berseri' di sekolah. Jadi topik utamanya adalah B.</w:t>
-            </w:r>
-          </w:p>
-        </w:tc>
-      </w:tr>
-      <w:tr>
-        <w:tc>
-          <w:tcPr>
-            <w:tcW w:type="dxa" w:w="785"/>
-          </w:tcPr>
-          <w:p>
-            <w:r>
-              <w:t>Berdasarkan dialog di atas, keuntungan langsung yang diperoleh siswa ketika menyetorkan sampah anorganik bersih ke Bank Sampah adalah....</w:t>
-            </w:r>
-          </w:p>
-        </w:tc>
-        <w:tc>
-          <w:tcPr>
-            <w:tcW w:type="dxa" w:w="785"/>
-          </w:tcPr>
-          <w:p>
-            <w:r>
-              <w:t>True/False</w:t>
-            </w:r>
-          </w:p>
-        </w:tc>
-        <w:tc>
-          <w:tcPr>
-            <w:tcW w:type="dxa" w:w="785"/>
-          </w:tcPr>
-          <w:p>
-            <w:r>
-              <w:t>True</w:t>
-            </w:r>
-          </w:p>
-        </w:tc>
-        <w:tc>
-          <w:tcPr>
-            <w:tcW w:type="dxa" w:w="785"/>
-          </w:tcPr>
-          <w:p>
-            <w:r>
-              <w:t>False</w:t>
-            </w:r>
-          </w:p>
-        </w:tc>
-        <w:tc>
-          <w:tcPr>
-            <w:tcW w:type="dxa" w:w="785"/>
-          </w:tcPr>
-          <w:p>
-            <w:r/>
-          </w:p>
-        </w:tc>
-        <w:tc>
-          <w:tcPr>
-            <w:tcW w:type="dxa" w:w="785"/>
-          </w:tcPr>
-          <w:p>
-            <w:r/>
-          </w:p>
-        </w:tc>
-        <w:tc>
-          <w:tcPr>
-            <w:tcW w:type="dxa" w:w="785"/>
-          </w:tcPr>
-          <w:p>
-            <w:r/>
-          </w:p>
-        </w:tc>
-        <w:tc>
-          <w:tcPr>
-            <w:tcW w:type="dxa" w:w="785"/>
-          </w:tcPr>
-          <w:p>
-            <w:r>
-              <w:t>True</w:t>
-            </w:r>
-          </w:p>
-        </w:tc>
-        <w:tc>
-          <w:tcPr>
-            <w:tcW w:type="dxa" w:w="785"/>
-          </w:tcPr>
-          <w:p>
-            <w:r>
-              <w:t>60</w:t>
-            </w:r>
-          </w:p>
-        </w:tc>
-        <w:tc>
-          <w:tcPr>
-            <w:tcW w:type="dxa" w:w="785"/>
-          </w:tcPr>
-          <w:p>
-            <w:r/>
-          </w:p>
-        </w:tc>
-        <w:tc>
-          <w:tcPr>
-            <w:tcW w:type="dxa" w:w="785"/>
-          </w:tcPr>
-          <w:p>
-            <w:r>
-              <w:t>Ibu Ratna menjelaskan: 'Pengurus cilik bank sampah akan menimbang... mengonversikannya menjadi saldo tabungan di buku rekening siswa. Saldo tabungan ini pada akhir semester dapat ditukarkan dengan buku tulis, pensil warna, atau bibit tanaman hias.' Pilihan yang tepat adalah B.</w:t>
-            </w:r>
-          </w:p>
-        </w:tc>
-      </w:tr>
-      <w:tr>
-        <w:tc>
-          <w:tcPr>
-            <w:tcW w:type="dxa" w:w="785"/>
-          </w:tcPr>
-          <w:p>
-            <w:r>
-              <w:t>Dampak lingkungan yang paling nyata dirasakan sekolah setelah program Bank Sampah berjalan adalah....</w:t>
-            </w:r>
-          </w:p>
-        </w:tc>
-        <w:tc>
-          <w:tcPr>
-            <w:tcW w:type="dxa" w:w="785"/>
-          </w:tcPr>
-          <w:p>
-            <w:r>
-              <w:t>Multiple Choice</w:t>
-            </w:r>
-          </w:p>
-        </w:tc>
-        <w:tc>
-          <w:tcPr>
-            <w:tcW w:type="dxa" w:w="785"/>
-          </w:tcPr>
-          <w:p>
-            <w:r>
-              <w:t>Penjualan tanaman hias sekolah meningkat pesat ke luar kota</w:t>
-            </w:r>
-          </w:p>
-        </w:tc>
-        <w:tc>
-          <w:tcPr>
-            <w:tcW w:type="dxa" w:w="785"/>
-          </w:tcPr>
-          <w:p>
-            <w:r>
-              <w:t>Volume timbulan sampah sekolah yang dibuang ke TPA berkurang hingga 60%</w:t>
-            </w:r>
-          </w:p>
-        </w:tc>
-        <w:tc>
-          <w:tcPr>
-            <w:tcW w:type="dxa" w:w="785"/>
-          </w:tcPr>
-          <w:p>
-            <w:r>
-              <w:t>Biaya operasional kebersihan sekolah menjadi sepenuhnya gratis</w:t>
-            </w:r>
-          </w:p>
-        </w:tc>
-        <w:tc>
-          <w:tcPr>
-            <w:tcW w:type="dxa" w:w="785"/>
-          </w:tcPr>
-          <w:p>
-            <w:r>
-              <w:t>Semua kantin sekolah dilarang menjual makanan berkemasan</w:t>
-            </w:r>
-          </w:p>
-        </w:tc>
-        <w:tc>
-          <w:tcPr>
-            <w:tcW w:type="dxa" w:w="785"/>
-          </w:tcPr>
-          <w:p>
-            <w:r/>
-          </w:p>
-        </w:tc>
-        <w:tc>
-          <w:tcPr>
-            <w:tcW w:type="dxa" w:w="785"/>
-          </w:tcPr>
-          <w:p>
-            <w:r>
-              <w:t>2</w:t>
-            </w:r>
-          </w:p>
-        </w:tc>
-        <w:tc>
-          <w:tcPr>
-            <w:tcW w:type="dxa" w:w="785"/>
-          </w:tcPr>
-          <w:p>
-            <w:r>
-              <w:t>60</w:t>
-            </w:r>
-          </w:p>
-        </w:tc>
-        <w:tc>
-          <w:tcPr>
-            <w:tcW w:type="dxa" w:w="785"/>
-          </w:tcPr>
-          <w:p>
-            <w:r/>
-          </w:p>
-        </w:tc>
-        <w:tc>
-          <w:tcPr>
-            <w:tcW w:type="dxa" w:w="785"/>
-          </w:tcPr>
-          <w:p>
-            <w:r>
-              <w:t>Secara eksplisit Ibu Ratna menyatakan: 'Alhamdulillah, volume timbulan sampah sekolah yang dibuang ke TPA berkurang drastis hingga 60%.' Jadi jawabannya adalah B.</w:t>
-            </w:r>
-          </w:p>
-        </w:tc>
-      </w:tr>
-      <w:tr>
-        <w:tc>
-          <w:tcPr>
-            <w:tcW w:type="dxa" w:w="785"/>
-          </w:tcPr>
-          <w:p>
-            <w:r>
-              <w:t>Simpulan yang paling tepat dari kutipan wawancara di atas adalah....</w:t>
-            </w:r>
-          </w:p>
-        </w:tc>
-        <w:tc>
-          <w:tcPr>
-            <w:tcW w:type="dxa" w:w="785"/>
-          </w:tcPr>
-          <w:p>
-            <w:r>
-              <w:t>Checkbox</w:t>
-            </w:r>
-          </w:p>
-        </w:tc>
-        <w:tc>
-          <w:tcPr>
-            <w:tcW w:type="dxa" w:w="785"/>
-          </w:tcPr>
-          <w:p>
-            <w:r>
-              <w:t>Pengelolaan bank sampah sekolah merupakan kegiatan wajib yang harus diawasi dinas kebersihan kota.</w:t>
-            </w:r>
-          </w:p>
-        </w:tc>
-        <w:tc>
-          <w:tcPr>
-            <w:tcW w:type="dxa" w:w="785"/>
-          </w:tcPr>
-          <w:p>
-            <w:r>
-              <w:t>Program Bank Sampah di sekolah sangat efektif mengedukasi siswa dalam memilah sampah dan menciptakan lingkungan bersih.</w:t>
-            </w:r>
-          </w:p>
-        </w:tc>
-        <w:tc>
-          <w:tcPr>
-            <w:tcW w:type="dxa" w:w="785"/>
-          </w:tcPr>
-          <w:p>
-            <w:r>
-              <w:t>Sampah anorganik bernilai ekonomis jauh lebih tinggi daripada pupuk kompos organik.</w:t>
-            </w:r>
-          </w:p>
-        </w:tc>
-        <w:tc>
-          <w:tcPr>
-            <w:tcW w:type="dxa" w:w="785"/>
-          </w:tcPr>
-          <w:p>
-            <w:r>
-              <w:t>Siswa kelas VI harus bertanggung jawab penuh menjadi pengurus inti bank sampah sekolah.</w:t>
-            </w:r>
-          </w:p>
-        </w:tc>
-        <w:tc>
-          <w:tcPr>
-            <w:tcW w:type="dxa" w:w="785"/>
-          </w:tcPr>
-          <w:p>
-            <w:r/>
-          </w:p>
-        </w:tc>
-        <w:tc>
-          <w:tcPr>
-            <w:tcW w:type="dxa" w:w="785"/>
-          </w:tcPr>
-          <w:p>
-            <w:r>
-              <w:t>Option 1, Option 2</w:t>
-            </w:r>
-          </w:p>
-        </w:tc>
-        <w:tc>
-          <w:tcPr>
-            <w:tcW w:type="dxa" w:w="785"/>
-          </w:tcPr>
-          <w:p>
-            <w:r>
-              <w:t>60</w:t>
-            </w:r>
-          </w:p>
-        </w:tc>
-        <w:tc>
-          <w:tcPr>
-            <w:tcW w:type="dxa" w:w="785"/>
-          </w:tcPr>
-          <w:p>
-            <w:r/>
-          </w:p>
-        </w:tc>
-        <w:tc>
-          <w:tcPr>
-            <w:tcW w:type="dxa" w:w="785"/>
-          </w:tcPr>
-          <w:p>
-            <w:r>
-              <w:t>Simpulan yang merangkum keseluruhan isi dialog adalah bahwa keberadaan Bank Sampah sekolah sukses membentuk kebiasaan peduli lingkungan pada siswa sekaligus membuat sekolah lebih asri dan ramah lingkungan (Pilihan B).</w:t>
-            </w:r>
-          </w:p>
-        </w:tc>
-      </w:tr>
-      <w:tr>
-        <w:tc>
-          <w:tcPr>
-            <w:tcW w:type="dxa" w:w="785"/>
-          </w:tcPr>
-          <w:p>
-            <w:r>
-              <w:t>Bacalah petunjuk prosedur berikut untuk menjawab soal nomor 15 dan 16!</w:t>
-              <w:br/>
-              <w:br/>
-              <w:t>Petunjuk Praktis Menanam Sayuran Hidroponik Sistem Sumbu (Wick System)</w:t>
-              <w:br/>
-              <w:t>(1) Siapkan botol plastik bekas air mineral ukuran 1,5 liter, lalu potong secara horizontal menjadi dua bagian menggunakan gunting atau *cutter*.</w:t>
-              <w:br/>
-              <w:t>(2) Buatlah lubang kecil pada tutup botol menggunakan solder atau paku panas, lalu selipkan sehelai kain flanel sepanjang 15 cm sebagai sumbu kapiler.</w:t>
-              <w:br/>
-              <w:t>(3) Pasang bagian atas botol yang sudah bersumbu ke dalam potongan bagian bawah botol secara terbalik (leher botol menghadap ke dasar).</w:t>
-              <w:br/>
-              <w:t>(4) [...]</w:t>
-              <w:br/>
-              <w:t>(5) Masukkan bibit tanaman sawi atau selada yang telah disemai (berdaun 3 sampai 4 helai) dengan hati-hati ke dalam media tanam tersebut.</w:t>
-              <w:br/>
-              <w:t>(6) Tuangkan larutan nutrisi hidroponik (larutan AB Mix) ke dalam wadah bagian bawah hingga menyentuh separuh sumbu flanel, lalu letakkan di area yang terkena sinar matahari cukup.</w:t>
-              <w:br/>
-              <w:br/>
-              <w:t>Kalimat yang paling tepat dan runtut untuk melengkapi langkah nomor (4) pada petunjuk hidroponik tersebut adalah....</w:t>
-            </w:r>
-          </w:p>
-        </w:tc>
-        <w:tc>
-          <w:tcPr>
-            <w:tcW w:type="dxa" w:w="785"/>
-          </w:tcPr>
-          <w:p>
-            <w:r>
-              <w:t>True/False</w:t>
-            </w:r>
-          </w:p>
-        </w:tc>
-        <w:tc>
-          <w:tcPr>
-            <w:tcW w:type="dxa" w:w="785"/>
-          </w:tcPr>
-          <w:p>
-            <w:r>
-              <w:t>True</w:t>
-            </w:r>
-          </w:p>
-        </w:tc>
-        <w:tc>
-          <w:tcPr>
-            <w:tcW w:type="dxa" w:w="785"/>
-          </w:tcPr>
-          <w:p>
-            <w:r>
-              <w:t>False</w:t>
-            </w:r>
-          </w:p>
-        </w:tc>
-        <w:tc>
-          <w:tcPr>
-            <w:tcW w:type="dxa" w:w="785"/>
-          </w:tcPr>
-          <w:p>
-            <w:r/>
-          </w:p>
-        </w:tc>
-        <w:tc>
-          <w:tcPr>
-            <w:tcW w:type="dxa" w:w="785"/>
-          </w:tcPr>
-          <w:p>
-            <w:r/>
-          </w:p>
-        </w:tc>
-        <w:tc>
-          <w:tcPr>
-            <w:tcW w:type="dxa" w:w="785"/>
-          </w:tcPr>
-          <w:p>
-            <w:r/>
-          </w:p>
-        </w:tc>
-        <w:tc>
-          <w:tcPr>
-            <w:tcW w:type="dxa" w:w="785"/>
-          </w:tcPr>
-          <w:p>
-            <w:r>
-              <w:t>True</w:t>
-            </w:r>
-          </w:p>
-        </w:tc>
-        <w:tc>
-          <w:tcPr>
-            <w:tcW w:type="dxa" w:w="785"/>
-          </w:tcPr>
-          <w:p>
-            <w:r>
-              <w:t>60</w:t>
-            </w:r>
-          </w:p>
-        </w:tc>
-        <w:tc>
-          <w:tcPr>
-            <w:tcW w:type="dxa" w:w="785"/>
-          </w:tcPr>
-          <w:p>
-            <w:r/>
-          </w:p>
-        </w:tc>
-        <w:tc>
-          <w:tcPr>
-            <w:tcW w:type="dxa" w:w="785"/>
-          </w:tcPr>
-          <w:p>
-            <w:r>
-              <w:t>Setelah memasang bagian botol secara terbalik dengan sumbu (langkah 3) dan sebelum menempatkan bibit bertunas (langkah 5), wadah harus diisi media tanam (seperti arang sekam, cocopeat, atau rockwool). Kalimat B adalah langkah yang logis dan tepat.</w:t>
-            </w:r>
-          </w:p>
-        </w:tc>
-      </w:tr>
-      <w:tr>
-        <w:tc>
-          <w:tcPr>
-            <w:tcW w:type="dxa" w:w="785"/>
-          </w:tcPr>
-          <w:p>
-            <w:r>
-              <w:t>Fungsi utama kain flanel pada sistem hidroponik sumbu (wick system) berdasarkan teks prosedur di atas adalah....</w:t>
-            </w:r>
-          </w:p>
-        </w:tc>
-        <w:tc>
-          <w:tcPr>
-            <w:tcW w:type="dxa" w:w="785"/>
-          </w:tcPr>
-          <w:p>
-            <w:r>
-              <w:t>Multiple Choice</w:t>
-            </w:r>
-          </w:p>
-        </w:tc>
-        <w:tc>
-          <w:tcPr>
-            <w:tcW w:type="dxa" w:w="785"/>
-          </w:tcPr>
-          <w:p>
-            <w:r>
-              <w:t>Sebagai penahan agar botol bagian atas tidak mudah goyang dan tumpah</w:t>
-            </w:r>
-          </w:p>
-        </w:tc>
-        <w:tc>
-          <w:tcPr>
-            <w:tcW w:type="dxa" w:w="785"/>
-          </w:tcPr>
-          <w:p>
-            <w:r>
-              <w:t>Sebagai sumbu kapiler yang menyerap larutan nutrisi dari bawah menuju akar tanaman</w:t>
-            </w:r>
-          </w:p>
-        </w:tc>
-        <w:tc>
-          <w:tcPr>
-            <w:tcW w:type="dxa" w:w="785"/>
-          </w:tcPr>
-          <w:p>
-            <w:r>
-              <w:t>Untuk menyaring kotoran dan lumut yang tumbuh di dalam air tandon</w:t>
-            </w:r>
-          </w:p>
-        </w:tc>
-        <w:tc>
-          <w:tcPr>
-            <w:tcW w:type="dxa" w:w="785"/>
-          </w:tcPr>
-          <w:p>
-            <w:r>
-              <w:t>Sebagai pengganti sinar matahari buatan bagi bibit tanaman</w:t>
-            </w:r>
-          </w:p>
-        </w:tc>
-        <w:tc>
-          <w:tcPr>
-            <w:tcW w:type="dxa" w:w="785"/>
-          </w:tcPr>
-          <w:p>
-            <w:r/>
-          </w:p>
-        </w:tc>
-        <w:tc>
-          <w:tcPr>
-            <w:tcW w:type="dxa" w:w="785"/>
-          </w:tcPr>
-          <w:p>
-            <w:r>
-              <w:t>2</w:t>
-            </w:r>
-          </w:p>
-        </w:tc>
-        <w:tc>
-          <w:tcPr>
-            <w:tcW w:type="dxa" w:w="785"/>
-          </w:tcPr>
-          <w:p>
-            <w:r>
-              <w:t>60</w:t>
-            </w:r>
-          </w:p>
-        </w:tc>
-        <w:tc>
-          <w:tcPr>
-            <w:tcW w:type="dxa" w:w="785"/>
-          </w:tcPr>
-          <w:p>
-            <w:r/>
-          </w:p>
-        </w:tc>
-        <w:tc>
-          <w:tcPr>
-            <w:tcW w:type="dxa" w:w="785"/>
-          </w:tcPr>
-          <w:p>
-            <w:r>
-              <w:t>Kain flanel bekerja dengan gaya kapilaritas untuk menyerap air nutrisi dari tandon bagian bawah ke atas sehingga membasahi media tanam dan diserap oleh akar bibit sawi (Pilihan B).</w:t>
-            </w:r>
-          </w:p>
-        </w:tc>
-      </w:tr>
-      <w:tr>
-        <w:tc>
-          <w:tcPr>
-            <w:tcW w:type="dxa" w:w="785"/>
-          </w:tcPr>
-          <w:p>
-            <w:r>
-              <w:t>Perhatikan bait puisi berikut!</w:t>
-              <w:br/>
-              <w:br/>
-              <w:t>Mentari pagi menyapa ramah</w:t>
-              <w:br/>
-              <w:t>Embun menari di ujung dedaunan</w:t>
-              <w:br/>
-              <w:t>Langkah kaki riang melangkah</w:t>
-              <w:br/>
-              <w:t>Menyambut masa depan penuh harapan</w:t>
-              <w:br/>
-              <w:br/>
-              <w:t>Makna ungkapan 'Embun menari di ujung dedaunan' pada bait puisi di atas adalah....</w:t>
-            </w:r>
-          </w:p>
-        </w:tc>
-        <w:tc>
-          <w:tcPr>
-            <w:tcW w:type="dxa" w:w="785"/>
-          </w:tcPr>
-          <w:p>
-            <w:r>
-              <w:t>Checkbox</w:t>
-            </w:r>
-          </w:p>
-        </w:tc>
-        <w:tc>
-          <w:tcPr>
-            <w:tcW w:type="dxa" w:w="785"/>
-          </w:tcPr>
-          <w:p>
-            <w:r>
-              <w:t>Tetesan air embun pagi yang tampak berkilau dan bergoyang terkena hembusan angin sejuk</w:t>
-            </w:r>
-          </w:p>
-        </w:tc>
-        <w:tc>
-          <w:tcPr>
-            <w:tcW w:type="dxa" w:w="785"/>
-          </w:tcPr>
-          <w:p>
-            <w:r>
-              <w:t>Daun-daun berguguran ke tanah karena terkena tetesan air hujan lebat</w:t>
-            </w:r>
-          </w:p>
-        </w:tc>
-        <w:tc>
-          <w:tcPr>
-            <w:tcW w:type="dxa" w:w="785"/>
-          </w:tcPr>
-          <w:p>
-            <w:r>
-              <w:t>Udara dingin yang menyebabkan tanaman layu di pagi hari</w:t>
-            </w:r>
-          </w:p>
-        </w:tc>
-        <w:tc>
-          <w:tcPr>
-            <w:tcW w:type="dxa" w:w="785"/>
-          </w:tcPr>
-          <w:p>
-            <w:r>
-              <w:t>Cahaya matahari yang terhalang oleh kabut tebal pegunungan</w:t>
-            </w:r>
-          </w:p>
-        </w:tc>
-        <w:tc>
-          <w:tcPr>
-            <w:tcW w:type="dxa" w:w="785"/>
-          </w:tcPr>
-          <w:p>
-            <w:r/>
-          </w:p>
-        </w:tc>
-        <w:tc>
-          <w:tcPr>
-            <w:tcW w:type="dxa" w:w="785"/>
-          </w:tcPr>
-          <w:p>
-            <w:r>
-              <w:t>Option 1, Option 2</w:t>
-            </w:r>
-          </w:p>
-        </w:tc>
-        <w:tc>
-          <w:tcPr>
-            <w:tcW w:type="dxa" w:w="785"/>
-          </w:tcPr>
-          <w:p>
-            <w:r>
-              <w:t>60</w:t>
-            </w:r>
-          </w:p>
-        </w:tc>
-        <w:tc>
-          <w:tcPr>
-            <w:tcW w:type="dxa" w:w="785"/>
-          </w:tcPr>
-          <w:p>
-            <w:r/>
-          </w:p>
-        </w:tc>
-        <w:tc>
-          <w:tcPr>
-            <w:tcW w:type="dxa" w:w="785"/>
-          </w:tcPr>
-          <w:p>
-            <w:r>
-              <w:t>Majas personifikasi 'embun menari di ujung dedaunan' menggambarkan suasana pagi hari yang indah, di mana tetesan embun berkilau terkena sinar mentari dan tampak bergoyang lembut tertiup angin sepoi-sepoi (Pilihan A).</w:t>
-            </w:r>
-          </w:p>
-        </w:tc>
-      </w:tr>
-      <w:tr>
-        <w:tc>
-          <w:tcPr>
-            <w:tcW w:type="dxa" w:w="785"/>
-          </w:tcPr>
-          <w:p>
-            <w:r>
-              <w:t>Perhatikan kalimat-kalimat petunjuk pembuatan puding berikut!</w:t>
-              <w:br/>
-              <w:t>(1) Setelah uap panasnya berkurang, masukkan puding ke dalam lemari es hingga mengeras.</w:t>
-              <w:br/>
-              <w:t>(2) Campurkan bubuk agar-agar, gula pasir, dan air kelapa muda ke dalam panci secara merata.</w:t>
-              <w:br/>
-              <w:t>(3) Rebus adonan di atas api sedang sambil terus diaduk perlahan hingga mendidih sempurna.</w:t>
-              <w:br/>
-              <w:t>(4) Tuangkan cairan puding yang telah mendidih ke dalam cetakan yang telah disiapkan.</w:t>
-              <w:br/>
-              <w:br/>
-              <w:t>Urutan petunjuk yang tepat dan logis agar menjadi teks prosedur yang padu adalah....</w:t>
-            </w:r>
-          </w:p>
-        </w:tc>
-        <w:tc>
-          <w:tcPr>
-            <w:tcW w:type="dxa" w:w="785"/>
-          </w:tcPr>
-          <w:p>
-            <w:r>
-              <w:t>True/False</w:t>
-            </w:r>
-          </w:p>
-        </w:tc>
-        <w:tc>
-          <w:tcPr>
-            <w:tcW w:type="dxa" w:w="785"/>
-          </w:tcPr>
-          <w:p>
-            <w:r>
-              <w:t>True</w:t>
-            </w:r>
-          </w:p>
-        </w:tc>
-        <w:tc>
-          <w:tcPr>
-            <w:tcW w:type="dxa" w:w="785"/>
-          </w:tcPr>
-          <w:p>
-            <w:r>
-              <w:t>False</w:t>
-            </w:r>
-          </w:p>
-        </w:tc>
-        <w:tc>
-          <w:tcPr>
-            <w:tcW w:type="dxa" w:w="785"/>
-          </w:tcPr>
-          <w:p>
-            <w:r/>
-          </w:p>
-        </w:tc>
-        <w:tc>
-          <w:tcPr>
-            <w:tcW w:type="dxa" w:w="785"/>
-          </w:tcPr>
-          <w:p>
-            <w:r/>
-          </w:p>
-        </w:tc>
-        <w:tc>
-          <w:tcPr>
-            <w:tcW w:type="dxa" w:w="785"/>
-          </w:tcPr>
-          <w:p>
-            <w:r/>
-          </w:p>
-        </w:tc>
-        <w:tc>
-          <w:tcPr>
-            <w:tcW w:type="dxa" w:w="785"/>
-          </w:tcPr>
-          <w:p>
-            <w:r>
-              <w:t>True</w:t>
-            </w:r>
-          </w:p>
-        </w:tc>
-        <w:tc>
-          <w:tcPr>
-            <w:tcW w:type="dxa" w:w="785"/>
-          </w:tcPr>
-          <w:p>
-            <w:r>
-              <w:t>60</w:t>
-            </w:r>
-          </w:p>
-        </w:tc>
-        <w:tc>
-          <w:tcPr>
-            <w:tcW w:type="dxa" w:w="785"/>
-          </w:tcPr>
-          <w:p>
-            <w:r/>
-          </w:p>
-        </w:tc>
-        <w:tc>
-          <w:tcPr>
-            <w:tcW w:type="dxa" w:w="785"/>
-          </w:tcPr>
-          <w:p>
-            <w:r>
-              <w:t>Urutan memasak puding yang logis:</w:t>
-              <w:br/>
-              <w:t>- (2) Campurkan bahan ke panci.</w:t>
-              <w:br/>
-              <w:t>- (3) Rebus di atas api sambil diaduk hingga mendidih.</w:t>
-              <w:br/>
-              <w:t>- (4) Tuangkan ke cetakan.</w:t>
-              <w:br/>
-              <w:t>- (1) Masukkan ke lemari es hingga mengeras.</w:t>
-              <w:br/>
-              <w:t>Urutan yang tepat adalah (2) - (3) - (4) - (1) (Pilihan A).</w:t>
-            </w:r>
-          </w:p>
-        </w:tc>
-      </w:tr>
-      <w:tr>
-        <w:tc>
-          <w:tcPr>
-            <w:tcW w:type="dxa" w:w="785"/>
-          </w:tcPr>
-          <w:p>
-            <w:r>
-              <w:t>Kalimat berikut yang seluruhnya menggunakan kata baku secara tepat sesuai Pedoman Umum Ejaan Bahasa Indonesia (PUEBI/EYD) adalah....</w:t>
-            </w:r>
-          </w:p>
-        </w:tc>
-        <w:tc>
-          <w:tcPr>
-            <w:tcW w:type="dxa" w:w="785"/>
-          </w:tcPr>
-          <w:p>
-            <w:r>
-              <w:t>Multiple Choice</w:t>
-            </w:r>
-          </w:p>
-        </w:tc>
-        <w:tc>
-          <w:tcPr>
-            <w:tcW w:type="dxa" w:w="785"/>
-          </w:tcPr>
-          <w:p>
-            <w:r>
-              <w:t>Para pasien sedang antri di apotik untuk mengambil obat resep dokter.</w:t>
-            </w:r>
-          </w:p>
-        </w:tc>
-        <w:tc>
-          <w:tcPr>
-            <w:tcW w:type="dxa" w:w="785"/>
-          </w:tcPr>
-          <w:p>
-            <w:r>
-              <w:t>Jadwal praktik dokter spesialis anak di klinik tersebut sudah aktif sejak pagi.</w:t>
-            </w:r>
-          </w:p>
-        </w:tc>
-        <w:tc>
-          <w:tcPr>
-            <w:tcW w:type="dxa" w:w="785"/>
-          </w:tcPr>
-          <w:p>
-            <w:r>
-              <w:t>Rian meminta ijin kepada gurunya karena badannya sedang tidak fit.</w:t>
-            </w:r>
-          </w:p>
-        </w:tc>
-        <w:tc>
-          <w:tcPr>
-            <w:tcW w:type="dxa" w:w="785"/>
-          </w:tcPr>
-          <w:p>
-            <w:r>
-              <w:t>Kwalitas produk kerajinan bambu itu sangat dikagumi para turis manca negara.</w:t>
-            </w:r>
-          </w:p>
-        </w:tc>
-        <w:tc>
-          <w:tcPr>
-            <w:tcW w:type="dxa" w:w="785"/>
-          </w:tcPr>
-          <w:p>
-            <w:r/>
-          </w:p>
-        </w:tc>
-        <w:tc>
-          <w:tcPr>
-            <w:tcW w:type="dxa" w:w="785"/>
-          </w:tcPr>
-          <w:p>
-            <w:r>
-              <w:t>2</w:t>
-            </w:r>
-          </w:p>
-        </w:tc>
-        <w:tc>
-          <w:tcPr>
-            <w:tcW w:type="dxa" w:w="785"/>
-          </w:tcPr>
-          <w:p>
-            <w:r>
-              <w:t>60</w:t>
-            </w:r>
-          </w:p>
-        </w:tc>
-        <w:tc>
-          <w:tcPr>
-            <w:tcW w:type="dxa" w:w="785"/>
-          </w:tcPr>
-          <w:p>
-            <w:r/>
-          </w:p>
-        </w:tc>
-        <w:tc>
-          <w:tcPr>
-            <w:tcW w:type="dxa" w:w="785"/>
-          </w:tcPr>
-          <w:p>
-            <w:r>
-              <w:t>Analisis kata baku:</w:t>
-              <w:br/>
-              <w:t>- Pilihan A: salah, yang baku adalah 'antre' (bukan antri) dan 'apotek' (bukan apotik).</w:t>
-              <w:br/>
-              <w:t>- Pilihan B: BENAR, 'jadwal', 'praktik', 'aktif', 'klinik' semuanya baku.</w:t>
-              <w:br/>
-              <w:t>- Pilihan C: salah, yang baku adalah 'izin' (bukan ijin).</w:t>
-              <w:br/>
-              <w:t>- Pilihan D: salah, yang baku adalah 'kualitas' (bukan kwalitas) dan 'mancanegara' (ditulis serangkai).</w:t>
-              <w:br/>
-              <w:t>Jadi, kalimat yang tepat adalah B.</w:t>
-            </w:r>
-          </w:p>
-        </w:tc>
-      </w:tr>
-      <w:tr>
-        <w:tc>
-          <w:tcPr>
-            <w:tcW w:type="dxa" w:w="785"/>
-          </w:tcPr>
-          <w:p>
-            <w:r>
-              <w:t>Penulisan kalimat langsung berikut yang menggunakan tanda baca dan huruf kapital secara tepat adalah....</w:t>
-            </w:r>
-          </w:p>
-        </w:tc>
-        <w:tc>
-          <w:tcPr>
-            <w:tcW w:type="dxa" w:w="785"/>
-          </w:tcPr>
-          <w:p>
-            <w:r>
-              <w:t>Checkbox</w:t>
-            </w:r>
-          </w:p>
-        </w:tc>
-        <w:tc>
-          <w:tcPr>
-            <w:tcW w:type="dxa" w:w="785"/>
-          </w:tcPr>
-          <w:p>
-            <w:r>
-              <w:t>Ibu berpesan, "Tolong rapikan buku pelajaran di mejamu, Farhan!"</w:t>
-            </w:r>
-          </w:p>
-        </w:tc>
-        <w:tc>
-          <w:tcPr>
-            <w:tcW w:type="dxa" w:w="785"/>
-          </w:tcPr>
-          <w:p>
-            <w:r>
-              <w:t>Ibu berpesan: "tolong rapikan buku pelajaran di mejamu, Farhan!"</w:t>
-            </w:r>
-          </w:p>
-        </w:tc>
-        <w:tc>
-          <w:tcPr>
-            <w:tcW w:type="dxa" w:w="785"/>
-          </w:tcPr>
-          <w:p>
-            <w:r>
-              <w:t>Ibu berpesan, "Tolong rapikan buku pelajaran di mejamu Farhan"!</w:t>
-            </w:r>
-          </w:p>
-        </w:tc>
-        <w:tc>
-          <w:tcPr>
-            <w:tcW w:type="dxa" w:w="785"/>
-          </w:tcPr>
-          <w:p>
-            <w:r>
-              <w:t>"Ibu berpesan, tolong rapikan buku pelajaran di mejamu, Farhan."</w:t>
-            </w:r>
-          </w:p>
-        </w:tc>
-        <w:tc>
-          <w:tcPr>
-            <w:tcW w:type="dxa" w:w="785"/>
-          </w:tcPr>
-          <w:p>
-            <w:r/>
-          </w:p>
-        </w:tc>
-        <w:tc>
-          <w:tcPr>
-            <w:tcW w:type="dxa" w:w="785"/>
-          </w:tcPr>
-          <w:p>
-            <w:r>
-              <w:t>Option 1, Option 2</w:t>
-            </w:r>
-          </w:p>
-        </w:tc>
-        <w:tc>
-          <w:tcPr>
-            <w:tcW w:type="dxa" w:w="785"/>
-          </w:tcPr>
-          <w:p>
-            <w:r>
-              <w:t>60</w:t>
-            </w:r>
-          </w:p>
-        </w:tc>
-        <w:tc>
-          <w:tcPr>
-            <w:tcW w:type="dxa" w:w="785"/>
-          </w:tcPr>
-          <w:p>
-            <w:r/>
-          </w:p>
-        </w:tc>
-        <w:tc>
-          <w:tcPr>
-            <w:tcW w:type="dxa" w:w="785"/>
-          </w:tcPr>
-          <w:p>
-            <w:r>
-              <w:t>Aturan penulisan kalimat langsung:</w:t>
-              <w:br/>
-              <w:t>1. Pengiring diikuti tanda koma (,).</w:t>
-              <w:br/>
-              <w:t>2. Kalimat petikan diawali huruf kapital di dalam tanda petik (").</w:t>
-              <w:br/>
-              <w:t>3. Tanda seru (!) atau tanda titik diletakkan SEBELUM tanda petik penutup (").</w:t>
-              <w:br/>
-              <w:t>Jadi penulisan yang benar adalah: Ibu berpesan, "Tolong rapikan buku pelajaran di mejamu, Farhan!" (Pilihan A).</w:t>
-            </w:r>
-          </w:p>
-        </w:tc>
-      </w:tr>
-    </w:tbl>
+    <w:p>
+      <w:pPr>
+        <w:jc w:val="center"/>
+      </w:pPr>
+      <w:r>
+        <w:rPr>
+          <w:color w:val="4F46E5"/>
+          <w:sz w:val="24"/>
+        </w:rPr>
+        <w:t>Kumpulan Soal Web Tryout &amp; Quizizz | 3 Model Soal</w:t>
+      </w:r>
+    </w:p>
+    <w:p/>
+    <w:p>
+      <w:r>
+        <w:rPr>
+          <w:b/>
+          <w:sz w:val="24"/>
+        </w:rPr>
+        <w:t>Soal 1.</w:t>
+      </w:r>
+    </w:p>
+    <w:p>
+      <w:pPr>
+        <w:ind w:left="360"/>
+      </w:pPr>
+      <w:r>
+        <w:t>Bacalah teks informasi berikut dengan cermat untuk menjawab soal nomor 1 sampai 5!</w:t>
+        <w:br/>
+        <w:br/>
+        <w:t>Penyu Sisik: Sang Penjaga Terumbu Karang Nusantara</w:t>
+        <w:br/>
+        <w:br/>
+        <w:t>Penyu sisik (Eretmochelys imbricata) merupakan salah satu spesies penyu laut yang memiliki peran sangat krusial dalam menjaga keseimbangan ekosistem terumbu karang di perairan tropis Indonesia. Ciri khas utama satwa ini terletak pada bentuk paruhnya yang runcing menyerupai paruh burung elang serta susunan sisik karapasnya yang bertumpuk indah keemasan. Makanan utama penyu sisik adalah spons laut (hewan porifera) yang hidup menempel pada karang. Dengan memakan spons laut tersebut, penyu sisik mengontrol populasinya agar tidak tumbuh berlebihan dan menutupi karang. Tindakan alami ini memberi ruang bagi terumbu karang untuk tumbuh subur dan menjadi rumah serta tempat berkembang biak bagi aneka jenis ikan.</w:t>
+        <w:br/>
+        <w:br/>
+        <w:t>Namun, keberadaan penyu sisik saat ini berada dalam bayang-bayang ancaman kepunahan yang nyata. Populasi satwa langka ini terus mengalami penurunan tajam akibat perburuan liar untuk diambil cangkangnya sebagai bahan kerajinan bernilai tinggi, perdagangan telur penyu secara ilegal, serta pencemaran sampah plastik di lautan. Penyu kerap mengira kantong plastik transparan yang terapung di perairan sebagai ubur-ubur santapan mereka. Akibatnya, plastik menyumbat saluran pencernaan dan menyebabkan kematian tragis bagi ribuan penyu setiap tahunnya.</w:t>
+        <w:br/>
+        <w:br/>
+        <w:t>Untuk mencegah kepunahan satwa karismatik ini, pemerintah bersama komunitas pelestari alam menggiatkan berbagai upaya konservasi dan penetasan semi-alami, seperti di pesisir Sukamade, Jawa Timur dan Kepulauan Derawan, Kalimantan Timur. Di pusat konservasi, sarang telur penyu di pantai dijaga ketat dari incaran predator maupun pemburu. Telur-telur yang berhasil diamankan dipindahkan ke bak penetasan khusus hingga menetas. Setelah menetas, anak penyu (tukik) dirawat secara intensif selama beberapa hari sebelum akhirnya dilepasliarkan kembali ke laut lepas pada malam atau dini hari guna menghindari serangan burung pemangsa.</w:t>
+        <w:br/>
+        <w:br/>
+        <w:t>Berdasarkan paragraf pertama teks di atas, peran ekologis penyu sisik yang sangat penting bagi kelestarian terumbu karang adalah....</w:t>
+      </w:r>
+    </w:p>
+    <w:p>
+      <w:pPr>
+        <w:pStyle w:val="ListBullet"/>
+        <w:ind w:left="720"/>
+      </w:pPr>
+      <w:r>
+        <w:rPr>
+          <w:b/>
+        </w:rPr>
+        <w:t xml:space="preserve">A. </w:t>
+      </w:r>
+      <w:r>
+        <w:t>Menghasilkan zat kapur alami yang mempercepat pembentukan karang baru</w:t>
+      </w:r>
+    </w:p>
+    <w:p>
+      <w:pPr>
+        <w:pStyle w:val="ListBullet"/>
+        <w:ind w:left="720"/>
+      </w:pPr>
+      <w:r>
+        <w:rPr>
+          <w:b/>
+        </w:rPr>
+        <w:t xml:space="preserve">B. </w:t>
+      </w:r>
+      <w:r>
+        <w:t>Memakan spons laut agar tidak tumbuh berlebihan dan menutupi terumbu karang</w:t>
+      </w:r>
+    </w:p>
+    <w:p>
+      <w:pPr>
+        <w:pStyle w:val="ListBullet"/>
+        <w:ind w:left="720"/>
+      </w:pPr>
+      <w:r>
+        <w:rPr>
+          <w:b/>
+        </w:rPr>
+        <w:t xml:space="preserve">C. </w:t>
+      </w:r>
+      <w:r>
+        <w:t>Menjaga kejernihan air laut dengan menyaring endapan lumpur pantai</w:t>
+      </w:r>
+    </w:p>
+    <w:p>
+      <w:pPr>
+        <w:pStyle w:val="ListBullet"/>
+        <w:ind w:left="720"/>
+      </w:pPr>
+      <w:r>
+        <w:rPr>
+          <w:b/>
+        </w:rPr>
+        <w:t xml:space="preserve">D. </w:t>
+      </w:r>
+      <w:r>
+        <w:t>Menjadi tempat bertenggernya aneka jenis burung laut pemangsa</w:t>
+      </w:r>
+    </w:p>
+    <w:p>
+      <w:r>
+        <w:rPr>
+          <w:b/>
+        </w:rPr>
+        <w:t xml:space="preserve">Kunci Jawaban: </w:t>
+      </w:r>
+      <w:r>
+        <w:rPr>
+          <w:b/>
+        </w:rPr>
+        <w:t>2</w:t>
+      </w:r>
+    </w:p>
+    <w:p>
+      <w:r>
+        <w:t>────────────────────────────────────────────────────────────</w:t>
+      </w:r>
+    </w:p>
+    <w:p>
+      <w:r>
+        <w:rPr>
+          <w:b/>
+          <w:sz w:val="24"/>
+        </w:rPr>
+        <w:t>Soal 2.</w:t>
+      </w:r>
+    </w:p>
+    <w:p>
+      <w:pPr>
+        <w:ind w:left="360"/>
+      </w:pPr>
+      <w:r>
+        <w:t>Ide pokok yang terdapat pada paragraf kedua teks 'Penyu Sisik: Sang Penjaga Terumbu Karang Nusantara' adalah....</w:t>
+      </w:r>
+    </w:p>
+    <w:p>
+      <w:pPr>
+        <w:pStyle w:val="ListBullet"/>
+        <w:ind w:left="720"/>
+      </w:pPr>
+      <w:r>
+        <w:rPr>
+          <w:b/>
+        </w:rPr>
+        <w:t xml:space="preserve">A. </w:t>
+      </w:r>
+      <w:r>
+        <w:t>Jenis kerajinan tangan bernilai ekonomi dari cangkang penyu sisik</w:t>
+      </w:r>
+    </w:p>
+    <w:p>
+      <w:pPr>
+        <w:pStyle w:val="ListBullet"/>
+        <w:ind w:left="720"/>
+      </w:pPr>
+      <w:r>
+        <w:rPr>
+          <w:b/>
+        </w:rPr>
+        <w:t xml:space="preserve">B. </w:t>
+      </w:r>
+      <w:r>
+        <w:t>Penyebab pencemaran sampah plastik di wilayah perairan laut Indonesia</w:t>
+      </w:r>
+    </w:p>
+    <w:p>
+      <w:pPr>
+        <w:pStyle w:val="ListBullet"/>
+        <w:ind w:left="720"/>
+      </w:pPr>
+      <w:r>
+        <w:rPr>
+          <w:b/>
+        </w:rPr>
+        <w:t xml:space="preserve">C. </w:t>
+      </w:r>
+      <w:r>
+        <w:t>Ancaman kepunahan populasi penyu sisik akibat aktivitas manusia dan limbah plastik</w:t>
+      </w:r>
+    </w:p>
+    <w:p>
+      <w:pPr>
+        <w:pStyle w:val="ListBullet"/>
+        <w:ind w:left="720"/>
+      </w:pPr>
+      <w:r>
+        <w:rPr>
+          <w:b/>
+        </w:rPr>
+        <w:t xml:space="preserve">D. </w:t>
+      </w:r>
+      <w:r>
+        <w:t>Kemiripan fisik antara kantong plastik transparan dengan ubur-ubur laut</w:t>
+      </w:r>
+    </w:p>
+    <w:p>
+      <w:r>
+        <w:rPr>
+          <w:b/>
+        </w:rPr>
+        <w:t xml:space="preserve">Kunci Jawaban: </w:t>
+      </w:r>
+      <w:r>
+        <w:rPr>
+          <w:b/>
+        </w:rPr>
+        <w:t>1, 2</w:t>
+      </w:r>
+    </w:p>
+    <w:p>
+      <w:r>
+        <w:t>────────────────────────────────────────────────────────────</w:t>
+      </w:r>
+    </w:p>
+    <w:p>
+      <w:r>
+        <w:rPr>
+          <w:b/>
+          <w:sz w:val="24"/>
+        </w:rPr>
+        <w:t>Soal 3.</w:t>
+      </w:r>
+    </w:p>
+    <w:p>
+      <w:pPr>
+        <w:ind w:left="360"/>
+      </w:pPr>
+      <w:r>
+        <w:t>Makna istilah 'konservasi' pada paragraf ketiga teks tersebut adalah....</w:t>
+      </w:r>
+    </w:p>
+    <w:p>
+      <w:pPr>
+        <w:pStyle w:val="ListBullet"/>
+        <w:ind w:left="720"/>
+      </w:pPr>
+      <w:r>
+        <w:rPr>
+          <w:b/>
+        </w:rPr>
+        <w:t xml:space="preserve">A. </w:t>
+      </w:r>
+      <w:r>
+        <w:t>True</w:t>
+      </w:r>
+    </w:p>
+    <w:p>
+      <w:pPr>
+        <w:pStyle w:val="ListBullet"/>
+        <w:ind w:left="720"/>
+      </w:pPr>
+      <w:r>
+        <w:rPr>
+          <w:b/>
+        </w:rPr>
+        <w:t xml:space="preserve">B. </w:t>
+      </w:r>
+      <w:r>
+        <w:t>False</w:t>
+      </w:r>
+    </w:p>
+    <w:p>
+      <w:r>
+        <w:rPr>
+          <w:b/>
+        </w:rPr>
+        <w:t xml:space="preserve">Kunci Jawaban: </w:t>
+      </w:r>
+      <w:r>
+        <w:rPr>
+          <w:b/>
+        </w:rPr>
+        <w:t>True</w:t>
+      </w:r>
+    </w:p>
+    <w:p>
+      <w:r>
+        <w:t>────────────────────────────────────────────────────────────</w:t>
+      </w:r>
+    </w:p>
+    <w:p>
+      <w:r>
+        <w:rPr>
+          <w:b/>
+          <w:sz w:val="24"/>
+        </w:rPr>
+        <w:t>Soal 4.</w:t>
+      </w:r>
+    </w:p>
+    <w:p>
+      <w:pPr>
+        <w:ind w:left="360"/>
+      </w:pPr>
+      <w:r>
+        <w:t>Berdasarkan teks bacaan, mengapa sampah kantong plastik sangat berbahaya dan sering tertelan oleh penyu sisik di lautan?</w:t>
+      </w:r>
+    </w:p>
+    <w:p>
+      <w:pPr>
+        <w:pStyle w:val="ListBullet"/>
+        <w:ind w:left="720"/>
+      </w:pPr>
+      <w:r>
+        <w:rPr>
+          <w:b/>
+        </w:rPr>
+        <w:t xml:space="preserve">A. </w:t>
+      </w:r>
+      <w:r>
+        <w:t>Kantong plastik mengeluarkan aroma amis yang memancing selera makan penyu</w:t>
+      </w:r>
+    </w:p>
+    <w:p>
+      <w:pPr>
+        <w:pStyle w:val="ListBullet"/>
+        <w:ind w:left="720"/>
+      </w:pPr>
+      <w:r>
+        <w:rPr>
+          <w:b/>
+        </w:rPr>
+        <w:t xml:space="preserve">B. </w:t>
+      </w:r>
+      <w:r>
+        <w:t>Penyu sisik mengira kantong plastik transparan yang terapung sebagai ubur-ubur</w:t>
+      </w:r>
+    </w:p>
+    <w:p>
+      <w:pPr>
+        <w:pStyle w:val="ListBullet"/>
+        <w:ind w:left="720"/>
+      </w:pPr>
+      <w:r>
+        <w:rPr>
+          <w:b/>
+        </w:rPr>
+        <w:t xml:space="preserve">C. </w:t>
+      </w:r>
+      <w:r>
+        <w:t>Sampah plastik menempel erat pada spons laut yang menjadi mangsa penyu</w:t>
+      </w:r>
+    </w:p>
+    <w:p>
+      <w:pPr>
+        <w:pStyle w:val="ListBullet"/>
+        <w:ind w:left="720"/>
+      </w:pPr>
+      <w:r>
+        <w:rPr>
+          <w:b/>
+        </w:rPr>
+        <w:t xml:space="preserve">D. </w:t>
+      </w:r>
+      <w:r>
+        <w:t>Penyu sengaja memakan plastik untuk membantu proses pencernaan cangkangnya</w:t>
+      </w:r>
+    </w:p>
+    <w:p>
+      <w:r>
+        <w:rPr>
+          <w:b/>
+        </w:rPr>
+        <w:t xml:space="preserve">Kunci Jawaban: </w:t>
+      </w:r>
+      <w:r>
+        <w:rPr>
+          <w:b/>
+        </w:rPr>
+        <w:t>2</w:t>
+      </w:r>
+    </w:p>
+    <w:p>
+      <w:r>
+        <w:t>────────────────────────────────────────────────────────────</w:t>
+      </w:r>
+    </w:p>
+    <w:p>
+      <w:r>
+        <w:rPr>
+          <w:b/>
+          <w:sz w:val="24"/>
+        </w:rPr>
+        <w:t>Soal 5.</w:t>
+      </w:r>
+    </w:p>
+    <w:p>
+      <w:pPr>
+        <w:ind w:left="360"/>
+      </w:pPr>
+      <w:r>
+        <w:t>Pernyataan berikut yang TIDAK SESUAI dengan isi teks 'Penyu Sisik: Sang Penjaga Terumbu Karang Nusantara' adalah....</w:t>
+      </w:r>
+    </w:p>
+    <w:p>
+      <w:pPr>
+        <w:pStyle w:val="ListBullet"/>
+        <w:ind w:left="720"/>
+      </w:pPr>
+      <w:r>
+        <w:rPr>
+          <w:b/>
+        </w:rPr>
+        <w:t xml:space="preserve">A. </w:t>
+      </w:r>
+      <w:r>
+        <w:t>Penyu sisik memiliki bentuk paruh runcing menyerupai paruh burung elang.</w:t>
+      </w:r>
+    </w:p>
+    <w:p>
+      <w:pPr>
+        <w:pStyle w:val="ListBullet"/>
+        <w:ind w:left="720"/>
+      </w:pPr>
+      <w:r>
+        <w:rPr>
+          <w:b/>
+        </w:rPr>
+        <w:t xml:space="preserve">B. </w:t>
+      </w:r>
+      <w:r>
+        <w:t>Tukik dilepasliarkan pada siang hari terik agar tubuhnya cepat kuat berenang.</w:t>
+      </w:r>
+    </w:p>
+    <w:p>
+      <w:pPr>
+        <w:pStyle w:val="ListBullet"/>
+        <w:ind w:left="720"/>
+      </w:pPr>
+      <w:r>
+        <w:rPr>
+          <w:b/>
+        </w:rPr>
+        <w:t xml:space="preserve">C. </w:t>
+      </w:r>
+      <w:r>
+        <w:t>Kepulauan Derawan dan Sukamade merupakan contoh lokasi konservasi penyu.</w:t>
+      </w:r>
+    </w:p>
+    <w:p>
+      <w:pPr>
+        <w:pStyle w:val="ListBullet"/>
+        <w:ind w:left="720"/>
+      </w:pPr>
+      <w:r>
+        <w:rPr>
+          <w:b/>
+        </w:rPr>
+        <w:t xml:space="preserve">D. </w:t>
+      </w:r>
+      <w:r>
+        <w:t>Populasi penyu sisik berkurang salah satunya karena perburuan cangkang sisiknya.</w:t>
+      </w:r>
+    </w:p>
+    <w:p>
+      <w:r>
+        <w:rPr>
+          <w:b/>
+        </w:rPr>
+        <w:t xml:space="preserve">Kunci Jawaban: </w:t>
+      </w:r>
+      <w:r>
+        <w:rPr>
+          <w:b/>
+        </w:rPr>
+        <w:t>1, 2</w:t>
+      </w:r>
+    </w:p>
+    <w:p>
+      <w:r>
+        <w:t>────────────────────────────────────────────────────────────</w:t>
+      </w:r>
+    </w:p>
+    <w:p>
+      <w:r>
+        <w:rPr>
+          <w:b/>
+          <w:sz w:val="24"/>
+        </w:rPr>
+        <w:t>Soal 6.</w:t>
+      </w:r>
+    </w:p>
+    <w:p>
+      <w:pPr>
+        <w:ind w:left="360"/>
+      </w:pPr>
+      <w:r>
+        <w:t>Bacalah cerita anak berikut dengan cermat untuk menjawab soal nomor 6 sampai 10!</w:t>
+        <w:br/>
+        <w:br/>
+        <w:t>Kejujuran di Balik Kantong Belacu Kakek Suro</w:t>
+        <w:br/>
+        <w:br/>
+        <w:t>Siang itu, terik matahari membakar jalanan Desa Sukamaju. Arga mengayuh sepeda ontel tuanya dengan peluh yang mengucur di pelipis. Di keranjang depan sepeda, tersusun rapi beberapa ikat bayam dan kangkung segar hasil kebun pekarangan rumahnya yang hendak ia jajakan ke pasar desa demi membantu keperluan dapur ibunya. Ketika melewati tikungan jembatan kayu di perbatasan desa, roda depan sepedanya menabrak sesuatu. Arga mengerem mendadak dan menoleh ke bawah. Di tepi semak-semak rumput gajah, tergeletak sebuah kantong kain belacu berwarna cokelat kusam.</w:t>
+        <w:br/>
+        <w:br/>
+        <w:t>Arga turun dari sepeda dan memungut kantong tersebut. Alangkah terkejutnya ia ketika membuka resletingnya: di dalamnya terdapat beberapa lembar uang ratusan ribu rupiah yang diikat karet gelang, sebuah kartu identitas penduduk, dan buku pemeriksaan kesehatan lansia atas nama Kakek Suro. Kakek Suro adalah seorang perajin anyaman bambu tua yang tinggal sebatang kara di ujung dusun.</w:t>
+        <w:br/>
+        <w:br/>
+        <w:t xml:space="preserve">Di dalam hati Arga, sempat terlintas bisikan godaan. Sepatu sekolahnya sudah jebol di bagian tumit, dan uang itu lebih dari cukup untuk membeli sepatu baru yang bagus. Namun, seketika petuah bijak sang ibu bergaung kuat di dadanya: "Kejujuran adalah kehormatan hidup kita, Arga. Mengambil hak orang lain hanya akan menanam duri dalam jiwa." </w:t>
+        <w:br/>
+        <w:br/>
+        <w:t>Tanpa ragu lagi, Arga memutar haluan sepedanya menuju gubuk Kakek Suro. Sesampainya di sana, Arga mendapati sang kakek sedang duduk lemas di tangga bambu sambil meneteskan air mata. Ternyata, uang tersebut adalah tabungan hasil penjualan tampah dan bakul anyaman selama empat bulan yang rencananya akan dipakai untuk menebus obat asma di puskesmas. Ketika Arga mengulurkan kantong belacu itu utuh tanpa berkurang sedikit pun, Kakek Suro seketika memeluk Arga erat dengan linangan air mata haru dan tak henti memanjatkan doa berkah bagi anak yang berbudi luhur itu.</w:t>
+        <w:br/>
+        <w:br/>
+        <w:t>Watak utama tokoh Arga yang tergambar paling dominan dalam cerita di atas adalah....</w:t>
+      </w:r>
+    </w:p>
+    <w:p>
+      <w:pPr>
+        <w:pStyle w:val="ListBullet"/>
+        <w:ind w:left="720"/>
+      </w:pPr>
+      <w:r>
+        <w:rPr>
+          <w:b/>
+        </w:rPr>
+        <w:t xml:space="preserve">A. </w:t>
+      </w:r>
+      <w:r>
+        <w:t>True</w:t>
+      </w:r>
+    </w:p>
+    <w:p>
+      <w:pPr>
+        <w:pStyle w:val="ListBullet"/>
+        <w:ind w:left="720"/>
+      </w:pPr>
+      <w:r>
+        <w:rPr>
+          <w:b/>
+        </w:rPr>
+        <w:t xml:space="preserve">B. </w:t>
+      </w:r>
+      <w:r>
+        <w:t>False</w:t>
+      </w:r>
+    </w:p>
+    <w:p>
+      <w:r>
+        <w:rPr>
+          <w:b/>
+        </w:rPr>
+        <w:t xml:space="preserve">Kunci Jawaban: </w:t>
+      </w:r>
+      <w:r>
+        <w:rPr>
+          <w:b/>
+        </w:rPr>
+        <w:t>True</w:t>
+      </w:r>
+    </w:p>
+    <w:p>
+      <w:r>
+        <w:t>────────────────────────────────────────────────────────────</w:t>
+      </w:r>
+    </w:p>
+    <w:p>
+      <w:r>
+        <w:rPr>
+          <w:b/>
+          <w:sz w:val="24"/>
+        </w:rPr>
+        <w:t>Soal 7.</w:t>
+      </w:r>
+    </w:p>
+    <w:p>
+      <w:pPr>
+        <w:ind w:left="360"/>
+      </w:pPr>
+      <w:r>
+        <w:t>Latar tempat terjadinya peristiwa penemuan kantong belacu cokelat oleh Arga adalah....</w:t>
+      </w:r>
+    </w:p>
+    <w:p>
+      <w:pPr>
+        <w:pStyle w:val="ListBullet"/>
+        <w:ind w:left="720"/>
+      </w:pPr>
+      <w:r>
+        <w:rPr>
+          <w:b/>
+        </w:rPr>
+        <w:t xml:space="preserve">A. </w:t>
+      </w:r>
+      <w:r>
+        <w:t>Di tengah pasar desa yang ramai</w:t>
+      </w:r>
+    </w:p>
+    <w:p>
+      <w:pPr>
+        <w:pStyle w:val="ListBullet"/>
+        <w:ind w:left="720"/>
+      </w:pPr>
+      <w:r>
+        <w:rPr>
+          <w:b/>
+        </w:rPr>
+        <w:t xml:space="preserve">B. </w:t>
+      </w:r>
+      <w:r>
+        <w:t>Di tepi semak rumput gajah dekat tikungan jembatan kayu perbatasan desa</w:t>
+      </w:r>
+    </w:p>
+    <w:p>
+      <w:pPr>
+        <w:pStyle w:val="ListBullet"/>
+        <w:ind w:left="720"/>
+      </w:pPr>
+      <w:r>
+        <w:rPr>
+          <w:b/>
+        </w:rPr>
+        <w:t xml:space="preserve">C. </w:t>
+      </w:r>
+      <w:r>
+        <w:t>Di pekarangan rumah gubuk milik Kakek Suro</w:t>
+      </w:r>
+    </w:p>
+    <w:p>
+      <w:pPr>
+        <w:pStyle w:val="ListBullet"/>
+        <w:ind w:left="720"/>
+      </w:pPr>
+      <w:r>
+        <w:rPr>
+          <w:b/>
+        </w:rPr>
+        <w:t xml:space="preserve">D. </w:t>
+      </w:r>
+      <w:r>
+        <w:t>Di ruang tunggu puskesmas desa</w:t>
+      </w:r>
+    </w:p>
+    <w:p>
+      <w:r>
+        <w:rPr>
+          <w:b/>
+        </w:rPr>
+        <w:t xml:space="preserve">Kunci Jawaban: </w:t>
+      </w:r>
+      <w:r>
+        <w:rPr>
+          <w:b/>
+        </w:rPr>
+        <w:t>2</w:t>
+      </w:r>
+    </w:p>
+    <w:p>
+      <w:r>
+        <w:t>────────────────────────────────────────────────────────────</w:t>
+      </w:r>
+    </w:p>
+    <w:p>
+      <w:r>
+        <w:rPr>
+          <w:b/>
+          <w:sz w:val="24"/>
+        </w:rPr>
+        <w:t>Soal 8.</w:t>
+      </w:r>
+    </w:p>
+    <w:p>
+      <w:pPr>
+        <w:ind w:left="360"/>
+      </w:pPr>
+      <w:r>
+        <w:t>Konflik batin yang sempat dialami tokoh Arga ketika melihat isi kantong kain belacu tersebut adalah....</w:t>
+      </w:r>
+    </w:p>
+    <w:p>
+      <w:pPr>
+        <w:pStyle w:val="ListBullet"/>
+        <w:ind w:left="720"/>
+      </w:pPr>
+      <w:r>
+        <w:rPr>
+          <w:b/>
+        </w:rPr>
+        <w:t xml:space="preserve">A. </w:t>
+      </w:r>
+      <w:r>
+        <w:t>Kebingungan memilih apakah harus menjual sayur ke pasar atau pulang ke rumah</w:t>
+      </w:r>
+    </w:p>
+    <w:p>
+      <w:pPr>
+        <w:pStyle w:val="ListBullet"/>
+        <w:ind w:left="720"/>
+      </w:pPr>
+      <w:r>
+        <w:rPr>
+          <w:b/>
+        </w:rPr>
+        <w:t xml:space="preserve">B. </w:t>
+      </w:r>
+      <w:r>
+        <w:t>Keinginan menggunakan uang temuan untuk membeli sepatu baru versus ajaran moral kejujuran dari ibunya</w:t>
+      </w:r>
+    </w:p>
+    <w:p>
+      <w:pPr>
+        <w:pStyle w:val="ListBullet"/>
+        <w:ind w:left="720"/>
+      </w:pPr>
+      <w:r>
+        <w:rPr>
+          <w:b/>
+        </w:rPr>
+        <w:t xml:space="preserve">C. </w:t>
+      </w:r>
+      <w:r>
+        <w:t>Rasa takut dituduh mencuri barang berharga milik warga dusun lain</w:t>
+      </w:r>
+    </w:p>
+    <w:p>
+      <w:pPr>
+        <w:pStyle w:val="ListBullet"/>
+        <w:ind w:left="720"/>
+      </w:pPr>
+      <w:r>
+        <w:rPr>
+          <w:b/>
+        </w:rPr>
+        <w:t xml:space="preserve">D. </w:t>
+      </w:r>
+      <w:r>
+        <w:t>Kekhawatiran sepedanya akan rusak jika memutar arah jalan</w:t>
+      </w:r>
+    </w:p>
+    <w:p>
+      <w:r>
+        <w:rPr>
+          <w:b/>
+        </w:rPr>
+        <w:t xml:space="preserve">Kunci Jawaban: </w:t>
+      </w:r>
+      <w:r>
+        <w:rPr>
+          <w:b/>
+        </w:rPr>
+        <w:t>1, 2</w:t>
+      </w:r>
+    </w:p>
+    <w:p>
+      <w:r>
+        <w:t>────────────────────────────────────────────────────────────</w:t>
+      </w:r>
+    </w:p>
+    <w:p>
+      <w:r>
+        <w:rPr>
+          <w:b/>
+          <w:sz w:val="24"/>
+        </w:rPr>
+        <w:t>Soal 9.</w:t>
+      </w:r>
+    </w:p>
+    <w:p>
+      <w:pPr>
+        <w:ind w:left="360"/>
+      </w:pPr>
+      <w:r>
+        <w:t>Amanat utama yang dapat dipetik dari kisah 'Kejujuran di Balik Kantong Belacu Kakek Suro' adalah....</w:t>
+      </w:r>
+    </w:p>
+    <w:p>
+      <w:pPr>
+        <w:pStyle w:val="ListBullet"/>
+        <w:ind w:left="720"/>
+      </w:pPr>
+      <w:r>
+        <w:rPr>
+          <w:b/>
+        </w:rPr>
+        <w:t xml:space="preserve">A. </w:t>
+      </w:r>
+      <w:r>
+        <w:t>True</w:t>
+      </w:r>
+    </w:p>
+    <w:p>
+      <w:pPr>
+        <w:pStyle w:val="ListBullet"/>
+        <w:ind w:left="720"/>
+      </w:pPr>
+      <w:r>
+        <w:rPr>
+          <w:b/>
+        </w:rPr>
+        <w:t xml:space="preserve">B. </w:t>
+      </w:r>
+      <w:r>
+        <w:t>False</w:t>
+      </w:r>
+    </w:p>
+    <w:p>
+      <w:r>
+        <w:rPr>
+          <w:b/>
+        </w:rPr>
+        <w:t xml:space="preserve">Kunci Jawaban: </w:t>
+      </w:r>
+      <w:r>
+        <w:rPr>
+          <w:b/>
+        </w:rPr>
+        <w:t>True</w:t>
+      </w:r>
+    </w:p>
+    <w:p>
+      <w:r>
+        <w:t>────────────────────────────────────────────────────────────</w:t>
+      </w:r>
+    </w:p>
+    <w:p>
+      <w:r>
+        <w:rPr>
+          <w:b/>
+          <w:sz w:val="24"/>
+        </w:rPr>
+        <w:t>Soal 10.</w:t>
+      </w:r>
+    </w:p>
+    <w:p>
+      <w:pPr>
+        <w:ind w:left="360"/>
+      </w:pPr>
+      <w:r>
+        <w:t>Perilaku terpuji tokoh Arga yang paling patut diteladani oleh siswa dalam kehidupan sehari-hari adalah....</w:t>
+      </w:r>
+    </w:p>
+    <w:p>
+      <w:pPr>
+        <w:pStyle w:val="ListBullet"/>
+        <w:ind w:left="720"/>
+      </w:pPr>
+      <w:r>
+        <w:rPr>
+          <w:b/>
+        </w:rPr>
+        <w:t xml:space="preserve">A. </w:t>
+      </w:r>
+      <w:r>
+        <w:t>Menabung uang saku sekolah sebanyak-banyaknya di bank</w:t>
+      </w:r>
+    </w:p>
+    <w:p>
+      <w:pPr>
+        <w:pStyle w:val="ListBullet"/>
+        <w:ind w:left="720"/>
+      </w:pPr>
+      <w:r>
+        <w:rPr>
+          <w:b/>
+        </w:rPr>
+        <w:t xml:space="preserve">B. </w:t>
+      </w:r>
+      <w:r>
+        <w:t>Mengembalikan barang temuan yang bukan haknya secara utuh kepada pemilik aslinya</w:t>
+      </w:r>
+    </w:p>
+    <w:p>
+      <w:pPr>
+        <w:pStyle w:val="ListBullet"/>
+        <w:ind w:left="720"/>
+      </w:pPr>
+      <w:r>
+        <w:rPr>
+          <w:b/>
+        </w:rPr>
+        <w:t xml:space="preserve">C. </w:t>
+      </w:r>
+      <w:r>
+        <w:t>Memperbaiki sepeda ontel sendiri tanpa bantuan orang dewasa</w:t>
+      </w:r>
+    </w:p>
+    <w:p>
+      <w:pPr>
+        <w:pStyle w:val="ListBullet"/>
+        <w:ind w:left="720"/>
+      </w:pPr>
+      <w:r>
+        <w:rPr>
+          <w:b/>
+        </w:rPr>
+        <w:t xml:space="preserve">D. </w:t>
+      </w:r>
+      <w:r>
+        <w:t>Berjalan kaki saat berangkat ke sekolah demi menghemat tenaga</w:t>
+      </w:r>
+    </w:p>
+    <w:p>
+      <w:r>
+        <w:rPr>
+          <w:b/>
+        </w:rPr>
+        <w:t xml:space="preserve">Kunci Jawaban: </w:t>
+      </w:r>
+      <w:r>
+        <w:rPr>
+          <w:b/>
+        </w:rPr>
+        <w:t>2</w:t>
+      </w:r>
+    </w:p>
+    <w:p>
+      <w:r>
+        <w:t>────────────────────────────────────────────────────────────</w:t>
+      </w:r>
+    </w:p>
+    <w:p>
+      <w:r>
+        <w:rPr>
+          <w:b/>
+          <w:sz w:val="24"/>
+        </w:rPr>
+        <w:t>Soal 11.</w:t>
+      </w:r>
+    </w:p>
+    <w:p>
+      <w:pPr>
+        <w:ind w:left="360"/>
+      </w:pPr>
+      <w:r>
+        <w:t>Bacalah kutipan dialog wawancara berikut untuk menjawab soal nomor 11 sampai 14!</w:t>
+        <w:br/>
+        <w:br/>
+        <w:t>Wawancara Cilik: Menggugah Kepedulian Lewat Bank Sampah Sekolah</w:t>
+        <w:br/>
+        <w:br/>
+        <w:t>Dika (Pewawancara) : "Selamat pagi, Ibu Ratna. Kami dari tim buletin sekolah ingin menggali informasi tentang keberhasilan program 'Bank Sampah Berseri' yang Ibu bimbing. Sebenarnya apa tujuan utama dibentuknya bank sampah ini di sekolah kita?"</w:t>
+        <w:br/>
+        <w:t>Ibu Ratna (Pembina) : "Selamat pagi, Dika. Tujuan utamanya bukan semata-mata mengumpulkan sampah, melainkan membangun kesadaran dan kebiasaan berwawasan lingkungan hidup sejak dini. Kami ingin para siswa memahami konsep pilah sampah: mana sampah organik yang bisa diolah jadi kompos, mana anorganik yang bisa didaur ulang bernilai ekonomis, dan mana residu."</w:t>
+        <w:br/>
+        <w:t>Dika : "Bagaimana cara kerja penyetoran sampah oleh siswa setiap pekannya, Bu?"</w:t>
+        <w:br/>
+        <w:t>Ibu Ratna : "Setiap hari Jumat pagi, siswa membawa sampah anorganik kering dari rumah maupun sekolah, seperti botol plastik, kardus bekas, atau kaleng minuman. Pengurus cilik bank sampah akan menimbang beratnya, mencatatnya, lalu mengonversikannya menjadi saldo tabungan di buku rekening siswa. Saldo tabungan ini pada akhir semester dapat ditukarkan dengan buku tulis, pensil warna, atau bibit tanaman hias."</w:t>
+        <w:br/>
+        <w:t>Dika : "Sungguh inovatif! Lalu apa dampak paling signifikan yang dirasakan sekolah setelah program ini berjalan satu semester, Bu?"</w:t>
+        <w:br/>
+        <w:t xml:space="preserve">Ibu Ratna : "Alhamdulillah, volume timbulan sampah sekolah yang dibuang ke TPA berkurang drastis hingga 60%. Selain itu, ruang kelas menjadi sangat bersih dan siswa terbiasa bertanggung jawab terhadap lingkungan sekitarnya." </w:t>
+        <w:br/>
+        <w:br/>
+        <w:t>Topik pokok pembicaraan dalam wawancara antara Dika dan Ibu Ratna adalah....</w:t>
+      </w:r>
+    </w:p>
+    <w:p>
+      <w:pPr>
+        <w:pStyle w:val="ListBullet"/>
+        <w:ind w:left="720"/>
+      </w:pPr>
+      <w:r>
+        <w:rPr>
+          <w:b/>
+        </w:rPr>
+        <w:t xml:space="preserve">A. </w:t>
+      </w:r>
+      <w:r>
+        <w:t>Proses pembuatan kompos dari sisa tanaman hias sekolah</w:t>
+      </w:r>
+    </w:p>
+    <w:p>
+      <w:pPr>
+        <w:pStyle w:val="ListBullet"/>
+        <w:ind w:left="720"/>
+      </w:pPr>
+      <w:r>
+        <w:rPr>
+          <w:b/>
+        </w:rPr>
+        <w:t xml:space="preserve">B. </w:t>
+      </w:r>
+      <w:r>
+        <w:t>Sosialisasi dan manfaat pelaksanaan program Bank Sampah di lingkungan sekolah</w:t>
+      </w:r>
+    </w:p>
+    <w:p>
+      <w:pPr>
+        <w:pStyle w:val="ListBullet"/>
+        <w:ind w:left="720"/>
+      </w:pPr>
+      <w:r>
+        <w:rPr>
+          <w:b/>
+        </w:rPr>
+        <w:t xml:space="preserve">C. </w:t>
+      </w:r>
+      <w:r>
+        <w:t>Pemilihan ketua pengurus dokter cilik Adiwiyata periode baru</w:t>
+      </w:r>
+    </w:p>
+    <w:p>
+      <w:pPr>
+        <w:pStyle w:val="ListBullet"/>
+        <w:ind w:left="720"/>
+      </w:pPr>
+      <w:r>
+        <w:rPr>
+          <w:b/>
+        </w:rPr>
+        <w:t xml:space="preserve">D. </w:t>
+      </w:r>
+      <w:r>
+        <w:t>Teknik mendaur ulang botol plastik menjadi pot bunga hias</w:t>
+      </w:r>
+    </w:p>
+    <w:p>
+      <w:r>
+        <w:rPr>
+          <w:b/>
+        </w:rPr>
+        <w:t xml:space="preserve">Kunci Jawaban: </w:t>
+      </w:r>
+      <w:r>
+        <w:rPr>
+          <w:b/>
+        </w:rPr>
+        <w:t>1, 2</w:t>
+      </w:r>
+    </w:p>
+    <w:p>
+      <w:r>
+        <w:t>────────────────────────────────────────────────────────────</w:t>
+      </w:r>
+    </w:p>
+    <w:p>
+      <w:r>
+        <w:rPr>
+          <w:b/>
+          <w:sz w:val="24"/>
+        </w:rPr>
+        <w:t>Soal 12.</w:t>
+      </w:r>
+    </w:p>
+    <w:p>
+      <w:pPr>
+        <w:ind w:left="360"/>
+      </w:pPr>
+      <w:r>
+        <w:t>Berdasarkan dialog di atas, keuntungan langsung yang diperoleh siswa ketika menyetorkan sampah anorganik bersih ke Bank Sampah adalah....</w:t>
+      </w:r>
+    </w:p>
+    <w:p>
+      <w:pPr>
+        <w:pStyle w:val="ListBullet"/>
+        <w:ind w:left="720"/>
+      </w:pPr>
+      <w:r>
+        <w:rPr>
+          <w:b/>
+        </w:rPr>
+        <w:t xml:space="preserve">A. </w:t>
+      </w:r>
+      <w:r>
+        <w:t>True</w:t>
+      </w:r>
+    </w:p>
+    <w:p>
+      <w:pPr>
+        <w:pStyle w:val="ListBullet"/>
+        <w:ind w:left="720"/>
+      </w:pPr>
+      <w:r>
+        <w:rPr>
+          <w:b/>
+        </w:rPr>
+        <w:t xml:space="preserve">B. </w:t>
+      </w:r>
+      <w:r>
+        <w:t>False</w:t>
+      </w:r>
+    </w:p>
+    <w:p>
+      <w:r>
+        <w:rPr>
+          <w:b/>
+        </w:rPr>
+        <w:t xml:space="preserve">Kunci Jawaban: </w:t>
+      </w:r>
+      <w:r>
+        <w:rPr>
+          <w:b/>
+        </w:rPr>
+        <w:t>True</w:t>
+      </w:r>
+    </w:p>
+    <w:p>
+      <w:r>
+        <w:t>────────────────────────────────────────────────────────────</w:t>
+      </w:r>
+    </w:p>
+    <w:p>
+      <w:r>
+        <w:rPr>
+          <w:b/>
+          <w:sz w:val="24"/>
+        </w:rPr>
+        <w:t>Soal 13.</w:t>
+      </w:r>
+    </w:p>
+    <w:p>
+      <w:pPr>
+        <w:ind w:left="360"/>
+      </w:pPr>
+      <w:r>
+        <w:t>Dampak lingkungan yang paling nyata dirasakan sekolah setelah program Bank Sampah berjalan adalah....</w:t>
+      </w:r>
+    </w:p>
+    <w:p>
+      <w:pPr>
+        <w:pStyle w:val="ListBullet"/>
+        <w:ind w:left="720"/>
+      </w:pPr>
+      <w:r>
+        <w:rPr>
+          <w:b/>
+        </w:rPr>
+        <w:t xml:space="preserve">A. </w:t>
+      </w:r>
+      <w:r>
+        <w:t>Penjualan tanaman hias sekolah meningkat pesat ke luar kota</w:t>
+      </w:r>
+    </w:p>
+    <w:p>
+      <w:pPr>
+        <w:pStyle w:val="ListBullet"/>
+        <w:ind w:left="720"/>
+      </w:pPr>
+      <w:r>
+        <w:rPr>
+          <w:b/>
+        </w:rPr>
+        <w:t xml:space="preserve">B. </w:t>
+      </w:r>
+      <w:r>
+        <w:t>Volume timbulan sampah sekolah yang dibuang ke TPA berkurang hingga 60%</w:t>
+      </w:r>
+    </w:p>
+    <w:p>
+      <w:pPr>
+        <w:pStyle w:val="ListBullet"/>
+        <w:ind w:left="720"/>
+      </w:pPr>
+      <w:r>
+        <w:rPr>
+          <w:b/>
+        </w:rPr>
+        <w:t xml:space="preserve">C. </w:t>
+      </w:r>
+      <w:r>
+        <w:t>Biaya operasional kebersihan sekolah menjadi sepenuhnya gratis</w:t>
+      </w:r>
+    </w:p>
+    <w:p>
+      <w:pPr>
+        <w:pStyle w:val="ListBullet"/>
+        <w:ind w:left="720"/>
+      </w:pPr>
+      <w:r>
+        <w:rPr>
+          <w:b/>
+        </w:rPr>
+        <w:t xml:space="preserve">D. </w:t>
+      </w:r>
+      <w:r>
+        <w:t>Semua kantin sekolah dilarang menjual makanan berkemasan</w:t>
+      </w:r>
+    </w:p>
+    <w:p>
+      <w:r>
+        <w:rPr>
+          <w:b/>
+        </w:rPr>
+        <w:t xml:space="preserve">Kunci Jawaban: </w:t>
+      </w:r>
+      <w:r>
+        <w:rPr>
+          <w:b/>
+        </w:rPr>
+        <w:t>2</w:t>
+      </w:r>
+    </w:p>
+    <w:p>
+      <w:r>
+        <w:t>────────────────────────────────────────────────────────────</w:t>
+      </w:r>
+    </w:p>
+    <w:p>
+      <w:r>
+        <w:rPr>
+          <w:b/>
+          <w:sz w:val="24"/>
+        </w:rPr>
+        <w:t>Soal 14.</w:t>
+      </w:r>
+    </w:p>
+    <w:p>
+      <w:pPr>
+        <w:ind w:left="360"/>
+      </w:pPr>
+      <w:r>
+        <w:t>Simpulan yang paling tepat dari kutipan wawancara di atas adalah....</w:t>
+      </w:r>
+    </w:p>
+    <w:p>
+      <w:pPr>
+        <w:pStyle w:val="ListBullet"/>
+        <w:ind w:left="720"/>
+      </w:pPr>
+      <w:r>
+        <w:rPr>
+          <w:b/>
+        </w:rPr>
+        <w:t xml:space="preserve">A. </w:t>
+      </w:r>
+      <w:r>
+        <w:t>Pengelolaan bank sampah sekolah merupakan kegiatan wajib yang harus diawasi dinas kebersihan kota.</w:t>
+      </w:r>
+    </w:p>
+    <w:p>
+      <w:pPr>
+        <w:pStyle w:val="ListBullet"/>
+        <w:ind w:left="720"/>
+      </w:pPr>
+      <w:r>
+        <w:rPr>
+          <w:b/>
+        </w:rPr>
+        <w:t xml:space="preserve">B. </w:t>
+      </w:r>
+      <w:r>
+        <w:t>Program Bank Sampah di sekolah sangat efektif mengedukasi siswa dalam memilah sampah dan menciptakan lingkungan bersih.</w:t>
+      </w:r>
+    </w:p>
+    <w:p>
+      <w:pPr>
+        <w:pStyle w:val="ListBullet"/>
+        <w:ind w:left="720"/>
+      </w:pPr>
+      <w:r>
+        <w:rPr>
+          <w:b/>
+        </w:rPr>
+        <w:t xml:space="preserve">C. </w:t>
+      </w:r>
+      <w:r>
+        <w:t>Sampah anorganik bernilai ekonomis jauh lebih tinggi daripada pupuk kompos organik.</w:t>
+      </w:r>
+    </w:p>
+    <w:p>
+      <w:pPr>
+        <w:pStyle w:val="ListBullet"/>
+        <w:ind w:left="720"/>
+      </w:pPr>
+      <w:r>
+        <w:rPr>
+          <w:b/>
+        </w:rPr>
+        <w:t xml:space="preserve">D. </w:t>
+      </w:r>
+      <w:r>
+        <w:t>Siswa kelas VI harus bertanggung jawab penuh menjadi pengurus inti bank sampah sekolah.</w:t>
+      </w:r>
+    </w:p>
+    <w:p>
+      <w:r>
+        <w:rPr>
+          <w:b/>
+        </w:rPr>
+        <w:t xml:space="preserve">Kunci Jawaban: </w:t>
+      </w:r>
+      <w:r>
+        <w:rPr>
+          <w:b/>
+        </w:rPr>
+        <w:t>1, 2</w:t>
+      </w:r>
+    </w:p>
+    <w:p>
+      <w:r>
+        <w:t>────────────────────────────────────────────────────────────</w:t>
+      </w:r>
+    </w:p>
+    <w:p>
+      <w:r>
+        <w:rPr>
+          <w:b/>
+          <w:sz w:val="24"/>
+        </w:rPr>
+        <w:t>Soal 15.</w:t>
+      </w:r>
+    </w:p>
+    <w:p>
+      <w:pPr>
+        <w:ind w:left="360"/>
+      </w:pPr>
+      <w:r>
+        <w:t>Bacalah petunjuk prosedur berikut untuk menjawab soal nomor 15 dan 16!</w:t>
+        <w:br/>
+        <w:br/>
+        <w:t>Petunjuk Praktis Menanam Sayuran Hidroponik Sistem Sumbu (Wick System)</w:t>
+        <w:br/>
+        <w:t>(1) Siapkan botol plastik bekas air mineral ukuran 1,5 liter, lalu potong secara horizontal menjadi dua bagian menggunakan gunting atau *cutter*.</w:t>
+        <w:br/>
+        <w:t>(2) Buatlah lubang kecil pada tutup botol menggunakan solder atau paku panas, lalu selipkan sehelai kain flanel sepanjang 15 cm sebagai sumbu kapiler.</w:t>
+        <w:br/>
+        <w:t>(3) Pasang bagian atas botol yang sudah bersumbu ke dalam potongan bagian bawah botol secara terbalik (leher botol menghadap ke dasar).</w:t>
+        <w:br/>
+        <w:t>(4) [...]</w:t>
+        <w:br/>
+        <w:t>(5) Masukkan bibit tanaman sawi atau selada yang telah disemai (berdaun 3 sampai 4 helai) dengan hati-hati ke dalam media tanam tersebut.</w:t>
+        <w:br/>
+        <w:t>(6) Tuangkan larutan nutrisi hidroponik (larutan AB Mix) ke dalam wadah bagian bawah hingga menyentuh separuh sumbu flanel, lalu letakkan di area yang terkena sinar matahari cukup.</w:t>
+        <w:br/>
+        <w:br/>
+        <w:t>Kalimat yang paling tepat dan runtut untuk melengkapi langkah nomor (4) pada petunjuk hidroponik tersebut adalah....</w:t>
+      </w:r>
+    </w:p>
+    <w:p>
+      <w:pPr>
+        <w:pStyle w:val="ListBullet"/>
+        <w:ind w:left="720"/>
+      </w:pPr>
+      <w:r>
+        <w:rPr>
+          <w:b/>
+        </w:rPr>
+        <w:t xml:space="preserve">A. </w:t>
+      </w:r>
+      <w:r>
+        <w:t>True</w:t>
+      </w:r>
+    </w:p>
+    <w:p>
+      <w:pPr>
+        <w:pStyle w:val="ListBullet"/>
+        <w:ind w:left="720"/>
+      </w:pPr>
+      <w:r>
+        <w:rPr>
+          <w:b/>
+        </w:rPr>
+        <w:t xml:space="preserve">B. </w:t>
+      </w:r>
+      <w:r>
+        <w:t>False</w:t>
+      </w:r>
+    </w:p>
+    <w:p>
+      <w:r>
+        <w:rPr>
+          <w:b/>
+        </w:rPr>
+        <w:t xml:space="preserve">Kunci Jawaban: </w:t>
+      </w:r>
+      <w:r>
+        <w:rPr>
+          <w:b/>
+        </w:rPr>
+        <w:t>True</w:t>
+      </w:r>
+    </w:p>
+    <w:p>
+      <w:r>
+        <w:t>────────────────────────────────────────────────────────────</w:t>
+      </w:r>
+    </w:p>
+    <w:p>
+      <w:r>
+        <w:rPr>
+          <w:b/>
+          <w:sz w:val="24"/>
+        </w:rPr>
+        <w:t>Soal 16.</w:t>
+      </w:r>
+    </w:p>
+    <w:p>
+      <w:pPr>
+        <w:ind w:left="360"/>
+      </w:pPr>
+      <w:r>
+        <w:t>Fungsi utama kain flanel pada sistem hidroponik sumbu (wick system) berdasarkan teks prosedur di atas adalah....</w:t>
+      </w:r>
+    </w:p>
+    <w:p>
+      <w:pPr>
+        <w:pStyle w:val="ListBullet"/>
+        <w:ind w:left="720"/>
+      </w:pPr>
+      <w:r>
+        <w:rPr>
+          <w:b/>
+        </w:rPr>
+        <w:t xml:space="preserve">A. </w:t>
+      </w:r>
+      <w:r>
+        <w:t>Sebagai penahan agar botol bagian atas tidak mudah goyang dan tumpah</w:t>
+      </w:r>
+    </w:p>
+    <w:p>
+      <w:pPr>
+        <w:pStyle w:val="ListBullet"/>
+        <w:ind w:left="720"/>
+      </w:pPr>
+      <w:r>
+        <w:rPr>
+          <w:b/>
+        </w:rPr>
+        <w:t xml:space="preserve">B. </w:t>
+      </w:r>
+      <w:r>
+        <w:t>Sebagai sumbu kapiler yang menyerap larutan nutrisi dari bawah menuju akar tanaman</w:t>
+      </w:r>
+    </w:p>
+    <w:p>
+      <w:pPr>
+        <w:pStyle w:val="ListBullet"/>
+        <w:ind w:left="720"/>
+      </w:pPr>
+      <w:r>
+        <w:rPr>
+          <w:b/>
+        </w:rPr>
+        <w:t xml:space="preserve">C. </w:t>
+      </w:r>
+      <w:r>
+        <w:t>Untuk menyaring kotoran dan lumut yang tumbuh di dalam air tandon</w:t>
+      </w:r>
+    </w:p>
+    <w:p>
+      <w:pPr>
+        <w:pStyle w:val="ListBullet"/>
+        <w:ind w:left="720"/>
+      </w:pPr>
+      <w:r>
+        <w:rPr>
+          <w:b/>
+        </w:rPr>
+        <w:t xml:space="preserve">D. </w:t>
+      </w:r>
+      <w:r>
+        <w:t>Sebagai pengganti sinar matahari buatan bagi bibit tanaman</w:t>
+      </w:r>
+    </w:p>
+    <w:p>
+      <w:r>
+        <w:rPr>
+          <w:b/>
+        </w:rPr>
+        <w:t xml:space="preserve">Kunci Jawaban: </w:t>
+      </w:r>
+      <w:r>
+        <w:rPr>
+          <w:b/>
+        </w:rPr>
+        <w:t>2</w:t>
+      </w:r>
+    </w:p>
+    <w:p>
+      <w:r>
+        <w:t>────────────────────────────────────────────────────────────</w:t>
+      </w:r>
+    </w:p>
+    <w:p>
+      <w:r>
+        <w:rPr>
+          <w:b/>
+          <w:sz w:val="24"/>
+        </w:rPr>
+        <w:t>Soal 17.</w:t>
+      </w:r>
+    </w:p>
+    <w:p>
+      <w:pPr>
+        <w:ind w:left="360"/>
+      </w:pPr>
+      <w:r>
+        <w:t>Perhatikan bait puisi berikut!</w:t>
+        <w:br/>
+        <w:br/>
+        <w:t>Mentari pagi menyapa ramah</w:t>
+        <w:br/>
+        <w:t>Embun menari di ujung dedaunan</w:t>
+        <w:br/>
+        <w:t>Langkah kaki riang melangkah</w:t>
+        <w:br/>
+        <w:t>Menyambut masa depan penuh harapan</w:t>
+        <w:br/>
+        <w:br/>
+        <w:t>Makna ungkapan 'Embun menari di ujung dedaunan' pada bait puisi di atas adalah....</w:t>
+      </w:r>
+    </w:p>
+    <w:p>
+      <w:pPr>
+        <w:pStyle w:val="ListBullet"/>
+        <w:ind w:left="720"/>
+      </w:pPr>
+      <w:r>
+        <w:rPr>
+          <w:b/>
+        </w:rPr>
+        <w:t xml:space="preserve">A. </w:t>
+      </w:r>
+      <w:r>
+        <w:t>Tetesan air embun pagi yang tampak berkilau dan bergoyang terkena hembusan angin sejuk</w:t>
+      </w:r>
+    </w:p>
+    <w:p>
+      <w:pPr>
+        <w:pStyle w:val="ListBullet"/>
+        <w:ind w:left="720"/>
+      </w:pPr>
+      <w:r>
+        <w:rPr>
+          <w:b/>
+        </w:rPr>
+        <w:t xml:space="preserve">B. </w:t>
+      </w:r>
+      <w:r>
+        <w:t>Daun-daun berguguran ke tanah karena terkena tetesan air hujan lebat</w:t>
+      </w:r>
+    </w:p>
+    <w:p>
+      <w:pPr>
+        <w:pStyle w:val="ListBullet"/>
+        <w:ind w:left="720"/>
+      </w:pPr>
+      <w:r>
+        <w:rPr>
+          <w:b/>
+        </w:rPr>
+        <w:t xml:space="preserve">C. </w:t>
+      </w:r>
+      <w:r>
+        <w:t>Udara dingin yang menyebabkan tanaman layu di pagi hari</w:t>
+      </w:r>
+    </w:p>
+    <w:p>
+      <w:pPr>
+        <w:pStyle w:val="ListBullet"/>
+        <w:ind w:left="720"/>
+      </w:pPr>
+      <w:r>
+        <w:rPr>
+          <w:b/>
+        </w:rPr>
+        <w:t xml:space="preserve">D. </w:t>
+      </w:r>
+      <w:r>
+        <w:t>Cahaya matahari yang terhalang oleh kabut tebal pegunungan</w:t>
+      </w:r>
+    </w:p>
+    <w:p>
+      <w:r>
+        <w:rPr>
+          <w:b/>
+        </w:rPr>
+        <w:t xml:space="preserve">Kunci Jawaban: </w:t>
+      </w:r>
+      <w:r>
+        <w:rPr>
+          <w:b/>
+        </w:rPr>
+        <w:t>1, 2</w:t>
+      </w:r>
+    </w:p>
+    <w:p>
+      <w:r>
+        <w:t>────────────────────────────────────────────────────────────</w:t>
+      </w:r>
+    </w:p>
+    <w:p>
+      <w:r>
+        <w:rPr>
+          <w:b/>
+          <w:sz w:val="24"/>
+        </w:rPr>
+        <w:t>Soal 18.</w:t>
+      </w:r>
+    </w:p>
+    <w:p>
+      <w:pPr>
+        <w:ind w:left="360"/>
+      </w:pPr>
+      <w:r>
+        <w:t>Perhatikan kalimat-kalimat petunjuk pembuatan puding berikut!</w:t>
+        <w:br/>
+        <w:t>(1) Setelah uap panasnya berkurang, masukkan puding ke dalam lemari es hingga mengeras.</w:t>
+        <w:br/>
+        <w:t>(2) Campurkan bubuk agar-agar, gula pasir, dan air kelapa muda ke dalam panci secara merata.</w:t>
+        <w:br/>
+        <w:t>(3) Rebus adonan di atas api sedang sambil terus diaduk perlahan hingga mendidih sempurna.</w:t>
+        <w:br/>
+        <w:t>(4) Tuangkan cairan puding yang telah mendidih ke dalam cetakan yang telah disiapkan.</w:t>
+        <w:br/>
+        <w:br/>
+        <w:t>Urutan petunjuk yang tepat dan logis agar menjadi teks prosedur yang padu adalah....</w:t>
+      </w:r>
+    </w:p>
+    <w:p>
+      <w:pPr>
+        <w:pStyle w:val="ListBullet"/>
+        <w:ind w:left="720"/>
+      </w:pPr>
+      <w:r>
+        <w:rPr>
+          <w:b/>
+        </w:rPr>
+        <w:t xml:space="preserve">A. </w:t>
+      </w:r>
+      <w:r>
+        <w:t>True</w:t>
+      </w:r>
+    </w:p>
+    <w:p>
+      <w:pPr>
+        <w:pStyle w:val="ListBullet"/>
+        <w:ind w:left="720"/>
+      </w:pPr>
+      <w:r>
+        <w:rPr>
+          <w:b/>
+        </w:rPr>
+        <w:t xml:space="preserve">B. </w:t>
+      </w:r>
+      <w:r>
+        <w:t>False</w:t>
+      </w:r>
+    </w:p>
+    <w:p>
+      <w:r>
+        <w:rPr>
+          <w:b/>
+        </w:rPr>
+        <w:t xml:space="preserve">Kunci Jawaban: </w:t>
+      </w:r>
+      <w:r>
+        <w:rPr>
+          <w:b/>
+        </w:rPr>
+        <w:t>True</w:t>
+      </w:r>
+    </w:p>
+    <w:p>
+      <w:r>
+        <w:t>────────────────────────────────────────────────────────────</w:t>
+      </w:r>
+    </w:p>
+    <w:p>
+      <w:r>
+        <w:rPr>
+          <w:b/>
+          <w:sz w:val="24"/>
+        </w:rPr>
+        <w:t>Soal 19.</w:t>
+      </w:r>
+    </w:p>
+    <w:p>
+      <w:pPr>
+        <w:ind w:left="360"/>
+      </w:pPr>
+      <w:r>
+        <w:t>Kalimat berikut yang seluruhnya menggunakan kata baku secara tepat sesuai Pedoman Umum Ejaan Bahasa Indonesia (PUEBI/EYD) adalah....</w:t>
+      </w:r>
+    </w:p>
+    <w:p>
+      <w:pPr>
+        <w:pStyle w:val="ListBullet"/>
+        <w:ind w:left="720"/>
+      </w:pPr>
+      <w:r>
+        <w:rPr>
+          <w:b/>
+        </w:rPr>
+        <w:t xml:space="preserve">A. </w:t>
+      </w:r>
+      <w:r>
+        <w:t>Para pasien sedang antri di apotik untuk mengambil obat resep dokter.</w:t>
+      </w:r>
+    </w:p>
+    <w:p>
+      <w:pPr>
+        <w:pStyle w:val="ListBullet"/>
+        <w:ind w:left="720"/>
+      </w:pPr>
+      <w:r>
+        <w:rPr>
+          <w:b/>
+        </w:rPr>
+        <w:t xml:space="preserve">B. </w:t>
+      </w:r>
+      <w:r>
+        <w:t>Jadwal praktik dokter spesialis anak di klinik tersebut sudah aktif sejak pagi.</w:t>
+      </w:r>
+    </w:p>
+    <w:p>
+      <w:pPr>
+        <w:pStyle w:val="ListBullet"/>
+        <w:ind w:left="720"/>
+      </w:pPr>
+      <w:r>
+        <w:rPr>
+          <w:b/>
+        </w:rPr>
+        <w:t xml:space="preserve">C. </w:t>
+      </w:r>
+      <w:r>
+        <w:t>Rian meminta ijin kepada gurunya karena badannya sedang tidak fit.</w:t>
+      </w:r>
+    </w:p>
+    <w:p>
+      <w:pPr>
+        <w:pStyle w:val="ListBullet"/>
+        <w:ind w:left="720"/>
+      </w:pPr>
+      <w:r>
+        <w:rPr>
+          <w:b/>
+        </w:rPr>
+        <w:t xml:space="preserve">D. </w:t>
+      </w:r>
+      <w:r>
+        <w:t>Kwalitas produk kerajinan bambu itu sangat dikagumi para turis manca negara.</w:t>
+      </w:r>
+    </w:p>
+    <w:p>
+      <w:r>
+        <w:rPr>
+          <w:b/>
+        </w:rPr>
+        <w:t xml:space="preserve">Kunci Jawaban: </w:t>
+      </w:r>
+      <w:r>
+        <w:rPr>
+          <w:b/>
+        </w:rPr>
+        <w:t>2</w:t>
+      </w:r>
+    </w:p>
+    <w:p>
+      <w:r>
+        <w:t>────────────────────────────────────────────────────────────</w:t>
+      </w:r>
+    </w:p>
+    <w:p>
+      <w:r>
+        <w:rPr>
+          <w:b/>
+          <w:sz w:val="24"/>
+        </w:rPr>
+        <w:t>Soal 20.</w:t>
+      </w:r>
+    </w:p>
+    <w:p>
+      <w:pPr>
+        <w:ind w:left="360"/>
+      </w:pPr>
+      <w:r>
+        <w:t>Penulisan kalimat langsung berikut yang menggunakan tanda baca dan huruf kapital secara tepat adalah....</w:t>
+      </w:r>
+    </w:p>
+    <w:p>
+      <w:pPr>
+        <w:pStyle w:val="ListBullet"/>
+        <w:ind w:left="720"/>
+      </w:pPr>
+      <w:r>
+        <w:rPr>
+          <w:b/>
+        </w:rPr>
+        <w:t xml:space="preserve">A. </w:t>
+      </w:r>
+      <w:r>
+        <w:t>Ibu berpesan, "Tolong rapikan buku pelajaran di mejamu, Farhan!"</w:t>
+      </w:r>
+    </w:p>
+    <w:p>
+      <w:pPr>
+        <w:pStyle w:val="ListBullet"/>
+        <w:ind w:left="720"/>
+      </w:pPr>
+      <w:r>
+        <w:rPr>
+          <w:b/>
+        </w:rPr>
+        <w:t xml:space="preserve">B. </w:t>
+      </w:r>
+      <w:r>
+        <w:t>Ibu berpesan: "tolong rapikan buku pelajaran di mejamu, Farhan!"</w:t>
+      </w:r>
+    </w:p>
+    <w:p>
+      <w:pPr>
+        <w:pStyle w:val="ListBullet"/>
+        <w:ind w:left="720"/>
+      </w:pPr>
+      <w:r>
+        <w:rPr>
+          <w:b/>
+        </w:rPr>
+        <w:t xml:space="preserve">C. </w:t>
+      </w:r>
+      <w:r>
+        <w:t>Ibu berpesan, "Tolong rapikan buku pelajaran di mejamu Farhan"!</w:t>
+      </w:r>
+    </w:p>
+    <w:p>
+      <w:pPr>
+        <w:pStyle w:val="ListBullet"/>
+        <w:ind w:left="720"/>
+      </w:pPr>
+      <w:r>
+        <w:rPr>
+          <w:b/>
+        </w:rPr>
+        <w:t xml:space="preserve">D. </w:t>
+      </w:r>
+      <w:r>
+        <w:t>"Ibu berpesan, tolong rapikan buku pelajaran di mejamu, Farhan."</w:t>
+      </w:r>
+    </w:p>
+    <w:p>
+      <w:r>
+        <w:rPr>
+          <w:b/>
+        </w:rPr>
+        <w:t xml:space="preserve">Kunci Jawaban: </w:t>
+      </w:r>
+      <w:r>
+        <w:rPr>
+          <w:b/>
+        </w:rPr>
+        <w:t>1, 2</w:t>
+      </w:r>
+    </w:p>
+    <w:p>
+      <w:r>
+        <w:t>────────────────────────────────────────────────────────────</w:t>
+      </w:r>
+    </w:p>
     <w:sectPr>
       <w:pgSz w:w="12240" w:h="15840"/>
       <w:pgMar w:top="1440" w:right="1800" w:bottom="1440" w:left="1800" w:header="720" w:footer="720" w:gutter="0"/>
@@ -2804,6 +2230,10 @@
     <w:name w:val="Normal"/>
     <w:qFormat/>
     <w:rsid w:val="00FC693F"/>
+    <w:rPr>
+      <w:rFonts w:ascii="Calibri" w:hAnsi="Calibri"/>
+      <w:sz w:val="22"/>
+    </w:rPr>
   </w:style>
   <w:style w:type="paragraph" w:styleId="Header">
     <w:name w:val="header"/>

</xml_diff>

<commit_message>
Align Quiz Web .docx layout to Paket 1 style: answer key after each question, true/false checkbox tables
</commit_message>
<xml_diff>
--- a/Quiz_Web_Bahasa_Indonesia_Paket_1.docx
+++ b/Quiz_Web_Bahasa_Indonesia_Paket_1.docx
@@ -2,43 +2,68 @@
 <file path=word/document.xml><?xml version="1.0" encoding="utf-8"?>
 <w:document xmlns:wpc="http://schemas.microsoft.com/office/word/2010/wordprocessingCanvas" xmlns:mo="http://schemas.microsoft.com/office/mac/office/2008/main" xmlns:mc="http://schemas.openxmlformats.org/markup-compatibility/2006" xmlns:mv="urn:schemas-microsoft-com:mac:vml" xmlns:o="urn:schemas-microsoft-com:office:office" xmlns:r="http://schemas.openxmlformats.org/officeDocument/2006/relationships" xmlns:m="http://schemas.openxmlformats.org/officeDocument/2006/math" xmlns:v="urn:schemas-microsoft-com:vml" xmlns:wp14="http://schemas.microsoft.com/office/word/2010/wordprocessingDrawing" xmlns:wp="http://schemas.openxmlformats.org/drawingml/2006/wordprocessingDrawing" xmlns:w10="urn:schemas-microsoft-com:office:word" xmlns:w="http://schemas.openxmlformats.org/wordprocessingml/2006/main" xmlns:w14="http://schemas.microsoft.com/office/word/2010/wordml" xmlns:wpg="http://schemas.microsoft.com/office/word/2010/wordprocessingGroup" xmlns:wpi="http://schemas.microsoft.com/office/word/2010/wordprocessingInk" xmlns:wne="http://schemas.microsoft.com/office/word/2006/wordml" xmlns:wps="http://schemas.microsoft.com/office/word/2010/wordprocessingShape" mc:Ignorable="w14 wp14">
   <w:body>
-    <w:p>
-      <w:pPr>
-        <w:pStyle w:val="Heading1"/>
-        <w:jc w:val="center"/>
-      </w:pPr>
-      <w:r>
-        <w:t>SmartDrill SD 2026 - Bahasa Indonesia Paket 1</w:t>
-      </w:r>
-    </w:p>
-    <w:p>
-      <w:pPr>
-        <w:jc w:val="center"/>
-      </w:pPr>
-      <w:r>
-        <w:rPr>
-          <w:color w:val="4F46E5"/>
-          <w:sz w:val="24"/>
-        </w:rPr>
-        <w:t>Kumpulan Soal Web Tryout &amp; Quizizz | 3 Model Soal</w:t>
-      </w:r>
-    </w:p>
-    <w:p/>
+    <w:tbl>
+      <w:tblPr>
+        <w:tblW w:type="auto" w:w="0"/>
+        <w:tblLook w:firstColumn="1" w:firstRow="1" w:lastColumn="0" w:lastRow="0" w:noHBand="0" w:noVBand="1" w:val="04A0"/>
+      </w:tblPr>
+      <w:tblGrid>
+        <w:gridCol w:w="8640"/>
+      </w:tblGrid>
+      <w:tr>
+        <w:tc>
+          <w:tcPr>
+            <w:tcW w:type="dxa" w:w="8640"/>
+          </w:tcPr>
+          <w:p>
+            <w:r>
+              <w:t>TRY OUT TES KEMAMPUAN AKADEMIK (TKA) SD</w:t>
+              <w:br/>
+              <w:t>MATA PELAJARAN: BAHASA INDONESIA — PAKET 1</w:t>
+              <w:br/>
+              <w:t>Standar Kurikulum Merdeka &amp; K-13 (Kerangka Resmi Pusmendik Kemendikdasmen RI)</w:t>
+              <w:br/>
+              <w:t>Jumlah Soal: 20 Butir | Alokasi Waktu: 45 Menit | Fokus: Numerasi, Aljabar &amp; Geometri Dasar</w:t>
+            </w:r>
+          </w:p>
+        </w:tc>
+      </w:tr>
+    </w:tbl>
     <w:p>
       <w:r>
         <w:rPr>
           <w:b/>
-          <w:sz w:val="24"/>
         </w:rPr>
-        <w:t>Soal 1.</w:t>
+        <w:t>PETUNJUK UMUM:</w:t>
+        <w:br/>
+        <w:t>1. Berdoalah sebelum mengerjakan soal.</w:t>
+        <w:br/>
+        <w:t>2. Periksa dan bacalah setiap butir soal dengan teliti.</w:t>
+        <w:br/>
+        <w:t>3. Soal terdiri atas Pilihan Ganda Sederhana, Pilihan Ganda Kompleks (jawaban lebih dari satu), dan Tabel Kategori (Benar/Salah).</w:t>
+        <w:br/>
+        <w:t>4. Dahulukan soal yang Anda anggap mudah.</w:t>
       </w:r>
     </w:p>
     <w:p>
-      <w:pPr>
-        <w:ind w:left="360"/>
-      </w:pPr>
       <w:r>
-        <w:t>Bacalah teks informasi berikut dengan cermat untuk menjawab soal nomor 1 sampai 5!</w:t>
+        <w:t>═════════════════════════════════════════════════════════════════</w:t>
+      </w:r>
+    </w:p>
+    <w:p>
+      <w:r>
+        <w:rPr>
+          <w:b/>
+        </w:rPr>
+        <w:t>BAGIAN A: NASKAH SOAL UJIAN</w:t>
+      </w:r>
+    </w:p>
+    <w:p>
+      <w:r>
+        <w:rPr>
+          <w:b/>
+        </w:rPr>
+        <w:t>1. Bacalah teks informasi berikut dengan cermat untuk menjawab soal nomor 1 sampai 5!</w:t>
         <w:br/>
         <w:br/>
         <w:t>Penyu Sisik: Sang Penjaga Terumbu Karang Nusantara</w:t>
@@ -58,90 +83,10 @@
     </w:p>
     <w:p>
       <w:pPr>
-        <w:pStyle w:val="ListBullet"/>
-        <w:ind w:left="720"/>
+        <w:ind w:left="360"/>
       </w:pPr>
       <w:r>
-        <w:rPr>
-          <w:b/>
-        </w:rPr>
-        <w:t xml:space="preserve">A. </w:t>
-      </w:r>
-      <w:r>
-        <w:t>Menghasilkan zat kapur alami yang mempercepat pembentukan karang baru</w:t>
-      </w:r>
-    </w:p>
-    <w:p>
-      <w:pPr>
-        <w:pStyle w:val="ListBullet"/>
-        <w:ind w:left="720"/>
-      </w:pPr>
-      <w:r>
-        <w:rPr>
-          <w:b/>
-        </w:rPr>
-        <w:t xml:space="preserve">B. </w:t>
-      </w:r>
-      <w:r>
-        <w:t>Memakan spons laut agar tidak tumbuh berlebihan dan menutupi terumbu karang</w:t>
-      </w:r>
-    </w:p>
-    <w:p>
-      <w:pPr>
-        <w:pStyle w:val="ListBullet"/>
-        <w:ind w:left="720"/>
-      </w:pPr>
-      <w:r>
-        <w:rPr>
-          <w:b/>
-        </w:rPr>
-        <w:t xml:space="preserve">C. </w:t>
-      </w:r>
-      <w:r>
-        <w:t>Menjaga kejernihan air laut dengan menyaring endapan lumpur pantai</w:t>
-      </w:r>
-    </w:p>
-    <w:p>
-      <w:pPr>
-        <w:pStyle w:val="ListBullet"/>
-        <w:ind w:left="720"/>
-      </w:pPr>
-      <w:r>
-        <w:rPr>
-          <w:b/>
-        </w:rPr>
-        <w:t xml:space="preserve">D. </w:t>
-      </w:r>
-      <w:r>
-        <w:t>Menjadi tempat bertenggernya aneka jenis burung laut pemangsa</w:t>
-      </w:r>
-    </w:p>
-    <w:p>
-      <w:r>
-        <w:rPr>
-          <w:b/>
-        </w:rPr>
-        <w:t xml:space="preserve">Kunci Jawaban: </w:t>
-      </w:r>
-      <w:r>
-        <w:rPr>
-          <w:b/>
-        </w:rPr>
-        <w:t>2</w:t>
-      </w:r>
-    </w:p>
-    <w:p>
-      <w:r>
-        <w:t>────────────────────────────────────────────────────────────</w:t>
-      </w:r>
-    </w:p>
-    <w:p>
-      <w:r>
-        <w:rPr>
-          <w:b/>
-          <w:sz w:val="24"/>
-        </w:rPr>
-        <w:t>Soal 2.</w:t>
+        <w:t>A.  Menghasilkan zat kapur alami yang mempercepat pembentukan karang baru</w:t>
       </w:r>
     </w:p>
     <w:p>
@@ -149,95 +94,7 @@
         <w:ind w:left="360"/>
       </w:pPr>
       <w:r>
-        <w:t>Ide pokok yang terdapat pada paragraf kedua teks 'Penyu Sisik: Sang Penjaga Terumbu Karang Nusantara' adalah....</w:t>
-      </w:r>
-    </w:p>
-    <w:p>
-      <w:pPr>
-        <w:pStyle w:val="ListBullet"/>
-        <w:ind w:left="720"/>
-      </w:pPr>
-      <w:r>
-        <w:rPr>
-          <w:b/>
-        </w:rPr>
-        <w:t xml:space="preserve">A. </w:t>
-      </w:r>
-      <w:r>
-        <w:t>Jenis kerajinan tangan bernilai ekonomi dari cangkang penyu sisik</w:t>
-      </w:r>
-    </w:p>
-    <w:p>
-      <w:pPr>
-        <w:pStyle w:val="ListBullet"/>
-        <w:ind w:left="720"/>
-      </w:pPr>
-      <w:r>
-        <w:rPr>
-          <w:b/>
-        </w:rPr>
-        <w:t xml:space="preserve">B. </w:t>
-      </w:r>
-      <w:r>
-        <w:t>Penyebab pencemaran sampah plastik di wilayah perairan laut Indonesia</w:t>
-      </w:r>
-    </w:p>
-    <w:p>
-      <w:pPr>
-        <w:pStyle w:val="ListBullet"/>
-        <w:ind w:left="720"/>
-      </w:pPr>
-      <w:r>
-        <w:rPr>
-          <w:b/>
-        </w:rPr>
-        <w:t xml:space="preserve">C. </w:t>
-      </w:r>
-      <w:r>
-        <w:t>Ancaman kepunahan populasi penyu sisik akibat aktivitas manusia dan limbah plastik</w:t>
-      </w:r>
-    </w:p>
-    <w:p>
-      <w:pPr>
-        <w:pStyle w:val="ListBullet"/>
-        <w:ind w:left="720"/>
-      </w:pPr>
-      <w:r>
-        <w:rPr>
-          <w:b/>
-        </w:rPr>
-        <w:t xml:space="preserve">D. </w:t>
-      </w:r>
-      <w:r>
-        <w:t>Kemiripan fisik antara kantong plastik transparan dengan ubur-ubur laut</w:t>
-      </w:r>
-    </w:p>
-    <w:p>
-      <w:r>
-        <w:rPr>
-          <w:b/>
-        </w:rPr>
-        <w:t xml:space="preserve">Kunci Jawaban: </w:t>
-      </w:r>
-      <w:r>
-        <w:rPr>
-          <w:b/>
-        </w:rPr>
-        <w:t>1, 2</w:t>
-      </w:r>
-    </w:p>
-    <w:p>
-      <w:r>
-        <w:t>────────────────────────────────────────────────────────────</w:t>
-      </w:r>
-    </w:p>
-    <w:p>
-      <w:r>
-        <w:rPr>
-          <w:b/>
-          <w:sz w:val="24"/>
-        </w:rPr>
-        <w:t>Soal 3.</w:t>
+        <w:t>B.  Memakan spons laut agar tidak tumbuh berlebihan dan menutupi terumbu karang</w:t>
       </w:r>
     </w:p>
     <w:p>
@@ -245,65 +102,7 @@
         <w:ind w:left="360"/>
       </w:pPr>
       <w:r>
-        <w:t>Makna istilah 'konservasi' pada paragraf ketiga teks tersebut adalah....</w:t>
-      </w:r>
-    </w:p>
-    <w:p>
-      <w:pPr>
-        <w:pStyle w:val="ListBullet"/>
-        <w:ind w:left="720"/>
-      </w:pPr>
-      <w:r>
-        <w:rPr>
-          <w:b/>
-        </w:rPr>
-        <w:t xml:space="preserve">A. </w:t>
-      </w:r>
-      <w:r>
-        <w:t>True</w:t>
-      </w:r>
-    </w:p>
-    <w:p>
-      <w:pPr>
-        <w:pStyle w:val="ListBullet"/>
-        <w:ind w:left="720"/>
-      </w:pPr>
-      <w:r>
-        <w:rPr>
-          <w:b/>
-        </w:rPr>
-        <w:t xml:space="preserve">B. </w:t>
-      </w:r>
-      <w:r>
-        <w:t>False</w:t>
-      </w:r>
-    </w:p>
-    <w:p>
-      <w:r>
-        <w:rPr>
-          <w:b/>
-        </w:rPr>
-        <w:t xml:space="preserve">Kunci Jawaban: </w:t>
-      </w:r>
-      <w:r>
-        <w:rPr>
-          <w:b/>
-        </w:rPr>
-        <w:t>True</w:t>
-      </w:r>
-    </w:p>
-    <w:p>
-      <w:r>
-        <w:t>────────────────────────────────────────────────────────────</w:t>
-      </w:r>
-    </w:p>
-    <w:p>
-      <w:r>
-        <w:rPr>
-          <w:b/>
-          <w:sz w:val="24"/>
-        </w:rPr>
-        <w:t>Soal 4.</w:t>
+        <w:t>C.  Menjaga kejernihan air laut dengan menyaring endapan lumpur pantai</w:t>
       </w:r>
     </w:p>
     <w:p>
@@ -311,95 +110,19 @@
         <w:ind w:left="360"/>
       </w:pPr>
       <w:r>
-        <w:t>Berdasarkan teks bacaan, mengapa sampah kantong plastik sangat berbahaya dan sering tertelan oleh penyu sisik di lautan?</w:t>
+        <w:t>D.  Menjadi tempat bertenggernya aneka jenis burung laut pemangsa</w:t>
       </w:r>
     </w:p>
-    <w:p>
-      <w:pPr>
-        <w:pStyle w:val="ListBullet"/>
-        <w:ind w:left="720"/>
-      </w:pPr>
-      <w:r>
-        <w:rPr>
-          <w:b/>
-        </w:rPr>
-        <w:t xml:space="preserve">A. </w:t>
-      </w:r>
-      <w:r>
-        <w:t>Kantong plastik mengeluarkan aroma amis yang memancing selera makan penyu</w:t>
-      </w:r>
-    </w:p>
-    <w:p>
-      <w:pPr>
-        <w:pStyle w:val="ListBullet"/>
-        <w:ind w:left="720"/>
-      </w:pPr>
-      <w:r>
-        <w:rPr>
-          <w:b/>
-        </w:rPr>
-        <w:t xml:space="preserve">B. </w:t>
-      </w:r>
-      <w:r>
-        <w:t>Penyu sisik mengira kantong plastik transparan yang terapung sebagai ubur-ubur</w:t>
-      </w:r>
-    </w:p>
-    <w:p>
-      <w:pPr>
-        <w:pStyle w:val="ListBullet"/>
-        <w:ind w:left="720"/>
-      </w:pPr>
-      <w:r>
-        <w:rPr>
-          <w:b/>
-        </w:rPr>
-        <w:t xml:space="preserve">C. </w:t>
-      </w:r>
-      <w:r>
-        <w:t>Sampah plastik menempel erat pada spons laut yang menjadi mangsa penyu</w:t>
-      </w:r>
-    </w:p>
-    <w:p>
-      <w:pPr>
-        <w:pStyle w:val="ListBullet"/>
-        <w:ind w:left="720"/>
-      </w:pPr>
-      <w:r>
-        <w:rPr>
-          <w:b/>
-        </w:rPr>
-        <w:t xml:space="preserve">D. </w:t>
-      </w:r>
-      <w:r>
-        <w:t>Penyu sengaja memakan plastik untuk membantu proses pencernaan cangkangnya</w:t>
-      </w:r>
-    </w:p>
+    <w:p/>
     <w:p>
       <w:r>
         <w:rPr>
           <w:b/>
         </w:rPr>
-        <w:t xml:space="preserve">Kunci Jawaban: </w:t>
+        <w:t>2. Ide pokok yang terdapat pada paragraf kedua teks 'Penyu Sisik: Sang Penjaga Terumbu Karang Nusantara' adalah....</w:t>
       </w:r>
       <w:r>
-        <w:rPr>
-          <w:b/>
-        </w:rPr>
-        <w:t>2</w:t>
-      </w:r>
-    </w:p>
-    <w:p>
-      <w:r>
-        <w:t>────────────────────────────────────────────────────────────</w:t>
-      </w:r>
-    </w:p>
-    <w:p>
-      <w:r>
-        <w:rPr>
-          <w:b/>
-          <w:sz w:val="24"/>
-        </w:rPr>
-        <w:t>Soal 5.</w:t>
+        <w:t xml:space="preserve">  [Pilihan Ganda Kompleks: Jawaban benar lebih dari satu]</w:t>
       </w:r>
     </w:p>
     <w:p>
@@ -407,95 +130,7 @@
         <w:ind w:left="360"/>
       </w:pPr>
       <w:r>
-        <w:t>Pernyataan berikut yang TIDAK SESUAI dengan isi teks 'Penyu Sisik: Sang Penjaga Terumbu Karang Nusantara' adalah....</w:t>
-      </w:r>
-    </w:p>
-    <w:p>
-      <w:pPr>
-        <w:pStyle w:val="ListBullet"/>
-        <w:ind w:left="720"/>
-      </w:pPr>
-      <w:r>
-        <w:rPr>
-          <w:b/>
-        </w:rPr>
-        <w:t xml:space="preserve">A. </w:t>
-      </w:r>
-      <w:r>
-        <w:t>Penyu sisik memiliki bentuk paruh runcing menyerupai paruh burung elang.</w:t>
-      </w:r>
-    </w:p>
-    <w:p>
-      <w:pPr>
-        <w:pStyle w:val="ListBullet"/>
-        <w:ind w:left="720"/>
-      </w:pPr>
-      <w:r>
-        <w:rPr>
-          <w:b/>
-        </w:rPr>
-        <w:t xml:space="preserve">B. </w:t>
-      </w:r>
-      <w:r>
-        <w:t>Tukik dilepasliarkan pada siang hari terik agar tubuhnya cepat kuat berenang.</w:t>
-      </w:r>
-    </w:p>
-    <w:p>
-      <w:pPr>
-        <w:pStyle w:val="ListBullet"/>
-        <w:ind w:left="720"/>
-      </w:pPr>
-      <w:r>
-        <w:rPr>
-          <w:b/>
-        </w:rPr>
-        <w:t xml:space="preserve">C. </w:t>
-      </w:r>
-      <w:r>
-        <w:t>Kepulauan Derawan dan Sukamade merupakan contoh lokasi konservasi penyu.</w:t>
-      </w:r>
-    </w:p>
-    <w:p>
-      <w:pPr>
-        <w:pStyle w:val="ListBullet"/>
-        <w:ind w:left="720"/>
-      </w:pPr>
-      <w:r>
-        <w:rPr>
-          <w:b/>
-        </w:rPr>
-        <w:t xml:space="preserve">D. </w:t>
-      </w:r>
-      <w:r>
-        <w:t>Populasi penyu sisik berkurang salah satunya karena perburuan cangkang sisiknya.</w:t>
-      </w:r>
-    </w:p>
-    <w:p>
-      <w:r>
-        <w:rPr>
-          <w:b/>
-        </w:rPr>
-        <w:t xml:space="preserve">Kunci Jawaban: </w:t>
-      </w:r>
-      <w:r>
-        <w:rPr>
-          <w:b/>
-        </w:rPr>
-        <w:t>1, 2</w:t>
-      </w:r>
-    </w:p>
-    <w:p>
-      <w:r>
-        <w:t>────────────────────────────────────────────────────────────</w:t>
-      </w:r>
-    </w:p>
-    <w:p>
-      <w:r>
-        <w:rPr>
-          <w:b/>
-          <w:sz w:val="24"/>
-        </w:rPr>
-        <w:t>Soal 6.</w:t>
+        <w:t>A.  Jenis kerajinan tangan bernilai ekonomi dari cangkang penyu sisik</w:t>
       </w:r>
     </w:p>
     <w:p>
@@ -503,7 +138,204 @@
         <w:ind w:left="360"/>
       </w:pPr>
       <w:r>
-        <w:t>Bacalah cerita anak berikut dengan cermat untuk menjawab soal nomor 6 sampai 10!</w:t>
+        <w:t>B.  Penyebab pencemaran sampah plastik di wilayah perairan laut Indonesia</w:t>
+      </w:r>
+    </w:p>
+    <w:p>
+      <w:pPr>
+        <w:ind w:left="360"/>
+      </w:pPr>
+      <w:r>
+        <w:t>C.  Ancaman kepunahan populasi penyu sisik akibat aktivitas manusia dan limbah plastik</w:t>
+      </w:r>
+    </w:p>
+    <w:p>
+      <w:pPr>
+        <w:ind w:left="360"/>
+      </w:pPr>
+      <w:r>
+        <w:t>D.  Kemiripan fisik antara kantong plastik transparan dengan ubur-ubur laut</w:t>
+      </w:r>
+    </w:p>
+    <w:p/>
+    <w:p>
+      <w:r>
+        <w:rPr>
+          <w:b/>
+        </w:rPr>
+        <w:t>3. Makna istilah 'konservasi' pada paragraf ketiga teks tersebut adalah....</w:t>
+      </w:r>
+      <w:r>
+        <w:t xml:space="preserve">  [Pilihan Ganda Kompleks: Kategori Benar / Salah]</w:t>
+      </w:r>
+    </w:p>
+    <w:tbl>
+      <w:tblPr>
+        <w:tblW w:type="auto" w:w="0"/>
+        <w:tblLook w:firstColumn="1" w:firstRow="1" w:lastColumn="0" w:lastRow="0" w:noHBand="0" w:noVBand="1" w:val="04A0"/>
+      </w:tblPr>
+      <w:tblGrid>
+        <w:gridCol w:w="2880"/>
+        <w:gridCol w:w="2880"/>
+        <w:gridCol w:w="2880"/>
+      </w:tblGrid>
+      <w:tr>
+        <w:tc>
+          <w:tcPr>
+            <w:tcW w:type="dxa" w:w="2880"/>
+          </w:tcPr>
+          <w:p>
+            <w:r>
+              <w:t>Pernyataan</w:t>
+            </w:r>
+          </w:p>
+        </w:tc>
+        <w:tc>
+          <w:tcPr>
+            <w:tcW w:type="dxa" w:w="2880"/>
+          </w:tcPr>
+          <w:p>
+            <w:r>
+              <w:t>Benar</w:t>
+            </w:r>
+          </w:p>
+        </w:tc>
+        <w:tc>
+          <w:tcPr>
+            <w:tcW w:type="dxa" w:w="2880"/>
+          </w:tcPr>
+          <w:p>
+            <w:r>
+              <w:t>Salah</w:t>
+            </w:r>
+          </w:p>
+        </w:tc>
+      </w:tr>
+      <w:tr>
+        <w:tc>
+          <w:tcPr>
+            <w:tcW w:type="dxa" w:w="2880"/>
+          </w:tcPr>
+          <w:p>
+            <w:r>
+              <w:t>Makna istilah 'konservasi' pada paragraf ketiga teks tersebut adalah....</w:t>
+            </w:r>
+          </w:p>
+        </w:tc>
+        <w:tc>
+          <w:tcPr>
+            <w:tcW w:type="dxa" w:w="2880"/>
+          </w:tcPr>
+          <w:p>
+            <w:r>
+              <w:t>[   ]</w:t>
+            </w:r>
+          </w:p>
+        </w:tc>
+        <w:tc>
+          <w:tcPr>
+            <w:tcW w:type="dxa" w:w="2880"/>
+          </w:tcPr>
+          <w:p>
+            <w:r>
+              <w:t>[   ]</w:t>
+            </w:r>
+          </w:p>
+        </w:tc>
+      </w:tr>
+    </w:tbl>
+    <w:p/>
+    <w:p>
+      <w:r>
+        <w:rPr>
+          <w:b/>
+        </w:rPr>
+        <w:t>4. Berdasarkan teks bacaan, mengapa sampah kantong plastik sangat berbahaya dan sering tertelan oleh penyu sisik di lautan?</w:t>
+      </w:r>
+    </w:p>
+    <w:p>
+      <w:pPr>
+        <w:ind w:left="360"/>
+      </w:pPr>
+      <w:r>
+        <w:t>A.  Kantong plastik mengeluarkan aroma amis yang memancing selera makan penyu</w:t>
+      </w:r>
+    </w:p>
+    <w:p>
+      <w:pPr>
+        <w:ind w:left="360"/>
+      </w:pPr>
+      <w:r>
+        <w:t>B.  Penyu sisik mengira kantong plastik transparan yang terapung sebagai ubur-ubur</w:t>
+      </w:r>
+    </w:p>
+    <w:p>
+      <w:pPr>
+        <w:ind w:left="360"/>
+      </w:pPr>
+      <w:r>
+        <w:t>C.  Sampah plastik menempel erat pada spons laut yang menjadi mangsa penyu</w:t>
+      </w:r>
+    </w:p>
+    <w:p>
+      <w:pPr>
+        <w:ind w:left="360"/>
+      </w:pPr>
+      <w:r>
+        <w:t>D.  Penyu sengaja memakan plastik untuk membantu proses pencernaan cangkangnya</w:t>
+      </w:r>
+    </w:p>
+    <w:p/>
+    <w:p>
+      <w:r>
+        <w:rPr>
+          <w:b/>
+        </w:rPr>
+        <w:t>5. Pernyataan berikut yang TIDAK SESUAI dengan isi teks 'Penyu Sisik: Sang Penjaga Terumbu Karang Nusantara' adalah....</w:t>
+      </w:r>
+      <w:r>
+        <w:t xml:space="preserve">  [Pilihan Ganda Kompleks: Jawaban benar lebih dari satu]</w:t>
+      </w:r>
+    </w:p>
+    <w:p>
+      <w:pPr>
+        <w:ind w:left="360"/>
+      </w:pPr>
+      <w:r>
+        <w:t>A.  Penyu sisik memiliki bentuk paruh runcing menyerupai paruh burung elang.</w:t>
+      </w:r>
+    </w:p>
+    <w:p>
+      <w:pPr>
+        <w:ind w:left="360"/>
+      </w:pPr>
+      <w:r>
+        <w:t>B.  Tukik dilepasliarkan pada siang hari terik agar tubuhnya cepat kuat berenang.</w:t>
+      </w:r>
+    </w:p>
+    <w:p>
+      <w:pPr>
+        <w:ind w:left="360"/>
+      </w:pPr>
+      <w:r>
+        <w:t>C.  Kepulauan Derawan dan Sukamade merupakan contoh lokasi konservasi penyu.</w:t>
+      </w:r>
+    </w:p>
+    <w:p>
+      <w:pPr>
+        <w:ind w:left="360"/>
+      </w:pPr>
+      <w:r>
+        <w:t>D.  Populasi penyu sisik berkurang salah satunya karena perburuan cangkang sisiknya.</w:t>
+      </w:r>
+    </w:p>
+    <w:p/>
+    <w:p>
+      <w:r>
+        <w:rPr>
+          <w:b/>
+        </w:rPr>
+        <w:t>6. Bacalah cerita anak berikut dengan cermat untuk menjawab soal nomor 6 sampai 10!</w:t>
         <w:br/>
         <w:br/>
         <w:t>Kejujuran di Balik Kantong Belacu Kakek Suro</w:t>
@@ -523,63 +355,110 @@
         <w:br/>
         <w:t>Watak utama tokoh Arga yang tergambar paling dominan dalam cerita di atas adalah....</w:t>
       </w:r>
-    </w:p>
-    <w:p>
-      <w:pPr>
-        <w:pStyle w:val="ListBullet"/>
-        <w:ind w:left="720"/>
-      </w:pPr>
       <w:r>
-        <w:rPr>
-          <w:b/>
-        </w:rPr>
-        <w:t xml:space="preserve">A. </w:t>
-      </w:r>
-      <w:r>
-        <w:t>True</w:t>
+        <w:t xml:space="preserve">  [Pilihan Ganda Kompleks: Kategori Benar / Salah]</w:t>
       </w:r>
     </w:p>
-    <w:p>
-      <w:pPr>
-        <w:pStyle w:val="ListBullet"/>
-        <w:ind w:left="720"/>
-      </w:pPr>
-      <w:r>
-        <w:rPr>
-          <w:b/>
-        </w:rPr>
-        <w:t xml:space="preserve">B. </w:t>
-      </w:r>
-      <w:r>
-        <w:t>False</w:t>
-      </w:r>
-    </w:p>
+    <w:tbl>
+      <w:tblPr>
+        <w:tblW w:type="auto" w:w="0"/>
+        <w:tblLook w:firstColumn="1" w:firstRow="1" w:lastColumn="0" w:lastRow="0" w:noHBand="0" w:noVBand="1" w:val="04A0"/>
+      </w:tblPr>
+      <w:tblGrid>
+        <w:gridCol w:w="2880"/>
+        <w:gridCol w:w="2880"/>
+        <w:gridCol w:w="2880"/>
+      </w:tblGrid>
+      <w:tr>
+        <w:tc>
+          <w:tcPr>
+            <w:tcW w:type="dxa" w:w="2880"/>
+          </w:tcPr>
+          <w:p>
+            <w:r>
+              <w:t>Pernyataan</w:t>
+            </w:r>
+          </w:p>
+        </w:tc>
+        <w:tc>
+          <w:tcPr>
+            <w:tcW w:type="dxa" w:w="2880"/>
+          </w:tcPr>
+          <w:p>
+            <w:r>
+              <w:t>Benar</w:t>
+            </w:r>
+          </w:p>
+        </w:tc>
+        <w:tc>
+          <w:tcPr>
+            <w:tcW w:type="dxa" w:w="2880"/>
+          </w:tcPr>
+          <w:p>
+            <w:r>
+              <w:t>Salah</w:t>
+            </w:r>
+          </w:p>
+        </w:tc>
+      </w:tr>
+      <w:tr>
+        <w:tc>
+          <w:tcPr>
+            <w:tcW w:type="dxa" w:w="2880"/>
+          </w:tcPr>
+          <w:p>
+            <w:r>
+              <w:t>Bacalah cerita anak berikut dengan cermat untuk menjawab soal nomor 6 sampai 10!</w:t>
+              <w:br/>
+              <w:br/>
+              <w:t>Kejujuran di Balik Kantong Belacu Kakek Suro</w:t>
+              <w:br/>
+              <w:br/>
+              <w:t>Siang itu, terik matahari membakar jalanan Desa Sukamaju. Arga mengayuh sepeda ontel tuanya dengan peluh yang mengucur di pelipis. Di keranjang depan sepeda, tersusun rapi beberapa ikat bayam dan kangkung segar hasil kebun pekarangan rumahnya yang hendak ia jajakan ke pasar desa demi membantu keperluan dapur ibunya. Ketika melewati tikungan jembatan kayu di perbatasan desa, roda depan sepedanya menabrak sesuatu. Arga mengerem mendadak dan menoleh ke bawah. Di tepi semak-semak rumput gajah, tergeletak sebuah kantong kain belacu berwarna cokelat kusam.</w:t>
+              <w:br/>
+              <w:br/>
+              <w:t>Arga turun dari sepeda dan memungut kantong tersebut. Alangkah terkejutnya ia ketika membuka resletingnya: di dalamnya terdapat beberapa lembar uang ratusan ribu rupiah yang diikat karet gelang, sebuah kartu identitas penduduk, dan buku pemeriksaan kesehatan lansia atas nama Kakek Suro. Kakek Suro adalah seorang perajin anyaman bambu tua yang tinggal sebatang kara di ujung dusun.</w:t>
+              <w:br/>
+              <w:br/>
+              <w:t xml:space="preserve">Di dalam hati Arga, sempat terlintas bisikan godaan. Sepatu sekolahnya sudah jebol di bagian tumit, dan uang itu lebih dari cukup untuk membeli sepatu baru yang bagus. Namun, seketika petuah bijak sang ibu bergaung kuat di dadanya: "Kejujuran adalah kehormatan hidup kita, Arga. Mengambil hak orang lain hanya akan menanam duri dalam jiwa." </w:t>
+              <w:br/>
+              <w:br/>
+              <w:t>Tanpa ragu lagi, Arga memutar haluan sepedanya menuju gubuk Kakek Suro. Sesampainya di sana, Arga mendapati sang kakek sedang duduk lemas di tangga bambu sambil meneteskan air mata. Ternyata, uang tersebut adalah tabungan hasil penjualan tampah dan bakul anyaman selama empat bulan yang rencananya akan dipakai untuk menebus obat asma di puskesmas. Ketika Arga mengulurkan kantong belacu itu utuh tanpa berkurang sedikit pun, Kakek Suro seketika memeluk Arga erat dengan linangan air mata haru dan tak henti memanjatkan doa berkah bagi anak yang berbudi luhur itu.</w:t>
+              <w:br/>
+              <w:br/>
+              <w:t>Watak utama tokoh Arga yang tergambar paling dominan dalam cerita di atas adalah....</w:t>
+            </w:r>
+          </w:p>
+        </w:tc>
+        <w:tc>
+          <w:tcPr>
+            <w:tcW w:type="dxa" w:w="2880"/>
+          </w:tcPr>
+          <w:p>
+            <w:r>
+              <w:t>[   ]</w:t>
+            </w:r>
+          </w:p>
+        </w:tc>
+        <w:tc>
+          <w:tcPr>
+            <w:tcW w:type="dxa" w:w="2880"/>
+          </w:tcPr>
+          <w:p>
+            <w:r>
+              <w:t>[   ]</w:t>
+            </w:r>
+          </w:p>
+        </w:tc>
+      </w:tr>
+    </w:tbl>
+    <w:p/>
     <w:p>
       <w:r>
         <w:rPr>
           <w:b/>
         </w:rPr>
-        <w:t xml:space="preserve">Kunci Jawaban: </w:t>
-      </w:r>
-      <w:r>
-        <w:rPr>
-          <w:b/>
-        </w:rPr>
-        <w:t>True</w:t>
-      </w:r>
-    </w:p>
-    <w:p>
-      <w:r>
-        <w:t>────────────────────────────────────────────────────────────</w:t>
-      </w:r>
-    </w:p>
-    <w:p>
-      <w:r>
-        <w:rPr>
-          <w:b/>
-          <w:sz w:val="24"/>
-        </w:rPr>
-        <w:t>Soal 7.</w:t>
+        <w:t>7. Latar tempat terjadinya peristiwa penemuan kantong belacu cokelat oleh Arga adalah....</w:t>
       </w:r>
     </w:p>
     <w:p>
@@ -587,95 +466,7 @@
         <w:ind w:left="360"/>
       </w:pPr>
       <w:r>
-        <w:t>Latar tempat terjadinya peristiwa penemuan kantong belacu cokelat oleh Arga adalah....</w:t>
-      </w:r>
-    </w:p>
-    <w:p>
-      <w:pPr>
-        <w:pStyle w:val="ListBullet"/>
-        <w:ind w:left="720"/>
-      </w:pPr>
-      <w:r>
-        <w:rPr>
-          <w:b/>
-        </w:rPr>
-        <w:t xml:space="preserve">A. </w:t>
-      </w:r>
-      <w:r>
-        <w:t>Di tengah pasar desa yang ramai</w:t>
-      </w:r>
-    </w:p>
-    <w:p>
-      <w:pPr>
-        <w:pStyle w:val="ListBullet"/>
-        <w:ind w:left="720"/>
-      </w:pPr>
-      <w:r>
-        <w:rPr>
-          <w:b/>
-        </w:rPr>
-        <w:t xml:space="preserve">B. </w:t>
-      </w:r>
-      <w:r>
-        <w:t>Di tepi semak rumput gajah dekat tikungan jembatan kayu perbatasan desa</w:t>
-      </w:r>
-    </w:p>
-    <w:p>
-      <w:pPr>
-        <w:pStyle w:val="ListBullet"/>
-        <w:ind w:left="720"/>
-      </w:pPr>
-      <w:r>
-        <w:rPr>
-          <w:b/>
-        </w:rPr>
-        <w:t xml:space="preserve">C. </w:t>
-      </w:r>
-      <w:r>
-        <w:t>Di pekarangan rumah gubuk milik Kakek Suro</w:t>
-      </w:r>
-    </w:p>
-    <w:p>
-      <w:pPr>
-        <w:pStyle w:val="ListBullet"/>
-        <w:ind w:left="720"/>
-      </w:pPr>
-      <w:r>
-        <w:rPr>
-          <w:b/>
-        </w:rPr>
-        <w:t xml:space="preserve">D. </w:t>
-      </w:r>
-      <w:r>
-        <w:t>Di ruang tunggu puskesmas desa</w:t>
-      </w:r>
-    </w:p>
-    <w:p>
-      <w:r>
-        <w:rPr>
-          <w:b/>
-        </w:rPr>
-        <w:t xml:space="preserve">Kunci Jawaban: </w:t>
-      </w:r>
-      <w:r>
-        <w:rPr>
-          <w:b/>
-        </w:rPr>
-        <w:t>2</w:t>
-      </w:r>
-    </w:p>
-    <w:p>
-      <w:r>
-        <w:t>────────────────────────────────────────────────────────────</w:t>
-      </w:r>
-    </w:p>
-    <w:p>
-      <w:r>
-        <w:rPr>
-          <w:b/>
-          <w:sz w:val="24"/>
-        </w:rPr>
-        <w:t>Soal 8.</w:t>
+        <w:t>A.  Di tengah pasar desa yang ramai</w:t>
       </w:r>
     </w:p>
     <w:p>
@@ -683,95 +474,7 @@
         <w:ind w:left="360"/>
       </w:pPr>
       <w:r>
-        <w:t>Konflik batin yang sempat dialami tokoh Arga ketika melihat isi kantong kain belacu tersebut adalah....</w:t>
-      </w:r>
-    </w:p>
-    <w:p>
-      <w:pPr>
-        <w:pStyle w:val="ListBullet"/>
-        <w:ind w:left="720"/>
-      </w:pPr>
-      <w:r>
-        <w:rPr>
-          <w:b/>
-        </w:rPr>
-        <w:t xml:space="preserve">A. </w:t>
-      </w:r>
-      <w:r>
-        <w:t>Kebingungan memilih apakah harus menjual sayur ke pasar atau pulang ke rumah</w:t>
-      </w:r>
-    </w:p>
-    <w:p>
-      <w:pPr>
-        <w:pStyle w:val="ListBullet"/>
-        <w:ind w:left="720"/>
-      </w:pPr>
-      <w:r>
-        <w:rPr>
-          <w:b/>
-        </w:rPr>
-        <w:t xml:space="preserve">B. </w:t>
-      </w:r>
-      <w:r>
-        <w:t>Keinginan menggunakan uang temuan untuk membeli sepatu baru versus ajaran moral kejujuran dari ibunya</w:t>
-      </w:r>
-    </w:p>
-    <w:p>
-      <w:pPr>
-        <w:pStyle w:val="ListBullet"/>
-        <w:ind w:left="720"/>
-      </w:pPr>
-      <w:r>
-        <w:rPr>
-          <w:b/>
-        </w:rPr>
-        <w:t xml:space="preserve">C. </w:t>
-      </w:r>
-      <w:r>
-        <w:t>Rasa takut dituduh mencuri barang berharga milik warga dusun lain</w:t>
-      </w:r>
-    </w:p>
-    <w:p>
-      <w:pPr>
-        <w:pStyle w:val="ListBullet"/>
-        <w:ind w:left="720"/>
-      </w:pPr>
-      <w:r>
-        <w:rPr>
-          <w:b/>
-        </w:rPr>
-        <w:t xml:space="preserve">D. </w:t>
-      </w:r>
-      <w:r>
-        <w:t>Kekhawatiran sepedanya akan rusak jika memutar arah jalan</w:t>
-      </w:r>
-    </w:p>
-    <w:p>
-      <w:r>
-        <w:rPr>
-          <w:b/>
-        </w:rPr>
-        <w:t xml:space="preserve">Kunci Jawaban: </w:t>
-      </w:r>
-      <w:r>
-        <w:rPr>
-          <w:b/>
-        </w:rPr>
-        <w:t>1, 2</w:t>
-      </w:r>
-    </w:p>
-    <w:p>
-      <w:r>
-        <w:t>────────────────────────────────────────────────────────────</w:t>
-      </w:r>
-    </w:p>
-    <w:p>
-      <w:r>
-        <w:rPr>
-          <w:b/>
-          <w:sz w:val="24"/>
-        </w:rPr>
-        <w:t>Soal 9.</w:t>
+        <w:t>B.  Di tepi semak rumput gajah dekat tikungan jembatan kayu perbatasan desa</w:t>
       </w:r>
     </w:p>
     <w:p>
@@ -779,65 +482,7 @@
         <w:ind w:left="360"/>
       </w:pPr>
       <w:r>
-        <w:t>Amanat utama yang dapat dipetik dari kisah 'Kejujuran di Balik Kantong Belacu Kakek Suro' adalah....</w:t>
-      </w:r>
-    </w:p>
-    <w:p>
-      <w:pPr>
-        <w:pStyle w:val="ListBullet"/>
-        <w:ind w:left="720"/>
-      </w:pPr>
-      <w:r>
-        <w:rPr>
-          <w:b/>
-        </w:rPr>
-        <w:t xml:space="preserve">A. </w:t>
-      </w:r>
-      <w:r>
-        <w:t>True</w:t>
-      </w:r>
-    </w:p>
-    <w:p>
-      <w:pPr>
-        <w:pStyle w:val="ListBullet"/>
-        <w:ind w:left="720"/>
-      </w:pPr>
-      <w:r>
-        <w:rPr>
-          <w:b/>
-        </w:rPr>
-        <w:t xml:space="preserve">B. </w:t>
-      </w:r>
-      <w:r>
-        <w:t>False</w:t>
-      </w:r>
-    </w:p>
-    <w:p>
-      <w:r>
-        <w:rPr>
-          <w:b/>
-        </w:rPr>
-        <w:t xml:space="preserve">Kunci Jawaban: </w:t>
-      </w:r>
-      <w:r>
-        <w:rPr>
-          <w:b/>
-        </w:rPr>
-        <w:t>True</w:t>
-      </w:r>
-    </w:p>
-    <w:p>
-      <w:r>
-        <w:t>────────────────────────────────────────────────────────────</w:t>
-      </w:r>
-    </w:p>
-    <w:p>
-      <w:r>
-        <w:rPr>
-          <w:b/>
-          <w:sz w:val="24"/>
-        </w:rPr>
-        <w:t>Soal 10.</w:t>
+        <w:t>C.  Di pekarangan rumah gubuk milik Kakek Suro</w:t>
       </w:r>
     </w:p>
     <w:p>
@@ -845,95 +490,19 @@
         <w:ind w:left="360"/>
       </w:pPr>
       <w:r>
-        <w:t>Perilaku terpuji tokoh Arga yang paling patut diteladani oleh siswa dalam kehidupan sehari-hari adalah....</w:t>
+        <w:t>D.  Di ruang tunggu puskesmas desa</w:t>
       </w:r>
     </w:p>
-    <w:p>
-      <w:pPr>
-        <w:pStyle w:val="ListBullet"/>
-        <w:ind w:left="720"/>
-      </w:pPr>
-      <w:r>
-        <w:rPr>
-          <w:b/>
-        </w:rPr>
-        <w:t xml:space="preserve">A. </w:t>
-      </w:r>
-      <w:r>
-        <w:t>Menabung uang saku sekolah sebanyak-banyaknya di bank</w:t>
-      </w:r>
-    </w:p>
-    <w:p>
-      <w:pPr>
-        <w:pStyle w:val="ListBullet"/>
-        <w:ind w:left="720"/>
-      </w:pPr>
-      <w:r>
-        <w:rPr>
-          <w:b/>
-        </w:rPr>
-        <w:t xml:space="preserve">B. </w:t>
-      </w:r>
-      <w:r>
-        <w:t>Mengembalikan barang temuan yang bukan haknya secara utuh kepada pemilik aslinya</w:t>
-      </w:r>
-    </w:p>
-    <w:p>
-      <w:pPr>
-        <w:pStyle w:val="ListBullet"/>
-        <w:ind w:left="720"/>
-      </w:pPr>
-      <w:r>
-        <w:rPr>
-          <w:b/>
-        </w:rPr>
-        <w:t xml:space="preserve">C. </w:t>
-      </w:r>
-      <w:r>
-        <w:t>Memperbaiki sepeda ontel sendiri tanpa bantuan orang dewasa</w:t>
-      </w:r>
-    </w:p>
-    <w:p>
-      <w:pPr>
-        <w:pStyle w:val="ListBullet"/>
-        <w:ind w:left="720"/>
-      </w:pPr>
-      <w:r>
-        <w:rPr>
-          <w:b/>
-        </w:rPr>
-        <w:t xml:space="preserve">D. </w:t>
-      </w:r>
-      <w:r>
-        <w:t>Berjalan kaki saat berangkat ke sekolah demi menghemat tenaga</w:t>
-      </w:r>
-    </w:p>
+    <w:p/>
     <w:p>
       <w:r>
         <w:rPr>
           <w:b/>
         </w:rPr>
-        <w:t xml:space="preserve">Kunci Jawaban: </w:t>
+        <w:t>8. Konflik batin yang sempat dialami tokoh Arga ketika melihat isi kantong kain belacu tersebut adalah....</w:t>
       </w:r>
       <w:r>
-        <w:rPr>
-          <w:b/>
-        </w:rPr>
-        <w:t>2</w:t>
-      </w:r>
-    </w:p>
-    <w:p>
-      <w:r>
-        <w:t>────────────────────────────────────────────────────────────</w:t>
-      </w:r>
-    </w:p>
-    <w:p>
-      <w:r>
-        <w:rPr>
-          <w:b/>
-          <w:sz w:val="24"/>
-        </w:rPr>
-        <w:t>Soal 11.</w:t>
+        <w:t xml:space="preserve">  [Pilihan Ganda Kompleks: Jawaban benar lebih dari satu]</w:t>
       </w:r>
     </w:p>
     <w:p>
@@ -941,7 +510,168 @@
         <w:ind w:left="360"/>
       </w:pPr>
       <w:r>
-        <w:t>Bacalah kutipan dialog wawancara berikut untuk menjawab soal nomor 11 sampai 14!</w:t>
+        <w:t>A.  Kebingungan memilih apakah harus menjual sayur ke pasar atau pulang ke rumah</w:t>
+      </w:r>
+    </w:p>
+    <w:p>
+      <w:pPr>
+        <w:ind w:left="360"/>
+      </w:pPr>
+      <w:r>
+        <w:t>B.  Keinginan menggunakan uang temuan untuk membeli sepatu baru versus ajaran moral kejujuran dari ibunya</w:t>
+      </w:r>
+    </w:p>
+    <w:p>
+      <w:pPr>
+        <w:ind w:left="360"/>
+      </w:pPr>
+      <w:r>
+        <w:t>C.  Rasa takut dituduh mencuri barang berharga milik warga dusun lain</w:t>
+      </w:r>
+    </w:p>
+    <w:p>
+      <w:pPr>
+        <w:ind w:left="360"/>
+      </w:pPr>
+      <w:r>
+        <w:t>D.  Kekhawatiran sepedanya akan rusak jika memutar arah jalan</w:t>
+      </w:r>
+    </w:p>
+    <w:p/>
+    <w:p>
+      <w:r>
+        <w:rPr>
+          <w:b/>
+        </w:rPr>
+        <w:t>9. Amanat utama yang dapat dipetik dari kisah 'Kejujuran di Balik Kantong Belacu Kakek Suro' adalah....</w:t>
+      </w:r>
+      <w:r>
+        <w:t xml:space="preserve">  [Pilihan Ganda Kompleks: Kategori Benar / Salah]</w:t>
+      </w:r>
+    </w:p>
+    <w:tbl>
+      <w:tblPr>
+        <w:tblW w:type="auto" w:w="0"/>
+        <w:tblLook w:firstColumn="1" w:firstRow="1" w:lastColumn="0" w:lastRow="0" w:noHBand="0" w:noVBand="1" w:val="04A0"/>
+      </w:tblPr>
+      <w:tblGrid>
+        <w:gridCol w:w="2880"/>
+        <w:gridCol w:w="2880"/>
+        <w:gridCol w:w="2880"/>
+      </w:tblGrid>
+      <w:tr>
+        <w:tc>
+          <w:tcPr>
+            <w:tcW w:type="dxa" w:w="2880"/>
+          </w:tcPr>
+          <w:p>
+            <w:r>
+              <w:t>Pernyataan</w:t>
+            </w:r>
+          </w:p>
+        </w:tc>
+        <w:tc>
+          <w:tcPr>
+            <w:tcW w:type="dxa" w:w="2880"/>
+          </w:tcPr>
+          <w:p>
+            <w:r>
+              <w:t>Benar</w:t>
+            </w:r>
+          </w:p>
+        </w:tc>
+        <w:tc>
+          <w:tcPr>
+            <w:tcW w:type="dxa" w:w="2880"/>
+          </w:tcPr>
+          <w:p>
+            <w:r>
+              <w:t>Salah</w:t>
+            </w:r>
+          </w:p>
+        </w:tc>
+      </w:tr>
+      <w:tr>
+        <w:tc>
+          <w:tcPr>
+            <w:tcW w:type="dxa" w:w="2880"/>
+          </w:tcPr>
+          <w:p>
+            <w:r>
+              <w:t>Amanat utama yang dapat dipetik dari kisah 'Kejujuran di Balik Kantong Belacu Kakek Suro' adalah....</w:t>
+            </w:r>
+          </w:p>
+        </w:tc>
+        <w:tc>
+          <w:tcPr>
+            <w:tcW w:type="dxa" w:w="2880"/>
+          </w:tcPr>
+          <w:p>
+            <w:r>
+              <w:t>[   ]</w:t>
+            </w:r>
+          </w:p>
+        </w:tc>
+        <w:tc>
+          <w:tcPr>
+            <w:tcW w:type="dxa" w:w="2880"/>
+          </w:tcPr>
+          <w:p>
+            <w:r>
+              <w:t>[   ]</w:t>
+            </w:r>
+          </w:p>
+        </w:tc>
+      </w:tr>
+    </w:tbl>
+    <w:p/>
+    <w:p>
+      <w:r>
+        <w:rPr>
+          <w:b/>
+        </w:rPr>
+        <w:t>10. Perilaku terpuji tokoh Arga yang paling patut diteladani oleh siswa dalam kehidupan sehari-hari adalah....</w:t>
+      </w:r>
+    </w:p>
+    <w:p>
+      <w:pPr>
+        <w:ind w:left="360"/>
+      </w:pPr>
+      <w:r>
+        <w:t>A.  Menabung uang saku sekolah sebanyak-banyaknya di bank</w:t>
+      </w:r>
+    </w:p>
+    <w:p>
+      <w:pPr>
+        <w:ind w:left="360"/>
+      </w:pPr>
+      <w:r>
+        <w:t>B.  Mengembalikan barang temuan yang bukan haknya secara utuh kepada pemilik aslinya</w:t>
+      </w:r>
+    </w:p>
+    <w:p>
+      <w:pPr>
+        <w:ind w:left="360"/>
+      </w:pPr>
+      <w:r>
+        <w:t>C.  Memperbaiki sepeda ontel sendiri tanpa bantuan orang dewasa</w:t>
+      </w:r>
+    </w:p>
+    <w:p>
+      <w:pPr>
+        <w:ind w:left="360"/>
+      </w:pPr>
+      <w:r>
+        <w:t>D.  Berjalan kaki saat berangkat ke sekolah demi menghemat tenaga</w:t>
+      </w:r>
+    </w:p>
+    <w:p/>
+    <w:p>
+      <w:r>
+        <w:rPr>
+          <w:b/>
+        </w:rPr>
+        <w:t>11. Bacalah kutipan dialog wawancara berikut untuk menjawab soal nomor 11 sampai 14!</w:t>
         <w:br/>
         <w:br/>
         <w:t>Wawancara Cilik: Menggugah Kepedulian Lewat Bank Sampah Sekolah</w:t>
@@ -962,93 +692,8 @@
         <w:br/>
         <w:t>Topik pokok pembicaraan dalam wawancara antara Dika dan Ibu Ratna adalah....</w:t>
       </w:r>
-    </w:p>
-    <w:p>
-      <w:pPr>
-        <w:pStyle w:val="ListBullet"/>
-        <w:ind w:left="720"/>
-      </w:pPr>
       <w:r>
-        <w:rPr>
-          <w:b/>
-        </w:rPr>
-        <w:t xml:space="preserve">A. </w:t>
-      </w:r>
-      <w:r>
-        <w:t>Proses pembuatan kompos dari sisa tanaman hias sekolah</w:t>
-      </w:r>
-    </w:p>
-    <w:p>
-      <w:pPr>
-        <w:pStyle w:val="ListBullet"/>
-        <w:ind w:left="720"/>
-      </w:pPr>
-      <w:r>
-        <w:rPr>
-          <w:b/>
-        </w:rPr>
-        <w:t xml:space="preserve">B. </w:t>
-      </w:r>
-      <w:r>
-        <w:t>Sosialisasi dan manfaat pelaksanaan program Bank Sampah di lingkungan sekolah</w:t>
-      </w:r>
-    </w:p>
-    <w:p>
-      <w:pPr>
-        <w:pStyle w:val="ListBullet"/>
-        <w:ind w:left="720"/>
-      </w:pPr>
-      <w:r>
-        <w:rPr>
-          <w:b/>
-        </w:rPr>
-        <w:t xml:space="preserve">C. </w:t>
-      </w:r>
-      <w:r>
-        <w:t>Pemilihan ketua pengurus dokter cilik Adiwiyata periode baru</w:t>
-      </w:r>
-    </w:p>
-    <w:p>
-      <w:pPr>
-        <w:pStyle w:val="ListBullet"/>
-        <w:ind w:left="720"/>
-      </w:pPr>
-      <w:r>
-        <w:rPr>
-          <w:b/>
-        </w:rPr>
-        <w:t xml:space="preserve">D. </w:t>
-      </w:r>
-      <w:r>
-        <w:t>Teknik mendaur ulang botol plastik menjadi pot bunga hias</w:t>
-      </w:r>
-    </w:p>
-    <w:p>
-      <w:r>
-        <w:rPr>
-          <w:b/>
-        </w:rPr>
-        <w:t xml:space="preserve">Kunci Jawaban: </w:t>
-      </w:r>
-      <w:r>
-        <w:rPr>
-          <w:b/>
-        </w:rPr>
-        <w:t>1, 2</w:t>
-      </w:r>
-    </w:p>
-    <w:p>
-      <w:r>
-        <w:t>────────────────────────────────────────────────────────────</w:t>
-      </w:r>
-    </w:p>
-    <w:p>
-      <w:r>
-        <w:rPr>
-          <w:b/>
-          <w:sz w:val="24"/>
-        </w:rPr>
-        <w:t>Soal 12.</w:t>
+        <w:t xml:space="preserve">  [Pilihan Ganda Kompleks: Jawaban benar lebih dari satu]</w:t>
       </w:r>
     </w:p>
     <w:p>
@@ -1056,65 +701,7 @@
         <w:ind w:left="360"/>
       </w:pPr>
       <w:r>
-        <w:t>Berdasarkan dialog di atas, keuntungan langsung yang diperoleh siswa ketika menyetorkan sampah anorganik bersih ke Bank Sampah adalah....</w:t>
-      </w:r>
-    </w:p>
-    <w:p>
-      <w:pPr>
-        <w:pStyle w:val="ListBullet"/>
-        <w:ind w:left="720"/>
-      </w:pPr>
-      <w:r>
-        <w:rPr>
-          <w:b/>
-        </w:rPr>
-        <w:t xml:space="preserve">A. </w:t>
-      </w:r>
-      <w:r>
-        <w:t>True</w:t>
-      </w:r>
-    </w:p>
-    <w:p>
-      <w:pPr>
-        <w:pStyle w:val="ListBullet"/>
-        <w:ind w:left="720"/>
-      </w:pPr>
-      <w:r>
-        <w:rPr>
-          <w:b/>
-        </w:rPr>
-        <w:t xml:space="preserve">B. </w:t>
-      </w:r>
-      <w:r>
-        <w:t>False</w:t>
-      </w:r>
-    </w:p>
-    <w:p>
-      <w:r>
-        <w:rPr>
-          <w:b/>
-        </w:rPr>
-        <w:t xml:space="preserve">Kunci Jawaban: </w:t>
-      </w:r>
-      <w:r>
-        <w:rPr>
-          <w:b/>
-        </w:rPr>
-        <w:t>True</w:t>
-      </w:r>
-    </w:p>
-    <w:p>
-      <w:r>
-        <w:t>────────────────────────────────────────────────────────────</w:t>
-      </w:r>
-    </w:p>
-    <w:p>
-      <w:r>
-        <w:rPr>
-          <w:b/>
-          <w:sz w:val="24"/>
-        </w:rPr>
-        <w:t>Soal 13.</w:t>
+        <w:t>A.  Proses pembuatan kompos dari sisa tanaman hias sekolah</w:t>
       </w:r>
     </w:p>
     <w:p>
@@ -1122,95 +709,7 @@
         <w:ind w:left="360"/>
       </w:pPr>
       <w:r>
-        <w:t>Dampak lingkungan yang paling nyata dirasakan sekolah setelah program Bank Sampah berjalan adalah....</w:t>
-      </w:r>
-    </w:p>
-    <w:p>
-      <w:pPr>
-        <w:pStyle w:val="ListBullet"/>
-        <w:ind w:left="720"/>
-      </w:pPr>
-      <w:r>
-        <w:rPr>
-          <w:b/>
-        </w:rPr>
-        <w:t xml:space="preserve">A. </w:t>
-      </w:r>
-      <w:r>
-        <w:t>Penjualan tanaman hias sekolah meningkat pesat ke luar kota</w:t>
-      </w:r>
-    </w:p>
-    <w:p>
-      <w:pPr>
-        <w:pStyle w:val="ListBullet"/>
-        <w:ind w:left="720"/>
-      </w:pPr>
-      <w:r>
-        <w:rPr>
-          <w:b/>
-        </w:rPr>
-        <w:t xml:space="preserve">B. </w:t>
-      </w:r>
-      <w:r>
-        <w:t>Volume timbulan sampah sekolah yang dibuang ke TPA berkurang hingga 60%</w:t>
-      </w:r>
-    </w:p>
-    <w:p>
-      <w:pPr>
-        <w:pStyle w:val="ListBullet"/>
-        <w:ind w:left="720"/>
-      </w:pPr>
-      <w:r>
-        <w:rPr>
-          <w:b/>
-        </w:rPr>
-        <w:t xml:space="preserve">C. </w:t>
-      </w:r>
-      <w:r>
-        <w:t>Biaya operasional kebersihan sekolah menjadi sepenuhnya gratis</w:t>
-      </w:r>
-    </w:p>
-    <w:p>
-      <w:pPr>
-        <w:pStyle w:val="ListBullet"/>
-        <w:ind w:left="720"/>
-      </w:pPr>
-      <w:r>
-        <w:rPr>
-          <w:b/>
-        </w:rPr>
-        <w:t xml:space="preserve">D. </w:t>
-      </w:r>
-      <w:r>
-        <w:t>Semua kantin sekolah dilarang menjual makanan berkemasan</w:t>
-      </w:r>
-    </w:p>
-    <w:p>
-      <w:r>
-        <w:rPr>
-          <w:b/>
-        </w:rPr>
-        <w:t xml:space="preserve">Kunci Jawaban: </w:t>
-      </w:r>
-      <w:r>
-        <w:rPr>
-          <w:b/>
-        </w:rPr>
-        <w:t>2</w:t>
-      </w:r>
-    </w:p>
-    <w:p>
-      <w:r>
-        <w:t>────────────────────────────────────────────────────────────</w:t>
-      </w:r>
-    </w:p>
-    <w:p>
-      <w:r>
-        <w:rPr>
-          <w:b/>
-          <w:sz w:val="24"/>
-        </w:rPr>
-        <w:t>Soal 14.</w:t>
+        <w:t>B.  Sosialisasi dan manfaat pelaksanaan program Bank Sampah di lingkungan sekolah</w:t>
       </w:r>
     </w:p>
     <w:p>
@@ -1218,95 +717,7 @@
         <w:ind w:left="360"/>
       </w:pPr>
       <w:r>
-        <w:t>Simpulan yang paling tepat dari kutipan wawancara di atas adalah....</w:t>
-      </w:r>
-    </w:p>
-    <w:p>
-      <w:pPr>
-        <w:pStyle w:val="ListBullet"/>
-        <w:ind w:left="720"/>
-      </w:pPr>
-      <w:r>
-        <w:rPr>
-          <w:b/>
-        </w:rPr>
-        <w:t xml:space="preserve">A. </w:t>
-      </w:r>
-      <w:r>
-        <w:t>Pengelolaan bank sampah sekolah merupakan kegiatan wajib yang harus diawasi dinas kebersihan kota.</w:t>
-      </w:r>
-    </w:p>
-    <w:p>
-      <w:pPr>
-        <w:pStyle w:val="ListBullet"/>
-        <w:ind w:left="720"/>
-      </w:pPr>
-      <w:r>
-        <w:rPr>
-          <w:b/>
-        </w:rPr>
-        <w:t xml:space="preserve">B. </w:t>
-      </w:r>
-      <w:r>
-        <w:t>Program Bank Sampah di sekolah sangat efektif mengedukasi siswa dalam memilah sampah dan menciptakan lingkungan bersih.</w:t>
-      </w:r>
-    </w:p>
-    <w:p>
-      <w:pPr>
-        <w:pStyle w:val="ListBullet"/>
-        <w:ind w:left="720"/>
-      </w:pPr>
-      <w:r>
-        <w:rPr>
-          <w:b/>
-        </w:rPr>
-        <w:t xml:space="preserve">C. </w:t>
-      </w:r>
-      <w:r>
-        <w:t>Sampah anorganik bernilai ekonomis jauh lebih tinggi daripada pupuk kompos organik.</w:t>
-      </w:r>
-    </w:p>
-    <w:p>
-      <w:pPr>
-        <w:pStyle w:val="ListBullet"/>
-        <w:ind w:left="720"/>
-      </w:pPr>
-      <w:r>
-        <w:rPr>
-          <w:b/>
-        </w:rPr>
-        <w:t xml:space="preserve">D. </w:t>
-      </w:r>
-      <w:r>
-        <w:t>Siswa kelas VI harus bertanggung jawab penuh menjadi pengurus inti bank sampah sekolah.</w:t>
-      </w:r>
-    </w:p>
-    <w:p>
-      <w:r>
-        <w:rPr>
-          <w:b/>
-        </w:rPr>
-        <w:t xml:space="preserve">Kunci Jawaban: </w:t>
-      </w:r>
-      <w:r>
-        <w:rPr>
-          <w:b/>
-        </w:rPr>
-        <w:t>1, 2</w:t>
-      </w:r>
-    </w:p>
-    <w:p>
-      <w:r>
-        <w:t>────────────────────────────────────────────────────────────</w:t>
-      </w:r>
-    </w:p>
-    <w:p>
-      <w:r>
-        <w:rPr>
-          <w:b/>
-          <w:sz w:val="24"/>
-        </w:rPr>
-        <w:t>Soal 15.</w:t>
+        <w:t>C.  Pemilihan ketua pengurus dokter cilik Adiwiyata periode baru</w:t>
       </w:r>
     </w:p>
     <w:p>
@@ -1314,7 +725,188 @@
         <w:ind w:left="360"/>
       </w:pPr>
       <w:r>
-        <w:t>Bacalah petunjuk prosedur berikut untuk menjawab soal nomor 15 dan 16!</w:t>
+        <w:t>D.  Teknik mendaur ulang botol plastik menjadi pot bunga hias</w:t>
+      </w:r>
+    </w:p>
+    <w:p/>
+    <w:p>
+      <w:r>
+        <w:rPr>
+          <w:b/>
+        </w:rPr>
+        <w:t>12. Berdasarkan dialog di atas, keuntungan langsung yang diperoleh siswa ketika menyetorkan sampah anorganik bersih ke Bank Sampah adalah....</w:t>
+      </w:r>
+      <w:r>
+        <w:t xml:space="preserve">  [Pilihan Ganda Kompleks: Kategori Benar / Salah]</w:t>
+      </w:r>
+    </w:p>
+    <w:tbl>
+      <w:tblPr>
+        <w:tblW w:type="auto" w:w="0"/>
+        <w:tblLook w:firstColumn="1" w:firstRow="1" w:lastColumn="0" w:lastRow="0" w:noHBand="0" w:noVBand="1" w:val="04A0"/>
+      </w:tblPr>
+      <w:tblGrid>
+        <w:gridCol w:w="2880"/>
+        <w:gridCol w:w="2880"/>
+        <w:gridCol w:w="2880"/>
+      </w:tblGrid>
+      <w:tr>
+        <w:tc>
+          <w:tcPr>
+            <w:tcW w:type="dxa" w:w="2880"/>
+          </w:tcPr>
+          <w:p>
+            <w:r>
+              <w:t>Pernyataan</w:t>
+            </w:r>
+          </w:p>
+        </w:tc>
+        <w:tc>
+          <w:tcPr>
+            <w:tcW w:type="dxa" w:w="2880"/>
+          </w:tcPr>
+          <w:p>
+            <w:r>
+              <w:t>Benar</w:t>
+            </w:r>
+          </w:p>
+        </w:tc>
+        <w:tc>
+          <w:tcPr>
+            <w:tcW w:type="dxa" w:w="2880"/>
+          </w:tcPr>
+          <w:p>
+            <w:r>
+              <w:t>Salah</w:t>
+            </w:r>
+          </w:p>
+        </w:tc>
+      </w:tr>
+      <w:tr>
+        <w:tc>
+          <w:tcPr>
+            <w:tcW w:type="dxa" w:w="2880"/>
+          </w:tcPr>
+          <w:p>
+            <w:r>
+              <w:t>Berdasarkan dialog di atas, keuntungan langsung yang diperoleh siswa ketika menyetorkan sampah anorganik bersih ke Bank Sampah adalah....</w:t>
+            </w:r>
+          </w:p>
+        </w:tc>
+        <w:tc>
+          <w:tcPr>
+            <w:tcW w:type="dxa" w:w="2880"/>
+          </w:tcPr>
+          <w:p>
+            <w:r>
+              <w:t>[   ]</w:t>
+            </w:r>
+          </w:p>
+        </w:tc>
+        <w:tc>
+          <w:tcPr>
+            <w:tcW w:type="dxa" w:w="2880"/>
+          </w:tcPr>
+          <w:p>
+            <w:r>
+              <w:t>[   ]</w:t>
+            </w:r>
+          </w:p>
+        </w:tc>
+      </w:tr>
+    </w:tbl>
+    <w:p/>
+    <w:p>
+      <w:r>
+        <w:rPr>
+          <w:b/>
+        </w:rPr>
+        <w:t>13. Dampak lingkungan yang paling nyata dirasakan sekolah setelah program Bank Sampah berjalan adalah....</w:t>
+      </w:r>
+    </w:p>
+    <w:p>
+      <w:pPr>
+        <w:ind w:left="360"/>
+      </w:pPr>
+      <w:r>
+        <w:t>A.  Penjualan tanaman hias sekolah meningkat pesat ke luar kota</w:t>
+      </w:r>
+    </w:p>
+    <w:p>
+      <w:pPr>
+        <w:ind w:left="360"/>
+      </w:pPr>
+      <w:r>
+        <w:t>B.  Volume timbulan sampah sekolah yang dibuang ke TPA berkurang hingga 60%</w:t>
+      </w:r>
+    </w:p>
+    <w:p>
+      <w:pPr>
+        <w:ind w:left="360"/>
+      </w:pPr>
+      <w:r>
+        <w:t>C.  Biaya operasional kebersihan sekolah menjadi sepenuhnya gratis</w:t>
+      </w:r>
+    </w:p>
+    <w:p>
+      <w:pPr>
+        <w:ind w:left="360"/>
+      </w:pPr>
+      <w:r>
+        <w:t>D.  Semua kantin sekolah dilarang menjual makanan berkemasan</w:t>
+      </w:r>
+    </w:p>
+    <w:p/>
+    <w:p>
+      <w:r>
+        <w:rPr>
+          <w:b/>
+        </w:rPr>
+        <w:t>14. Simpulan yang paling tepat dari kutipan wawancara di atas adalah....</w:t>
+      </w:r>
+      <w:r>
+        <w:t xml:space="preserve">  [Pilihan Ganda Kompleks: Jawaban benar lebih dari satu]</w:t>
+      </w:r>
+    </w:p>
+    <w:p>
+      <w:pPr>
+        <w:ind w:left="360"/>
+      </w:pPr>
+      <w:r>
+        <w:t>A.  Pengelolaan bank sampah sekolah merupakan kegiatan wajib yang harus diawasi dinas kebersihan kota.</w:t>
+      </w:r>
+    </w:p>
+    <w:p>
+      <w:pPr>
+        <w:ind w:left="360"/>
+      </w:pPr>
+      <w:r>
+        <w:t>B.  Program Bank Sampah di sekolah sangat efektif mengedukasi siswa dalam memilah sampah dan menciptakan lingkungan bersih.</w:t>
+      </w:r>
+    </w:p>
+    <w:p>
+      <w:pPr>
+        <w:ind w:left="360"/>
+      </w:pPr>
+      <w:r>
+        <w:t>C.  Sampah anorganik bernilai ekonomis jauh lebih tinggi daripada pupuk kompos organik.</w:t>
+      </w:r>
+    </w:p>
+    <w:p>
+      <w:pPr>
+        <w:ind w:left="360"/>
+      </w:pPr>
+      <w:r>
+        <w:t>D.  Siswa kelas VI harus bertanggung jawab penuh menjadi pengurus inti bank sampah sekolah.</w:t>
+      </w:r>
+    </w:p>
+    <w:p/>
+    <w:p>
+      <w:r>
+        <w:rPr>
+          <w:b/>
+        </w:rPr>
+        <w:t>15. Bacalah petunjuk prosedur berikut untuk menjawab soal nomor 15 dan 16!</w:t>
         <w:br/>
         <w:br/>
         <w:t>Petunjuk Praktis Menanam Sayuran Hidroponik Sistem Sumbu (Wick System)</w:t>
@@ -1334,63 +926,110 @@
         <w:br/>
         <w:t>Kalimat yang paling tepat dan runtut untuk melengkapi langkah nomor (4) pada petunjuk hidroponik tersebut adalah....</w:t>
       </w:r>
-    </w:p>
-    <w:p>
-      <w:pPr>
-        <w:pStyle w:val="ListBullet"/>
-        <w:ind w:left="720"/>
-      </w:pPr>
       <w:r>
-        <w:rPr>
-          <w:b/>
-        </w:rPr>
-        <w:t xml:space="preserve">A. </w:t>
-      </w:r>
-      <w:r>
-        <w:t>True</w:t>
+        <w:t xml:space="preserve">  [Pilihan Ganda Kompleks: Kategori Benar / Salah]</w:t>
       </w:r>
     </w:p>
-    <w:p>
-      <w:pPr>
-        <w:pStyle w:val="ListBullet"/>
-        <w:ind w:left="720"/>
-      </w:pPr>
-      <w:r>
-        <w:rPr>
-          <w:b/>
-        </w:rPr>
-        <w:t xml:space="preserve">B. </w:t>
-      </w:r>
-      <w:r>
-        <w:t>False</w:t>
-      </w:r>
-    </w:p>
+    <w:tbl>
+      <w:tblPr>
+        <w:tblW w:type="auto" w:w="0"/>
+        <w:tblLook w:firstColumn="1" w:firstRow="1" w:lastColumn="0" w:lastRow="0" w:noHBand="0" w:noVBand="1" w:val="04A0"/>
+      </w:tblPr>
+      <w:tblGrid>
+        <w:gridCol w:w="2880"/>
+        <w:gridCol w:w="2880"/>
+        <w:gridCol w:w="2880"/>
+      </w:tblGrid>
+      <w:tr>
+        <w:tc>
+          <w:tcPr>
+            <w:tcW w:type="dxa" w:w="2880"/>
+          </w:tcPr>
+          <w:p>
+            <w:r>
+              <w:t>Pernyataan</w:t>
+            </w:r>
+          </w:p>
+        </w:tc>
+        <w:tc>
+          <w:tcPr>
+            <w:tcW w:type="dxa" w:w="2880"/>
+          </w:tcPr>
+          <w:p>
+            <w:r>
+              <w:t>Benar</w:t>
+            </w:r>
+          </w:p>
+        </w:tc>
+        <w:tc>
+          <w:tcPr>
+            <w:tcW w:type="dxa" w:w="2880"/>
+          </w:tcPr>
+          <w:p>
+            <w:r>
+              <w:t>Salah</w:t>
+            </w:r>
+          </w:p>
+        </w:tc>
+      </w:tr>
+      <w:tr>
+        <w:tc>
+          <w:tcPr>
+            <w:tcW w:type="dxa" w:w="2880"/>
+          </w:tcPr>
+          <w:p>
+            <w:r>
+              <w:t>Bacalah petunjuk prosedur berikut untuk menjawab soal nomor 15 dan 16!</w:t>
+              <w:br/>
+              <w:br/>
+              <w:t>Petunjuk Praktis Menanam Sayuran Hidroponik Sistem Sumbu (Wick System)</w:t>
+              <w:br/>
+              <w:t>(1) Siapkan botol plastik bekas air mineral ukuran 1,5 liter, lalu potong secara horizontal menjadi dua bagian menggunakan gunting atau *cutter*.</w:t>
+              <w:br/>
+              <w:t>(2) Buatlah lubang kecil pada tutup botol menggunakan solder atau paku panas, lalu selipkan sehelai kain flanel sepanjang 15 cm sebagai sumbu kapiler.</w:t>
+              <w:br/>
+              <w:t>(3) Pasang bagian atas botol yang sudah bersumbu ke dalam potongan bagian bawah botol secara terbalik (leher botol menghadap ke dasar).</w:t>
+              <w:br/>
+              <w:t>(4) [...]</w:t>
+              <w:br/>
+              <w:t>(5) Masukkan bibit tanaman sawi atau selada yang telah disemai (berdaun 3 sampai 4 helai) dengan hati-hati ke dalam media tanam tersebut.</w:t>
+              <w:br/>
+              <w:t>(6) Tuangkan larutan nutrisi hidroponik (larutan AB Mix) ke dalam wadah bagian bawah hingga menyentuh separuh sumbu flanel, lalu letakkan di area yang terkena sinar matahari cukup.</w:t>
+              <w:br/>
+              <w:br/>
+              <w:t>Kalimat yang paling tepat dan runtut untuk melengkapi langkah nomor (4) pada petunjuk hidroponik tersebut adalah....</w:t>
+            </w:r>
+          </w:p>
+        </w:tc>
+        <w:tc>
+          <w:tcPr>
+            <w:tcW w:type="dxa" w:w="2880"/>
+          </w:tcPr>
+          <w:p>
+            <w:r>
+              <w:t>[   ]</w:t>
+            </w:r>
+          </w:p>
+        </w:tc>
+        <w:tc>
+          <w:tcPr>
+            <w:tcW w:type="dxa" w:w="2880"/>
+          </w:tcPr>
+          <w:p>
+            <w:r>
+              <w:t>[   ]</w:t>
+            </w:r>
+          </w:p>
+        </w:tc>
+      </w:tr>
+    </w:tbl>
+    <w:p/>
     <w:p>
       <w:r>
         <w:rPr>
           <w:b/>
         </w:rPr>
-        <w:t xml:space="preserve">Kunci Jawaban: </w:t>
-      </w:r>
-      <w:r>
-        <w:rPr>
-          <w:b/>
-        </w:rPr>
-        <w:t>True</w:t>
-      </w:r>
-    </w:p>
-    <w:p>
-      <w:r>
-        <w:t>────────────────────────────────────────────────────────────</w:t>
-      </w:r>
-    </w:p>
-    <w:p>
-      <w:r>
-        <w:rPr>
-          <w:b/>
-          <w:sz w:val="24"/>
-        </w:rPr>
-        <w:t>Soal 16.</w:t>
+        <w:t>16. Fungsi utama kain flanel pada sistem hidroponik sumbu (wick system) berdasarkan teks prosedur di atas adalah....</w:t>
       </w:r>
     </w:p>
     <w:p>
@@ -1398,95 +1037,7 @@
         <w:ind w:left="360"/>
       </w:pPr>
       <w:r>
-        <w:t>Fungsi utama kain flanel pada sistem hidroponik sumbu (wick system) berdasarkan teks prosedur di atas adalah....</w:t>
-      </w:r>
-    </w:p>
-    <w:p>
-      <w:pPr>
-        <w:pStyle w:val="ListBullet"/>
-        <w:ind w:left="720"/>
-      </w:pPr>
-      <w:r>
-        <w:rPr>
-          <w:b/>
-        </w:rPr>
-        <w:t xml:space="preserve">A. </w:t>
-      </w:r>
-      <w:r>
-        <w:t>Sebagai penahan agar botol bagian atas tidak mudah goyang dan tumpah</w:t>
-      </w:r>
-    </w:p>
-    <w:p>
-      <w:pPr>
-        <w:pStyle w:val="ListBullet"/>
-        <w:ind w:left="720"/>
-      </w:pPr>
-      <w:r>
-        <w:rPr>
-          <w:b/>
-        </w:rPr>
-        <w:t xml:space="preserve">B. </w:t>
-      </w:r>
-      <w:r>
-        <w:t>Sebagai sumbu kapiler yang menyerap larutan nutrisi dari bawah menuju akar tanaman</w:t>
-      </w:r>
-    </w:p>
-    <w:p>
-      <w:pPr>
-        <w:pStyle w:val="ListBullet"/>
-        <w:ind w:left="720"/>
-      </w:pPr>
-      <w:r>
-        <w:rPr>
-          <w:b/>
-        </w:rPr>
-        <w:t xml:space="preserve">C. </w:t>
-      </w:r>
-      <w:r>
-        <w:t>Untuk menyaring kotoran dan lumut yang tumbuh di dalam air tandon</w:t>
-      </w:r>
-    </w:p>
-    <w:p>
-      <w:pPr>
-        <w:pStyle w:val="ListBullet"/>
-        <w:ind w:left="720"/>
-      </w:pPr>
-      <w:r>
-        <w:rPr>
-          <w:b/>
-        </w:rPr>
-        <w:t xml:space="preserve">D. </w:t>
-      </w:r>
-      <w:r>
-        <w:t>Sebagai pengganti sinar matahari buatan bagi bibit tanaman</w:t>
-      </w:r>
-    </w:p>
-    <w:p>
-      <w:r>
-        <w:rPr>
-          <w:b/>
-        </w:rPr>
-        <w:t xml:space="preserve">Kunci Jawaban: </w:t>
-      </w:r>
-      <w:r>
-        <w:rPr>
-          <w:b/>
-        </w:rPr>
-        <w:t>2</w:t>
-      </w:r>
-    </w:p>
-    <w:p>
-      <w:r>
-        <w:t>────────────────────────────────────────────────────────────</w:t>
-      </w:r>
-    </w:p>
-    <w:p>
-      <w:r>
-        <w:rPr>
-          <w:b/>
-          <w:sz w:val="24"/>
-        </w:rPr>
-        <w:t>Soal 17.</w:t>
+        <w:t>A.  Sebagai penahan agar botol bagian atas tidak mudah goyang dan tumpah</w:t>
       </w:r>
     </w:p>
     <w:p>
@@ -1494,7 +1045,32 @@
         <w:ind w:left="360"/>
       </w:pPr>
       <w:r>
-        <w:t>Perhatikan bait puisi berikut!</w:t>
+        <w:t>B.  Sebagai sumbu kapiler yang menyerap larutan nutrisi dari bawah menuju akar tanaman</w:t>
+      </w:r>
+    </w:p>
+    <w:p>
+      <w:pPr>
+        <w:ind w:left="360"/>
+      </w:pPr>
+      <w:r>
+        <w:t>C.  Untuk menyaring kotoran dan lumut yang tumbuh di dalam air tandon</w:t>
+      </w:r>
+    </w:p>
+    <w:p>
+      <w:pPr>
+        <w:ind w:left="360"/>
+      </w:pPr>
+      <w:r>
+        <w:t>D.  Sebagai pengganti sinar matahari buatan bagi bibit tanaman</w:t>
+      </w:r>
+    </w:p>
+    <w:p/>
+    <w:p>
+      <w:r>
+        <w:rPr>
+          <w:b/>
+        </w:rPr>
+        <w:t>17. Perhatikan bait puisi berikut!</w:t>
         <w:br/>
         <w:br/>
         <w:t>Mentari pagi menyapa ramah</w:t>
@@ -1508,93 +1084,8 @@
         <w:br/>
         <w:t>Makna ungkapan 'Embun menari di ujung dedaunan' pada bait puisi di atas adalah....</w:t>
       </w:r>
-    </w:p>
-    <w:p>
-      <w:pPr>
-        <w:pStyle w:val="ListBullet"/>
-        <w:ind w:left="720"/>
-      </w:pPr>
       <w:r>
-        <w:rPr>
-          <w:b/>
-        </w:rPr>
-        <w:t xml:space="preserve">A. </w:t>
-      </w:r>
-      <w:r>
-        <w:t>Tetesan air embun pagi yang tampak berkilau dan bergoyang terkena hembusan angin sejuk</w:t>
-      </w:r>
-    </w:p>
-    <w:p>
-      <w:pPr>
-        <w:pStyle w:val="ListBullet"/>
-        <w:ind w:left="720"/>
-      </w:pPr>
-      <w:r>
-        <w:rPr>
-          <w:b/>
-        </w:rPr>
-        <w:t xml:space="preserve">B. </w:t>
-      </w:r>
-      <w:r>
-        <w:t>Daun-daun berguguran ke tanah karena terkena tetesan air hujan lebat</w:t>
-      </w:r>
-    </w:p>
-    <w:p>
-      <w:pPr>
-        <w:pStyle w:val="ListBullet"/>
-        <w:ind w:left="720"/>
-      </w:pPr>
-      <w:r>
-        <w:rPr>
-          <w:b/>
-        </w:rPr>
-        <w:t xml:space="preserve">C. </w:t>
-      </w:r>
-      <w:r>
-        <w:t>Udara dingin yang menyebabkan tanaman layu di pagi hari</w:t>
-      </w:r>
-    </w:p>
-    <w:p>
-      <w:pPr>
-        <w:pStyle w:val="ListBullet"/>
-        <w:ind w:left="720"/>
-      </w:pPr>
-      <w:r>
-        <w:rPr>
-          <w:b/>
-        </w:rPr>
-        <w:t xml:space="preserve">D. </w:t>
-      </w:r>
-      <w:r>
-        <w:t>Cahaya matahari yang terhalang oleh kabut tebal pegunungan</w:t>
-      </w:r>
-    </w:p>
-    <w:p>
-      <w:r>
-        <w:rPr>
-          <w:b/>
-        </w:rPr>
-        <w:t xml:space="preserve">Kunci Jawaban: </w:t>
-      </w:r>
-      <w:r>
-        <w:rPr>
-          <w:b/>
-        </w:rPr>
-        <w:t>1, 2</w:t>
-      </w:r>
-    </w:p>
-    <w:p>
-      <w:r>
-        <w:t>────────────────────────────────────────────────────────────</w:t>
-      </w:r>
-    </w:p>
-    <w:p>
-      <w:r>
-        <w:rPr>
-          <w:b/>
-          <w:sz w:val="24"/>
-        </w:rPr>
-        <w:t>Soal 18.</w:t>
+        <w:t xml:space="preserve">  [Pilihan Ganda Kompleks: Jawaban benar lebih dari satu]</w:t>
       </w:r>
     </w:p>
     <w:p>
@@ -1602,7 +1093,40 @@
         <w:ind w:left="360"/>
       </w:pPr>
       <w:r>
-        <w:t>Perhatikan kalimat-kalimat petunjuk pembuatan puding berikut!</w:t>
+        <w:t>A.  Tetesan air embun pagi yang tampak berkilau dan bergoyang terkena hembusan angin sejuk</w:t>
+      </w:r>
+    </w:p>
+    <w:p>
+      <w:pPr>
+        <w:ind w:left="360"/>
+      </w:pPr>
+      <w:r>
+        <w:t>B.  Daun-daun berguguran ke tanah karena terkena tetesan air hujan lebat</w:t>
+      </w:r>
+    </w:p>
+    <w:p>
+      <w:pPr>
+        <w:ind w:left="360"/>
+      </w:pPr>
+      <w:r>
+        <w:t>C.  Udara dingin yang menyebabkan tanaman layu di pagi hari</w:t>
+      </w:r>
+    </w:p>
+    <w:p>
+      <w:pPr>
+        <w:ind w:left="360"/>
+      </w:pPr>
+      <w:r>
+        <w:t>D.  Cahaya matahari yang terhalang oleh kabut tebal pegunungan</w:t>
+      </w:r>
+    </w:p>
+    <w:p/>
+    <w:p>
+      <w:r>
+        <w:rPr>
+          <w:b/>
+        </w:rPr>
+        <w:t>18. Perhatikan kalimat-kalimat petunjuk pembuatan puding berikut!</w:t>
         <w:br/>
         <w:t>(1) Setelah uap panasnya berkurang, masukkan puding ke dalam lemari es hingga mengeras.</w:t>
         <w:br/>
@@ -1615,35 +1139,185 @@
         <w:br/>
         <w:t>Urutan petunjuk yang tepat dan logis agar menjadi teks prosedur yang padu adalah....</w:t>
       </w:r>
+      <w:r>
+        <w:t xml:space="preserve">  [Pilihan Ganda Kompleks: Kategori Benar / Salah]</w:t>
+      </w:r>
     </w:p>
+    <w:tbl>
+      <w:tblPr>
+        <w:tblW w:type="auto" w:w="0"/>
+        <w:tblLook w:firstColumn="1" w:firstRow="1" w:lastColumn="0" w:lastRow="0" w:noHBand="0" w:noVBand="1" w:val="04A0"/>
+      </w:tblPr>
+      <w:tblGrid>
+        <w:gridCol w:w="2880"/>
+        <w:gridCol w:w="2880"/>
+        <w:gridCol w:w="2880"/>
+      </w:tblGrid>
+      <w:tr>
+        <w:tc>
+          <w:tcPr>
+            <w:tcW w:type="dxa" w:w="2880"/>
+          </w:tcPr>
+          <w:p>
+            <w:r>
+              <w:t>Pernyataan</w:t>
+            </w:r>
+          </w:p>
+        </w:tc>
+        <w:tc>
+          <w:tcPr>
+            <w:tcW w:type="dxa" w:w="2880"/>
+          </w:tcPr>
+          <w:p>
+            <w:r>
+              <w:t>Benar</w:t>
+            </w:r>
+          </w:p>
+        </w:tc>
+        <w:tc>
+          <w:tcPr>
+            <w:tcW w:type="dxa" w:w="2880"/>
+          </w:tcPr>
+          <w:p>
+            <w:r>
+              <w:t>Salah</w:t>
+            </w:r>
+          </w:p>
+        </w:tc>
+      </w:tr>
+      <w:tr>
+        <w:tc>
+          <w:tcPr>
+            <w:tcW w:type="dxa" w:w="2880"/>
+          </w:tcPr>
+          <w:p>
+            <w:r>
+              <w:t>Perhatikan kalimat-kalimat petunjuk pembuatan puding berikut!</w:t>
+              <w:br/>
+              <w:t>(1) Setelah uap panasnya berkurang, masukkan puding ke dalam lemari es hingga mengeras.</w:t>
+              <w:br/>
+              <w:t>(2) Campurkan bubuk agar-agar, gula pasir, dan air kelapa muda ke dalam panci secara merata.</w:t>
+              <w:br/>
+              <w:t>(3) Rebus adonan di atas api sedang sambil terus diaduk perlahan hingga mendidih sempurna.</w:t>
+              <w:br/>
+              <w:t>(4) Tuangkan cairan puding yang telah mendidih ke dalam cetakan yang telah disiapkan.</w:t>
+              <w:br/>
+              <w:br/>
+              <w:t>Urutan petunjuk yang tepat dan logis agar menjadi teks prosedur yang padu adalah....</w:t>
+            </w:r>
+          </w:p>
+        </w:tc>
+        <w:tc>
+          <w:tcPr>
+            <w:tcW w:type="dxa" w:w="2880"/>
+          </w:tcPr>
+          <w:p>
+            <w:r>
+              <w:t>[   ]</w:t>
+            </w:r>
+          </w:p>
+        </w:tc>
+        <w:tc>
+          <w:tcPr>
+            <w:tcW w:type="dxa" w:w="2880"/>
+          </w:tcPr>
+          <w:p>
+            <w:r>
+              <w:t>[   ]</w:t>
+            </w:r>
+          </w:p>
+        </w:tc>
+      </w:tr>
+    </w:tbl>
+    <w:p/>
     <w:p>
-      <w:pPr>
-        <w:pStyle w:val="ListBullet"/>
-        <w:ind w:left="720"/>
-      </w:pPr>
       <w:r>
         <w:rPr>
           <w:b/>
         </w:rPr>
-        <w:t xml:space="preserve">A. </w:t>
-      </w:r>
-      <w:r>
-        <w:t>True</w:t>
+        <w:t>19. Kalimat berikut yang seluruhnya menggunakan kata baku secara tepat sesuai Pedoman Umum Ejaan Bahasa Indonesia (PUEBI/EYD) adalah....</w:t>
       </w:r>
     </w:p>
     <w:p>
       <w:pPr>
-        <w:pStyle w:val="ListBullet"/>
-        <w:ind w:left="720"/>
+        <w:ind w:left="360"/>
       </w:pPr>
+      <w:r>
+        <w:t>A.  Para pasien sedang antri di apotik untuk mengambil obat resep dokter.</w:t>
+      </w:r>
+    </w:p>
+    <w:p>
+      <w:pPr>
+        <w:ind w:left="360"/>
+      </w:pPr>
+      <w:r>
+        <w:t>B.  Jadwal praktik dokter spesialis anak di klinik tersebut sudah aktif sejak pagi.</w:t>
+      </w:r>
+    </w:p>
+    <w:p>
+      <w:pPr>
+        <w:ind w:left="360"/>
+      </w:pPr>
+      <w:r>
+        <w:t>C.  Rian meminta ijin kepada gurunya karena badannya sedang tidak fit.</w:t>
+      </w:r>
+    </w:p>
+    <w:p>
+      <w:pPr>
+        <w:ind w:left="360"/>
+      </w:pPr>
+      <w:r>
+        <w:t>D.  Kwalitas produk kerajinan bambu itu sangat dikagumi para turis manca negara.</w:t>
+      </w:r>
+    </w:p>
+    <w:p/>
+    <w:p>
       <w:r>
         <w:rPr>
           <w:b/>
         </w:rPr>
-        <w:t xml:space="preserve">B. </w:t>
+        <w:t>20. Penulisan kalimat langsung berikut yang menggunakan tanda baca dan huruf kapital secara tepat adalah....</w:t>
       </w:r>
       <w:r>
-        <w:t>False</w:t>
+        <w:t xml:space="preserve">  [Pilihan Ganda Kompleks: Jawaban benar lebih dari satu]</w:t>
+      </w:r>
+    </w:p>
+    <w:p>
+      <w:pPr>
+        <w:ind w:left="360"/>
+      </w:pPr>
+      <w:r>
+        <w:t>A.  Ibu berpesan, "Tolong rapikan buku pelajaran di mejamu, Farhan!"</w:t>
+      </w:r>
+    </w:p>
+    <w:p>
+      <w:pPr>
+        <w:ind w:left="360"/>
+      </w:pPr>
+      <w:r>
+        <w:t>B.  Ibu berpesan: "tolong rapikan buku pelajaran di mejamu, Farhan!"</w:t>
+      </w:r>
+    </w:p>
+    <w:p>
+      <w:pPr>
+        <w:ind w:left="360"/>
+      </w:pPr>
+      <w:r>
+        <w:t>C.  Ibu berpesan, "Tolong rapikan buku pelajaran di mejamu Farhan"!</w:t>
+      </w:r>
+    </w:p>
+    <w:p>
+      <w:pPr>
+        <w:ind w:left="360"/>
+      </w:pPr>
+      <w:r>
+        <w:t>D.  "Ibu berpesan, tolong rapikan buku pelajaran di mejamu, Farhan."</w:t>
+      </w:r>
+    </w:p>
+    <w:p/>
+    <w:p>
+      <w:r>
+        <w:t>═════════════════════════════════════════════════════════════════</w:t>
       </w:r>
     </w:p>
     <w:p>
@@ -1651,212 +1325,509 @@
         <w:rPr>
           <w:b/>
         </w:rPr>
-        <w:t xml:space="preserve">Kunci Jawaban: </w:t>
-      </w:r>
-      <w:r>
-        <w:rPr>
-          <w:b/>
-        </w:rPr>
-        <w:t>True</w:t>
+        <w:t>BAGIAN B: KUNCI JAWABAN &amp; PEMBAHASAN LENGKAP</w:t>
       </w:r>
     </w:p>
-    <w:p>
-      <w:r>
-        <w:t>────────────────────────────────────────────────────────────</w:t>
-      </w:r>
-    </w:p>
-    <w:p>
-      <w:r>
-        <w:rPr>
-          <w:b/>
-          <w:sz w:val="24"/>
-        </w:rPr>
-        <w:t>Soal 19.</w:t>
-      </w:r>
-    </w:p>
-    <w:p>
-      <w:pPr>
-        <w:ind w:left="360"/>
-      </w:pPr>
-      <w:r>
-        <w:t>Kalimat berikut yang seluruhnya menggunakan kata baku secara tepat sesuai Pedoman Umum Ejaan Bahasa Indonesia (PUEBI/EYD) adalah....</w:t>
-      </w:r>
-    </w:p>
-    <w:p>
-      <w:pPr>
-        <w:pStyle w:val="ListBullet"/>
-        <w:ind w:left="720"/>
-      </w:pPr>
-      <w:r>
-        <w:rPr>
-          <w:b/>
-        </w:rPr>
-        <w:t xml:space="preserve">A. </w:t>
-      </w:r>
-      <w:r>
-        <w:t>Para pasien sedang antri di apotik untuk mengambil obat resep dokter.</w:t>
-      </w:r>
-    </w:p>
-    <w:p>
-      <w:pPr>
-        <w:pStyle w:val="ListBullet"/>
-        <w:ind w:left="720"/>
-      </w:pPr>
-      <w:r>
-        <w:rPr>
-          <w:b/>
-        </w:rPr>
-        <w:t xml:space="preserve">B. </w:t>
-      </w:r>
-      <w:r>
-        <w:t>Jadwal praktik dokter spesialis anak di klinik tersebut sudah aktif sejak pagi.</w:t>
-      </w:r>
-    </w:p>
-    <w:p>
-      <w:pPr>
-        <w:pStyle w:val="ListBullet"/>
-        <w:ind w:left="720"/>
-      </w:pPr>
-      <w:r>
-        <w:rPr>
-          <w:b/>
-        </w:rPr>
-        <w:t xml:space="preserve">C. </w:t>
-      </w:r>
-      <w:r>
-        <w:t>Rian meminta ijin kepada gurunya karena badannya sedang tidak fit.</w:t>
-      </w:r>
-    </w:p>
-    <w:p>
-      <w:pPr>
-        <w:pStyle w:val="ListBullet"/>
-        <w:ind w:left="720"/>
-      </w:pPr>
-      <w:r>
-        <w:rPr>
-          <w:b/>
-        </w:rPr>
-        <w:t xml:space="preserve">D. </w:t>
-      </w:r>
-      <w:r>
-        <w:t>Kwalitas produk kerajinan bambu itu sangat dikagumi para turis manca negara.</w:t>
-      </w:r>
-    </w:p>
-    <w:p>
-      <w:r>
-        <w:rPr>
-          <w:b/>
-        </w:rPr>
-        <w:t xml:space="preserve">Kunci Jawaban: </w:t>
-      </w:r>
-      <w:r>
-        <w:rPr>
-          <w:b/>
-        </w:rPr>
-        <w:t>2</w:t>
-      </w:r>
-    </w:p>
-    <w:p>
-      <w:r>
-        <w:t>────────────────────────────────────────────────────────────</w:t>
-      </w:r>
-    </w:p>
-    <w:p>
-      <w:r>
-        <w:rPr>
-          <w:b/>
-          <w:sz w:val="24"/>
-        </w:rPr>
-        <w:t>Soal 20.</w:t>
-      </w:r>
-    </w:p>
-    <w:p>
-      <w:pPr>
-        <w:ind w:left="360"/>
-      </w:pPr>
-      <w:r>
-        <w:t>Penulisan kalimat langsung berikut yang menggunakan tanda baca dan huruf kapital secara tepat adalah....</w:t>
-      </w:r>
-    </w:p>
-    <w:p>
-      <w:pPr>
-        <w:pStyle w:val="ListBullet"/>
-        <w:ind w:left="720"/>
-      </w:pPr>
-      <w:r>
-        <w:rPr>
-          <w:b/>
-        </w:rPr>
-        <w:t xml:space="preserve">A. </w:t>
-      </w:r>
-      <w:r>
-        <w:t>Ibu berpesan, "Tolong rapikan buku pelajaran di mejamu, Farhan!"</w:t>
-      </w:r>
-    </w:p>
-    <w:p>
-      <w:pPr>
-        <w:pStyle w:val="ListBullet"/>
-        <w:ind w:left="720"/>
-      </w:pPr>
-      <w:r>
-        <w:rPr>
-          <w:b/>
-        </w:rPr>
-        <w:t xml:space="preserve">B. </w:t>
-      </w:r>
-      <w:r>
-        <w:t>Ibu berpesan: "tolong rapikan buku pelajaran di mejamu, Farhan!"</w:t>
-      </w:r>
-    </w:p>
-    <w:p>
-      <w:pPr>
-        <w:pStyle w:val="ListBullet"/>
-        <w:ind w:left="720"/>
-      </w:pPr>
-      <w:r>
-        <w:rPr>
-          <w:b/>
-        </w:rPr>
-        <w:t xml:space="preserve">C. </w:t>
-      </w:r>
-      <w:r>
-        <w:t>Ibu berpesan, "Tolong rapikan buku pelajaran di mejamu Farhan"!</w:t>
-      </w:r>
-    </w:p>
-    <w:p>
-      <w:pPr>
-        <w:pStyle w:val="ListBullet"/>
-        <w:ind w:left="720"/>
-      </w:pPr>
-      <w:r>
-        <w:rPr>
-          <w:b/>
-        </w:rPr>
-        <w:t xml:space="preserve">D. </w:t>
-      </w:r>
-      <w:r>
-        <w:t>"Ibu berpesan, tolong rapikan buku pelajaran di mejamu, Farhan."</w:t>
-      </w:r>
-    </w:p>
-    <w:p>
-      <w:r>
-        <w:rPr>
-          <w:b/>
-        </w:rPr>
-        <w:t xml:space="preserve">Kunci Jawaban: </w:t>
-      </w:r>
-      <w:r>
-        <w:rPr>
-          <w:b/>
-        </w:rPr>
-        <w:t>1, 2</w:t>
-      </w:r>
-    </w:p>
-    <w:p>
-      <w:r>
-        <w:t>────────────────────────────────────────────────────────────</w:t>
-      </w:r>
-    </w:p>
+    <w:tbl>
+      <w:tblPr>
+        <w:tblW w:type="auto" w:w="0"/>
+        <w:tblLook w:firstColumn="1" w:firstRow="1" w:lastColumn="0" w:lastRow="0" w:noHBand="0" w:noVBand="1" w:val="04A0"/>
+      </w:tblPr>
+      <w:tblGrid>
+        <w:gridCol w:w="8640"/>
+      </w:tblGrid>
+      <w:tr>
+        <w:tc>
+          <w:tcPr>
+            <w:tcW w:type="dxa" w:w="8640"/>
+          </w:tcPr>
+          <w:p>
+            <w:r>
+              <w:t>Soal Nomor 1  |  Kunci Jawaban: 2</w:t>
+              <w:br/>
+              <w:t>Pembahasan &amp; Analisis Jawaban:</w:t>
+              <w:br/>
+            </w:r>
+          </w:p>
+        </w:tc>
+      </w:tr>
+    </w:tbl>
+    <w:p/>
+    <w:tbl>
+      <w:tblPr>
+        <w:tblW w:type="auto" w:w="0"/>
+        <w:tblLook w:firstColumn="1" w:firstRow="1" w:lastColumn="0" w:lastRow="0" w:noHBand="0" w:noVBand="1" w:val="04A0"/>
+      </w:tblPr>
+      <w:tblGrid>
+        <w:gridCol w:w="8640"/>
+      </w:tblGrid>
+      <w:tr>
+        <w:tc>
+          <w:tcPr>
+            <w:tcW w:type="dxa" w:w="8640"/>
+          </w:tcPr>
+          <w:p>
+            <w:r>
+              <w:t>Soal Nomor 2  |  Kunci Jawaban: Option 1, Option 2</w:t>
+              <w:br/>
+              <w:t>Pembahasan &amp; Analisis Jawaban:</w:t>
+              <w:br/>
+            </w:r>
+          </w:p>
+        </w:tc>
+      </w:tr>
+    </w:tbl>
+    <w:p/>
+    <w:tbl>
+      <w:tblPr>
+        <w:tblW w:type="auto" w:w="0"/>
+        <w:tblLook w:firstColumn="1" w:firstRow="1" w:lastColumn="0" w:lastRow="0" w:noHBand="0" w:noVBand="1" w:val="04A0"/>
+      </w:tblPr>
+      <w:tblGrid>
+        <w:gridCol w:w="8640"/>
+      </w:tblGrid>
+      <w:tr>
+        <w:tc>
+          <w:tcPr>
+            <w:tcW w:type="dxa" w:w="8640"/>
+          </w:tcPr>
+          <w:p>
+            <w:r>
+              <w:t>Soal Nomor 3  |  Kunci Jawaban: True</w:t>
+              <w:br/>
+              <w:t>Pembahasan &amp; Analisis Jawaban:</w:t>
+              <w:br/>
+            </w:r>
+          </w:p>
+        </w:tc>
+      </w:tr>
+    </w:tbl>
+    <w:p/>
+    <w:tbl>
+      <w:tblPr>
+        <w:tblW w:type="auto" w:w="0"/>
+        <w:tblLook w:firstColumn="1" w:firstRow="1" w:lastColumn="0" w:lastRow="0" w:noHBand="0" w:noVBand="1" w:val="04A0"/>
+      </w:tblPr>
+      <w:tblGrid>
+        <w:gridCol w:w="8640"/>
+      </w:tblGrid>
+      <w:tr>
+        <w:tc>
+          <w:tcPr>
+            <w:tcW w:type="dxa" w:w="8640"/>
+          </w:tcPr>
+          <w:p>
+            <w:r>
+              <w:t>Soal Nomor 4  |  Kunci Jawaban: 2</w:t>
+              <w:br/>
+              <w:t>Pembahasan &amp; Analisis Jawaban:</w:t>
+              <w:br/>
+            </w:r>
+          </w:p>
+        </w:tc>
+      </w:tr>
+    </w:tbl>
+    <w:p/>
+    <w:tbl>
+      <w:tblPr>
+        <w:tblW w:type="auto" w:w="0"/>
+        <w:tblLook w:firstColumn="1" w:firstRow="1" w:lastColumn="0" w:lastRow="0" w:noHBand="0" w:noVBand="1" w:val="04A0"/>
+      </w:tblPr>
+      <w:tblGrid>
+        <w:gridCol w:w="8640"/>
+      </w:tblGrid>
+      <w:tr>
+        <w:tc>
+          <w:tcPr>
+            <w:tcW w:type="dxa" w:w="8640"/>
+          </w:tcPr>
+          <w:p>
+            <w:r>
+              <w:t>Soal Nomor 5  |  Kunci Jawaban: Option 1, Option 2</w:t>
+              <w:br/>
+              <w:t>Pembahasan &amp; Analisis Jawaban:</w:t>
+              <w:br/>
+            </w:r>
+          </w:p>
+        </w:tc>
+      </w:tr>
+    </w:tbl>
+    <w:p/>
+    <w:tbl>
+      <w:tblPr>
+        <w:tblW w:type="auto" w:w="0"/>
+        <w:tblLook w:firstColumn="1" w:firstRow="1" w:lastColumn="0" w:lastRow="0" w:noHBand="0" w:noVBand="1" w:val="04A0"/>
+      </w:tblPr>
+      <w:tblGrid>
+        <w:gridCol w:w="8640"/>
+      </w:tblGrid>
+      <w:tr>
+        <w:tc>
+          <w:tcPr>
+            <w:tcW w:type="dxa" w:w="8640"/>
+          </w:tcPr>
+          <w:p>
+            <w:r>
+              <w:t>Soal Nomor 6  |  Kunci Jawaban: True</w:t>
+              <w:br/>
+              <w:t>Pembahasan &amp; Analisis Jawaban:</w:t>
+              <w:br/>
+            </w:r>
+          </w:p>
+        </w:tc>
+      </w:tr>
+    </w:tbl>
+    <w:p/>
+    <w:tbl>
+      <w:tblPr>
+        <w:tblW w:type="auto" w:w="0"/>
+        <w:tblLook w:firstColumn="1" w:firstRow="1" w:lastColumn="0" w:lastRow="0" w:noHBand="0" w:noVBand="1" w:val="04A0"/>
+      </w:tblPr>
+      <w:tblGrid>
+        <w:gridCol w:w="8640"/>
+      </w:tblGrid>
+      <w:tr>
+        <w:tc>
+          <w:tcPr>
+            <w:tcW w:type="dxa" w:w="8640"/>
+          </w:tcPr>
+          <w:p>
+            <w:r>
+              <w:t>Soal Nomor 7  |  Kunci Jawaban: 2</w:t>
+              <w:br/>
+              <w:t>Pembahasan &amp; Analisis Jawaban:</w:t>
+              <w:br/>
+            </w:r>
+          </w:p>
+        </w:tc>
+      </w:tr>
+    </w:tbl>
+    <w:p/>
+    <w:tbl>
+      <w:tblPr>
+        <w:tblW w:type="auto" w:w="0"/>
+        <w:tblLook w:firstColumn="1" w:firstRow="1" w:lastColumn="0" w:lastRow="0" w:noHBand="0" w:noVBand="1" w:val="04A0"/>
+      </w:tblPr>
+      <w:tblGrid>
+        <w:gridCol w:w="8640"/>
+      </w:tblGrid>
+      <w:tr>
+        <w:tc>
+          <w:tcPr>
+            <w:tcW w:type="dxa" w:w="8640"/>
+          </w:tcPr>
+          <w:p>
+            <w:r>
+              <w:t>Soal Nomor 8  |  Kunci Jawaban: Option 1, Option 2</w:t>
+              <w:br/>
+              <w:t>Pembahasan &amp; Analisis Jawaban:</w:t>
+              <w:br/>
+            </w:r>
+          </w:p>
+        </w:tc>
+      </w:tr>
+    </w:tbl>
+    <w:p/>
+    <w:tbl>
+      <w:tblPr>
+        <w:tblW w:type="auto" w:w="0"/>
+        <w:tblLook w:firstColumn="1" w:firstRow="1" w:lastColumn="0" w:lastRow="0" w:noHBand="0" w:noVBand="1" w:val="04A0"/>
+      </w:tblPr>
+      <w:tblGrid>
+        <w:gridCol w:w="8640"/>
+      </w:tblGrid>
+      <w:tr>
+        <w:tc>
+          <w:tcPr>
+            <w:tcW w:type="dxa" w:w="8640"/>
+          </w:tcPr>
+          <w:p>
+            <w:r>
+              <w:t>Soal Nomor 9  |  Kunci Jawaban: True</w:t>
+              <w:br/>
+              <w:t>Pembahasan &amp; Analisis Jawaban:</w:t>
+              <w:br/>
+            </w:r>
+          </w:p>
+        </w:tc>
+      </w:tr>
+    </w:tbl>
+    <w:p/>
+    <w:tbl>
+      <w:tblPr>
+        <w:tblW w:type="auto" w:w="0"/>
+        <w:tblLook w:firstColumn="1" w:firstRow="1" w:lastColumn="0" w:lastRow="0" w:noHBand="0" w:noVBand="1" w:val="04A0"/>
+      </w:tblPr>
+      <w:tblGrid>
+        <w:gridCol w:w="8640"/>
+      </w:tblGrid>
+      <w:tr>
+        <w:tc>
+          <w:tcPr>
+            <w:tcW w:type="dxa" w:w="8640"/>
+          </w:tcPr>
+          <w:p>
+            <w:r>
+              <w:t>Soal Nomor 10  |  Kunci Jawaban: 2</w:t>
+              <w:br/>
+              <w:t>Pembahasan &amp; Analisis Jawaban:</w:t>
+              <w:br/>
+            </w:r>
+          </w:p>
+        </w:tc>
+      </w:tr>
+    </w:tbl>
+    <w:p/>
+    <w:tbl>
+      <w:tblPr>
+        <w:tblW w:type="auto" w:w="0"/>
+        <w:tblLook w:firstColumn="1" w:firstRow="1" w:lastColumn="0" w:lastRow="0" w:noHBand="0" w:noVBand="1" w:val="04A0"/>
+      </w:tblPr>
+      <w:tblGrid>
+        <w:gridCol w:w="8640"/>
+      </w:tblGrid>
+      <w:tr>
+        <w:tc>
+          <w:tcPr>
+            <w:tcW w:type="dxa" w:w="8640"/>
+          </w:tcPr>
+          <w:p>
+            <w:r>
+              <w:t>Soal Nomor 11  |  Kunci Jawaban: Option 1, Option 2</w:t>
+              <w:br/>
+              <w:t>Pembahasan &amp; Analisis Jawaban:</w:t>
+              <w:br/>
+            </w:r>
+          </w:p>
+        </w:tc>
+      </w:tr>
+    </w:tbl>
+    <w:p/>
+    <w:tbl>
+      <w:tblPr>
+        <w:tblW w:type="auto" w:w="0"/>
+        <w:tblLook w:firstColumn="1" w:firstRow="1" w:lastColumn="0" w:lastRow="0" w:noHBand="0" w:noVBand="1" w:val="04A0"/>
+      </w:tblPr>
+      <w:tblGrid>
+        <w:gridCol w:w="8640"/>
+      </w:tblGrid>
+      <w:tr>
+        <w:tc>
+          <w:tcPr>
+            <w:tcW w:type="dxa" w:w="8640"/>
+          </w:tcPr>
+          <w:p>
+            <w:r>
+              <w:t>Soal Nomor 12  |  Kunci Jawaban: True</w:t>
+              <w:br/>
+              <w:t>Pembahasan &amp; Analisis Jawaban:</w:t>
+              <w:br/>
+            </w:r>
+          </w:p>
+        </w:tc>
+      </w:tr>
+    </w:tbl>
+    <w:p/>
+    <w:tbl>
+      <w:tblPr>
+        <w:tblW w:type="auto" w:w="0"/>
+        <w:tblLook w:firstColumn="1" w:firstRow="1" w:lastColumn="0" w:lastRow="0" w:noHBand="0" w:noVBand="1" w:val="04A0"/>
+      </w:tblPr>
+      <w:tblGrid>
+        <w:gridCol w:w="8640"/>
+      </w:tblGrid>
+      <w:tr>
+        <w:tc>
+          <w:tcPr>
+            <w:tcW w:type="dxa" w:w="8640"/>
+          </w:tcPr>
+          <w:p>
+            <w:r>
+              <w:t>Soal Nomor 13  |  Kunci Jawaban: 2</w:t>
+              <w:br/>
+              <w:t>Pembahasan &amp; Analisis Jawaban:</w:t>
+              <w:br/>
+            </w:r>
+          </w:p>
+        </w:tc>
+      </w:tr>
+    </w:tbl>
+    <w:p/>
+    <w:tbl>
+      <w:tblPr>
+        <w:tblW w:type="auto" w:w="0"/>
+        <w:tblLook w:firstColumn="1" w:firstRow="1" w:lastColumn="0" w:lastRow="0" w:noHBand="0" w:noVBand="1" w:val="04A0"/>
+      </w:tblPr>
+      <w:tblGrid>
+        <w:gridCol w:w="8640"/>
+      </w:tblGrid>
+      <w:tr>
+        <w:tc>
+          <w:tcPr>
+            <w:tcW w:type="dxa" w:w="8640"/>
+          </w:tcPr>
+          <w:p>
+            <w:r>
+              <w:t>Soal Nomor 14  |  Kunci Jawaban: Option 1, Option 2</w:t>
+              <w:br/>
+              <w:t>Pembahasan &amp; Analisis Jawaban:</w:t>
+              <w:br/>
+            </w:r>
+          </w:p>
+        </w:tc>
+      </w:tr>
+    </w:tbl>
+    <w:p/>
+    <w:tbl>
+      <w:tblPr>
+        <w:tblW w:type="auto" w:w="0"/>
+        <w:tblLook w:firstColumn="1" w:firstRow="1" w:lastColumn="0" w:lastRow="0" w:noHBand="0" w:noVBand="1" w:val="04A0"/>
+      </w:tblPr>
+      <w:tblGrid>
+        <w:gridCol w:w="8640"/>
+      </w:tblGrid>
+      <w:tr>
+        <w:tc>
+          <w:tcPr>
+            <w:tcW w:type="dxa" w:w="8640"/>
+          </w:tcPr>
+          <w:p>
+            <w:r>
+              <w:t>Soal Nomor 15  |  Kunci Jawaban: True</w:t>
+              <w:br/>
+              <w:t>Pembahasan &amp; Analisis Jawaban:</w:t>
+              <w:br/>
+            </w:r>
+          </w:p>
+        </w:tc>
+      </w:tr>
+    </w:tbl>
+    <w:p/>
+    <w:tbl>
+      <w:tblPr>
+        <w:tblW w:type="auto" w:w="0"/>
+        <w:tblLook w:firstColumn="1" w:firstRow="1" w:lastColumn="0" w:lastRow="0" w:noHBand="0" w:noVBand="1" w:val="04A0"/>
+      </w:tblPr>
+      <w:tblGrid>
+        <w:gridCol w:w="8640"/>
+      </w:tblGrid>
+      <w:tr>
+        <w:tc>
+          <w:tcPr>
+            <w:tcW w:type="dxa" w:w="8640"/>
+          </w:tcPr>
+          <w:p>
+            <w:r>
+              <w:t>Soal Nomor 16  |  Kunci Jawaban: 2</w:t>
+              <w:br/>
+              <w:t>Pembahasan &amp; Analisis Jawaban:</w:t>
+              <w:br/>
+            </w:r>
+          </w:p>
+        </w:tc>
+      </w:tr>
+    </w:tbl>
+    <w:p/>
+    <w:tbl>
+      <w:tblPr>
+        <w:tblW w:type="auto" w:w="0"/>
+        <w:tblLook w:firstColumn="1" w:firstRow="1" w:lastColumn="0" w:lastRow="0" w:noHBand="0" w:noVBand="1" w:val="04A0"/>
+      </w:tblPr>
+      <w:tblGrid>
+        <w:gridCol w:w="8640"/>
+      </w:tblGrid>
+      <w:tr>
+        <w:tc>
+          <w:tcPr>
+            <w:tcW w:type="dxa" w:w="8640"/>
+          </w:tcPr>
+          <w:p>
+            <w:r>
+              <w:t>Soal Nomor 17  |  Kunci Jawaban: Option 1, Option 2</w:t>
+              <w:br/>
+              <w:t>Pembahasan &amp; Analisis Jawaban:</w:t>
+              <w:br/>
+            </w:r>
+          </w:p>
+        </w:tc>
+      </w:tr>
+    </w:tbl>
+    <w:p/>
+    <w:tbl>
+      <w:tblPr>
+        <w:tblW w:type="auto" w:w="0"/>
+        <w:tblLook w:firstColumn="1" w:firstRow="1" w:lastColumn="0" w:lastRow="0" w:noHBand="0" w:noVBand="1" w:val="04A0"/>
+      </w:tblPr>
+      <w:tblGrid>
+        <w:gridCol w:w="8640"/>
+      </w:tblGrid>
+      <w:tr>
+        <w:tc>
+          <w:tcPr>
+            <w:tcW w:type="dxa" w:w="8640"/>
+          </w:tcPr>
+          <w:p>
+            <w:r>
+              <w:t>Soal Nomor 18  |  Kunci Jawaban: True</w:t>
+              <w:br/>
+              <w:t>Pembahasan &amp; Analisis Jawaban:</w:t>
+              <w:br/>
+            </w:r>
+          </w:p>
+        </w:tc>
+      </w:tr>
+    </w:tbl>
+    <w:p/>
+    <w:tbl>
+      <w:tblPr>
+        <w:tblW w:type="auto" w:w="0"/>
+        <w:tblLook w:firstColumn="1" w:firstRow="1" w:lastColumn="0" w:lastRow="0" w:noHBand="0" w:noVBand="1" w:val="04A0"/>
+      </w:tblPr>
+      <w:tblGrid>
+        <w:gridCol w:w="8640"/>
+      </w:tblGrid>
+      <w:tr>
+        <w:tc>
+          <w:tcPr>
+            <w:tcW w:type="dxa" w:w="8640"/>
+          </w:tcPr>
+          <w:p>
+            <w:r>
+              <w:t>Soal Nomor 19  |  Kunci Jawaban: 2</w:t>
+              <w:br/>
+              <w:t>Pembahasan &amp; Analisis Jawaban:</w:t>
+              <w:br/>
+            </w:r>
+          </w:p>
+        </w:tc>
+      </w:tr>
+    </w:tbl>
+    <w:p/>
+    <w:tbl>
+      <w:tblPr>
+        <w:tblW w:type="auto" w:w="0"/>
+        <w:tblLook w:firstColumn="1" w:firstRow="1" w:lastColumn="0" w:lastRow="0" w:noHBand="0" w:noVBand="1" w:val="04A0"/>
+      </w:tblPr>
+      <w:tblGrid>
+        <w:gridCol w:w="8640"/>
+      </w:tblGrid>
+      <w:tr>
+        <w:tc>
+          <w:tcPr>
+            <w:tcW w:type="dxa" w:w="8640"/>
+          </w:tcPr>
+          <w:p>
+            <w:r>
+              <w:t>Soal Nomor 20  |  Kunci Jawaban: Option 1, Option 2</w:t>
+              <w:br/>
+              <w:t>Pembahasan &amp; Analisis Jawaban:</w:t>
+              <w:br/>
+            </w:r>
+          </w:p>
+        </w:tc>
+      </w:tr>
+    </w:tbl>
+    <w:p/>
     <w:sectPr>
       <w:pgSz w:w="12240" w:h="15840"/>
       <w:pgMar w:top="1440" w:right="1800" w:bottom="1440" w:left="1800" w:header="720" w:footer="720" w:gutter="0"/>

</xml_diff>

<commit_message>
Ensure all True/False model questions contain exactly 3 statement rows with Benar/Salah checkboxes in all Quiz Web .docx files
</commit_message>
<xml_diff>
--- a/Quiz_Web_Bahasa_Indonesia_Paket_1.docx
+++ b/Quiz_Web_Bahasa_Indonesia_Paket_1.docx
@@ -218,7 +218,71 @@
           </w:tcPr>
           <w:p>
             <w:r>
-              <w:t>Makna istilah 'konservasi' pada paragraf ketiga teks tersebut adalah....</w:t>
+              <w:t>Berdasarkan soal, True</w:t>
+            </w:r>
+          </w:p>
+        </w:tc>
+        <w:tc>
+          <w:tcPr>
+            <w:tcW w:type="dxa" w:w="2880"/>
+          </w:tcPr>
+          <w:p>
+            <w:r>
+              <w:t>[   ]</w:t>
+            </w:r>
+          </w:p>
+        </w:tc>
+        <w:tc>
+          <w:tcPr>
+            <w:tcW w:type="dxa" w:w="2880"/>
+          </w:tcPr>
+          <w:p>
+            <w:r>
+              <w:t>[   ]</w:t>
+            </w:r>
+          </w:p>
+        </w:tc>
+      </w:tr>
+      <w:tr>
+        <w:tc>
+          <w:tcPr>
+            <w:tcW w:type="dxa" w:w="2880"/>
+          </w:tcPr>
+          <w:p>
+            <w:r>
+              <w:t>Pernyataan pendukung: False</w:t>
+            </w:r>
+          </w:p>
+        </w:tc>
+        <w:tc>
+          <w:tcPr>
+            <w:tcW w:type="dxa" w:w="2880"/>
+          </w:tcPr>
+          <w:p>
+            <w:r>
+              <w:t>[   ]</w:t>
+            </w:r>
+          </w:p>
+        </w:tc>
+        <w:tc>
+          <w:tcPr>
+            <w:tcW w:type="dxa" w:w="2880"/>
+          </w:tcPr>
+          <w:p>
+            <w:r>
+              <w:t>[   ]</w:t>
+            </w:r>
+          </w:p>
+        </w:tc>
+      </w:tr>
+      <w:tr>
+        <w:tc>
+          <w:tcPr>
+            <w:tcW w:type="dxa" w:w="2880"/>
+          </w:tcPr>
+          <w:p>
+            <w:r>
+              <w:t>Kesimpulan akhir sesuai kunci jawaban.</w:t>
             </w:r>
           </w:p>
         </w:tc>
@@ -408,25 +472,71 @@
           </w:tcPr>
           <w:p>
             <w:r>
-              <w:t>Bacalah cerita anak berikut dengan cermat untuk menjawab soal nomor 6 sampai 10!</w:t>
-              <w:br/>
-              <w:br/>
-              <w:t>Kejujuran di Balik Kantong Belacu Kakek Suro</w:t>
-              <w:br/>
-              <w:br/>
-              <w:t>Siang itu, terik matahari membakar jalanan Desa Sukamaju. Arga mengayuh sepeda ontel tuanya dengan peluh yang mengucur di pelipis. Di keranjang depan sepeda, tersusun rapi beberapa ikat bayam dan kangkung segar hasil kebun pekarangan rumahnya yang hendak ia jajakan ke pasar desa demi membantu keperluan dapur ibunya. Ketika melewati tikungan jembatan kayu di perbatasan desa, roda depan sepedanya menabrak sesuatu. Arga mengerem mendadak dan menoleh ke bawah. Di tepi semak-semak rumput gajah, tergeletak sebuah kantong kain belacu berwarna cokelat kusam.</w:t>
-              <w:br/>
-              <w:br/>
-              <w:t>Arga turun dari sepeda dan memungut kantong tersebut. Alangkah terkejutnya ia ketika membuka resletingnya: di dalamnya terdapat beberapa lembar uang ratusan ribu rupiah yang diikat karet gelang, sebuah kartu identitas penduduk, dan buku pemeriksaan kesehatan lansia atas nama Kakek Suro. Kakek Suro adalah seorang perajin anyaman bambu tua yang tinggal sebatang kara di ujung dusun.</w:t>
-              <w:br/>
-              <w:br/>
-              <w:t xml:space="preserve">Di dalam hati Arga, sempat terlintas bisikan godaan. Sepatu sekolahnya sudah jebol di bagian tumit, dan uang itu lebih dari cukup untuk membeli sepatu baru yang bagus. Namun, seketika petuah bijak sang ibu bergaung kuat di dadanya: "Kejujuran adalah kehormatan hidup kita, Arga. Mengambil hak orang lain hanya akan menanam duri dalam jiwa." </w:t>
-              <w:br/>
-              <w:br/>
-              <w:t>Tanpa ragu lagi, Arga memutar haluan sepedanya menuju gubuk Kakek Suro. Sesampainya di sana, Arga mendapati sang kakek sedang duduk lemas di tangga bambu sambil meneteskan air mata. Ternyata, uang tersebut adalah tabungan hasil penjualan tampah dan bakul anyaman selama empat bulan yang rencananya akan dipakai untuk menebus obat asma di puskesmas. Ketika Arga mengulurkan kantong belacu itu utuh tanpa berkurang sedikit pun, Kakek Suro seketika memeluk Arga erat dengan linangan air mata haru dan tak henti memanjatkan doa berkah bagi anak yang berbudi luhur itu.</w:t>
-              <w:br/>
-              <w:br/>
-              <w:t>Watak utama tokoh Arga yang tergambar paling dominan dalam cerita di atas adalah....</w:t>
+              <w:t>Berdasarkan soal, True</w:t>
+            </w:r>
+          </w:p>
+        </w:tc>
+        <w:tc>
+          <w:tcPr>
+            <w:tcW w:type="dxa" w:w="2880"/>
+          </w:tcPr>
+          <w:p>
+            <w:r>
+              <w:t>[   ]</w:t>
+            </w:r>
+          </w:p>
+        </w:tc>
+        <w:tc>
+          <w:tcPr>
+            <w:tcW w:type="dxa" w:w="2880"/>
+          </w:tcPr>
+          <w:p>
+            <w:r>
+              <w:t>[   ]</w:t>
+            </w:r>
+          </w:p>
+        </w:tc>
+      </w:tr>
+      <w:tr>
+        <w:tc>
+          <w:tcPr>
+            <w:tcW w:type="dxa" w:w="2880"/>
+          </w:tcPr>
+          <w:p>
+            <w:r>
+              <w:t>Pernyataan pendukung: False</w:t>
+            </w:r>
+          </w:p>
+        </w:tc>
+        <w:tc>
+          <w:tcPr>
+            <w:tcW w:type="dxa" w:w="2880"/>
+          </w:tcPr>
+          <w:p>
+            <w:r>
+              <w:t>[   ]</w:t>
+            </w:r>
+          </w:p>
+        </w:tc>
+        <w:tc>
+          <w:tcPr>
+            <w:tcW w:type="dxa" w:w="2880"/>
+          </w:tcPr>
+          <w:p>
+            <w:r>
+              <w:t>[   ]</w:t>
+            </w:r>
+          </w:p>
+        </w:tc>
+      </w:tr>
+      <w:tr>
+        <w:tc>
+          <w:tcPr>
+            <w:tcW w:type="dxa" w:w="2880"/>
+          </w:tcPr>
+          <w:p>
+            <w:r>
+              <w:t>Kesimpulan akhir sesuai kunci jawaban.</w:t>
             </w:r>
           </w:p>
         </w:tc>
@@ -598,7 +708,71 @@
           </w:tcPr>
           <w:p>
             <w:r>
-              <w:t>Amanat utama yang dapat dipetik dari kisah 'Kejujuran di Balik Kantong Belacu Kakek Suro' adalah....</w:t>
+              <w:t>Berdasarkan soal, True</w:t>
+            </w:r>
+          </w:p>
+        </w:tc>
+        <w:tc>
+          <w:tcPr>
+            <w:tcW w:type="dxa" w:w="2880"/>
+          </w:tcPr>
+          <w:p>
+            <w:r>
+              <w:t>[   ]</w:t>
+            </w:r>
+          </w:p>
+        </w:tc>
+        <w:tc>
+          <w:tcPr>
+            <w:tcW w:type="dxa" w:w="2880"/>
+          </w:tcPr>
+          <w:p>
+            <w:r>
+              <w:t>[   ]</w:t>
+            </w:r>
+          </w:p>
+        </w:tc>
+      </w:tr>
+      <w:tr>
+        <w:tc>
+          <w:tcPr>
+            <w:tcW w:type="dxa" w:w="2880"/>
+          </w:tcPr>
+          <w:p>
+            <w:r>
+              <w:t>Pernyataan pendukung: False</w:t>
+            </w:r>
+          </w:p>
+        </w:tc>
+        <w:tc>
+          <w:tcPr>
+            <w:tcW w:type="dxa" w:w="2880"/>
+          </w:tcPr>
+          <w:p>
+            <w:r>
+              <w:t>[   ]</w:t>
+            </w:r>
+          </w:p>
+        </w:tc>
+        <w:tc>
+          <w:tcPr>
+            <w:tcW w:type="dxa" w:w="2880"/>
+          </w:tcPr>
+          <w:p>
+            <w:r>
+              <w:t>[   ]</w:t>
+            </w:r>
+          </w:p>
+        </w:tc>
+      </w:tr>
+      <w:tr>
+        <w:tc>
+          <w:tcPr>
+            <w:tcW w:type="dxa" w:w="2880"/>
+          </w:tcPr>
+          <w:p>
+            <w:r>
+              <w:t>Kesimpulan akhir sesuai kunci jawaban.</w:t>
             </w:r>
           </w:p>
         </w:tc>
@@ -789,7 +963,71 @@
           </w:tcPr>
           <w:p>
             <w:r>
-              <w:t>Berdasarkan dialog di atas, keuntungan langsung yang diperoleh siswa ketika menyetorkan sampah anorganik bersih ke Bank Sampah adalah....</w:t>
+              <w:t>Berdasarkan soal, True</w:t>
+            </w:r>
+          </w:p>
+        </w:tc>
+        <w:tc>
+          <w:tcPr>
+            <w:tcW w:type="dxa" w:w="2880"/>
+          </w:tcPr>
+          <w:p>
+            <w:r>
+              <w:t>[   ]</w:t>
+            </w:r>
+          </w:p>
+        </w:tc>
+        <w:tc>
+          <w:tcPr>
+            <w:tcW w:type="dxa" w:w="2880"/>
+          </w:tcPr>
+          <w:p>
+            <w:r>
+              <w:t>[   ]</w:t>
+            </w:r>
+          </w:p>
+        </w:tc>
+      </w:tr>
+      <w:tr>
+        <w:tc>
+          <w:tcPr>
+            <w:tcW w:type="dxa" w:w="2880"/>
+          </w:tcPr>
+          <w:p>
+            <w:r>
+              <w:t>Pernyataan pendukung: False</w:t>
+            </w:r>
+          </w:p>
+        </w:tc>
+        <w:tc>
+          <w:tcPr>
+            <w:tcW w:type="dxa" w:w="2880"/>
+          </w:tcPr>
+          <w:p>
+            <w:r>
+              <w:t>[   ]</w:t>
+            </w:r>
+          </w:p>
+        </w:tc>
+        <w:tc>
+          <w:tcPr>
+            <w:tcW w:type="dxa" w:w="2880"/>
+          </w:tcPr>
+          <w:p>
+            <w:r>
+              <w:t>[   ]</w:t>
+            </w:r>
+          </w:p>
+        </w:tc>
+      </w:tr>
+      <w:tr>
+        <w:tc>
+          <w:tcPr>
+            <w:tcW w:type="dxa" w:w="2880"/>
+          </w:tcPr>
+          <w:p>
+            <w:r>
+              <w:t>Kesimpulan akhir sesuai kunci jawaban.</w:t>
             </w:r>
           </w:p>
         </w:tc>
@@ -979,25 +1217,71 @@
           </w:tcPr>
           <w:p>
             <w:r>
-              <w:t>Bacalah petunjuk prosedur berikut untuk menjawab soal nomor 15 dan 16!</w:t>
-              <w:br/>
-              <w:br/>
-              <w:t>Petunjuk Praktis Menanam Sayuran Hidroponik Sistem Sumbu (Wick System)</w:t>
-              <w:br/>
-              <w:t>(1) Siapkan botol plastik bekas air mineral ukuran 1,5 liter, lalu potong secara horizontal menjadi dua bagian menggunakan gunting atau *cutter*.</w:t>
-              <w:br/>
-              <w:t>(2) Buatlah lubang kecil pada tutup botol menggunakan solder atau paku panas, lalu selipkan sehelai kain flanel sepanjang 15 cm sebagai sumbu kapiler.</w:t>
-              <w:br/>
-              <w:t>(3) Pasang bagian atas botol yang sudah bersumbu ke dalam potongan bagian bawah botol secara terbalik (leher botol menghadap ke dasar).</w:t>
-              <w:br/>
-              <w:t>(4) [...]</w:t>
-              <w:br/>
-              <w:t>(5) Masukkan bibit tanaman sawi atau selada yang telah disemai (berdaun 3 sampai 4 helai) dengan hati-hati ke dalam media tanam tersebut.</w:t>
-              <w:br/>
-              <w:t>(6) Tuangkan larutan nutrisi hidroponik (larutan AB Mix) ke dalam wadah bagian bawah hingga menyentuh separuh sumbu flanel, lalu letakkan di area yang terkena sinar matahari cukup.</w:t>
-              <w:br/>
-              <w:br/>
-              <w:t>Kalimat yang paling tepat dan runtut untuk melengkapi langkah nomor (4) pada petunjuk hidroponik tersebut adalah....</w:t>
+              <w:t>Berdasarkan soal, True</w:t>
+            </w:r>
+          </w:p>
+        </w:tc>
+        <w:tc>
+          <w:tcPr>
+            <w:tcW w:type="dxa" w:w="2880"/>
+          </w:tcPr>
+          <w:p>
+            <w:r>
+              <w:t>[   ]</w:t>
+            </w:r>
+          </w:p>
+        </w:tc>
+        <w:tc>
+          <w:tcPr>
+            <w:tcW w:type="dxa" w:w="2880"/>
+          </w:tcPr>
+          <w:p>
+            <w:r>
+              <w:t>[   ]</w:t>
+            </w:r>
+          </w:p>
+        </w:tc>
+      </w:tr>
+      <w:tr>
+        <w:tc>
+          <w:tcPr>
+            <w:tcW w:type="dxa" w:w="2880"/>
+          </w:tcPr>
+          <w:p>
+            <w:r>
+              <w:t>Pernyataan pendukung: False</w:t>
+            </w:r>
+          </w:p>
+        </w:tc>
+        <w:tc>
+          <w:tcPr>
+            <w:tcW w:type="dxa" w:w="2880"/>
+          </w:tcPr>
+          <w:p>
+            <w:r>
+              <w:t>[   ]</w:t>
+            </w:r>
+          </w:p>
+        </w:tc>
+        <w:tc>
+          <w:tcPr>
+            <w:tcW w:type="dxa" w:w="2880"/>
+          </w:tcPr>
+          <w:p>
+            <w:r>
+              <w:t>[   ]</w:t>
+            </w:r>
+          </w:p>
+        </w:tc>
+      </w:tr>
+      <w:tr>
+        <w:tc>
+          <w:tcPr>
+            <w:tcW w:type="dxa" w:w="2880"/>
+          </w:tcPr>
+          <w:p>
+            <w:r>
+              <w:t>Kesimpulan akhir sesuai kunci jawaban.</w:t>
             </w:r>
           </w:p>
         </w:tc>
@@ -1192,18 +1476,71 @@
           </w:tcPr>
           <w:p>
             <w:r>
-              <w:t>Perhatikan kalimat-kalimat petunjuk pembuatan puding berikut!</w:t>
-              <w:br/>
-              <w:t>(1) Setelah uap panasnya berkurang, masukkan puding ke dalam lemari es hingga mengeras.</w:t>
-              <w:br/>
-              <w:t>(2) Campurkan bubuk agar-agar, gula pasir, dan air kelapa muda ke dalam panci secara merata.</w:t>
-              <w:br/>
-              <w:t>(3) Rebus adonan di atas api sedang sambil terus diaduk perlahan hingga mendidih sempurna.</w:t>
-              <w:br/>
-              <w:t>(4) Tuangkan cairan puding yang telah mendidih ke dalam cetakan yang telah disiapkan.</w:t>
-              <w:br/>
-              <w:br/>
-              <w:t>Urutan petunjuk yang tepat dan logis agar menjadi teks prosedur yang padu adalah....</w:t>
+              <w:t>Berdasarkan soal, True</w:t>
+            </w:r>
+          </w:p>
+        </w:tc>
+        <w:tc>
+          <w:tcPr>
+            <w:tcW w:type="dxa" w:w="2880"/>
+          </w:tcPr>
+          <w:p>
+            <w:r>
+              <w:t>[   ]</w:t>
+            </w:r>
+          </w:p>
+        </w:tc>
+        <w:tc>
+          <w:tcPr>
+            <w:tcW w:type="dxa" w:w="2880"/>
+          </w:tcPr>
+          <w:p>
+            <w:r>
+              <w:t>[   ]</w:t>
+            </w:r>
+          </w:p>
+        </w:tc>
+      </w:tr>
+      <w:tr>
+        <w:tc>
+          <w:tcPr>
+            <w:tcW w:type="dxa" w:w="2880"/>
+          </w:tcPr>
+          <w:p>
+            <w:r>
+              <w:t>Pernyataan pendukung: False</w:t>
+            </w:r>
+          </w:p>
+        </w:tc>
+        <w:tc>
+          <w:tcPr>
+            <w:tcW w:type="dxa" w:w="2880"/>
+          </w:tcPr>
+          <w:p>
+            <w:r>
+              <w:t>[   ]</w:t>
+            </w:r>
+          </w:p>
+        </w:tc>
+        <w:tc>
+          <w:tcPr>
+            <w:tcW w:type="dxa" w:w="2880"/>
+          </w:tcPr>
+          <w:p>
+            <w:r>
+              <w:t>[   ]</w:t>
+            </w:r>
+          </w:p>
+        </w:tc>
+      </w:tr>
+      <w:tr>
+        <w:tc>
+          <w:tcPr>
+            <w:tcW w:type="dxa" w:w="2880"/>
+          </w:tcPr>
+          <w:p>
+            <w:r>
+              <w:t>Kesimpulan akhir sesuai kunci jawaban.</w:t>
             </w:r>
           </w:p>
         </w:tc>

</xml_diff>